<commit_message>
nmv 21 06 2026
</commit_message>
<xml_diff>
--- a/TS Jatai Ghanam Project/TS 3.4/TS 3.4 Ghanam Malayalam Corrections.docx
+++ b/TS Jatai Ghanam Project/TS 3.4/TS 3.4 Ghanam Malayalam Corrections.docx
@@ -1,7 +1,2144 @@
 
 <file path=word/document.xml><?xml version="1.0" encoding="utf-8"?>
-<w:document xmlns:wpc="http://schemas.microsoft.com/office/word/2010/wordprocessingCanvas" xmlns:cx="http://schemas.microsoft.com/office/drawing/2014/chartex" xmlns:cx1="http://schemas.microsoft.com/office/drawing/2015/9/8/chartex" xmlns:cx2="http://schemas.microsoft.com/office/drawing/2015/10/21/chartex" xmlns:cx3="http://schemas.microsoft.com/office/drawing/2016/5/9/chartex" xmlns:cx4="http://schemas.microsoft.com/office/drawing/2016/5/10/chartex" xmlns:cx5="http://schemas.microsoft.com/office/drawing/2016/5/11/chartex" xmlns:cx6="http://schemas.microsoft.com/office/drawing/2016/5/12/chartex" xmlns:cx7="http://schemas.microsoft.com/office/drawing/2016/5/13/chartex" xmlns:cx8="http://schemas.microsoft.com/office/drawing/2016/5/14/chartex" xmlns:mc="http://schemas.openxmlformats.org/markup-compatibility/2006" xmlns:aink="http://schemas.microsoft.com/office/drawing/2016/ink" xmlns:am3d="http://schemas.microsoft.com/office/drawing/2017/model3d" xmlns:o="urn:schemas-microsoft-com:office:office" xmlns:oel="http://schemas.microsoft.com/office/2019/extlst" xmlns:r="http://schemas.openxmlformats.org/officeDocument/2006/relationships" xmlns:m="http://schemas.openxmlformats.org/officeDocument/2006/math" xmlns:v="urn:schemas-microsoft-com:vml" xmlns:wp14="http://schemas.microsoft.com/office/word/2010/wordprocessingDrawing" xmlns:wp="http://schemas.openxmlformats.org/drawingml/2006/wordprocessingDrawing" xmlns:w10="urn:schemas-microsoft-com:office:word" xmlns:w="http://schemas.openxmlformats.org/wordprocessingml/2006/main" xmlns:w14="http://schemas.microsoft.com/office/word/2010/wordml" xmlns:w15="http://schemas.microsoft.com/office/word/2012/wordml" xmlns:w16cex="http://schemas.microsoft.com/office/word/2018/wordml/cex" xmlns:w16cid="http://schemas.microsoft.com/office/word/2016/wordml/cid" xmlns:w16="http://schemas.microsoft.com/office/word/2018/wordml" xmlns:w16sdtdh="http://schemas.microsoft.com/office/word/2020/wordml/sdtdatahash" xmlns:w16se="http://schemas.microsoft.com/office/word/2015/wordml/symex" xmlns:wpg="http://schemas.microsoft.com/office/word/2010/wordprocessingGroup" xmlns:wpi="http://schemas.microsoft.com/office/word/2010/wordprocessingInk" xmlns:wne="http://schemas.microsoft.com/office/word/2006/wordml" xmlns:wps="http://schemas.microsoft.com/office/word/2010/wordprocessingShape" mc:Ignorable="w14 w15 w16se w16cid w16 w16cex w16sdtdh wp14">
+<w:document xmlns:wpc="http://schemas.microsoft.com/office/word/2010/wordprocessingCanvas" xmlns:cx="http://schemas.microsoft.com/office/drawing/2014/chartex" xmlns:cx1="http://schemas.microsoft.com/office/drawing/2015/9/8/chartex" xmlns:cx2="http://schemas.microsoft.com/office/drawing/2015/10/21/chartex" xmlns:cx3="http://schemas.microsoft.com/office/drawing/2016/5/9/chartex" xmlns:cx4="http://schemas.microsoft.com/office/drawing/2016/5/10/chartex" xmlns:cx5="http://schemas.microsoft.com/office/drawing/2016/5/11/chartex" xmlns:cx6="http://schemas.microsoft.com/office/drawing/2016/5/12/chartex" xmlns:cx7="http://schemas.microsoft.com/office/drawing/2016/5/13/chartex" xmlns:cx8="http://schemas.microsoft.com/office/drawing/2016/5/14/chartex" xmlns:mc="http://schemas.openxmlformats.org/markup-compatibility/2006" xmlns:aink="http://schemas.microsoft.com/office/drawing/2016/ink" xmlns:am3d="http://schemas.microsoft.com/office/drawing/2017/model3d" xmlns:o="urn:schemas-microsoft-com:office:office" xmlns:oel="http://schemas.microsoft.com/office/2019/extlst" xmlns:r="http://schemas.openxmlformats.org/officeDocument/2006/relationships" xmlns:m="http://schemas.openxmlformats.org/officeDocument/2006/math" xmlns:v="urn:schemas-microsoft-com:vml" xmlns:wp14="http://schemas.microsoft.com/office/word/2010/wordprocessingDrawing" xmlns:wp="http://schemas.openxmlformats.org/drawingml/2006/wordprocessingDrawing" xmlns:w10="urn:schemas-microsoft-com:office:word" xmlns:w="http://schemas.openxmlformats.org/wordprocessingml/2006/main" xmlns:w14="http://schemas.microsoft.com/office/word/2010/wordml" xmlns:w15="http://schemas.microsoft.com/office/word/2012/wordml" xmlns:w16cei="http://schemas.microsoft.com/office/word/2026/wordml/cei" xmlns:w16cex="http://schemas.microsoft.com/office/word/2018/wordml/cex" xmlns:w16cid="http://schemas.microsoft.com/office/word/2016/wordml/cid" xmlns:w16="http://schemas.microsoft.com/office/word/2018/wordml" xmlns:w16du="http://schemas.microsoft.com/office/word/2023/wordml/word16du" xmlns:w16sdtdh="http://schemas.microsoft.com/office/word/2020/wordml/sdtdatahash" xmlns:w16sdtfl="http://schemas.microsoft.com/office/word/2024/wordml/sdtformatlock" xmlns:w16se="http://schemas.microsoft.com/office/word/2015/wordml/symex" xmlns:wpg="http://schemas.microsoft.com/office/word/2010/wordprocessingGroup" xmlns:wpi="http://schemas.microsoft.com/office/word/2010/wordprocessingInk" xmlns:wne="http://schemas.microsoft.com/office/word/2006/wordml" xmlns:wps="http://schemas.microsoft.com/office/word/2010/wordprocessingShape" mc:Ignorable="w14 w15 w16se w16cid w16 w16cex w16sdtdh w16sdtfl w16du wp14">
   <w:body>
+    <w:p>
+      <w:pPr>
+        <w:spacing w:before="0" w:line="240" w:lineRule="auto"/>
+        <w:jc w:val="center"/>
+        <w:rPr>
+          <w:b/>
+          <w:bCs/>
+          <w:sz w:val="32"/>
+          <w:szCs w:val="32"/>
+          <w:u w:val="single"/>
+        </w:rPr>
+      </w:pPr>
+      <w:r>
+        <w:rPr>
+          <w:b/>
+          <w:bCs/>
+          <w:sz w:val="32"/>
+          <w:szCs w:val="32"/>
+          <w:u w:val="single"/>
+        </w:rPr>
+        <w:t xml:space="preserve">TS </w:t>
+      </w:r>
+      <w:r>
+        <w:rPr>
+          <w:b/>
+          <w:bCs/>
+          <w:sz w:val="32"/>
+          <w:szCs w:val="32"/>
+          <w:u w:val="single"/>
+        </w:rPr>
+        <w:t>Ghanam</w:t>
+      </w:r>
+      <w:r>
+        <w:rPr>
+          <w:b/>
+          <w:bCs/>
+          <w:sz w:val="32"/>
+          <w:szCs w:val="32"/>
+          <w:u w:val="single"/>
+        </w:rPr>
+        <w:t xml:space="preserve"> </w:t>
+      </w:r>
+      <w:r>
+        <w:rPr>
+          <w:b/>
+          <w:bCs/>
+          <w:sz w:val="32"/>
+          <w:szCs w:val="32"/>
+          <w:u w:val="single"/>
+        </w:rPr>
+        <w:t xml:space="preserve">– TS </w:t>
+      </w:r>
+      <w:r>
+        <w:rPr>
+          <w:b/>
+          <w:bCs/>
+          <w:sz w:val="32"/>
+          <w:szCs w:val="32"/>
+          <w:u w:val="single"/>
+        </w:rPr>
+        <w:t>3.4</w:t>
+      </w:r>
+      <w:r>
+        <w:rPr>
+          <w:b/>
+          <w:bCs/>
+          <w:sz w:val="32"/>
+          <w:szCs w:val="32"/>
+          <w:u w:val="single"/>
+        </w:rPr>
+        <w:t xml:space="preserve"> </w:t>
+      </w:r>
+      <w:r>
+        <w:rPr>
+          <w:b/>
+          <w:bCs/>
+          <w:sz w:val="32"/>
+          <w:szCs w:val="32"/>
+          <w:u w:val="single"/>
+        </w:rPr>
+        <w:t>Malayalam</w:t>
+      </w:r>
+      <w:r>
+        <w:rPr>
+          <w:b/>
+          <w:bCs/>
+          <w:sz w:val="32"/>
+          <w:szCs w:val="32"/>
+          <w:u w:val="single"/>
+        </w:rPr>
+        <w:t xml:space="preserve"> Corrections –</w:t>
+      </w:r>
+      <w:r>
+        <w:rPr>
+          <w:b/>
+          <w:bCs/>
+          <w:sz w:val="32"/>
+          <w:szCs w:val="32"/>
+          <w:u w:val="single"/>
+        </w:rPr>
+        <w:t xml:space="preserve"> </w:t>
+      </w:r>
+      <w:r>
+        <w:rPr>
+          <w:b/>
+          <w:bCs/>
+          <w:sz w:val="32"/>
+          <w:szCs w:val="32"/>
+          <w:u w:val="single"/>
+        </w:rPr>
+        <w:t xml:space="preserve">Observed till </w:t>
+      </w:r>
+      <w:r>
+        <w:rPr>
+          <w:b/>
+          <w:bCs/>
+          <w:sz w:val="32"/>
+          <w:szCs w:val="32"/>
+          <w:highlight w:val="red"/>
+          <w:u w:val="single"/>
+        </w:rPr>
+        <w:t>?????</w:t>
+      </w:r>
+    </w:p>
+    <w:p>
+      <w:pPr>
+        <w:spacing w:before="0" w:line="240" w:lineRule="auto"/>
+        <w:jc w:val="center"/>
+        <w:rPr>
+          <w:b/>
+          <w:bCs/>
+          <w:sz w:val="28"/>
+          <w:szCs w:val="32"/>
+        </w:rPr>
+      </w:pPr>
+      <w:r>
+        <w:rPr>
+          <w:b/>
+          <w:bCs/>
+          <w:sz w:val="28"/>
+          <w:szCs w:val="32"/>
+        </w:rPr>
+        <w:t>(ignore those which are already incorporated in your book’s version and date)</w:t>
+      </w:r>
+    </w:p>
+    <w:tbl>
+      <w:tblPr>
+        <w:tblW w:w="14537" w:type="dxa"/>
+        <w:tblInd w:w="-792" w:type="dxa"/>
+        <w:tblBorders>
+          <w:top w:val="single" w:sz="4" w:space="0" w:color="000000"/>
+          <w:left w:val="single" w:sz="4" w:space="0" w:color="000000"/>
+          <w:bottom w:val="single" w:sz="4" w:space="0" w:color="000000"/>
+          <w:right w:val="single" w:sz="4" w:space="0" w:color="000000"/>
+          <w:insideH w:val="single" w:sz="4" w:space="0" w:color="000000"/>
+          <w:insideV w:val="single" w:sz="4" w:space="0" w:color="000000"/>
+        </w:tblBorders>
+        <w:tblLook w:val="04A0" w:firstRow="1" w:lastRow="0" w:firstColumn="1" w:lastColumn="0" w:noHBand="0" w:noVBand="1"/>
+      </w:tblPr>
+      <w:tblGrid>
+        <w:gridCol w:w="7166"/>
+        <w:gridCol w:w="7371"/>
+      </w:tblGrid>
+      <w:tr>
+        <w:tc>
+          <w:tcPr>
+            <w:tcW w:w="7166" w:type="dxa"/>
+          </w:tcPr>
+          <w:p>
+            <w:pPr>
+              <w:spacing w:before="0" w:line="240" w:lineRule="auto"/>
+              <w:jc w:val="center"/>
+              <w:rPr>
+                <w:b/>
+                <w:sz w:val="32"/>
+                <w:szCs w:val="32"/>
+              </w:rPr>
+            </w:pPr>
+            <w:r>
+              <w:rPr>
+                <w:b/>
+                <w:sz w:val="32"/>
+                <w:szCs w:val="32"/>
+              </w:rPr>
+              <w:t>As Printed</w:t>
+            </w:r>
+          </w:p>
+        </w:tc>
+        <w:tc>
+          <w:tcPr>
+            <w:tcW w:w="7371" w:type="dxa"/>
+          </w:tcPr>
+          <w:p>
+            <w:pPr>
+              <w:spacing w:before="0" w:line="240" w:lineRule="auto"/>
+              <w:ind w:right="-18"/>
+              <w:jc w:val="center"/>
+              <w:rPr>
+                <w:b/>
+                <w:sz w:val="32"/>
+                <w:szCs w:val="32"/>
+              </w:rPr>
+            </w:pPr>
+            <w:r>
+              <w:rPr>
+                <w:b/>
+                <w:sz w:val="32"/>
+                <w:szCs w:val="32"/>
+              </w:rPr>
+              <w:t>To be read as or corrected as</w:t>
+            </w:r>
+            <w:r>
+              <w:rPr>
+                <w:b/>
+                <w:sz w:val="32"/>
+                <w:szCs w:val="32"/>
+              </w:rPr>
+              <w:t xml:space="preserve"> </w:t>
+            </w:r>
+          </w:p>
+        </w:tc>
+      </w:tr>
+      <w:tr>
+        <w:trPr>
+          <w:trHeight w:val="1183"/>
+        </w:trPr>
+        <w:tc>
+          <w:tcPr>
+            <w:tcW w:w="7166" w:type="dxa"/>
+          </w:tcPr>
+          <w:p>
+            <w:pPr>
+              <w:widowControl w:val="0"/>
+              <w:autoSpaceDE w:val="0"/>
+              <w:autoSpaceDN w:val="0"/>
+              <w:adjustRightInd w:val="0"/>
+              <w:spacing w:before="0" w:line="240" w:lineRule="auto"/>
+              <w:rPr>
+                <w:rFonts w:ascii="BRH Malayalam Extra" w:hAnsi="BRH Malayalam Extra" w:cs="BRH Malayalam Extra"/>
+                <w:color w:val="000000"/>
+                <w:sz w:val="32"/>
+                <w:szCs w:val="32"/>
+              </w:rPr>
+            </w:pPr>
+            <w:r>
+              <w:rPr>
+                <w:rFonts w:cs="ar"/>
+                <w:color w:val="000000"/>
+                <w:szCs w:val="36"/>
+              </w:rPr>
+              <w:t>34</w:t>
+            </w:r>
+            <w:r>
+              <w:rPr>
+                <w:rFonts w:ascii="BRH Malayalam Extra" w:hAnsi="BRH Malayalam Extra" w:cs="BRH Malayalam Extra"/>
+                <w:color w:val="000000"/>
+                <w:sz w:val="32"/>
+                <w:szCs w:val="32"/>
+              </w:rPr>
+              <w:t>)</w:t>
+            </w:r>
+            <w:r>
+              <w:rPr>
+                <w:rFonts w:ascii="BRH Malayalam Extra" w:hAnsi="BRH Malayalam Extra" w:cs="BRH Malayalam Extra"/>
+                <w:color w:val="000000"/>
+                <w:sz w:val="32"/>
+                <w:szCs w:val="32"/>
+              </w:rPr>
+              <w:tab/>
+            </w:r>
+            <w:r>
+              <w:rPr>
+                <w:rFonts w:cs="ar"/>
+                <w:color w:val="000000"/>
+                <w:szCs w:val="36"/>
+              </w:rPr>
+              <w:t>3</w:t>
+            </w:r>
+            <w:r>
+              <w:rPr>
+                <w:rFonts w:ascii="BRH Malayalam Extra" w:hAnsi="BRH Malayalam Extra" w:cs="BRH Malayalam Extra"/>
+                <w:color w:val="000000"/>
+                <w:sz w:val="32"/>
+                <w:szCs w:val="32"/>
+              </w:rPr>
+              <w:t>.</w:t>
+            </w:r>
+            <w:r>
+              <w:rPr>
+                <w:rFonts w:cs="ar"/>
+                <w:color w:val="000000"/>
+                <w:szCs w:val="36"/>
+              </w:rPr>
+              <w:t>4</w:t>
+            </w:r>
+            <w:r>
+              <w:rPr>
+                <w:rFonts w:ascii="BRH Malayalam Extra" w:hAnsi="BRH Malayalam Extra" w:cs="BRH Malayalam Extra"/>
+                <w:color w:val="000000"/>
+                <w:sz w:val="32"/>
+                <w:szCs w:val="32"/>
+              </w:rPr>
+              <w:t>.</w:t>
+            </w:r>
+            <w:r>
+              <w:rPr>
+                <w:rFonts w:cs="ar"/>
+                <w:color w:val="000000"/>
+                <w:szCs w:val="36"/>
+              </w:rPr>
+              <w:t>9</w:t>
+            </w:r>
+            <w:r>
+              <w:rPr>
+                <w:rFonts w:ascii="BRH Malayalam Extra" w:hAnsi="BRH Malayalam Extra" w:cs="BRH Malayalam Extra"/>
+                <w:color w:val="000000"/>
+                <w:sz w:val="32"/>
+                <w:szCs w:val="32"/>
+              </w:rPr>
+              <w:t>.</w:t>
+            </w:r>
+            <w:r>
+              <w:rPr>
+                <w:rFonts w:cs="ar"/>
+                <w:color w:val="000000"/>
+                <w:szCs w:val="36"/>
+              </w:rPr>
+              <w:t>1</w:t>
+            </w:r>
+            <w:r>
+              <w:rPr>
+                <w:rFonts w:ascii="BRH Malayalam Extra" w:hAnsi="BRH Malayalam Extra" w:cs="BRH Malayalam Extra"/>
+                <w:color w:val="000000"/>
+                <w:sz w:val="32"/>
+                <w:szCs w:val="32"/>
+              </w:rPr>
+              <w:t>(</w:t>
+            </w:r>
+            <w:r>
+              <w:rPr>
+                <w:rFonts w:cs="ar"/>
+                <w:color w:val="000000"/>
+                <w:szCs w:val="36"/>
+              </w:rPr>
+              <w:t>29</w:t>
+            </w:r>
+            <w:r>
+              <w:rPr>
+                <w:rFonts w:ascii="BRH Malayalam Extra" w:hAnsi="BRH Malayalam Extra" w:cs="BRH Malayalam Extra"/>
+                <w:color w:val="000000"/>
+                <w:sz w:val="32"/>
+                <w:szCs w:val="32"/>
+              </w:rPr>
+              <w:t>)- Ad¡—iZyJ |</w:t>
+            </w:r>
+          </w:p>
+          <w:p>
+            <w:pPr>
+              <w:widowControl w:val="0"/>
+              <w:autoSpaceDE w:val="0"/>
+              <w:autoSpaceDN w:val="0"/>
+              <w:adjustRightInd w:val="0"/>
+              <w:spacing w:before="0" w:line="240" w:lineRule="auto"/>
+              <w:rPr>
+                <w:rFonts w:cs="BRH Malayalam Extra"/>
+                <w:szCs w:val="40"/>
+              </w:rPr>
+            </w:pPr>
+            <w:r>
+              <w:rPr>
+                <w:rFonts w:ascii="BRH Malayalam Extra" w:hAnsi="BRH Malayalam Extra" w:cs="BRH Malayalam Extra"/>
+                <w:color w:val="000000"/>
+                <w:sz w:val="32"/>
+                <w:szCs w:val="32"/>
+              </w:rPr>
+              <w:t>Ad¡—iZy</w:t>
+            </w:r>
+            <w:r>
+              <w:rPr>
+                <w:rFonts w:ascii="BRH Malayalam Extra" w:hAnsi="BRH Malayalam Extra" w:cs="BRH Malayalam Extra"/>
+                <w:color w:val="000000"/>
+                <w:sz w:val="26"/>
+                <w:szCs w:val="32"/>
+              </w:rPr>
+              <w:t>–</w:t>
+            </w:r>
+            <w:r>
+              <w:rPr>
+                <w:rFonts w:ascii="BRH Malayalam Extra" w:hAnsi="BRH Malayalam Extra" w:cs="BRH Malayalam Extra"/>
+                <w:color w:val="000000"/>
+                <w:sz w:val="32"/>
+                <w:szCs w:val="32"/>
+              </w:rPr>
+              <w:t>ky</w:t>
+            </w:r>
+            <w:r>
+              <w:rPr>
+                <w:rFonts w:ascii="BRH Malayalam Extra" w:hAnsi="BRH Malayalam Extra" w:cs="BRH Malayalam Extra"/>
+                <w:color w:val="000000"/>
+                <w:sz w:val="32"/>
+                <w:szCs w:val="32"/>
+                <w:highlight w:val="yellow"/>
+              </w:rPr>
+              <w:t>Zõ</w:t>
+            </w:r>
+            <w:r>
+              <w:rPr>
+                <w:rFonts w:ascii="BRH Malayalam Extra" w:hAnsi="BRH Malayalam Extra" w:cs="BRH Malayalam Extra"/>
+                <w:color w:val="000000"/>
+                <w:sz w:val="32"/>
+                <w:szCs w:val="32"/>
+              </w:rPr>
+              <w:t>—d¡ - i</w:t>
+            </w:r>
+            <w:r>
+              <w:rPr>
+                <w:rFonts w:ascii="BRH Malayalam Extra" w:hAnsi="BRH Malayalam Extra" w:cs="BRH Malayalam Extra"/>
+                <w:color w:val="000000"/>
+                <w:sz w:val="26"/>
+                <w:szCs w:val="32"/>
+              </w:rPr>
+              <w:t>–</w:t>
+            </w:r>
+            <w:r>
+              <w:rPr>
+                <w:rFonts w:ascii="BRH Malayalam Extra" w:hAnsi="BRH Malayalam Extra" w:cs="BRH Malayalam Extra"/>
+                <w:color w:val="000000"/>
+                <w:sz w:val="32"/>
+                <w:szCs w:val="32"/>
+              </w:rPr>
+              <w:t>Zy</w:t>
+            </w:r>
+            <w:r>
+              <w:rPr>
+                <w:rFonts w:ascii="BRH Malayalam Extra" w:hAnsi="BRH Malayalam Extra" w:cs="BRH Malayalam Extra"/>
+                <w:color w:val="000000"/>
+                <w:sz w:val="26"/>
+                <w:szCs w:val="32"/>
+              </w:rPr>
+              <w:t>–</w:t>
+            </w:r>
+            <w:r>
+              <w:rPr>
+                <w:rFonts w:ascii="BRH Malayalam Extra" w:hAnsi="BRH Malayalam Extra" w:cs="BRH Malayalam Extra"/>
+                <w:color w:val="000000"/>
+                <w:sz w:val="32"/>
+                <w:szCs w:val="32"/>
+              </w:rPr>
+              <w:t xml:space="preserve">J | </w:t>
+            </w:r>
+          </w:p>
+        </w:tc>
+        <w:tc>
+          <w:tcPr>
+            <w:tcW w:w="7371" w:type="dxa"/>
+          </w:tcPr>
+          <w:p>
+            <w:pPr>
+              <w:widowControl w:val="0"/>
+              <w:autoSpaceDE w:val="0"/>
+              <w:autoSpaceDN w:val="0"/>
+              <w:adjustRightInd w:val="0"/>
+              <w:spacing w:before="0" w:line="240" w:lineRule="auto"/>
+              <w:rPr>
+                <w:rFonts w:ascii="BRH Malayalam Extra" w:hAnsi="BRH Malayalam Extra" w:cs="BRH Malayalam Extra"/>
+                <w:color w:val="000000"/>
+                <w:sz w:val="32"/>
+                <w:szCs w:val="32"/>
+              </w:rPr>
+            </w:pPr>
+            <w:r>
+              <w:rPr>
+                <w:rFonts w:cs="ar"/>
+                <w:color w:val="000000"/>
+                <w:szCs w:val="36"/>
+              </w:rPr>
+              <w:t>34</w:t>
+            </w:r>
+            <w:r>
+              <w:rPr>
+                <w:rFonts w:ascii="BRH Malayalam Extra" w:hAnsi="BRH Malayalam Extra" w:cs="BRH Malayalam Extra"/>
+                <w:color w:val="000000"/>
+                <w:sz w:val="32"/>
+                <w:szCs w:val="32"/>
+              </w:rPr>
+              <w:t>)</w:t>
+            </w:r>
+            <w:r>
+              <w:rPr>
+                <w:rFonts w:ascii="BRH Malayalam Extra" w:hAnsi="BRH Malayalam Extra" w:cs="BRH Malayalam Extra"/>
+                <w:color w:val="000000"/>
+                <w:sz w:val="32"/>
+                <w:szCs w:val="32"/>
+              </w:rPr>
+              <w:tab/>
+            </w:r>
+            <w:r>
+              <w:rPr>
+                <w:rFonts w:cs="ar"/>
+                <w:color w:val="000000"/>
+                <w:szCs w:val="36"/>
+              </w:rPr>
+              <w:t>3</w:t>
+            </w:r>
+            <w:r>
+              <w:rPr>
+                <w:rFonts w:ascii="BRH Malayalam Extra" w:hAnsi="BRH Malayalam Extra" w:cs="BRH Malayalam Extra"/>
+                <w:color w:val="000000"/>
+                <w:sz w:val="32"/>
+                <w:szCs w:val="32"/>
+              </w:rPr>
+              <w:t>.</w:t>
+            </w:r>
+            <w:r>
+              <w:rPr>
+                <w:rFonts w:cs="ar"/>
+                <w:color w:val="000000"/>
+                <w:szCs w:val="36"/>
+              </w:rPr>
+              <w:t>4</w:t>
+            </w:r>
+            <w:r>
+              <w:rPr>
+                <w:rFonts w:ascii="BRH Malayalam Extra" w:hAnsi="BRH Malayalam Extra" w:cs="BRH Malayalam Extra"/>
+                <w:color w:val="000000"/>
+                <w:sz w:val="32"/>
+                <w:szCs w:val="32"/>
+              </w:rPr>
+              <w:t>.</w:t>
+            </w:r>
+            <w:r>
+              <w:rPr>
+                <w:rFonts w:cs="ar"/>
+                <w:color w:val="000000"/>
+                <w:szCs w:val="36"/>
+              </w:rPr>
+              <w:t>9</w:t>
+            </w:r>
+            <w:r>
+              <w:rPr>
+                <w:rFonts w:ascii="BRH Malayalam Extra" w:hAnsi="BRH Malayalam Extra" w:cs="BRH Malayalam Extra"/>
+                <w:color w:val="000000"/>
+                <w:sz w:val="32"/>
+                <w:szCs w:val="32"/>
+              </w:rPr>
+              <w:t>.</w:t>
+            </w:r>
+            <w:r>
+              <w:rPr>
+                <w:rFonts w:cs="ar"/>
+                <w:color w:val="000000"/>
+                <w:szCs w:val="36"/>
+              </w:rPr>
+              <w:t>1</w:t>
+            </w:r>
+            <w:r>
+              <w:rPr>
+                <w:rFonts w:ascii="BRH Malayalam Extra" w:hAnsi="BRH Malayalam Extra" w:cs="BRH Malayalam Extra"/>
+                <w:color w:val="000000"/>
+                <w:sz w:val="32"/>
+                <w:szCs w:val="32"/>
+              </w:rPr>
+              <w:t>(</w:t>
+            </w:r>
+            <w:r>
+              <w:rPr>
+                <w:rFonts w:cs="ar"/>
+                <w:color w:val="000000"/>
+                <w:szCs w:val="36"/>
+              </w:rPr>
+              <w:t>29</w:t>
+            </w:r>
+            <w:r>
+              <w:rPr>
+                <w:rFonts w:ascii="BRH Malayalam Extra" w:hAnsi="BRH Malayalam Extra" w:cs="BRH Malayalam Extra"/>
+                <w:color w:val="000000"/>
+                <w:sz w:val="32"/>
+                <w:szCs w:val="32"/>
+              </w:rPr>
+              <w:t>)- Ad¡—iZyJ |</w:t>
+            </w:r>
+          </w:p>
+          <w:p>
+            <w:pPr>
+              <w:widowControl w:val="0"/>
+              <w:autoSpaceDE w:val="0"/>
+              <w:autoSpaceDN w:val="0"/>
+              <w:adjustRightInd w:val="0"/>
+              <w:spacing w:before="0" w:line="240" w:lineRule="auto"/>
+              <w:rPr>
+                <w:rFonts w:cs="BRH Malayalam Extra"/>
+                <w:szCs w:val="40"/>
+              </w:rPr>
+            </w:pPr>
+            <w:r>
+              <w:rPr>
+                <w:rFonts w:ascii="BRH Malayalam Extra" w:hAnsi="BRH Malayalam Extra" w:cs="BRH Malayalam Extra"/>
+                <w:color w:val="000000"/>
+                <w:sz w:val="32"/>
+                <w:szCs w:val="32"/>
+              </w:rPr>
+              <w:t>Ad¡—iZy</w:t>
+            </w:r>
+            <w:r>
+              <w:rPr>
+                <w:rFonts w:ascii="BRH Malayalam Extra" w:hAnsi="BRH Malayalam Extra" w:cs="BRH Malayalam Extra"/>
+                <w:color w:val="000000"/>
+                <w:sz w:val="26"/>
+                <w:szCs w:val="32"/>
+              </w:rPr>
+              <w:t>–</w:t>
+            </w:r>
+            <w:r>
+              <w:rPr>
+                <w:rFonts w:ascii="BRH Malayalam Extra" w:hAnsi="BRH Malayalam Extra" w:cs="BRH Malayalam Extra"/>
+                <w:color w:val="000000"/>
+                <w:sz w:val="32"/>
+                <w:szCs w:val="32"/>
+              </w:rPr>
+              <w:t>kyZõ</w:t>
+            </w:r>
+            <w:r>
+              <w:rPr>
+                <w:rFonts w:ascii="BRH Malayalam Extra" w:hAnsi="BRH Malayalam Extra" w:cs="BRH Malayalam Extra"/>
+                <w:color w:val="000000"/>
+                <w:sz w:val="32"/>
+                <w:szCs w:val="32"/>
+                <w:highlight w:val="green"/>
+              </w:rPr>
+              <w:t>d¡</w:t>
+            </w:r>
+            <w:r>
+              <w:rPr>
+                <w:rFonts w:ascii="BRH Malayalam Extra" w:hAnsi="BRH Malayalam Extra" w:cs="BRH Malayalam Extra"/>
+                <w:color w:val="000000"/>
+                <w:sz w:val="32"/>
+                <w:szCs w:val="32"/>
+              </w:rPr>
+              <w:t>— - i</w:t>
+            </w:r>
+            <w:r>
+              <w:rPr>
+                <w:rFonts w:ascii="BRH Malayalam Extra" w:hAnsi="BRH Malayalam Extra" w:cs="BRH Malayalam Extra"/>
+                <w:color w:val="000000"/>
+                <w:sz w:val="26"/>
+                <w:szCs w:val="32"/>
+              </w:rPr>
+              <w:t>–</w:t>
+            </w:r>
+            <w:r>
+              <w:rPr>
+                <w:rFonts w:ascii="BRH Malayalam Extra" w:hAnsi="BRH Malayalam Extra" w:cs="BRH Malayalam Extra"/>
+                <w:color w:val="000000"/>
+                <w:sz w:val="32"/>
+                <w:szCs w:val="32"/>
+              </w:rPr>
+              <w:t>Zy</w:t>
+            </w:r>
+            <w:r>
+              <w:rPr>
+                <w:rFonts w:ascii="BRH Malayalam Extra" w:hAnsi="BRH Malayalam Extra" w:cs="BRH Malayalam Extra"/>
+                <w:color w:val="000000"/>
+                <w:sz w:val="26"/>
+                <w:szCs w:val="32"/>
+              </w:rPr>
+              <w:t>–</w:t>
+            </w:r>
+            <w:r>
+              <w:rPr>
+                <w:rFonts w:ascii="BRH Malayalam Extra" w:hAnsi="BRH Malayalam Extra" w:cs="BRH Malayalam Extra"/>
+                <w:color w:val="000000"/>
+                <w:sz w:val="32"/>
+                <w:szCs w:val="32"/>
+              </w:rPr>
+              <w:t xml:space="preserve">J | </w:t>
+            </w:r>
+          </w:p>
+        </w:tc>
+      </w:tr>
+      <w:tr>
+        <w:trPr>
+          <w:trHeight w:val="1183"/>
+        </w:trPr>
+        <w:tc>
+          <w:tcPr>
+            <w:tcW w:w="7166" w:type="dxa"/>
+          </w:tcPr>
+          <w:p>
+            <w:pPr>
+              <w:widowControl w:val="0"/>
+              <w:autoSpaceDE w:val="0"/>
+              <w:autoSpaceDN w:val="0"/>
+              <w:adjustRightInd w:val="0"/>
+              <w:spacing w:before="0" w:line="240" w:lineRule="auto"/>
+              <w:rPr>
+                <w:rFonts w:ascii="BRH Malayalam Extra" w:hAnsi="BRH Malayalam Extra" w:cs="BRH Malayalam Extra"/>
+                <w:color w:val="000000"/>
+                <w:sz w:val="32"/>
+                <w:szCs w:val="32"/>
+              </w:rPr>
+            </w:pPr>
+            <w:r>
+              <w:rPr>
+                <w:rFonts w:cs="ar"/>
+                <w:color w:val="000000"/>
+                <w:szCs w:val="36"/>
+              </w:rPr>
+              <w:t>23</w:t>
+            </w:r>
+            <w:r>
+              <w:rPr>
+                <w:rFonts w:ascii="BRH Malayalam Extra" w:hAnsi="BRH Malayalam Extra" w:cs="BRH Malayalam Extra"/>
+                <w:color w:val="000000"/>
+                <w:sz w:val="32"/>
+                <w:szCs w:val="32"/>
+              </w:rPr>
+              <w:t>)</w:t>
+            </w:r>
+            <w:r>
+              <w:rPr>
+                <w:rFonts w:ascii="BRH Malayalam Extra" w:hAnsi="BRH Malayalam Extra" w:cs="BRH Malayalam Extra"/>
+                <w:color w:val="000000"/>
+                <w:sz w:val="32"/>
+                <w:szCs w:val="32"/>
+              </w:rPr>
+              <w:tab/>
+            </w:r>
+            <w:r>
+              <w:rPr>
+                <w:rFonts w:cs="ar"/>
+                <w:color w:val="000000"/>
+                <w:szCs w:val="36"/>
+              </w:rPr>
+              <w:t>3</w:t>
+            </w:r>
+            <w:r>
+              <w:rPr>
+                <w:rFonts w:ascii="BRH Malayalam Extra" w:hAnsi="BRH Malayalam Extra" w:cs="BRH Malayalam Extra"/>
+                <w:color w:val="000000"/>
+                <w:sz w:val="32"/>
+                <w:szCs w:val="32"/>
+              </w:rPr>
+              <w:t>.</w:t>
+            </w:r>
+            <w:r>
+              <w:rPr>
+                <w:rFonts w:cs="ar"/>
+                <w:color w:val="000000"/>
+                <w:szCs w:val="36"/>
+              </w:rPr>
+              <w:t>4</w:t>
+            </w:r>
+            <w:r>
+              <w:rPr>
+                <w:rFonts w:ascii="BRH Malayalam Extra" w:hAnsi="BRH Malayalam Extra" w:cs="BRH Malayalam Extra"/>
+                <w:color w:val="000000"/>
+                <w:sz w:val="32"/>
+                <w:szCs w:val="32"/>
+              </w:rPr>
+              <w:t>.</w:t>
+            </w:r>
+            <w:r>
+              <w:rPr>
+                <w:rFonts w:cs="ar"/>
+                <w:color w:val="000000"/>
+                <w:szCs w:val="36"/>
+              </w:rPr>
+              <w:t>9</w:t>
+            </w:r>
+            <w:r>
+              <w:rPr>
+                <w:rFonts w:ascii="BRH Malayalam Extra" w:hAnsi="BRH Malayalam Extra" w:cs="BRH Malayalam Extra"/>
+                <w:color w:val="000000"/>
+                <w:sz w:val="32"/>
+                <w:szCs w:val="32"/>
+              </w:rPr>
+              <w:t>.</w:t>
+            </w:r>
+            <w:r>
+              <w:rPr>
+                <w:rFonts w:cs="ar"/>
+                <w:color w:val="000000"/>
+                <w:szCs w:val="36"/>
+              </w:rPr>
+              <w:t>2</w:t>
+            </w:r>
+            <w:r>
+              <w:rPr>
+                <w:rFonts w:ascii="BRH Malayalam Extra" w:hAnsi="BRH Malayalam Extra" w:cs="BRH Malayalam Extra"/>
+                <w:color w:val="000000"/>
+                <w:sz w:val="32"/>
+                <w:szCs w:val="32"/>
+              </w:rPr>
+              <w:t>(</w:t>
+            </w:r>
+            <w:r>
+              <w:rPr>
+                <w:rFonts w:cs="ar"/>
+                <w:color w:val="000000"/>
+                <w:szCs w:val="36"/>
+              </w:rPr>
+              <w:t>21</w:t>
+            </w:r>
+            <w:r>
+              <w:rPr>
+                <w:rFonts w:ascii="BRH Malayalam Extra" w:hAnsi="BRH Malayalam Extra" w:cs="BRH Malayalam Extra"/>
+                <w:color w:val="000000"/>
+                <w:sz w:val="32"/>
+                <w:szCs w:val="32"/>
+              </w:rPr>
+              <w:t>)- Ad¡—iZyJ |</w:t>
+            </w:r>
+          </w:p>
+          <w:p>
+            <w:pPr>
+              <w:widowControl w:val="0"/>
+              <w:autoSpaceDE w:val="0"/>
+              <w:autoSpaceDN w:val="0"/>
+              <w:adjustRightInd w:val="0"/>
+              <w:spacing w:before="0" w:line="240" w:lineRule="auto"/>
+              <w:rPr>
+                <w:rFonts w:cs="BRH Malayalam Extra"/>
+                <w:szCs w:val="40"/>
+              </w:rPr>
+            </w:pPr>
+            <w:r>
+              <w:rPr>
+                <w:rFonts w:ascii="BRH Malayalam Extra" w:hAnsi="BRH Malayalam Extra" w:cs="BRH Malayalam Extra"/>
+                <w:color w:val="000000"/>
+                <w:sz w:val="32"/>
+                <w:szCs w:val="32"/>
+              </w:rPr>
+              <w:t>Ad¡—iZy</w:t>
+            </w:r>
+            <w:r>
+              <w:rPr>
+                <w:rFonts w:ascii="BRH Malayalam Extra" w:hAnsi="BRH Malayalam Extra" w:cs="BRH Malayalam Extra"/>
+                <w:color w:val="000000"/>
+                <w:sz w:val="26"/>
+                <w:szCs w:val="32"/>
+              </w:rPr>
+              <w:t>–</w:t>
+            </w:r>
+            <w:r>
+              <w:rPr>
+                <w:rFonts w:ascii="BRH Malayalam Extra" w:hAnsi="BRH Malayalam Extra" w:cs="BRH Malayalam Extra"/>
+                <w:color w:val="000000"/>
+                <w:sz w:val="32"/>
+                <w:szCs w:val="32"/>
+              </w:rPr>
+              <w:t>ky</w:t>
+            </w:r>
+            <w:r>
+              <w:rPr>
+                <w:rFonts w:ascii="BRH Malayalam Extra" w:hAnsi="BRH Malayalam Extra" w:cs="BRH Malayalam Extra"/>
+                <w:color w:val="000000"/>
+                <w:sz w:val="32"/>
+                <w:szCs w:val="32"/>
+                <w:highlight w:val="yellow"/>
+              </w:rPr>
+              <w:t>Zõ</w:t>
+            </w:r>
+            <w:r>
+              <w:rPr>
+                <w:rFonts w:ascii="BRH Malayalam Extra" w:hAnsi="BRH Malayalam Extra" w:cs="BRH Malayalam Extra"/>
+                <w:color w:val="000000"/>
+                <w:sz w:val="32"/>
+                <w:szCs w:val="32"/>
+              </w:rPr>
+              <w:t>—d¡ - i</w:t>
+            </w:r>
+            <w:r>
+              <w:rPr>
+                <w:rFonts w:ascii="BRH Malayalam Extra" w:hAnsi="BRH Malayalam Extra" w:cs="BRH Malayalam Extra"/>
+                <w:color w:val="000000"/>
+                <w:sz w:val="26"/>
+                <w:szCs w:val="32"/>
+              </w:rPr>
+              <w:t>–</w:t>
+            </w:r>
+            <w:r>
+              <w:rPr>
+                <w:rFonts w:ascii="BRH Malayalam Extra" w:hAnsi="BRH Malayalam Extra" w:cs="BRH Malayalam Extra"/>
+                <w:color w:val="000000"/>
+                <w:sz w:val="32"/>
+                <w:szCs w:val="32"/>
+              </w:rPr>
+              <w:t>Zy</w:t>
+            </w:r>
+            <w:r>
+              <w:rPr>
+                <w:rFonts w:ascii="BRH Malayalam Extra" w:hAnsi="BRH Malayalam Extra" w:cs="BRH Malayalam Extra"/>
+                <w:color w:val="000000"/>
+                <w:sz w:val="26"/>
+                <w:szCs w:val="32"/>
+              </w:rPr>
+              <w:t>–</w:t>
+            </w:r>
+            <w:r>
+              <w:rPr>
+                <w:rFonts w:ascii="BRH Malayalam Extra" w:hAnsi="BRH Malayalam Extra" w:cs="BRH Malayalam Extra"/>
+                <w:color w:val="000000"/>
+                <w:sz w:val="32"/>
+                <w:szCs w:val="32"/>
+              </w:rPr>
+              <w:t xml:space="preserve">J | </w:t>
+            </w:r>
+          </w:p>
+        </w:tc>
+        <w:tc>
+          <w:tcPr>
+            <w:tcW w:w="7371" w:type="dxa"/>
+          </w:tcPr>
+          <w:p>
+            <w:pPr>
+              <w:widowControl w:val="0"/>
+              <w:autoSpaceDE w:val="0"/>
+              <w:autoSpaceDN w:val="0"/>
+              <w:adjustRightInd w:val="0"/>
+              <w:spacing w:before="0" w:line="240" w:lineRule="auto"/>
+              <w:rPr>
+                <w:rFonts w:ascii="BRH Malayalam Extra" w:hAnsi="BRH Malayalam Extra" w:cs="BRH Malayalam Extra"/>
+                <w:color w:val="000000"/>
+                <w:sz w:val="32"/>
+                <w:szCs w:val="32"/>
+              </w:rPr>
+            </w:pPr>
+            <w:r>
+              <w:rPr>
+                <w:rFonts w:cs="ar"/>
+                <w:color w:val="000000"/>
+                <w:szCs w:val="36"/>
+              </w:rPr>
+              <w:t>23</w:t>
+            </w:r>
+            <w:r>
+              <w:rPr>
+                <w:rFonts w:ascii="BRH Malayalam Extra" w:hAnsi="BRH Malayalam Extra" w:cs="BRH Malayalam Extra"/>
+                <w:color w:val="000000"/>
+                <w:sz w:val="32"/>
+                <w:szCs w:val="32"/>
+              </w:rPr>
+              <w:t>)</w:t>
+            </w:r>
+            <w:r>
+              <w:rPr>
+                <w:rFonts w:ascii="BRH Malayalam Extra" w:hAnsi="BRH Malayalam Extra" w:cs="BRH Malayalam Extra"/>
+                <w:color w:val="000000"/>
+                <w:sz w:val="32"/>
+                <w:szCs w:val="32"/>
+              </w:rPr>
+              <w:tab/>
+            </w:r>
+            <w:r>
+              <w:rPr>
+                <w:rFonts w:cs="ar"/>
+                <w:color w:val="000000"/>
+                <w:szCs w:val="36"/>
+              </w:rPr>
+              <w:t>3</w:t>
+            </w:r>
+            <w:r>
+              <w:rPr>
+                <w:rFonts w:ascii="BRH Malayalam Extra" w:hAnsi="BRH Malayalam Extra" w:cs="BRH Malayalam Extra"/>
+                <w:color w:val="000000"/>
+                <w:sz w:val="32"/>
+                <w:szCs w:val="32"/>
+              </w:rPr>
+              <w:t>.</w:t>
+            </w:r>
+            <w:r>
+              <w:rPr>
+                <w:rFonts w:cs="ar"/>
+                <w:color w:val="000000"/>
+                <w:szCs w:val="36"/>
+              </w:rPr>
+              <w:t>4</w:t>
+            </w:r>
+            <w:r>
+              <w:rPr>
+                <w:rFonts w:ascii="BRH Malayalam Extra" w:hAnsi="BRH Malayalam Extra" w:cs="BRH Malayalam Extra"/>
+                <w:color w:val="000000"/>
+                <w:sz w:val="32"/>
+                <w:szCs w:val="32"/>
+              </w:rPr>
+              <w:t>.</w:t>
+            </w:r>
+            <w:r>
+              <w:rPr>
+                <w:rFonts w:cs="ar"/>
+                <w:color w:val="000000"/>
+                <w:szCs w:val="36"/>
+              </w:rPr>
+              <w:t>9</w:t>
+            </w:r>
+            <w:r>
+              <w:rPr>
+                <w:rFonts w:ascii="BRH Malayalam Extra" w:hAnsi="BRH Malayalam Extra" w:cs="BRH Malayalam Extra"/>
+                <w:color w:val="000000"/>
+                <w:sz w:val="32"/>
+                <w:szCs w:val="32"/>
+              </w:rPr>
+              <w:t>.</w:t>
+            </w:r>
+            <w:r>
+              <w:rPr>
+                <w:rFonts w:cs="ar"/>
+                <w:color w:val="000000"/>
+                <w:szCs w:val="36"/>
+              </w:rPr>
+              <w:t>2</w:t>
+            </w:r>
+            <w:r>
+              <w:rPr>
+                <w:rFonts w:ascii="BRH Malayalam Extra" w:hAnsi="BRH Malayalam Extra" w:cs="BRH Malayalam Extra"/>
+                <w:color w:val="000000"/>
+                <w:sz w:val="32"/>
+                <w:szCs w:val="32"/>
+              </w:rPr>
+              <w:t>(</w:t>
+            </w:r>
+            <w:r>
+              <w:rPr>
+                <w:rFonts w:cs="ar"/>
+                <w:color w:val="000000"/>
+                <w:szCs w:val="36"/>
+              </w:rPr>
+              <w:t>21</w:t>
+            </w:r>
+            <w:r>
+              <w:rPr>
+                <w:rFonts w:ascii="BRH Malayalam Extra" w:hAnsi="BRH Malayalam Extra" w:cs="BRH Malayalam Extra"/>
+                <w:color w:val="000000"/>
+                <w:sz w:val="32"/>
+                <w:szCs w:val="32"/>
+              </w:rPr>
+              <w:t>)- Ad¡—iZyJ |</w:t>
+            </w:r>
+          </w:p>
+          <w:p>
+            <w:pPr>
+              <w:widowControl w:val="0"/>
+              <w:autoSpaceDE w:val="0"/>
+              <w:autoSpaceDN w:val="0"/>
+              <w:adjustRightInd w:val="0"/>
+              <w:spacing w:before="0" w:line="240" w:lineRule="auto"/>
+              <w:rPr>
+                <w:rFonts w:cs="BRH Malayalam Extra"/>
+                <w:szCs w:val="40"/>
+              </w:rPr>
+            </w:pPr>
+            <w:r>
+              <w:rPr>
+                <w:rFonts w:ascii="BRH Malayalam Extra" w:hAnsi="BRH Malayalam Extra" w:cs="BRH Malayalam Extra"/>
+                <w:color w:val="000000"/>
+                <w:sz w:val="32"/>
+                <w:szCs w:val="32"/>
+              </w:rPr>
+              <w:t>Ad¡—iZy</w:t>
+            </w:r>
+            <w:r>
+              <w:rPr>
+                <w:rFonts w:ascii="BRH Malayalam Extra" w:hAnsi="BRH Malayalam Extra" w:cs="BRH Malayalam Extra"/>
+                <w:color w:val="000000"/>
+                <w:sz w:val="26"/>
+                <w:szCs w:val="32"/>
+              </w:rPr>
+              <w:t>–</w:t>
+            </w:r>
+            <w:r>
+              <w:rPr>
+                <w:rFonts w:ascii="BRH Malayalam Extra" w:hAnsi="BRH Malayalam Extra" w:cs="BRH Malayalam Extra"/>
+                <w:color w:val="000000"/>
+                <w:sz w:val="32"/>
+                <w:szCs w:val="32"/>
+              </w:rPr>
+              <w:t>kyZõ</w:t>
+            </w:r>
+            <w:r>
+              <w:rPr>
+                <w:rFonts w:ascii="BRH Malayalam Extra" w:hAnsi="BRH Malayalam Extra" w:cs="BRH Malayalam Extra"/>
+                <w:color w:val="000000"/>
+                <w:sz w:val="32"/>
+                <w:szCs w:val="32"/>
+                <w:highlight w:val="green"/>
+              </w:rPr>
+              <w:t>d¡</w:t>
+            </w:r>
+            <w:r>
+              <w:rPr>
+                <w:rFonts w:ascii="BRH Malayalam Extra" w:hAnsi="BRH Malayalam Extra" w:cs="BRH Malayalam Extra"/>
+                <w:color w:val="000000"/>
+                <w:sz w:val="32"/>
+                <w:szCs w:val="32"/>
+              </w:rPr>
+              <w:t>— - i</w:t>
+            </w:r>
+            <w:r>
+              <w:rPr>
+                <w:rFonts w:ascii="BRH Malayalam Extra" w:hAnsi="BRH Malayalam Extra" w:cs="BRH Malayalam Extra"/>
+                <w:color w:val="000000"/>
+                <w:sz w:val="26"/>
+                <w:szCs w:val="32"/>
+              </w:rPr>
+              <w:t>–</w:t>
+            </w:r>
+            <w:r>
+              <w:rPr>
+                <w:rFonts w:ascii="BRH Malayalam Extra" w:hAnsi="BRH Malayalam Extra" w:cs="BRH Malayalam Extra"/>
+                <w:color w:val="000000"/>
+                <w:sz w:val="32"/>
+                <w:szCs w:val="32"/>
+              </w:rPr>
+              <w:t>Zy</w:t>
+            </w:r>
+            <w:r>
+              <w:rPr>
+                <w:rFonts w:ascii="BRH Malayalam Extra" w:hAnsi="BRH Malayalam Extra" w:cs="BRH Malayalam Extra"/>
+                <w:color w:val="000000"/>
+                <w:sz w:val="26"/>
+                <w:szCs w:val="32"/>
+              </w:rPr>
+              <w:t>–</w:t>
+            </w:r>
+            <w:r>
+              <w:rPr>
+                <w:rFonts w:ascii="BRH Malayalam Extra" w:hAnsi="BRH Malayalam Extra" w:cs="BRH Malayalam Extra"/>
+                <w:color w:val="000000"/>
+                <w:sz w:val="32"/>
+                <w:szCs w:val="32"/>
+              </w:rPr>
+              <w:t xml:space="preserve">J | </w:t>
+            </w:r>
+          </w:p>
+        </w:tc>
+      </w:tr>
+      <w:tr>
+        <w:trPr>
+          <w:trHeight w:val="1183"/>
+        </w:trPr>
+        <w:tc>
+          <w:tcPr>
+            <w:tcW w:w="7166" w:type="dxa"/>
+          </w:tcPr>
+          <w:p>
+            <w:pPr>
+              <w:widowControl w:val="0"/>
+              <w:autoSpaceDE w:val="0"/>
+              <w:autoSpaceDN w:val="0"/>
+              <w:adjustRightInd w:val="0"/>
+              <w:spacing w:before="0" w:line="240" w:lineRule="auto"/>
+              <w:rPr>
+                <w:rFonts w:ascii="BRH Malayalam Extra" w:hAnsi="BRH Malayalam Extra" w:cs="BRH Malayalam Extra"/>
+                <w:color w:val="000000"/>
+                <w:sz w:val="32"/>
+                <w:szCs w:val="32"/>
+              </w:rPr>
+            </w:pPr>
+            <w:r>
+              <w:rPr>
+                <w:rFonts w:cs="ar"/>
+                <w:color w:val="000000"/>
+                <w:szCs w:val="36"/>
+              </w:rPr>
+              <w:t>34</w:t>
+            </w:r>
+            <w:r>
+              <w:rPr>
+                <w:rFonts w:ascii="BRH Malayalam Extra" w:hAnsi="BRH Malayalam Extra" w:cs="BRH Malayalam Extra"/>
+                <w:color w:val="000000"/>
+                <w:sz w:val="32"/>
+                <w:szCs w:val="32"/>
+              </w:rPr>
+              <w:t>)</w:t>
+            </w:r>
+            <w:r>
+              <w:rPr>
+                <w:rFonts w:ascii="BRH Malayalam Extra" w:hAnsi="BRH Malayalam Extra" w:cs="BRH Malayalam Extra"/>
+                <w:color w:val="000000"/>
+                <w:sz w:val="32"/>
+                <w:szCs w:val="32"/>
+              </w:rPr>
+              <w:tab/>
+            </w:r>
+            <w:r>
+              <w:rPr>
+                <w:rFonts w:cs="ar"/>
+                <w:color w:val="000000"/>
+                <w:szCs w:val="36"/>
+              </w:rPr>
+              <w:t>3</w:t>
+            </w:r>
+            <w:r>
+              <w:rPr>
+                <w:rFonts w:ascii="BRH Malayalam Extra" w:hAnsi="BRH Malayalam Extra" w:cs="BRH Malayalam Extra"/>
+                <w:color w:val="000000"/>
+                <w:sz w:val="32"/>
+                <w:szCs w:val="32"/>
+              </w:rPr>
+              <w:t>.</w:t>
+            </w:r>
+            <w:r>
+              <w:rPr>
+                <w:rFonts w:cs="ar"/>
+                <w:color w:val="000000"/>
+                <w:szCs w:val="36"/>
+              </w:rPr>
+              <w:t>4</w:t>
+            </w:r>
+            <w:r>
+              <w:rPr>
+                <w:rFonts w:ascii="BRH Malayalam Extra" w:hAnsi="BRH Malayalam Extra" w:cs="BRH Malayalam Extra"/>
+                <w:color w:val="000000"/>
+                <w:sz w:val="32"/>
+                <w:szCs w:val="32"/>
+              </w:rPr>
+              <w:t>.</w:t>
+            </w:r>
+            <w:r>
+              <w:rPr>
+                <w:rFonts w:cs="ar"/>
+                <w:color w:val="000000"/>
+                <w:szCs w:val="36"/>
+              </w:rPr>
+              <w:t>9</w:t>
+            </w:r>
+            <w:r>
+              <w:rPr>
+                <w:rFonts w:ascii="BRH Malayalam Extra" w:hAnsi="BRH Malayalam Extra" w:cs="BRH Malayalam Extra"/>
+                <w:color w:val="000000"/>
+                <w:sz w:val="32"/>
+                <w:szCs w:val="32"/>
+              </w:rPr>
+              <w:t>.</w:t>
+            </w:r>
+            <w:r>
+              <w:rPr>
+                <w:rFonts w:cs="ar"/>
+                <w:color w:val="000000"/>
+                <w:szCs w:val="36"/>
+              </w:rPr>
+              <w:t>6</w:t>
+            </w:r>
+            <w:r>
+              <w:rPr>
+                <w:rFonts w:ascii="BRH Malayalam Extra" w:hAnsi="BRH Malayalam Extra" w:cs="BRH Malayalam Extra"/>
+                <w:color w:val="000000"/>
+                <w:sz w:val="32"/>
+                <w:szCs w:val="32"/>
+              </w:rPr>
+              <w:t>(</w:t>
+            </w:r>
+            <w:r>
+              <w:rPr>
+                <w:rFonts w:cs="ar"/>
+                <w:color w:val="000000"/>
+                <w:szCs w:val="36"/>
+              </w:rPr>
+              <w:t>31</w:t>
+            </w:r>
+            <w:r>
+              <w:rPr>
+                <w:rFonts w:ascii="BRH Malayalam Extra" w:hAnsi="BRH Malayalam Extra" w:cs="BRH Malayalam Extra"/>
+                <w:color w:val="000000"/>
+                <w:sz w:val="32"/>
+                <w:szCs w:val="32"/>
+              </w:rPr>
+              <w:t>)- Ad¡—iZyJ |</w:t>
+            </w:r>
+          </w:p>
+          <w:p>
+            <w:pPr>
+              <w:widowControl w:val="0"/>
+              <w:autoSpaceDE w:val="0"/>
+              <w:autoSpaceDN w:val="0"/>
+              <w:adjustRightInd w:val="0"/>
+              <w:spacing w:before="0" w:line="240" w:lineRule="auto"/>
+              <w:rPr>
+                <w:rFonts w:cs="ar"/>
+                <w:color w:val="000000"/>
+                <w:szCs w:val="36"/>
+              </w:rPr>
+            </w:pPr>
+            <w:r>
+              <w:rPr>
+                <w:rFonts w:ascii="BRH Malayalam Extra" w:hAnsi="BRH Malayalam Extra" w:cs="BRH Malayalam Extra"/>
+                <w:color w:val="000000"/>
+                <w:sz w:val="32"/>
+                <w:szCs w:val="32"/>
+              </w:rPr>
+              <w:t>Ad¡—iZy</w:t>
+            </w:r>
+            <w:r>
+              <w:rPr>
+                <w:rFonts w:ascii="BRH Malayalam Extra" w:hAnsi="BRH Malayalam Extra" w:cs="BRH Malayalam Extra"/>
+                <w:color w:val="000000"/>
+                <w:sz w:val="26"/>
+                <w:szCs w:val="32"/>
+              </w:rPr>
+              <w:t>–</w:t>
+            </w:r>
+            <w:r>
+              <w:rPr>
+                <w:rFonts w:ascii="BRH Malayalam Extra" w:hAnsi="BRH Malayalam Extra" w:cs="BRH Malayalam Extra"/>
+                <w:color w:val="000000"/>
+                <w:sz w:val="32"/>
+                <w:szCs w:val="32"/>
+              </w:rPr>
+              <w:t>ky</w:t>
+            </w:r>
+            <w:r>
+              <w:rPr>
+                <w:rFonts w:ascii="BRH Malayalam Extra" w:hAnsi="BRH Malayalam Extra" w:cs="BRH Malayalam Extra"/>
+                <w:color w:val="000000"/>
+                <w:sz w:val="32"/>
+                <w:szCs w:val="32"/>
+                <w:highlight w:val="yellow"/>
+              </w:rPr>
+              <w:t>Zõ</w:t>
+            </w:r>
+            <w:r>
+              <w:rPr>
+                <w:rFonts w:ascii="BRH Malayalam Extra" w:hAnsi="BRH Malayalam Extra" w:cs="BRH Malayalam Extra"/>
+                <w:color w:val="000000"/>
+                <w:sz w:val="32"/>
+                <w:szCs w:val="32"/>
+              </w:rPr>
+              <w:t>—d¡ - i</w:t>
+            </w:r>
+            <w:r>
+              <w:rPr>
+                <w:rFonts w:ascii="BRH Malayalam Extra" w:hAnsi="BRH Malayalam Extra" w:cs="BRH Malayalam Extra"/>
+                <w:color w:val="000000"/>
+                <w:sz w:val="26"/>
+                <w:szCs w:val="32"/>
+              </w:rPr>
+              <w:t>–</w:t>
+            </w:r>
+            <w:r>
+              <w:rPr>
+                <w:rFonts w:ascii="BRH Malayalam Extra" w:hAnsi="BRH Malayalam Extra" w:cs="BRH Malayalam Extra"/>
+                <w:color w:val="000000"/>
+                <w:sz w:val="32"/>
+                <w:szCs w:val="32"/>
+              </w:rPr>
+              <w:t>Zy</w:t>
+            </w:r>
+            <w:r>
+              <w:rPr>
+                <w:rFonts w:ascii="BRH Malayalam Extra" w:hAnsi="BRH Malayalam Extra" w:cs="BRH Malayalam Extra"/>
+                <w:color w:val="000000"/>
+                <w:sz w:val="26"/>
+                <w:szCs w:val="32"/>
+              </w:rPr>
+              <w:t>–</w:t>
+            </w:r>
+            <w:r>
+              <w:rPr>
+                <w:rFonts w:ascii="BRH Malayalam Extra" w:hAnsi="BRH Malayalam Extra" w:cs="BRH Malayalam Extra"/>
+                <w:color w:val="000000"/>
+                <w:sz w:val="32"/>
+                <w:szCs w:val="32"/>
+              </w:rPr>
+              <w:t xml:space="preserve">J | </w:t>
+            </w:r>
+          </w:p>
+        </w:tc>
+        <w:tc>
+          <w:tcPr>
+            <w:tcW w:w="7371" w:type="dxa"/>
+          </w:tcPr>
+          <w:p>
+            <w:pPr>
+              <w:widowControl w:val="0"/>
+              <w:autoSpaceDE w:val="0"/>
+              <w:autoSpaceDN w:val="0"/>
+              <w:adjustRightInd w:val="0"/>
+              <w:spacing w:before="0" w:line="240" w:lineRule="auto"/>
+              <w:rPr>
+                <w:rFonts w:ascii="BRH Malayalam Extra" w:hAnsi="BRH Malayalam Extra" w:cs="BRH Malayalam Extra"/>
+                <w:color w:val="000000"/>
+                <w:sz w:val="32"/>
+                <w:szCs w:val="32"/>
+              </w:rPr>
+            </w:pPr>
+            <w:r>
+              <w:rPr>
+                <w:rFonts w:cs="ar"/>
+                <w:color w:val="000000"/>
+                <w:szCs w:val="36"/>
+              </w:rPr>
+              <w:t>34</w:t>
+            </w:r>
+            <w:r>
+              <w:rPr>
+                <w:rFonts w:ascii="BRH Malayalam Extra" w:hAnsi="BRH Malayalam Extra" w:cs="BRH Malayalam Extra"/>
+                <w:color w:val="000000"/>
+                <w:sz w:val="32"/>
+                <w:szCs w:val="32"/>
+              </w:rPr>
+              <w:t>)</w:t>
+            </w:r>
+            <w:r>
+              <w:rPr>
+                <w:rFonts w:ascii="BRH Malayalam Extra" w:hAnsi="BRH Malayalam Extra" w:cs="BRH Malayalam Extra"/>
+                <w:color w:val="000000"/>
+                <w:sz w:val="32"/>
+                <w:szCs w:val="32"/>
+              </w:rPr>
+              <w:tab/>
+            </w:r>
+            <w:r>
+              <w:rPr>
+                <w:rFonts w:cs="ar"/>
+                <w:color w:val="000000"/>
+                <w:szCs w:val="36"/>
+              </w:rPr>
+              <w:t>3</w:t>
+            </w:r>
+            <w:r>
+              <w:rPr>
+                <w:rFonts w:ascii="BRH Malayalam Extra" w:hAnsi="BRH Malayalam Extra" w:cs="BRH Malayalam Extra"/>
+                <w:color w:val="000000"/>
+                <w:sz w:val="32"/>
+                <w:szCs w:val="32"/>
+              </w:rPr>
+              <w:t>.</w:t>
+            </w:r>
+            <w:r>
+              <w:rPr>
+                <w:rFonts w:cs="ar"/>
+                <w:color w:val="000000"/>
+                <w:szCs w:val="36"/>
+              </w:rPr>
+              <w:t>4</w:t>
+            </w:r>
+            <w:r>
+              <w:rPr>
+                <w:rFonts w:ascii="BRH Malayalam Extra" w:hAnsi="BRH Malayalam Extra" w:cs="BRH Malayalam Extra"/>
+                <w:color w:val="000000"/>
+                <w:sz w:val="32"/>
+                <w:szCs w:val="32"/>
+              </w:rPr>
+              <w:t>.</w:t>
+            </w:r>
+            <w:r>
+              <w:rPr>
+                <w:rFonts w:cs="ar"/>
+                <w:color w:val="000000"/>
+                <w:szCs w:val="36"/>
+              </w:rPr>
+              <w:t>9</w:t>
+            </w:r>
+            <w:r>
+              <w:rPr>
+                <w:rFonts w:ascii="BRH Malayalam Extra" w:hAnsi="BRH Malayalam Extra" w:cs="BRH Malayalam Extra"/>
+                <w:color w:val="000000"/>
+                <w:sz w:val="32"/>
+                <w:szCs w:val="32"/>
+              </w:rPr>
+              <w:t>.</w:t>
+            </w:r>
+            <w:r>
+              <w:rPr>
+                <w:rFonts w:cs="ar"/>
+                <w:color w:val="000000"/>
+                <w:szCs w:val="36"/>
+              </w:rPr>
+              <w:t>6</w:t>
+            </w:r>
+            <w:r>
+              <w:rPr>
+                <w:rFonts w:ascii="BRH Malayalam Extra" w:hAnsi="BRH Malayalam Extra" w:cs="BRH Malayalam Extra"/>
+                <w:color w:val="000000"/>
+                <w:sz w:val="32"/>
+                <w:szCs w:val="32"/>
+              </w:rPr>
+              <w:t>(</w:t>
+            </w:r>
+            <w:r>
+              <w:rPr>
+                <w:rFonts w:cs="ar"/>
+                <w:color w:val="000000"/>
+                <w:szCs w:val="36"/>
+              </w:rPr>
+              <w:t>31</w:t>
+            </w:r>
+            <w:r>
+              <w:rPr>
+                <w:rFonts w:ascii="BRH Malayalam Extra" w:hAnsi="BRH Malayalam Extra" w:cs="BRH Malayalam Extra"/>
+                <w:color w:val="000000"/>
+                <w:sz w:val="32"/>
+                <w:szCs w:val="32"/>
+              </w:rPr>
+              <w:t>)- Ad¡—iZyJ |</w:t>
+            </w:r>
+          </w:p>
+          <w:p>
+            <w:pPr>
+              <w:widowControl w:val="0"/>
+              <w:autoSpaceDE w:val="0"/>
+              <w:autoSpaceDN w:val="0"/>
+              <w:adjustRightInd w:val="0"/>
+              <w:spacing w:before="0" w:line="240" w:lineRule="auto"/>
+              <w:rPr>
+                <w:rFonts w:cs="ar"/>
+                <w:color w:val="000000"/>
+                <w:szCs w:val="36"/>
+              </w:rPr>
+            </w:pPr>
+            <w:r>
+              <w:rPr>
+                <w:rFonts w:ascii="BRH Malayalam Extra" w:hAnsi="BRH Malayalam Extra" w:cs="BRH Malayalam Extra"/>
+                <w:color w:val="000000"/>
+                <w:sz w:val="32"/>
+                <w:szCs w:val="32"/>
+              </w:rPr>
+              <w:t>Ad¡—iZy</w:t>
+            </w:r>
+            <w:r>
+              <w:rPr>
+                <w:rFonts w:ascii="BRH Malayalam Extra" w:hAnsi="BRH Malayalam Extra" w:cs="BRH Malayalam Extra"/>
+                <w:color w:val="000000"/>
+                <w:sz w:val="26"/>
+                <w:szCs w:val="32"/>
+              </w:rPr>
+              <w:t>–</w:t>
+            </w:r>
+            <w:r>
+              <w:rPr>
+                <w:rFonts w:ascii="BRH Malayalam Extra" w:hAnsi="BRH Malayalam Extra" w:cs="BRH Malayalam Extra"/>
+                <w:color w:val="000000"/>
+                <w:sz w:val="32"/>
+                <w:szCs w:val="32"/>
+              </w:rPr>
+              <w:t>kyZõ</w:t>
+            </w:r>
+            <w:r>
+              <w:rPr>
+                <w:rFonts w:ascii="BRH Malayalam Extra" w:hAnsi="BRH Malayalam Extra" w:cs="BRH Malayalam Extra"/>
+                <w:color w:val="000000"/>
+                <w:sz w:val="32"/>
+                <w:szCs w:val="32"/>
+                <w:highlight w:val="green"/>
+              </w:rPr>
+              <w:t>d¡</w:t>
+            </w:r>
+            <w:r>
+              <w:rPr>
+                <w:rFonts w:ascii="BRH Malayalam Extra" w:hAnsi="BRH Malayalam Extra" w:cs="BRH Malayalam Extra"/>
+                <w:color w:val="000000"/>
+                <w:sz w:val="32"/>
+                <w:szCs w:val="32"/>
+              </w:rPr>
+              <w:t>— - i</w:t>
+            </w:r>
+            <w:r>
+              <w:rPr>
+                <w:rFonts w:ascii="BRH Malayalam Extra" w:hAnsi="BRH Malayalam Extra" w:cs="BRH Malayalam Extra"/>
+                <w:color w:val="000000"/>
+                <w:sz w:val="26"/>
+                <w:szCs w:val="32"/>
+              </w:rPr>
+              <w:t>–</w:t>
+            </w:r>
+            <w:r>
+              <w:rPr>
+                <w:rFonts w:ascii="BRH Malayalam Extra" w:hAnsi="BRH Malayalam Extra" w:cs="BRH Malayalam Extra"/>
+                <w:color w:val="000000"/>
+                <w:sz w:val="32"/>
+                <w:szCs w:val="32"/>
+              </w:rPr>
+              <w:t>Zy</w:t>
+            </w:r>
+            <w:r>
+              <w:rPr>
+                <w:rFonts w:ascii="BRH Malayalam Extra" w:hAnsi="BRH Malayalam Extra" w:cs="BRH Malayalam Extra"/>
+                <w:color w:val="000000"/>
+                <w:sz w:val="26"/>
+                <w:szCs w:val="32"/>
+              </w:rPr>
+              <w:t>–</w:t>
+            </w:r>
+            <w:r>
+              <w:rPr>
+                <w:rFonts w:ascii="BRH Malayalam Extra" w:hAnsi="BRH Malayalam Extra" w:cs="BRH Malayalam Extra"/>
+                <w:color w:val="000000"/>
+                <w:sz w:val="32"/>
+                <w:szCs w:val="32"/>
+              </w:rPr>
+              <w:t xml:space="preserve">J | </w:t>
+            </w:r>
+          </w:p>
+        </w:tc>
+      </w:tr>
+      <w:tr>
+        <w:trPr>
+          <w:trHeight w:val="1183"/>
+        </w:trPr>
+        <w:tc>
+          <w:tcPr>
+            <w:tcW w:w="7166" w:type="dxa"/>
+          </w:tcPr>
+          <w:p>
+            <w:pPr>
+              <w:widowControl w:val="0"/>
+              <w:autoSpaceDE w:val="0"/>
+              <w:autoSpaceDN w:val="0"/>
+              <w:adjustRightInd w:val="0"/>
+              <w:spacing w:before="0" w:line="240" w:lineRule="auto"/>
+              <w:rPr>
+                <w:rFonts w:ascii="BRH Malayalam Extra" w:hAnsi="BRH Malayalam Extra" w:cs="BRH Malayalam Extra"/>
+                <w:color w:val="000000"/>
+                <w:sz w:val="32"/>
+                <w:szCs w:val="32"/>
+              </w:rPr>
+            </w:pPr>
+            <w:r>
+              <w:rPr>
+                <w:rFonts w:cs="ar"/>
+                <w:color w:val="000000"/>
+                <w:szCs w:val="36"/>
+              </w:rPr>
+              <w:t>57</w:t>
+            </w:r>
+            <w:r>
+              <w:rPr>
+                <w:rFonts w:ascii="BRH Malayalam Extra" w:hAnsi="BRH Malayalam Extra" w:cs="BRH Malayalam Extra"/>
+                <w:color w:val="000000"/>
+                <w:sz w:val="32"/>
+                <w:szCs w:val="32"/>
+              </w:rPr>
+              <w:t>)</w:t>
+            </w:r>
+            <w:r>
+              <w:rPr>
+                <w:rFonts w:ascii="BRH Malayalam Extra" w:hAnsi="BRH Malayalam Extra" w:cs="BRH Malayalam Extra"/>
+                <w:color w:val="000000"/>
+                <w:sz w:val="32"/>
+                <w:szCs w:val="32"/>
+              </w:rPr>
+              <w:tab/>
+            </w:r>
+            <w:r>
+              <w:rPr>
+                <w:rFonts w:cs="ar"/>
+                <w:color w:val="000000"/>
+                <w:szCs w:val="36"/>
+              </w:rPr>
+              <w:t>3</w:t>
+            </w:r>
+            <w:r>
+              <w:rPr>
+                <w:rFonts w:ascii="BRH Malayalam Extra" w:hAnsi="BRH Malayalam Extra" w:cs="BRH Malayalam Extra"/>
+                <w:color w:val="000000"/>
+                <w:sz w:val="32"/>
+                <w:szCs w:val="32"/>
+              </w:rPr>
+              <w:t>.</w:t>
+            </w:r>
+            <w:r>
+              <w:rPr>
+                <w:rFonts w:cs="ar"/>
+                <w:color w:val="000000"/>
+                <w:szCs w:val="36"/>
+              </w:rPr>
+              <w:t>4</w:t>
+            </w:r>
+            <w:r>
+              <w:rPr>
+                <w:rFonts w:ascii="BRH Malayalam Extra" w:hAnsi="BRH Malayalam Extra" w:cs="BRH Malayalam Extra"/>
+                <w:color w:val="000000"/>
+                <w:sz w:val="32"/>
+                <w:szCs w:val="32"/>
+              </w:rPr>
+              <w:t>.</w:t>
+            </w:r>
+            <w:r>
+              <w:rPr>
+                <w:rFonts w:cs="ar"/>
+                <w:color w:val="000000"/>
+                <w:szCs w:val="36"/>
+              </w:rPr>
+              <w:t>9</w:t>
+            </w:r>
+            <w:r>
+              <w:rPr>
+                <w:rFonts w:ascii="BRH Malayalam Extra" w:hAnsi="BRH Malayalam Extra" w:cs="BRH Malayalam Extra"/>
+                <w:color w:val="000000"/>
+                <w:sz w:val="32"/>
+                <w:szCs w:val="32"/>
+              </w:rPr>
+              <w:t>.</w:t>
+            </w:r>
+            <w:r>
+              <w:rPr>
+                <w:rFonts w:cs="ar"/>
+                <w:color w:val="000000"/>
+                <w:szCs w:val="36"/>
+              </w:rPr>
+              <w:t>6</w:t>
+            </w:r>
+            <w:r>
+              <w:rPr>
+                <w:rFonts w:ascii="BRH Malayalam Extra" w:hAnsi="BRH Malayalam Extra" w:cs="BRH Malayalam Extra"/>
+                <w:color w:val="000000"/>
+                <w:sz w:val="32"/>
+                <w:szCs w:val="32"/>
+              </w:rPr>
+              <w:t>(</w:t>
+            </w:r>
+            <w:r>
+              <w:rPr>
+                <w:rFonts w:cs="ar"/>
+                <w:color w:val="000000"/>
+                <w:szCs w:val="36"/>
+              </w:rPr>
+              <w:t>47</w:t>
+            </w:r>
+            <w:r>
+              <w:rPr>
+                <w:rFonts w:ascii="BRH Malayalam Extra" w:hAnsi="BRH Malayalam Extra" w:cs="BRH Malayalam Extra"/>
+                <w:color w:val="000000"/>
+                <w:sz w:val="32"/>
+                <w:szCs w:val="32"/>
+              </w:rPr>
+              <w:t>)- Ad¡—iZyJ |</w:t>
+            </w:r>
+          </w:p>
+          <w:p>
+            <w:pPr>
+              <w:widowControl w:val="0"/>
+              <w:autoSpaceDE w:val="0"/>
+              <w:autoSpaceDN w:val="0"/>
+              <w:adjustRightInd w:val="0"/>
+              <w:spacing w:before="0" w:line="240" w:lineRule="auto"/>
+              <w:rPr>
+                <w:rFonts w:cs="ar"/>
+                <w:color w:val="000000"/>
+                <w:szCs w:val="36"/>
+              </w:rPr>
+            </w:pPr>
+            <w:r>
+              <w:rPr>
+                <w:rFonts w:ascii="BRH Malayalam Extra" w:hAnsi="BRH Malayalam Extra" w:cs="BRH Malayalam Extra"/>
+                <w:color w:val="000000"/>
+                <w:sz w:val="32"/>
+                <w:szCs w:val="32"/>
+              </w:rPr>
+              <w:t>Ad¡—iZy</w:t>
+            </w:r>
+            <w:r>
+              <w:rPr>
+                <w:rFonts w:ascii="BRH Malayalam Extra" w:hAnsi="BRH Malayalam Extra" w:cs="BRH Malayalam Extra"/>
+                <w:color w:val="000000"/>
+                <w:sz w:val="26"/>
+                <w:szCs w:val="32"/>
+              </w:rPr>
+              <w:t>–</w:t>
+            </w:r>
+            <w:r>
+              <w:rPr>
+                <w:rFonts w:ascii="BRH Malayalam Extra" w:hAnsi="BRH Malayalam Extra" w:cs="BRH Malayalam Extra"/>
+                <w:color w:val="000000"/>
+                <w:sz w:val="32"/>
+                <w:szCs w:val="32"/>
+              </w:rPr>
+              <w:t>ky</w:t>
+            </w:r>
+            <w:r>
+              <w:rPr>
+                <w:rFonts w:ascii="BRH Malayalam Extra" w:hAnsi="BRH Malayalam Extra" w:cs="BRH Malayalam Extra"/>
+                <w:color w:val="000000"/>
+                <w:sz w:val="32"/>
+                <w:szCs w:val="32"/>
+                <w:highlight w:val="yellow"/>
+              </w:rPr>
+              <w:t>Zõ</w:t>
+            </w:r>
+            <w:r>
+              <w:rPr>
+                <w:rFonts w:ascii="BRH Malayalam Extra" w:hAnsi="BRH Malayalam Extra" w:cs="BRH Malayalam Extra"/>
+                <w:color w:val="000000"/>
+                <w:sz w:val="32"/>
+                <w:szCs w:val="32"/>
+              </w:rPr>
+              <w:t>—d¡ - i</w:t>
+            </w:r>
+            <w:r>
+              <w:rPr>
+                <w:rFonts w:ascii="BRH Malayalam Extra" w:hAnsi="BRH Malayalam Extra" w:cs="BRH Malayalam Extra"/>
+                <w:color w:val="000000"/>
+                <w:sz w:val="26"/>
+                <w:szCs w:val="32"/>
+              </w:rPr>
+              <w:t>–</w:t>
+            </w:r>
+            <w:r>
+              <w:rPr>
+                <w:rFonts w:ascii="BRH Malayalam Extra" w:hAnsi="BRH Malayalam Extra" w:cs="BRH Malayalam Extra"/>
+                <w:color w:val="000000"/>
+                <w:sz w:val="32"/>
+                <w:szCs w:val="32"/>
+              </w:rPr>
+              <w:t>Zy</w:t>
+            </w:r>
+            <w:r>
+              <w:rPr>
+                <w:rFonts w:ascii="BRH Malayalam Extra" w:hAnsi="BRH Malayalam Extra" w:cs="BRH Malayalam Extra"/>
+                <w:color w:val="000000"/>
+                <w:sz w:val="26"/>
+                <w:szCs w:val="32"/>
+              </w:rPr>
+              <w:t>–</w:t>
+            </w:r>
+            <w:r>
+              <w:rPr>
+                <w:rFonts w:ascii="BRH Malayalam Extra" w:hAnsi="BRH Malayalam Extra" w:cs="BRH Malayalam Extra"/>
+                <w:color w:val="000000"/>
+                <w:sz w:val="32"/>
+                <w:szCs w:val="32"/>
+              </w:rPr>
+              <w:t xml:space="preserve">J | </w:t>
+            </w:r>
+          </w:p>
+        </w:tc>
+        <w:tc>
+          <w:tcPr>
+            <w:tcW w:w="7371" w:type="dxa"/>
+          </w:tcPr>
+          <w:p>
+            <w:pPr>
+              <w:widowControl w:val="0"/>
+              <w:autoSpaceDE w:val="0"/>
+              <w:autoSpaceDN w:val="0"/>
+              <w:adjustRightInd w:val="0"/>
+              <w:spacing w:before="0" w:line="240" w:lineRule="auto"/>
+              <w:rPr>
+                <w:rFonts w:ascii="BRH Malayalam Extra" w:hAnsi="BRH Malayalam Extra" w:cs="BRH Malayalam Extra"/>
+                <w:color w:val="000000"/>
+                <w:sz w:val="32"/>
+                <w:szCs w:val="32"/>
+              </w:rPr>
+            </w:pPr>
+            <w:r>
+              <w:rPr>
+                <w:rFonts w:cs="ar"/>
+                <w:color w:val="000000"/>
+                <w:szCs w:val="36"/>
+              </w:rPr>
+              <w:t>57</w:t>
+            </w:r>
+            <w:r>
+              <w:rPr>
+                <w:rFonts w:ascii="BRH Malayalam Extra" w:hAnsi="BRH Malayalam Extra" w:cs="BRH Malayalam Extra"/>
+                <w:color w:val="000000"/>
+                <w:sz w:val="32"/>
+                <w:szCs w:val="32"/>
+              </w:rPr>
+              <w:t>)</w:t>
+            </w:r>
+            <w:r>
+              <w:rPr>
+                <w:rFonts w:ascii="BRH Malayalam Extra" w:hAnsi="BRH Malayalam Extra" w:cs="BRH Malayalam Extra"/>
+                <w:color w:val="000000"/>
+                <w:sz w:val="32"/>
+                <w:szCs w:val="32"/>
+              </w:rPr>
+              <w:tab/>
+            </w:r>
+            <w:r>
+              <w:rPr>
+                <w:rFonts w:cs="ar"/>
+                <w:color w:val="000000"/>
+                <w:szCs w:val="36"/>
+              </w:rPr>
+              <w:t>3</w:t>
+            </w:r>
+            <w:r>
+              <w:rPr>
+                <w:rFonts w:ascii="BRH Malayalam Extra" w:hAnsi="BRH Malayalam Extra" w:cs="BRH Malayalam Extra"/>
+                <w:color w:val="000000"/>
+                <w:sz w:val="32"/>
+                <w:szCs w:val="32"/>
+              </w:rPr>
+              <w:t>.</w:t>
+            </w:r>
+            <w:r>
+              <w:rPr>
+                <w:rFonts w:cs="ar"/>
+                <w:color w:val="000000"/>
+                <w:szCs w:val="36"/>
+              </w:rPr>
+              <w:t>4</w:t>
+            </w:r>
+            <w:r>
+              <w:rPr>
+                <w:rFonts w:ascii="BRH Malayalam Extra" w:hAnsi="BRH Malayalam Extra" w:cs="BRH Malayalam Extra"/>
+                <w:color w:val="000000"/>
+                <w:sz w:val="32"/>
+                <w:szCs w:val="32"/>
+              </w:rPr>
+              <w:t>.</w:t>
+            </w:r>
+            <w:r>
+              <w:rPr>
+                <w:rFonts w:cs="ar"/>
+                <w:color w:val="000000"/>
+                <w:szCs w:val="36"/>
+              </w:rPr>
+              <w:t>9</w:t>
+            </w:r>
+            <w:r>
+              <w:rPr>
+                <w:rFonts w:ascii="BRH Malayalam Extra" w:hAnsi="BRH Malayalam Extra" w:cs="BRH Malayalam Extra"/>
+                <w:color w:val="000000"/>
+                <w:sz w:val="32"/>
+                <w:szCs w:val="32"/>
+              </w:rPr>
+              <w:t>.</w:t>
+            </w:r>
+            <w:r>
+              <w:rPr>
+                <w:rFonts w:cs="ar"/>
+                <w:color w:val="000000"/>
+                <w:szCs w:val="36"/>
+              </w:rPr>
+              <w:t>6</w:t>
+            </w:r>
+            <w:r>
+              <w:rPr>
+                <w:rFonts w:ascii="BRH Malayalam Extra" w:hAnsi="BRH Malayalam Extra" w:cs="BRH Malayalam Extra"/>
+                <w:color w:val="000000"/>
+                <w:sz w:val="32"/>
+                <w:szCs w:val="32"/>
+              </w:rPr>
+              <w:t>(</w:t>
+            </w:r>
+            <w:r>
+              <w:rPr>
+                <w:rFonts w:cs="ar"/>
+                <w:color w:val="000000"/>
+                <w:szCs w:val="36"/>
+              </w:rPr>
+              <w:t>47</w:t>
+            </w:r>
+            <w:r>
+              <w:rPr>
+                <w:rFonts w:ascii="BRH Malayalam Extra" w:hAnsi="BRH Malayalam Extra" w:cs="BRH Malayalam Extra"/>
+                <w:color w:val="000000"/>
+                <w:sz w:val="32"/>
+                <w:szCs w:val="32"/>
+              </w:rPr>
+              <w:t>)- Ad¡—iZyJ |</w:t>
+            </w:r>
+          </w:p>
+          <w:p>
+            <w:pPr>
+              <w:widowControl w:val="0"/>
+              <w:autoSpaceDE w:val="0"/>
+              <w:autoSpaceDN w:val="0"/>
+              <w:adjustRightInd w:val="0"/>
+              <w:spacing w:before="0" w:line="240" w:lineRule="auto"/>
+              <w:rPr>
+                <w:rFonts w:cs="ar"/>
+                <w:color w:val="000000"/>
+                <w:szCs w:val="36"/>
+              </w:rPr>
+            </w:pPr>
+            <w:r>
+              <w:rPr>
+                <w:rFonts w:ascii="BRH Malayalam Extra" w:hAnsi="BRH Malayalam Extra" w:cs="BRH Malayalam Extra"/>
+                <w:color w:val="000000"/>
+                <w:sz w:val="32"/>
+                <w:szCs w:val="32"/>
+              </w:rPr>
+              <w:t>Ad¡—iZy</w:t>
+            </w:r>
+            <w:r>
+              <w:rPr>
+                <w:rFonts w:ascii="BRH Malayalam Extra" w:hAnsi="BRH Malayalam Extra" w:cs="BRH Malayalam Extra"/>
+                <w:color w:val="000000"/>
+                <w:sz w:val="26"/>
+                <w:szCs w:val="32"/>
+              </w:rPr>
+              <w:t>–</w:t>
+            </w:r>
+            <w:r>
+              <w:rPr>
+                <w:rFonts w:ascii="BRH Malayalam Extra" w:hAnsi="BRH Malayalam Extra" w:cs="BRH Malayalam Extra"/>
+                <w:color w:val="000000"/>
+                <w:sz w:val="32"/>
+                <w:szCs w:val="32"/>
+              </w:rPr>
+              <w:t>kyZõ</w:t>
+            </w:r>
+            <w:r>
+              <w:rPr>
+                <w:rFonts w:ascii="BRH Malayalam Extra" w:hAnsi="BRH Malayalam Extra" w:cs="BRH Malayalam Extra"/>
+                <w:color w:val="000000"/>
+                <w:sz w:val="32"/>
+                <w:szCs w:val="32"/>
+                <w:highlight w:val="green"/>
+              </w:rPr>
+              <w:t>d¡</w:t>
+            </w:r>
+            <w:r>
+              <w:rPr>
+                <w:rFonts w:ascii="BRH Malayalam Extra" w:hAnsi="BRH Malayalam Extra" w:cs="BRH Malayalam Extra"/>
+                <w:color w:val="000000"/>
+                <w:sz w:val="32"/>
+                <w:szCs w:val="32"/>
+              </w:rPr>
+              <w:t>— - i</w:t>
+            </w:r>
+            <w:r>
+              <w:rPr>
+                <w:rFonts w:ascii="BRH Malayalam Extra" w:hAnsi="BRH Malayalam Extra" w:cs="BRH Malayalam Extra"/>
+                <w:color w:val="000000"/>
+                <w:sz w:val="26"/>
+                <w:szCs w:val="32"/>
+              </w:rPr>
+              <w:t>–</w:t>
+            </w:r>
+            <w:r>
+              <w:rPr>
+                <w:rFonts w:ascii="BRH Malayalam Extra" w:hAnsi="BRH Malayalam Extra" w:cs="BRH Malayalam Extra"/>
+                <w:color w:val="000000"/>
+                <w:sz w:val="32"/>
+                <w:szCs w:val="32"/>
+              </w:rPr>
+              <w:t>Zy</w:t>
+            </w:r>
+            <w:r>
+              <w:rPr>
+                <w:rFonts w:ascii="BRH Malayalam Extra" w:hAnsi="BRH Malayalam Extra" w:cs="BRH Malayalam Extra"/>
+                <w:color w:val="000000"/>
+                <w:sz w:val="26"/>
+                <w:szCs w:val="32"/>
+              </w:rPr>
+              <w:t>–</w:t>
+            </w:r>
+            <w:r>
+              <w:rPr>
+                <w:rFonts w:ascii="BRH Malayalam Extra" w:hAnsi="BRH Malayalam Extra" w:cs="BRH Malayalam Extra"/>
+                <w:color w:val="000000"/>
+                <w:sz w:val="32"/>
+                <w:szCs w:val="32"/>
+              </w:rPr>
+              <w:t xml:space="preserve">J | </w:t>
+            </w:r>
+          </w:p>
+        </w:tc>
+      </w:tr>
+      <w:tr>
+        <w:trPr>
+          <w:trHeight w:val="1183"/>
+        </w:trPr>
+        <w:tc>
+          <w:tcPr>
+            <w:tcW w:w="7166" w:type="dxa"/>
+          </w:tcPr>
+          <w:p>
+            <w:pPr>
+              <w:widowControl w:val="0"/>
+              <w:autoSpaceDE w:val="0"/>
+              <w:autoSpaceDN w:val="0"/>
+              <w:adjustRightInd w:val="0"/>
+              <w:spacing w:before="0" w:line="240" w:lineRule="auto"/>
+              <w:rPr>
+                <w:rFonts w:cs="ar"/>
+                <w:color w:val="000000"/>
+                <w:szCs w:val="36"/>
+              </w:rPr>
+            </w:pPr>
+          </w:p>
+        </w:tc>
+        <w:tc>
+          <w:tcPr>
+            <w:tcW w:w="7371" w:type="dxa"/>
+          </w:tcPr>
+          <w:p>
+            <w:pPr>
+              <w:widowControl w:val="0"/>
+              <w:autoSpaceDE w:val="0"/>
+              <w:autoSpaceDN w:val="0"/>
+              <w:adjustRightInd w:val="0"/>
+              <w:spacing w:before="0" w:line="240" w:lineRule="auto"/>
+              <w:rPr>
+                <w:rFonts w:cs="ar"/>
+                <w:color w:val="000000"/>
+                <w:szCs w:val="36"/>
+              </w:rPr>
+            </w:pPr>
+          </w:p>
+        </w:tc>
+      </w:tr>
+    </w:tbl>
+    <w:p>
+      <w:pPr>
+        <w:spacing w:before="0" w:line="240" w:lineRule="auto"/>
+        <w:jc w:val="center"/>
+        <w:rPr>
+          <w:b/>
+          <w:bCs/>
+          <w:sz w:val="32"/>
+          <w:szCs w:val="32"/>
+          <w:u w:val="single"/>
+        </w:rPr>
+      </w:pPr>
+    </w:p>
+    <w:p>
+      <w:pPr>
+        <w:spacing w:before="0" w:line="240" w:lineRule="auto"/>
+        <w:jc w:val="center"/>
+        <w:rPr>
+          <w:b/>
+          <w:bCs/>
+          <w:sz w:val="32"/>
+          <w:szCs w:val="32"/>
+          <w:u w:val="single"/>
+        </w:rPr>
+      </w:pPr>
+    </w:p>
+    <w:p>
+      <w:pPr>
+        <w:spacing w:before="0" w:line="240" w:lineRule="auto"/>
+        <w:jc w:val="center"/>
+        <w:rPr>
+          <w:b/>
+          <w:bCs/>
+          <w:sz w:val="32"/>
+          <w:szCs w:val="32"/>
+          <w:u w:val="single"/>
+        </w:rPr>
+      </w:pPr>
+    </w:p>
     <w:p>
       <w:pPr>
         <w:spacing w:before="0" w:line="240" w:lineRule="auto"/>
@@ -254,6 +2391,7 @@
                 <w:sz w:val="32"/>
                 <w:szCs w:val="32"/>
               </w:rPr>
+              <w:lastRenderedPageBreak/>
               <w:t>As Printed</w:t>
             </w:r>
           </w:p>
@@ -29037,45 +31175,54 @@
                 <w:sz w:val="32"/>
                 <w:szCs w:val="32"/>
               </w:rPr>
+              <w:t>A(³§)¥tx— Aq§¥Tx Zõq§¥Tx</w:t>
+            </w:r>
+            <w:r>
+              <w:rPr>
+                <w:rFonts w:ascii="BRH Malayalam Extra" w:hAnsi="BRH Malayalam Extra" w:cs="BRH Malayalam Extra"/>
+                <w:color w:val="000000"/>
+                <w:sz w:val="26"/>
+                <w:szCs w:val="32"/>
+              </w:rPr>
+              <w:t>–</w:t>
+            </w:r>
+            <w:r>
+              <w:rPr>
+                <w:rFonts w:ascii="BRH Malayalam Extra" w:hAnsi="BRH Malayalam Extra" w:cs="BRH Malayalam Extra"/>
+                <w:color w:val="000000"/>
+                <w:sz w:val="32"/>
+                <w:szCs w:val="32"/>
+              </w:rPr>
+              <w:t xml:space="preserve"> Zõ(³§)</w:t>
+            </w:r>
+            <w:r>
+              <w:rPr>
+                <w:rFonts w:ascii="BRH Malayalam Extra" w:hAnsi="BRH Malayalam Extra" w:cs="BRH Malayalam Extra"/>
+                <w:color w:val="000000"/>
+                <w:sz w:val="32"/>
+                <w:szCs w:val="32"/>
+                <w:highlight w:val="yellow"/>
+              </w:rPr>
+              <w:t>¥tx—</w:t>
+            </w:r>
+            <w:r>
+              <w:rPr>
+                <w:rFonts w:ascii="BRH Malayalam Extra" w:hAnsi="BRH Malayalam Extra" w:cs="BRH Malayalam Extra"/>
+                <w:color w:val="000000"/>
+                <w:sz w:val="32"/>
+                <w:szCs w:val="32"/>
+              </w:rPr>
+              <w:t xml:space="preserve"> </w:t>
+            </w:r>
+            <w:r>
+              <w:rPr>
+                <w:rFonts w:ascii="BRH Malayalam Extra" w:hAnsi="BRH Malayalam Extra" w:cs="BRH Malayalam Extra"/>
+                <w:color w:val="000000"/>
+                <w:sz w:val="32"/>
+                <w:szCs w:val="32"/>
+              </w:rPr>
               <w:lastRenderedPageBreak/>
-              <w:t>A(³§)¥tx— Aq§¥Tx Zõq§¥Tx</w:t>
-            </w:r>
-            <w:r>
-              <w:rPr>
-                <w:rFonts w:ascii="BRH Malayalam Extra" w:hAnsi="BRH Malayalam Extra" w:cs="BRH Malayalam Extra"/>
-                <w:color w:val="000000"/>
-                <w:sz w:val="26"/>
-                <w:szCs w:val="32"/>
-              </w:rPr>
-              <w:t>–</w:t>
-            </w:r>
-            <w:r>
-              <w:rPr>
-                <w:rFonts w:ascii="BRH Malayalam Extra" w:hAnsi="BRH Malayalam Extra" w:cs="BRH Malayalam Extra"/>
-                <w:color w:val="000000"/>
-                <w:sz w:val="32"/>
-                <w:szCs w:val="32"/>
-              </w:rPr>
-              <w:t xml:space="preserve"> Zõ(³§)</w:t>
-            </w:r>
-            <w:r>
-              <w:rPr>
-                <w:rFonts w:ascii="BRH Malayalam Extra" w:hAnsi="BRH Malayalam Extra" w:cs="BRH Malayalam Extra"/>
-                <w:color w:val="000000"/>
-                <w:sz w:val="32"/>
-                <w:szCs w:val="32"/>
-                <w:highlight w:val="yellow"/>
-              </w:rPr>
-              <w:t>¥tx—</w:t>
-            </w:r>
-            <w:r>
-              <w:rPr>
-                <w:rFonts w:ascii="BRH Malayalam Extra" w:hAnsi="BRH Malayalam Extra" w:cs="BRH Malayalam Extra"/>
-                <w:color w:val="000000"/>
-                <w:sz w:val="32"/>
-                <w:szCs w:val="32"/>
-              </w:rPr>
-              <w:t xml:space="preserve"> „(³§)¥tx— Aq§¥Tx</w:t>
+              <w:t>„(³§)¥tx— Aq§¥Tx</w:t>
             </w:r>
             <w:r>
               <w:rPr>
@@ -30070,45 +32217,54 @@
                 <w:sz w:val="32"/>
                 <w:szCs w:val="32"/>
               </w:rPr>
+              <w:t>A(³§)¥tx— Aq§¥Tx Zõq§¥Tx</w:t>
+            </w:r>
+            <w:r>
+              <w:rPr>
+                <w:rFonts w:ascii="BRH Malayalam Extra" w:hAnsi="BRH Malayalam Extra" w:cs="BRH Malayalam Extra"/>
+                <w:color w:val="000000"/>
+                <w:sz w:val="26"/>
+                <w:szCs w:val="32"/>
+              </w:rPr>
+              <w:t>–</w:t>
+            </w:r>
+            <w:r>
+              <w:rPr>
+                <w:rFonts w:ascii="BRH Malayalam Extra" w:hAnsi="BRH Malayalam Extra" w:cs="BRH Malayalam Extra"/>
+                <w:color w:val="000000"/>
+                <w:sz w:val="32"/>
+                <w:szCs w:val="32"/>
+              </w:rPr>
+              <w:t xml:space="preserve"> Zõ(³§)</w:t>
+            </w:r>
+            <w:r>
+              <w:rPr>
+                <w:rFonts w:ascii="BRH Malayalam Extra" w:hAnsi="BRH Malayalam Extra" w:cs="BRH Malayalam Extra"/>
+                <w:color w:val="000000"/>
+                <w:sz w:val="32"/>
+                <w:szCs w:val="32"/>
+                <w:highlight w:val="green"/>
+              </w:rPr>
+              <w:t>¥tx</w:t>
+            </w:r>
+            <w:r>
+              <w:rPr>
+                <w:rFonts w:ascii="BRH Malayalam Extra" w:hAnsi="BRH Malayalam Extra" w:cs="BRH Malayalam Extra"/>
+                <w:color w:val="000000"/>
+                <w:sz w:val="32"/>
+                <w:szCs w:val="32"/>
+              </w:rPr>
+              <w:t xml:space="preserve"> </w:t>
+            </w:r>
+            <w:r>
+              <w:rPr>
+                <w:rFonts w:ascii="BRH Malayalam Extra" w:hAnsi="BRH Malayalam Extra" w:cs="BRH Malayalam Extra"/>
+                <w:color w:val="000000"/>
+                <w:sz w:val="32"/>
+                <w:szCs w:val="32"/>
+              </w:rPr>
               <w:lastRenderedPageBreak/>
-              <w:t>A(³§)¥tx— Aq§¥Tx Zõq§¥Tx</w:t>
-            </w:r>
-            <w:r>
-              <w:rPr>
-                <w:rFonts w:ascii="BRH Malayalam Extra" w:hAnsi="BRH Malayalam Extra" w:cs="BRH Malayalam Extra"/>
-                <w:color w:val="000000"/>
-                <w:sz w:val="26"/>
-                <w:szCs w:val="32"/>
-              </w:rPr>
-              <w:t>–</w:t>
-            </w:r>
-            <w:r>
-              <w:rPr>
-                <w:rFonts w:ascii="BRH Malayalam Extra" w:hAnsi="BRH Malayalam Extra" w:cs="BRH Malayalam Extra"/>
-                <w:color w:val="000000"/>
-                <w:sz w:val="32"/>
-                <w:szCs w:val="32"/>
-              </w:rPr>
-              <w:t xml:space="preserve"> Zõ(³§)</w:t>
-            </w:r>
-            <w:r>
-              <w:rPr>
-                <w:rFonts w:ascii="BRH Malayalam Extra" w:hAnsi="BRH Malayalam Extra" w:cs="BRH Malayalam Extra"/>
-                <w:color w:val="000000"/>
-                <w:sz w:val="32"/>
-                <w:szCs w:val="32"/>
-                <w:highlight w:val="green"/>
-              </w:rPr>
-              <w:t>¥tx</w:t>
-            </w:r>
-            <w:r>
-              <w:rPr>
-                <w:rFonts w:ascii="BRH Malayalam Extra" w:hAnsi="BRH Malayalam Extra" w:cs="BRH Malayalam Extra"/>
-                <w:color w:val="000000"/>
-                <w:sz w:val="32"/>
-                <w:szCs w:val="32"/>
-              </w:rPr>
-              <w:t xml:space="preserve"> „(³§)¥tx— Aq§¥Tx</w:t>
+              <w:t>„(³§)¥tx— Aq§¥Tx</w:t>
             </w:r>
             <w:r>
               <w:rPr>
@@ -30784,7 +32940,7 @@
 </file>
 
 <file path=word/endnotes.xml><?xml version="1.0" encoding="utf-8"?>
-<w:endnotes xmlns:wpc="http://schemas.microsoft.com/office/word/2010/wordprocessingCanvas" xmlns:cx="http://schemas.microsoft.com/office/drawing/2014/chartex" xmlns:cx1="http://schemas.microsoft.com/office/drawing/2015/9/8/chartex" xmlns:cx2="http://schemas.microsoft.com/office/drawing/2015/10/21/chartex" xmlns:cx3="http://schemas.microsoft.com/office/drawing/2016/5/9/chartex" xmlns:cx4="http://schemas.microsoft.com/office/drawing/2016/5/10/chartex" xmlns:cx5="http://schemas.microsoft.com/office/drawing/2016/5/11/chartex" xmlns:cx6="http://schemas.microsoft.com/office/drawing/2016/5/12/chartex" xmlns:cx7="http://schemas.microsoft.com/office/drawing/2016/5/13/chartex" xmlns:cx8="http://schemas.microsoft.com/office/drawing/2016/5/14/chartex" xmlns:mc="http://schemas.openxmlformats.org/markup-compatibility/2006" xmlns:aink="http://schemas.microsoft.com/office/drawing/2016/ink" xmlns:am3d="http://schemas.microsoft.com/office/drawing/2017/model3d" xmlns:o="urn:schemas-microsoft-com:office:office" xmlns:oel="http://schemas.microsoft.com/office/2019/extlst" xmlns:r="http://schemas.openxmlformats.org/officeDocument/2006/relationships" xmlns:m="http://schemas.openxmlformats.org/officeDocument/2006/math" xmlns:v="urn:schemas-microsoft-com:vml" xmlns:wp14="http://schemas.microsoft.com/office/word/2010/wordprocessingDrawing" xmlns:wp="http://schemas.openxmlformats.org/drawingml/2006/wordprocessingDrawing" xmlns:w10="urn:schemas-microsoft-com:office:word" xmlns:w="http://schemas.openxmlformats.org/wordprocessingml/2006/main" xmlns:w14="http://schemas.microsoft.com/office/word/2010/wordml" xmlns:w15="http://schemas.microsoft.com/office/word/2012/wordml" xmlns:w16cex="http://schemas.microsoft.com/office/word/2018/wordml/cex" xmlns:w16cid="http://schemas.microsoft.com/office/word/2016/wordml/cid" xmlns:w16="http://schemas.microsoft.com/office/word/2018/wordml" xmlns:w16sdtdh="http://schemas.microsoft.com/office/word/2020/wordml/sdtdatahash" xmlns:w16se="http://schemas.microsoft.com/office/word/2015/wordml/symex" xmlns:wpg="http://schemas.microsoft.com/office/word/2010/wordprocessingGroup" xmlns:wpi="http://schemas.microsoft.com/office/word/2010/wordprocessingInk" xmlns:wne="http://schemas.microsoft.com/office/word/2006/wordml" xmlns:wps="http://schemas.microsoft.com/office/word/2010/wordprocessingShape" mc:Ignorable="w14 w15 w16se w16cid w16 w16cex w16sdtdh wp14">
+<w:endnotes xmlns:wpc="http://schemas.microsoft.com/office/word/2010/wordprocessingCanvas" xmlns:cx="http://schemas.microsoft.com/office/drawing/2014/chartex" xmlns:cx1="http://schemas.microsoft.com/office/drawing/2015/9/8/chartex" xmlns:cx2="http://schemas.microsoft.com/office/drawing/2015/10/21/chartex" xmlns:cx3="http://schemas.microsoft.com/office/drawing/2016/5/9/chartex" xmlns:cx4="http://schemas.microsoft.com/office/drawing/2016/5/10/chartex" xmlns:cx5="http://schemas.microsoft.com/office/drawing/2016/5/11/chartex" xmlns:cx6="http://schemas.microsoft.com/office/drawing/2016/5/12/chartex" xmlns:cx7="http://schemas.microsoft.com/office/drawing/2016/5/13/chartex" xmlns:cx8="http://schemas.microsoft.com/office/drawing/2016/5/14/chartex" xmlns:mc="http://schemas.openxmlformats.org/markup-compatibility/2006" xmlns:aink="http://schemas.microsoft.com/office/drawing/2016/ink" xmlns:am3d="http://schemas.microsoft.com/office/drawing/2017/model3d" xmlns:o="urn:schemas-microsoft-com:office:office" xmlns:oel="http://schemas.microsoft.com/office/2019/extlst" xmlns:r="http://schemas.openxmlformats.org/officeDocument/2006/relationships" xmlns:m="http://schemas.openxmlformats.org/officeDocument/2006/math" xmlns:v="urn:schemas-microsoft-com:vml" xmlns:wp14="http://schemas.microsoft.com/office/word/2010/wordprocessingDrawing" xmlns:wp="http://schemas.openxmlformats.org/drawingml/2006/wordprocessingDrawing" xmlns:w10="urn:schemas-microsoft-com:office:word" xmlns:w="http://schemas.openxmlformats.org/wordprocessingml/2006/main" xmlns:w14="http://schemas.microsoft.com/office/word/2010/wordml" xmlns:w15="http://schemas.microsoft.com/office/word/2012/wordml" xmlns:w16cei="http://schemas.microsoft.com/office/word/2026/wordml/cei" xmlns:w16cex="http://schemas.microsoft.com/office/word/2018/wordml/cex" xmlns:w16cid="http://schemas.microsoft.com/office/word/2016/wordml/cid" xmlns:w16="http://schemas.microsoft.com/office/word/2018/wordml" xmlns:w16du="http://schemas.microsoft.com/office/word/2023/wordml/word16du" xmlns:w16sdtdh="http://schemas.microsoft.com/office/word/2020/wordml/sdtdatahash" xmlns:w16sdtfl="http://schemas.microsoft.com/office/word/2024/wordml/sdtformatlock" xmlns:w16se="http://schemas.microsoft.com/office/word/2015/wordml/symex" xmlns:wpg="http://schemas.microsoft.com/office/word/2010/wordprocessingGroup" xmlns:wpi="http://schemas.microsoft.com/office/word/2010/wordprocessingInk" xmlns:wne="http://schemas.microsoft.com/office/word/2006/wordml" xmlns:wps="http://schemas.microsoft.com/office/word/2010/wordprocessingShape" mc:Ignorable="w14 w15 w16se w16cid w16 w16cex w16sdtdh w16sdtfl w16du wp14">
   <w:endnote w:type="separator" w:id="-1">
     <w:p>
       <w:pPr>
@@ -30809,7 +32965,7 @@
 </file>
 
 <file path=word/footer1.xml><?xml version="1.0" encoding="utf-8"?>
-<w:ftr xmlns:wpc="http://schemas.microsoft.com/office/word/2010/wordprocessingCanvas" xmlns:cx="http://schemas.microsoft.com/office/drawing/2014/chartex" xmlns:cx1="http://schemas.microsoft.com/office/drawing/2015/9/8/chartex" xmlns:cx2="http://schemas.microsoft.com/office/drawing/2015/10/21/chartex" xmlns:cx3="http://schemas.microsoft.com/office/drawing/2016/5/9/chartex" xmlns:cx4="http://schemas.microsoft.com/office/drawing/2016/5/10/chartex" xmlns:cx5="http://schemas.microsoft.com/office/drawing/2016/5/11/chartex" xmlns:cx6="http://schemas.microsoft.com/office/drawing/2016/5/12/chartex" xmlns:cx7="http://schemas.microsoft.com/office/drawing/2016/5/13/chartex" xmlns:cx8="http://schemas.microsoft.com/office/drawing/2016/5/14/chartex" xmlns:mc="http://schemas.openxmlformats.org/markup-compatibility/2006" xmlns:aink="http://schemas.microsoft.com/office/drawing/2016/ink" xmlns:am3d="http://schemas.microsoft.com/office/drawing/2017/model3d" xmlns:o="urn:schemas-microsoft-com:office:office" xmlns:oel="http://schemas.microsoft.com/office/2019/extlst" xmlns:r="http://schemas.openxmlformats.org/officeDocument/2006/relationships" xmlns:m="http://schemas.openxmlformats.org/officeDocument/2006/math" xmlns:v="urn:schemas-microsoft-com:vml" xmlns:wp14="http://schemas.microsoft.com/office/word/2010/wordprocessingDrawing" xmlns:wp="http://schemas.openxmlformats.org/drawingml/2006/wordprocessingDrawing" xmlns:w10="urn:schemas-microsoft-com:office:word" xmlns:w="http://schemas.openxmlformats.org/wordprocessingml/2006/main" xmlns:w14="http://schemas.microsoft.com/office/word/2010/wordml" xmlns:w15="http://schemas.microsoft.com/office/word/2012/wordml" xmlns:w16cex="http://schemas.microsoft.com/office/word/2018/wordml/cex" xmlns:w16cid="http://schemas.microsoft.com/office/word/2016/wordml/cid" xmlns:w16="http://schemas.microsoft.com/office/word/2018/wordml" xmlns:w16sdtdh="http://schemas.microsoft.com/office/word/2020/wordml/sdtdatahash" xmlns:w16se="http://schemas.microsoft.com/office/word/2015/wordml/symex" xmlns:wpg="http://schemas.microsoft.com/office/word/2010/wordprocessingGroup" xmlns:wpi="http://schemas.microsoft.com/office/word/2010/wordprocessingInk" xmlns:wne="http://schemas.microsoft.com/office/word/2006/wordml" xmlns:wps="http://schemas.microsoft.com/office/word/2010/wordprocessingShape" mc:Ignorable="w14 w15 w16se w16cid w16 w16cex w16sdtdh wp14">
+<w:ftr xmlns:wpc="http://schemas.microsoft.com/office/word/2010/wordprocessingCanvas" xmlns:cx="http://schemas.microsoft.com/office/drawing/2014/chartex" xmlns:cx1="http://schemas.microsoft.com/office/drawing/2015/9/8/chartex" xmlns:cx2="http://schemas.microsoft.com/office/drawing/2015/10/21/chartex" xmlns:cx3="http://schemas.microsoft.com/office/drawing/2016/5/9/chartex" xmlns:cx4="http://schemas.microsoft.com/office/drawing/2016/5/10/chartex" xmlns:cx5="http://schemas.microsoft.com/office/drawing/2016/5/11/chartex" xmlns:cx6="http://schemas.microsoft.com/office/drawing/2016/5/12/chartex" xmlns:cx7="http://schemas.microsoft.com/office/drawing/2016/5/13/chartex" xmlns:cx8="http://schemas.microsoft.com/office/drawing/2016/5/14/chartex" xmlns:mc="http://schemas.openxmlformats.org/markup-compatibility/2006" xmlns:aink="http://schemas.microsoft.com/office/drawing/2016/ink" xmlns:am3d="http://schemas.microsoft.com/office/drawing/2017/model3d" xmlns:o="urn:schemas-microsoft-com:office:office" xmlns:oel="http://schemas.microsoft.com/office/2019/extlst" xmlns:r="http://schemas.openxmlformats.org/officeDocument/2006/relationships" xmlns:m="http://schemas.openxmlformats.org/officeDocument/2006/math" xmlns:v="urn:schemas-microsoft-com:vml" xmlns:wp14="http://schemas.microsoft.com/office/word/2010/wordprocessingDrawing" xmlns:wp="http://schemas.openxmlformats.org/drawingml/2006/wordprocessingDrawing" xmlns:w10="urn:schemas-microsoft-com:office:word" xmlns:w="http://schemas.openxmlformats.org/wordprocessingml/2006/main" xmlns:w14="http://schemas.microsoft.com/office/word/2010/wordml" xmlns:w15="http://schemas.microsoft.com/office/word/2012/wordml" xmlns:w16cei="http://schemas.microsoft.com/office/word/2026/wordml/cei" xmlns:w16cex="http://schemas.microsoft.com/office/word/2018/wordml/cex" xmlns:w16cid="http://schemas.microsoft.com/office/word/2016/wordml/cid" xmlns:w16="http://schemas.microsoft.com/office/word/2018/wordml" xmlns:w16du="http://schemas.microsoft.com/office/word/2023/wordml/word16du" xmlns:w16sdtdh="http://schemas.microsoft.com/office/word/2020/wordml/sdtdatahash" xmlns:w16sdtfl="http://schemas.microsoft.com/office/word/2024/wordml/sdtformatlock" xmlns:w16se="http://schemas.microsoft.com/office/word/2015/wordml/symex" xmlns:wpg="http://schemas.microsoft.com/office/word/2010/wordprocessingGroup" xmlns:wpi="http://schemas.microsoft.com/office/word/2010/wordprocessingInk" xmlns:wne="http://schemas.microsoft.com/office/word/2006/wordml" xmlns:wps="http://schemas.microsoft.com/office/word/2010/wordprocessingShape" mc:Ignorable="w14 w15 w16se w16cid w16 w16cex w16sdtdh w16sdtfl w16du wp14">
   <w:p>
     <w:pPr>
       <w:pBdr>
@@ -30991,7 +33147,7 @@
 </file>
 
 <file path=word/footer2.xml><?xml version="1.0" encoding="utf-8"?>
-<w:ftr xmlns:wpc="http://schemas.microsoft.com/office/word/2010/wordprocessingCanvas" xmlns:cx="http://schemas.microsoft.com/office/drawing/2014/chartex" xmlns:cx1="http://schemas.microsoft.com/office/drawing/2015/9/8/chartex" xmlns:cx2="http://schemas.microsoft.com/office/drawing/2015/10/21/chartex" xmlns:cx3="http://schemas.microsoft.com/office/drawing/2016/5/9/chartex" xmlns:cx4="http://schemas.microsoft.com/office/drawing/2016/5/10/chartex" xmlns:cx5="http://schemas.microsoft.com/office/drawing/2016/5/11/chartex" xmlns:cx6="http://schemas.microsoft.com/office/drawing/2016/5/12/chartex" xmlns:cx7="http://schemas.microsoft.com/office/drawing/2016/5/13/chartex" xmlns:cx8="http://schemas.microsoft.com/office/drawing/2016/5/14/chartex" xmlns:mc="http://schemas.openxmlformats.org/markup-compatibility/2006" xmlns:aink="http://schemas.microsoft.com/office/drawing/2016/ink" xmlns:am3d="http://schemas.microsoft.com/office/drawing/2017/model3d" xmlns:o="urn:schemas-microsoft-com:office:office" xmlns:oel="http://schemas.microsoft.com/office/2019/extlst" xmlns:r="http://schemas.openxmlformats.org/officeDocument/2006/relationships" xmlns:m="http://schemas.openxmlformats.org/officeDocument/2006/math" xmlns:v="urn:schemas-microsoft-com:vml" xmlns:wp14="http://schemas.microsoft.com/office/word/2010/wordprocessingDrawing" xmlns:wp="http://schemas.openxmlformats.org/drawingml/2006/wordprocessingDrawing" xmlns:w10="urn:schemas-microsoft-com:office:word" xmlns:w="http://schemas.openxmlformats.org/wordprocessingml/2006/main" xmlns:w14="http://schemas.microsoft.com/office/word/2010/wordml" xmlns:w15="http://schemas.microsoft.com/office/word/2012/wordml" xmlns:w16cex="http://schemas.microsoft.com/office/word/2018/wordml/cex" xmlns:w16cid="http://schemas.microsoft.com/office/word/2016/wordml/cid" xmlns:w16="http://schemas.microsoft.com/office/word/2018/wordml" xmlns:w16sdtdh="http://schemas.microsoft.com/office/word/2020/wordml/sdtdatahash" xmlns:w16se="http://schemas.microsoft.com/office/word/2015/wordml/symex" xmlns:wpg="http://schemas.microsoft.com/office/word/2010/wordprocessingGroup" xmlns:wpi="http://schemas.microsoft.com/office/word/2010/wordprocessingInk" xmlns:wne="http://schemas.microsoft.com/office/word/2006/wordml" xmlns:wps="http://schemas.microsoft.com/office/word/2010/wordprocessingShape" mc:Ignorable="w14 w15 w16se w16cid w16 w16cex w16sdtdh wp14">
+<w:ftr xmlns:wpc="http://schemas.microsoft.com/office/word/2010/wordprocessingCanvas" xmlns:cx="http://schemas.microsoft.com/office/drawing/2014/chartex" xmlns:cx1="http://schemas.microsoft.com/office/drawing/2015/9/8/chartex" xmlns:cx2="http://schemas.microsoft.com/office/drawing/2015/10/21/chartex" xmlns:cx3="http://schemas.microsoft.com/office/drawing/2016/5/9/chartex" xmlns:cx4="http://schemas.microsoft.com/office/drawing/2016/5/10/chartex" xmlns:cx5="http://schemas.microsoft.com/office/drawing/2016/5/11/chartex" xmlns:cx6="http://schemas.microsoft.com/office/drawing/2016/5/12/chartex" xmlns:cx7="http://schemas.microsoft.com/office/drawing/2016/5/13/chartex" xmlns:cx8="http://schemas.microsoft.com/office/drawing/2016/5/14/chartex" xmlns:mc="http://schemas.openxmlformats.org/markup-compatibility/2006" xmlns:aink="http://schemas.microsoft.com/office/drawing/2016/ink" xmlns:am3d="http://schemas.microsoft.com/office/drawing/2017/model3d" xmlns:o="urn:schemas-microsoft-com:office:office" xmlns:oel="http://schemas.microsoft.com/office/2019/extlst" xmlns:r="http://schemas.openxmlformats.org/officeDocument/2006/relationships" xmlns:m="http://schemas.openxmlformats.org/officeDocument/2006/math" xmlns:v="urn:schemas-microsoft-com:vml" xmlns:wp14="http://schemas.microsoft.com/office/word/2010/wordprocessingDrawing" xmlns:wp="http://schemas.openxmlformats.org/drawingml/2006/wordprocessingDrawing" xmlns:w10="urn:schemas-microsoft-com:office:word" xmlns:w="http://schemas.openxmlformats.org/wordprocessingml/2006/main" xmlns:w14="http://schemas.microsoft.com/office/word/2010/wordml" xmlns:w15="http://schemas.microsoft.com/office/word/2012/wordml" xmlns:w16cei="http://schemas.microsoft.com/office/word/2026/wordml/cei" xmlns:w16cex="http://schemas.microsoft.com/office/word/2018/wordml/cex" xmlns:w16cid="http://schemas.microsoft.com/office/word/2016/wordml/cid" xmlns:w16="http://schemas.microsoft.com/office/word/2018/wordml" xmlns:w16du="http://schemas.microsoft.com/office/word/2023/wordml/word16du" xmlns:w16sdtdh="http://schemas.microsoft.com/office/word/2020/wordml/sdtdatahash" xmlns:w16sdtfl="http://schemas.microsoft.com/office/word/2024/wordml/sdtformatlock" xmlns:w16se="http://schemas.microsoft.com/office/word/2015/wordml/symex" xmlns:wpg="http://schemas.microsoft.com/office/word/2010/wordprocessingGroup" xmlns:wpi="http://schemas.microsoft.com/office/word/2010/wordprocessingInk" xmlns:wne="http://schemas.microsoft.com/office/word/2006/wordml" xmlns:wps="http://schemas.microsoft.com/office/word/2010/wordprocessingShape" mc:Ignorable="w14 w15 w16se w16cid w16 w16cex w16sdtdh w16sdtfl w16du wp14">
   <w:p>
     <w:pPr>
       <w:pBdr>
@@ -31197,7 +33353,7 @@
 </file>
 
 <file path=word/footnotes.xml><?xml version="1.0" encoding="utf-8"?>
-<w:footnotes xmlns:wpc="http://schemas.microsoft.com/office/word/2010/wordprocessingCanvas" xmlns:cx="http://schemas.microsoft.com/office/drawing/2014/chartex" xmlns:cx1="http://schemas.microsoft.com/office/drawing/2015/9/8/chartex" xmlns:cx2="http://schemas.microsoft.com/office/drawing/2015/10/21/chartex" xmlns:cx3="http://schemas.microsoft.com/office/drawing/2016/5/9/chartex" xmlns:cx4="http://schemas.microsoft.com/office/drawing/2016/5/10/chartex" xmlns:cx5="http://schemas.microsoft.com/office/drawing/2016/5/11/chartex" xmlns:cx6="http://schemas.microsoft.com/office/drawing/2016/5/12/chartex" xmlns:cx7="http://schemas.microsoft.com/office/drawing/2016/5/13/chartex" xmlns:cx8="http://schemas.microsoft.com/office/drawing/2016/5/14/chartex" xmlns:mc="http://schemas.openxmlformats.org/markup-compatibility/2006" xmlns:aink="http://schemas.microsoft.com/office/drawing/2016/ink" xmlns:am3d="http://schemas.microsoft.com/office/drawing/2017/model3d" xmlns:o="urn:schemas-microsoft-com:office:office" xmlns:oel="http://schemas.microsoft.com/office/2019/extlst" xmlns:r="http://schemas.openxmlformats.org/officeDocument/2006/relationships" xmlns:m="http://schemas.openxmlformats.org/officeDocument/2006/math" xmlns:v="urn:schemas-microsoft-com:vml" xmlns:wp14="http://schemas.microsoft.com/office/word/2010/wordprocessingDrawing" xmlns:wp="http://schemas.openxmlformats.org/drawingml/2006/wordprocessingDrawing" xmlns:w10="urn:schemas-microsoft-com:office:word" xmlns:w="http://schemas.openxmlformats.org/wordprocessingml/2006/main" xmlns:w14="http://schemas.microsoft.com/office/word/2010/wordml" xmlns:w15="http://schemas.microsoft.com/office/word/2012/wordml" xmlns:w16cex="http://schemas.microsoft.com/office/word/2018/wordml/cex" xmlns:w16cid="http://schemas.microsoft.com/office/word/2016/wordml/cid" xmlns:w16="http://schemas.microsoft.com/office/word/2018/wordml" xmlns:w16sdtdh="http://schemas.microsoft.com/office/word/2020/wordml/sdtdatahash" xmlns:w16se="http://schemas.microsoft.com/office/word/2015/wordml/symex" xmlns:wpg="http://schemas.microsoft.com/office/word/2010/wordprocessingGroup" xmlns:wpi="http://schemas.microsoft.com/office/word/2010/wordprocessingInk" xmlns:wne="http://schemas.microsoft.com/office/word/2006/wordml" xmlns:wps="http://schemas.microsoft.com/office/word/2010/wordprocessingShape" mc:Ignorable="w14 w15 w16se w16cid w16 w16cex w16sdtdh wp14">
+<w:footnotes xmlns:wpc="http://schemas.microsoft.com/office/word/2010/wordprocessingCanvas" xmlns:cx="http://schemas.microsoft.com/office/drawing/2014/chartex" xmlns:cx1="http://schemas.microsoft.com/office/drawing/2015/9/8/chartex" xmlns:cx2="http://schemas.microsoft.com/office/drawing/2015/10/21/chartex" xmlns:cx3="http://schemas.microsoft.com/office/drawing/2016/5/9/chartex" xmlns:cx4="http://schemas.microsoft.com/office/drawing/2016/5/10/chartex" xmlns:cx5="http://schemas.microsoft.com/office/drawing/2016/5/11/chartex" xmlns:cx6="http://schemas.microsoft.com/office/drawing/2016/5/12/chartex" xmlns:cx7="http://schemas.microsoft.com/office/drawing/2016/5/13/chartex" xmlns:cx8="http://schemas.microsoft.com/office/drawing/2016/5/14/chartex" xmlns:mc="http://schemas.openxmlformats.org/markup-compatibility/2006" xmlns:aink="http://schemas.microsoft.com/office/drawing/2016/ink" xmlns:am3d="http://schemas.microsoft.com/office/drawing/2017/model3d" xmlns:o="urn:schemas-microsoft-com:office:office" xmlns:oel="http://schemas.microsoft.com/office/2019/extlst" xmlns:r="http://schemas.openxmlformats.org/officeDocument/2006/relationships" xmlns:m="http://schemas.openxmlformats.org/officeDocument/2006/math" xmlns:v="urn:schemas-microsoft-com:vml" xmlns:wp14="http://schemas.microsoft.com/office/word/2010/wordprocessingDrawing" xmlns:wp="http://schemas.openxmlformats.org/drawingml/2006/wordprocessingDrawing" xmlns:w10="urn:schemas-microsoft-com:office:word" xmlns:w="http://schemas.openxmlformats.org/wordprocessingml/2006/main" xmlns:w14="http://schemas.microsoft.com/office/word/2010/wordml" xmlns:w15="http://schemas.microsoft.com/office/word/2012/wordml" xmlns:w16cei="http://schemas.microsoft.com/office/word/2026/wordml/cei" xmlns:w16cex="http://schemas.microsoft.com/office/word/2018/wordml/cex" xmlns:w16cid="http://schemas.microsoft.com/office/word/2016/wordml/cid" xmlns:w16="http://schemas.microsoft.com/office/word/2018/wordml" xmlns:w16du="http://schemas.microsoft.com/office/word/2023/wordml/word16du" xmlns:w16sdtdh="http://schemas.microsoft.com/office/word/2020/wordml/sdtdatahash" xmlns:w16sdtfl="http://schemas.microsoft.com/office/word/2024/wordml/sdtformatlock" xmlns:w16se="http://schemas.microsoft.com/office/word/2015/wordml/symex" xmlns:wpg="http://schemas.microsoft.com/office/word/2010/wordprocessingGroup" xmlns:wpi="http://schemas.microsoft.com/office/word/2010/wordprocessingInk" xmlns:wne="http://schemas.microsoft.com/office/word/2006/wordml" xmlns:wps="http://schemas.microsoft.com/office/word/2010/wordprocessingShape" mc:Ignorable="w14 w15 w16se w16cid w16 w16cex w16sdtdh w16sdtfl w16du wp14">
   <w:footnote w:type="separator" w:id="-1">
     <w:p>
       <w:pPr>
@@ -31222,7 +33378,7 @@
 </file>
 
 <file path=word/header1.xml><?xml version="1.0" encoding="utf-8"?>
-<w:hdr xmlns:wpc="http://schemas.microsoft.com/office/word/2010/wordprocessingCanvas" xmlns:cx="http://schemas.microsoft.com/office/drawing/2014/chartex" xmlns:cx1="http://schemas.microsoft.com/office/drawing/2015/9/8/chartex" xmlns:cx2="http://schemas.microsoft.com/office/drawing/2015/10/21/chartex" xmlns:cx3="http://schemas.microsoft.com/office/drawing/2016/5/9/chartex" xmlns:cx4="http://schemas.microsoft.com/office/drawing/2016/5/10/chartex" xmlns:cx5="http://schemas.microsoft.com/office/drawing/2016/5/11/chartex" xmlns:cx6="http://schemas.microsoft.com/office/drawing/2016/5/12/chartex" xmlns:cx7="http://schemas.microsoft.com/office/drawing/2016/5/13/chartex" xmlns:cx8="http://schemas.microsoft.com/office/drawing/2016/5/14/chartex" xmlns:mc="http://schemas.openxmlformats.org/markup-compatibility/2006" xmlns:aink="http://schemas.microsoft.com/office/drawing/2016/ink" xmlns:am3d="http://schemas.microsoft.com/office/drawing/2017/model3d" xmlns:o="urn:schemas-microsoft-com:office:office" xmlns:oel="http://schemas.microsoft.com/office/2019/extlst" xmlns:r="http://schemas.openxmlformats.org/officeDocument/2006/relationships" xmlns:m="http://schemas.openxmlformats.org/officeDocument/2006/math" xmlns:v="urn:schemas-microsoft-com:vml" xmlns:wp14="http://schemas.microsoft.com/office/word/2010/wordprocessingDrawing" xmlns:wp="http://schemas.openxmlformats.org/drawingml/2006/wordprocessingDrawing" xmlns:w10="urn:schemas-microsoft-com:office:word" xmlns:w="http://schemas.openxmlformats.org/wordprocessingml/2006/main" xmlns:w14="http://schemas.microsoft.com/office/word/2010/wordml" xmlns:w15="http://schemas.microsoft.com/office/word/2012/wordml" xmlns:w16cex="http://schemas.microsoft.com/office/word/2018/wordml/cex" xmlns:w16cid="http://schemas.microsoft.com/office/word/2016/wordml/cid" xmlns:w16="http://schemas.microsoft.com/office/word/2018/wordml" xmlns:w16sdtdh="http://schemas.microsoft.com/office/word/2020/wordml/sdtdatahash" xmlns:w16se="http://schemas.microsoft.com/office/word/2015/wordml/symex" xmlns:wpg="http://schemas.microsoft.com/office/word/2010/wordprocessingGroup" xmlns:wpi="http://schemas.microsoft.com/office/word/2010/wordprocessingInk" xmlns:wne="http://schemas.microsoft.com/office/word/2006/wordml" xmlns:wps="http://schemas.microsoft.com/office/word/2010/wordprocessingShape" mc:Ignorable="w14 w15 w16se w16cid w16 w16cex w16sdtdh wp14">
+<w:hdr xmlns:wpc="http://schemas.microsoft.com/office/word/2010/wordprocessingCanvas" xmlns:cx="http://schemas.microsoft.com/office/drawing/2014/chartex" xmlns:cx1="http://schemas.microsoft.com/office/drawing/2015/9/8/chartex" xmlns:cx2="http://schemas.microsoft.com/office/drawing/2015/10/21/chartex" xmlns:cx3="http://schemas.microsoft.com/office/drawing/2016/5/9/chartex" xmlns:cx4="http://schemas.microsoft.com/office/drawing/2016/5/10/chartex" xmlns:cx5="http://schemas.microsoft.com/office/drawing/2016/5/11/chartex" xmlns:cx6="http://schemas.microsoft.com/office/drawing/2016/5/12/chartex" xmlns:cx7="http://schemas.microsoft.com/office/drawing/2016/5/13/chartex" xmlns:cx8="http://schemas.microsoft.com/office/drawing/2016/5/14/chartex" xmlns:mc="http://schemas.openxmlformats.org/markup-compatibility/2006" xmlns:aink="http://schemas.microsoft.com/office/drawing/2016/ink" xmlns:am3d="http://schemas.microsoft.com/office/drawing/2017/model3d" xmlns:o="urn:schemas-microsoft-com:office:office" xmlns:oel="http://schemas.microsoft.com/office/2019/extlst" xmlns:r="http://schemas.openxmlformats.org/officeDocument/2006/relationships" xmlns:m="http://schemas.openxmlformats.org/officeDocument/2006/math" xmlns:v="urn:schemas-microsoft-com:vml" xmlns:wp14="http://schemas.microsoft.com/office/word/2010/wordprocessingDrawing" xmlns:wp="http://schemas.openxmlformats.org/drawingml/2006/wordprocessingDrawing" xmlns:w10="urn:schemas-microsoft-com:office:word" xmlns:w="http://schemas.openxmlformats.org/wordprocessingml/2006/main" xmlns:w14="http://schemas.microsoft.com/office/word/2010/wordml" xmlns:w15="http://schemas.microsoft.com/office/word/2012/wordml" xmlns:w16cei="http://schemas.microsoft.com/office/word/2026/wordml/cei" xmlns:w16cex="http://schemas.microsoft.com/office/word/2018/wordml/cex" xmlns:w16cid="http://schemas.microsoft.com/office/word/2016/wordml/cid" xmlns:w16="http://schemas.microsoft.com/office/word/2018/wordml" xmlns:w16du="http://schemas.microsoft.com/office/word/2023/wordml/word16du" xmlns:w16sdtdh="http://schemas.microsoft.com/office/word/2020/wordml/sdtdatahash" xmlns:w16sdtfl="http://schemas.microsoft.com/office/word/2024/wordml/sdtformatlock" xmlns:w16se="http://schemas.microsoft.com/office/word/2015/wordml/symex" xmlns:wpg="http://schemas.microsoft.com/office/word/2010/wordprocessingGroup" xmlns:wpi="http://schemas.microsoft.com/office/word/2010/wordprocessingInk" xmlns:wne="http://schemas.microsoft.com/office/word/2006/wordml" xmlns:wps="http://schemas.microsoft.com/office/word/2010/wordprocessingShape" mc:Ignorable="w14 w15 w16se w16cid w16 w16cex w16sdtdh w16sdtfl w16du wp14">
   <w:p>
     <w:pPr>
       <w:pStyle w:val="Header"/>
@@ -31243,7 +33399,7 @@
 </file>
 
 <file path=word/header2.xml><?xml version="1.0" encoding="utf-8"?>
-<w:hdr xmlns:wpc="http://schemas.microsoft.com/office/word/2010/wordprocessingCanvas" xmlns:cx="http://schemas.microsoft.com/office/drawing/2014/chartex" xmlns:cx1="http://schemas.microsoft.com/office/drawing/2015/9/8/chartex" xmlns:cx2="http://schemas.microsoft.com/office/drawing/2015/10/21/chartex" xmlns:cx3="http://schemas.microsoft.com/office/drawing/2016/5/9/chartex" xmlns:cx4="http://schemas.microsoft.com/office/drawing/2016/5/10/chartex" xmlns:cx5="http://schemas.microsoft.com/office/drawing/2016/5/11/chartex" xmlns:cx6="http://schemas.microsoft.com/office/drawing/2016/5/12/chartex" xmlns:cx7="http://schemas.microsoft.com/office/drawing/2016/5/13/chartex" xmlns:cx8="http://schemas.microsoft.com/office/drawing/2016/5/14/chartex" xmlns:mc="http://schemas.openxmlformats.org/markup-compatibility/2006" xmlns:aink="http://schemas.microsoft.com/office/drawing/2016/ink" xmlns:am3d="http://schemas.microsoft.com/office/drawing/2017/model3d" xmlns:o="urn:schemas-microsoft-com:office:office" xmlns:oel="http://schemas.microsoft.com/office/2019/extlst" xmlns:r="http://schemas.openxmlformats.org/officeDocument/2006/relationships" xmlns:m="http://schemas.openxmlformats.org/officeDocument/2006/math" xmlns:v="urn:schemas-microsoft-com:vml" xmlns:wp14="http://schemas.microsoft.com/office/word/2010/wordprocessingDrawing" xmlns:wp="http://schemas.openxmlformats.org/drawingml/2006/wordprocessingDrawing" xmlns:w10="urn:schemas-microsoft-com:office:word" xmlns:w="http://schemas.openxmlformats.org/wordprocessingml/2006/main" xmlns:w14="http://schemas.microsoft.com/office/word/2010/wordml" xmlns:w15="http://schemas.microsoft.com/office/word/2012/wordml" xmlns:w16cex="http://schemas.microsoft.com/office/word/2018/wordml/cex" xmlns:w16cid="http://schemas.microsoft.com/office/word/2016/wordml/cid" xmlns:w16="http://schemas.microsoft.com/office/word/2018/wordml" xmlns:w16sdtdh="http://schemas.microsoft.com/office/word/2020/wordml/sdtdatahash" xmlns:w16se="http://schemas.microsoft.com/office/word/2015/wordml/symex" xmlns:wpg="http://schemas.microsoft.com/office/word/2010/wordprocessingGroup" xmlns:wpi="http://schemas.microsoft.com/office/word/2010/wordprocessingInk" xmlns:wne="http://schemas.microsoft.com/office/word/2006/wordml" xmlns:wps="http://schemas.microsoft.com/office/word/2010/wordprocessingShape" mc:Ignorable="w14 w15 w16se w16cid w16 w16cex w16sdtdh wp14">
+<w:hdr xmlns:wpc="http://schemas.microsoft.com/office/word/2010/wordprocessingCanvas" xmlns:cx="http://schemas.microsoft.com/office/drawing/2014/chartex" xmlns:cx1="http://schemas.microsoft.com/office/drawing/2015/9/8/chartex" xmlns:cx2="http://schemas.microsoft.com/office/drawing/2015/10/21/chartex" xmlns:cx3="http://schemas.microsoft.com/office/drawing/2016/5/9/chartex" xmlns:cx4="http://schemas.microsoft.com/office/drawing/2016/5/10/chartex" xmlns:cx5="http://schemas.microsoft.com/office/drawing/2016/5/11/chartex" xmlns:cx6="http://schemas.microsoft.com/office/drawing/2016/5/12/chartex" xmlns:cx7="http://schemas.microsoft.com/office/drawing/2016/5/13/chartex" xmlns:cx8="http://schemas.microsoft.com/office/drawing/2016/5/14/chartex" xmlns:mc="http://schemas.openxmlformats.org/markup-compatibility/2006" xmlns:aink="http://schemas.microsoft.com/office/drawing/2016/ink" xmlns:am3d="http://schemas.microsoft.com/office/drawing/2017/model3d" xmlns:o="urn:schemas-microsoft-com:office:office" xmlns:oel="http://schemas.microsoft.com/office/2019/extlst" xmlns:r="http://schemas.openxmlformats.org/officeDocument/2006/relationships" xmlns:m="http://schemas.openxmlformats.org/officeDocument/2006/math" xmlns:v="urn:schemas-microsoft-com:vml" xmlns:wp14="http://schemas.microsoft.com/office/word/2010/wordprocessingDrawing" xmlns:wp="http://schemas.openxmlformats.org/drawingml/2006/wordprocessingDrawing" xmlns:w10="urn:schemas-microsoft-com:office:word" xmlns:w="http://schemas.openxmlformats.org/wordprocessingml/2006/main" xmlns:w14="http://schemas.microsoft.com/office/word/2010/wordml" xmlns:w15="http://schemas.microsoft.com/office/word/2012/wordml" xmlns:w16cei="http://schemas.microsoft.com/office/word/2026/wordml/cei" xmlns:w16cex="http://schemas.microsoft.com/office/word/2018/wordml/cex" xmlns:w16cid="http://schemas.microsoft.com/office/word/2016/wordml/cid" xmlns:w16="http://schemas.microsoft.com/office/word/2018/wordml" xmlns:w16du="http://schemas.microsoft.com/office/word/2023/wordml/word16du" xmlns:w16sdtdh="http://schemas.microsoft.com/office/word/2020/wordml/sdtdatahash" xmlns:w16sdtfl="http://schemas.microsoft.com/office/word/2024/wordml/sdtformatlock" xmlns:w16se="http://schemas.microsoft.com/office/word/2015/wordml/symex" xmlns:wpg="http://schemas.microsoft.com/office/word/2010/wordprocessingGroup" xmlns:wpi="http://schemas.microsoft.com/office/word/2010/wordprocessingInk" xmlns:wne="http://schemas.microsoft.com/office/word/2006/wordml" xmlns:wps="http://schemas.microsoft.com/office/word/2010/wordprocessingShape" mc:Ignorable="w14 w15 w16se w16cid w16 w16cex w16sdtdh w16sdtfl w16du wp14">
   <w:p>
     <w:pPr>
       <w:pStyle w:val="Header"/>
@@ -31256,7 +33412,7 @@
 </file>
 
 <file path=word/styles.xml><?xml version="1.0" encoding="utf-8"?>
-<w:styles xmlns:mc="http://schemas.openxmlformats.org/markup-compatibility/2006" xmlns:r="http://schemas.openxmlformats.org/officeDocument/2006/relationships" xmlns:w="http://schemas.openxmlformats.org/wordprocessingml/2006/main" xmlns:w14="http://schemas.microsoft.com/office/word/2010/wordml" xmlns:w15="http://schemas.microsoft.com/office/word/2012/wordml" xmlns:w16cex="http://schemas.microsoft.com/office/word/2018/wordml/cex" xmlns:w16cid="http://schemas.microsoft.com/office/word/2016/wordml/cid" xmlns:w16="http://schemas.microsoft.com/office/word/2018/wordml" xmlns:w16sdtdh="http://schemas.microsoft.com/office/word/2020/wordml/sdtdatahash" xmlns:w16se="http://schemas.microsoft.com/office/word/2015/wordml/symex" mc:Ignorable="w14 w15 w16se w16cid w16 w16cex w16sdtdh">
+<w:styles xmlns:mc="http://schemas.openxmlformats.org/markup-compatibility/2006" xmlns:r="http://schemas.openxmlformats.org/officeDocument/2006/relationships" xmlns:w="http://schemas.openxmlformats.org/wordprocessingml/2006/main" xmlns:w14="http://schemas.microsoft.com/office/word/2010/wordml" xmlns:w15="http://schemas.microsoft.com/office/word/2012/wordml" xmlns:w16cex="http://schemas.microsoft.com/office/word/2018/wordml/cex" xmlns:w16cid="http://schemas.microsoft.com/office/word/2016/wordml/cid" xmlns:w16="http://schemas.microsoft.com/office/word/2018/wordml" xmlns:w16du="http://schemas.microsoft.com/office/word/2023/wordml/word16du" xmlns:w16sdtdh="http://schemas.microsoft.com/office/word/2020/wordml/sdtdatahash" xmlns:w16sdtfl="http://schemas.microsoft.com/office/word/2024/wordml/sdtformatlock" xmlns:w16se="http://schemas.microsoft.com/office/word/2015/wordml/symex" mc:Ignorable="w14 w15 w16se w16cid w16 w16cex w16sdtdh w16sdtfl w16du">
   <w:docDefaults>
     <w:rPrDefault>
       <w:rPr>

</xml_diff>

<commit_message>
nmv 22 08 2026
</commit_message>
<xml_diff>
--- a/TS Jatai Ghanam Project/TS 3.4/TS 3.4 Ghanam Malayalam Corrections.docx
+++ b/TS Jatai Ghanam Project/TS 3.4/TS 3.4 Ghanam Malayalam Corrections.docx
@@ -112,7 +112,18 @@
           <w:szCs w:val="32"/>
           <w:u w:val="single"/>
         </w:rPr>
-        <w:t xml:space="preserve">Observed till </w:t>
+        <w:t xml:space="preserve">Observed </w:t>
+      </w:r>
+      <w:proofErr w:type="gramStart"/>
+      <w:r>
+        <w:rPr>
+          <w:b/>
+          <w:bCs/>
+          <w:sz w:val="32"/>
+          <w:szCs w:val="32"/>
+          <w:u w:val="single"/>
+        </w:rPr>
+        <w:t xml:space="preserve">till </w:t>
       </w:r>
       <w:r>
         <w:rPr>
@@ -125,6 +136,7 @@
         </w:rPr>
         <w:t>?????</w:t>
       </w:r>
+      <w:proofErr w:type="gramEnd"/>
     </w:p>
     <w:p>
       <w:pPr>
@@ -2052,6 +2064,537 @@
                 <w:szCs w:val="32"/>
               </w:rPr>
               <w:t xml:space="preserve">J | </w:t>
+            </w:r>
+          </w:p>
+        </w:tc>
+      </w:tr>
+      <w:tr>
+        <w:trPr>
+          <w:trHeight w:val="1235"/>
+        </w:trPr>
+        <w:tc>
+          <w:tcPr>
+            <w:tcW w:w="7166" w:type="dxa"/>
+          </w:tcPr>
+          <w:p>
+            <w:pPr>
+              <w:widowControl w:val="0"/>
+              <w:autoSpaceDE w:val="0"/>
+              <w:autoSpaceDN w:val="0"/>
+              <w:adjustRightInd w:val="0"/>
+              <w:spacing w:before="0" w:line="240" w:lineRule="auto"/>
+              <w:rPr>
+                <w:rFonts w:ascii="BRH Malayalam Extra" w:hAnsi="BRH Malayalam Extra" w:cs="BRH Malayalam Extra"/>
+                <w:color w:val="000000"/>
+                <w:sz w:val="32"/>
+                <w:szCs w:val="32"/>
+              </w:rPr>
+            </w:pPr>
+            <w:r>
+              <w:rPr>
+                <w:rFonts w:cs="ar"/>
+                <w:color w:val="000000"/>
+                <w:szCs w:val="36"/>
+              </w:rPr>
+              <w:t>34</w:t>
+            </w:r>
+            <w:r>
+              <w:rPr>
+                <w:rFonts w:ascii="BRH Malayalam Extra" w:hAnsi="BRH Malayalam Extra" w:cs="BRH Malayalam Extra"/>
+                <w:color w:val="000000"/>
+                <w:sz w:val="32"/>
+                <w:szCs w:val="32"/>
+              </w:rPr>
+              <w:t>)</w:t>
+            </w:r>
+            <w:r>
+              <w:rPr>
+                <w:rFonts w:ascii="BRH Malayalam Extra" w:hAnsi="BRH Malayalam Extra" w:cs="BRH Malayalam Extra"/>
+                <w:color w:val="000000"/>
+                <w:sz w:val="32"/>
+                <w:szCs w:val="32"/>
+              </w:rPr>
+              <w:tab/>
+            </w:r>
+            <w:r>
+              <w:rPr>
+                <w:rFonts w:cs="ar"/>
+                <w:color w:val="000000"/>
+                <w:szCs w:val="36"/>
+              </w:rPr>
+              <w:t>3</w:t>
+            </w:r>
+            <w:r>
+              <w:rPr>
+                <w:rFonts w:ascii="BRH Malayalam Extra" w:hAnsi="BRH Malayalam Extra" w:cs="BRH Malayalam Extra"/>
+                <w:color w:val="000000"/>
+                <w:sz w:val="32"/>
+                <w:szCs w:val="32"/>
+              </w:rPr>
+              <w:t>.</w:t>
+            </w:r>
+            <w:r>
+              <w:rPr>
+                <w:rFonts w:cs="ar"/>
+                <w:color w:val="000000"/>
+                <w:szCs w:val="36"/>
+              </w:rPr>
+              <w:t>4</w:t>
+            </w:r>
+            <w:r>
+              <w:rPr>
+                <w:rFonts w:ascii="BRH Malayalam Extra" w:hAnsi="BRH Malayalam Extra" w:cs="BRH Malayalam Extra"/>
+                <w:color w:val="000000"/>
+                <w:sz w:val="32"/>
+                <w:szCs w:val="32"/>
+              </w:rPr>
+              <w:t>.</w:t>
+            </w:r>
+            <w:r>
+              <w:rPr>
+                <w:rFonts w:cs="ar"/>
+                <w:color w:val="000000"/>
+                <w:szCs w:val="36"/>
+              </w:rPr>
+              <w:t>11</w:t>
+            </w:r>
+            <w:r>
+              <w:rPr>
+                <w:rFonts w:ascii="BRH Malayalam Extra" w:hAnsi="BRH Malayalam Extra" w:cs="BRH Malayalam Extra"/>
+                <w:color w:val="000000"/>
+                <w:sz w:val="32"/>
+                <w:szCs w:val="32"/>
+              </w:rPr>
+              <w:t>.</w:t>
+            </w:r>
+            <w:r>
+              <w:rPr>
+                <w:rFonts w:cs="ar"/>
+                <w:color w:val="000000"/>
+                <w:szCs w:val="36"/>
+              </w:rPr>
+              <w:t>1</w:t>
+            </w:r>
+            <w:r>
+              <w:rPr>
+                <w:rFonts w:ascii="BRH Malayalam Extra" w:hAnsi="BRH Malayalam Extra" w:cs="BRH Malayalam Extra"/>
+                <w:color w:val="000000"/>
+                <w:sz w:val="32"/>
+                <w:szCs w:val="32"/>
+              </w:rPr>
+              <w:t>(</w:t>
+            </w:r>
+            <w:r>
+              <w:rPr>
+                <w:rFonts w:cs="ar"/>
+                <w:color w:val="000000"/>
+                <w:szCs w:val="36"/>
+              </w:rPr>
+              <w:t>27</w:t>
+            </w:r>
+            <w:r>
+              <w:rPr>
+                <w:rFonts w:ascii="BRH Malayalam Extra" w:hAnsi="BRH Malayalam Extra" w:cs="BRH Malayalam Extra"/>
+                <w:color w:val="000000"/>
+                <w:sz w:val="32"/>
+                <w:szCs w:val="32"/>
+              </w:rPr>
+              <w:t>)- öqpx</w:t>
+            </w:r>
+            <w:r>
+              <w:rPr>
+                <w:rFonts w:ascii="BRH Devanagari Extra" w:hAnsi="BRH Devanagari Extra" w:cs="BRH Malayalam Extra"/>
+                <w:color w:val="000000"/>
+                <w:sz w:val="26"/>
+                <w:szCs w:val="32"/>
+              </w:rPr>
+              <w:t>óè</w:t>
+            </w:r>
+            <w:r>
+              <w:rPr>
+                <w:rFonts w:ascii="BRH Malayalam Extra" w:hAnsi="BRH Malayalam Extra" w:cs="BRH Malayalam Extra"/>
+                <w:color w:val="000000"/>
+                <w:sz w:val="32"/>
+                <w:szCs w:val="32"/>
+              </w:rPr>
+              <w:t>—sy ||</w:t>
+            </w:r>
+          </w:p>
+          <w:p>
+            <w:pPr>
+              <w:widowControl w:val="0"/>
+              <w:autoSpaceDE w:val="0"/>
+              <w:autoSpaceDN w:val="0"/>
+              <w:adjustRightInd w:val="0"/>
+              <w:spacing w:before="0" w:line="240" w:lineRule="auto"/>
+              <w:rPr>
+                <w:rFonts w:cs="ar"/>
+                <w:color w:val="000000"/>
+                <w:szCs w:val="36"/>
+              </w:rPr>
+            </w:pPr>
+            <w:r>
+              <w:rPr>
+                <w:rFonts w:ascii="BRH Malayalam Extra" w:hAnsi="BRH Malayalam Extra" w:cs="BRH Malayalam Extra"/>
+                <w:color w:val="000000"/>
+                <w:sz w:val="32"/>
+                <w:szCs w:val="32"/>
+              </w:rPr>
+              <w:t>ö</w:t>
+            </w:r>
+            <w:r>
+              <w:rPr>
+                <w:rFonts w:ascii="BRH Malayalam Extra" w:hAnsi="BRH Malayalam Extra" w:cs="BRH Malayalam Extra"/>
+                <w:color w:val="000000"/>
+                <w:sz w:val="32"/>
+                <w:szCs w:val="32"/>
+                <w:highlight w:val="yellow"/>
+              </w:rPr>
+              <w:t>q</w:t>
+            </w:r>
+            <w:r>
+              <w:rPr>
+                <w:rFonts w:ascii="BRH Malayalam Extra" w:hAnsi="BRH Malayalam Extra" w:cs="BRH Malayalam Extra"/>
+                <w:color w:val="000000"/>
+                <w:sz w:val="26"/>
+                <w:szCs w:val="32"/>
+              </w:rPr>
+              <w:t>–</w:t>
+            </w:r>
+            <w:r>
+              <w:rPr>
+                <w:rFonts w:ascii="BRH Malayalam Extra" w:hAnsi="BRH Malayalam Extra" w:cs="BRH Malayalam Extra"/>
+                <w:color w:val="000000"/>
+                <w:sz w:val="32"/>
+                <w:szCs w:val="32"/>
+              </w:rPr>
+              <w:t>px</w:t>
+            </w:r>
+            <w:r>
+              <w:rPr>
+                <w:rFonts w:ascii="BRH Malayalam Extra" w:hAnsi="BRH Malayalam Extra" w:cs="BRH Malayalam Extra"/>
+                <w:color w:val="000000"/>
+                <w:sz w:val="26"/>
+                <w:szCs w:val="32"/>
+              </w:rPr>
+              <w:t>–</w:t>
+            </w:r>
+            <w:r>
+              <w:rPr>
+                <w:rFonts w:ascii="BRH Devanagari Extra" w:hAnsi="BRH Devanagari Extra" w:cs="BRH Malayalam Extra"/>
+                <w:color w:val="000000"/>
+                <w:sz w:val="26"/>
+                <w:szCs w:val="32"/>
+              </w:rPr>
+              <w:t>óè</w:t>
+            </w:r>
+            <w:r>
+              <w:rPr>
+                <w:rFonts w:ascii="BRH Malayalam Extra" w:hAnsi="BRH Malayalam Extra" w:cs="BRH Malayalam Extra"/>
+                <w:color w:val="000000"/>
+                <w:sz w:val="26"/>
+                <w:szCs w:val="32"/>
+              </w:rPr>
+              <w:t>–</w:t>
+            </w:r>
+            <w:r>
+              <w:rPr>
+                <w:rFonts w:ascii="BRH Malayalam Extra" w:hAnsi="BRH Malayalam Extra" w:cs="BRH Malayalam Extra"/>
+                <w:color w:val="000000"/>
+                <w:sz w:val="32"/>
+                <w:szCs w:val="32"/>
+              </w:rPr>
+              <w:t>szZy</w:t>
+            </w:r>
+            <w:r>
+              <w:rPr>
+                <w:rFonts w:ascii="BRH Malayalam Extra" w:hAnsi="BRH Malayalam Extra" w:cs="BRH Malayalam Extra"/>
+                <w:color w:val="000000"/>
+                <w:sz w:val="26"/>
+                <w:szCs w:val="32"/>
+              </w:rPr>
+              <w:t>–</w:t>
+            </w:r>
+            <w:r>
+              <w:rPr>
+                <w:rFonts w:ascii="BRH Malayalam Extra" w:hAnsi="BRH Malayalam Extra" w:cs="BRH Malayalam Extra"/>
+                <w:color w:val="000000"/>
+                <w:sz w:val="32"/>
+                <w:szCs w:val="32"/>
+              </w:rPr>
+              <w:t xml:space="preserve"> öqpx</w:t>
+            </w:r>
+            <w:r>
+              <w:rPr>
+                <w:rFonts w:ascii="BRH Devanagari Extra" w:hAnsi="BRH Devanagari Extra" w:cs="BRH Malayalam Extra"/>
+                <w:color w:val="000000"/>
+                <w:sz w:val="26"/>
+                <w:szCs w:val="32"/>
+              </w:rPr>
+              <w:t>óè</w:t>
+            </w:r>
+            <w:r>
+              <w:rPr>
+                <w:rFonts w:ascii="BRH Malayalam Extra" w:hAnsi="BRH Malayalam Extra" w:cs="BRH Malayalam Extra"/>
+                <w:color w:val="000000"/>
+                <w:sz w:val="32"/>
+                <w:szCs w:val="32"/>
+              </w:rPr>
+              <w:t xml:space="preserve">—sy | </w:t>
+            </w:r>
+          </w:p>
+        </w:tc>
+        <w:tc>
+          <w:tcPr>
+            <w:tcW w:w="7371" w:type="dxa"/>
+          </w:tcPr>
+          <w:p>
+            <w:pPr>
+              <w:widowControl w:val="0"/>
+              <w:autoSpaceDE w:val="0"/>
+              <w:autoSpaceDN w:val="0"/>
+              <w:adjustRightInd w:val="0"/>
+              <w:spacing w:before="0" w:line="240" w:lineRule="auto"/>
+              <w:rPr>
+                <w:rFonts w:ascii="BRH Malayalam Extra" w:hAnsi="BRH Malayalam Extra" w:cs="BRH Malayalam Extra"/>
+                <w:color w:val="000000"/>
+                <w:sz w:val="32"/>
+                <w:szCs w:val="32"/>
+              </w:rPr>
+            </w:pPr>
+            <w:r>
+              <w:rPr>
+                <w:rFonts w:cs="ar"/>
+                <w:color w:val="000000"/>
+                <w:szCs w:val="36"/>
+              </w:rPr>
+              <w:t>34</w:t>
+            </w:r>
+            <w:r>
+              <w:rPr>
+                <w:rFonts w:ascii="BRH Malayalam Extra" w:hAnsi="BRH Malayalam Extra" w:cs="BRH Malayalam Extra"/>
+                <w:color w:val="000000"/>
+                <w:sz w:val="32"/>
+                <w:szCs w:val="32"/>
+              </w:rPr>
+              <w:t>)</w:t>
+            </w:r>
+            <w:r>
+              <w:rPr>
+                <w:rFonts w:ascii="BRH Malayalam Extra" w:hAnsi="BRH Malayalam Extra" w:cs="BRH Malayalam Extra"/>
+                <w:color w:val="000000"/>
+                <w:sz w:val="32"/>
+                <w:szCs w:val="32"/>
+              </w:rPr>
+              <w:tab/>
+            </w:r>
+            <w:r>
+              <w:rPr>
+                <w:rFonts w:cs="ar"/>
+                <w:color w:val="000000"/>
+                <w:szCs w:val="36"/>
+              </w:rPr>
+              <w:t>3</w:t>
+            </w:r>
+            <w:r>
+              <w:rPr>
+                <w:rFonts w:ascii="BRH Malayalam Extra" w:hAnsi="BRH Malayalam Extra" w:cs="BRH Malayalam Extra"/>
+                <w:color w:val="000000"/>
+                <w:sz w:val="32"/>
+                <w:szCs w:val="32"/>
+              </w:rPr>
+              <w:t>.</w:t>
+            </w:r>
+            <w:r>
+              <w:rPr>
+                <w:rFonts w:cs="ar"/>
+                <w:color w:val="000000"/>
+                <w:szCs w:val="36"/>
+              </w:rPr>
+              <w:t>4</w:t>
+            </w:r>
+            <w:r>
+              <w:rPr>
+                <w:rFonts w:ascii="BRH Malayalam Extra" w:hAnsi="BRH Malayalam Extra" w:cs="BRH Malayalam Extra"/>
+                <w:color w:val="000000"/>
+                <w:sz w:val="32"/>
+                <w:szCs w:val="32"/>
+              </w:rPr>
+              <w:t>.</w:t>
+            </w:r>
+            <w:r>
+              <w:rPr>
+                <w:rFonts w:cs="ar"/>
+                <w:color w:val="000000"/>
+                <w:szCs w:val="36"/>
+              </w:rPr>
+              <w:t>11</w:t>
+            </w:r>
+            <w:r>
+              <w:rPr>
+                <w:rFonts w:ascii="BRH Malayalam Extra" w:hAnsi="BRH Malayalam Extra" w:cs="BRH Malayalam Extra"/>
+                <w:color w:val="000000"/>
+                <w:sz w:val="32"/>
+                <w:szCs w:val="32"/>
+              </w:rPr>
+              <w:t>.</w:t>
+            </w:r>
+            <w:r>
+              <w:rPr>
+                <w:rFonts w:cs="ar"/>
+                <w:color w:val="000000"/>
+                <w:szCs w:val="36"/>
+              </w:rPr>
+              <w:t>1</w:t>
+            </w:r>
+            <w:r>
+              <w:rPr>
+                <w:rFonts w:ascii="BRH Malayalam Extra" w:hAnsi="BRH Malayalam Extra" w:cs="BRH Malayalam Extra"/>
+                <w:color w:val="000000"/>
+                <w:sz w:val="32"/>
+                <w:szCs w:val="32"/>
+              </w:rPr>
+              <w:t>(</w:t>
+            </w:r>
+            <w:r>
+              <w:rPr>
+                <w:rFonts w:cs="ar"/>
+                <w:color w:val="000000"/>
+                <w:szCs w:val="36"/>
+              </w:rPr>
+              <w:t>27</w:t>
+            </w:r>
+            <w:r>
+              <w:rPr>
+                <w:rFonts w:ascii="BRH Malayalam Extra" w:hAnsi="BRH Malayalam Extra" w:cs="BRH Malayalam Extra"/>
+                <w:color w:val="000000"/>
+                <w:sz w:val="32"/>
+                <w:szCs w:val="32"/>
+              </w:rPr>
+              <w:t>)- öqpx</w:t>
+            </w:r>
+            <w:r>
+              <w:rPr>
+                <w:rFonts w:ascii="BRH Devanagari Extra" w:hAnsi="BRH Devanagari Extra" w:cs="BRH Malayalam Extra"/>
+                <w:color w:val="000000"/>
+                <w:sz w:val="26"/>
+                <w:szCs w:val="32"/>
+              </w:rPr>
+              <w:t>óè</w:t>
+            </w:r>
+            <w:r>
+              <w:rPr>
+                <w:rFonts w:ascii="BRH Malayalam Extra" w:hAnsi="BRH Malayalam Extra" w:cs="BRH Malayalam Extra"/>
+                <w:color w:val="000000"/>
+                <w:sz w:val="32"/>
+                <w:szCs w:val="32"/>
+              </w:rPr>
+              <w:t>—sy ||</w:t>
+            </w:r>
+          </w:p>
+          <w:p>
+            <w:pPr>
+              <w:widowControl w:val="0"/>
+              <w:autoSpaceDE w:val="0"/>
+              <w:autoSpaceDN w:val="0"/>
+              <w:adjustRightInd w:val="0"/>
+              <w:spacing w:before="0" w:line="240" w:lineRule="auto"/>
+              <w:rPr>
+                <w:rFonts w:cs="ar"/>
+                <w:color w:val="000000"/>
+                <w:szCs w:val="36"/>
+              </w:rPr>
+            </w:pPr>
+            <w:r>
+              <w:rPr>
+                <w:rFonts w:ascii="BRH Malayalam Extra" w:hAnsi="BRH Malayalam Extra" w:cs="BRH Malayalam Extra"/>
+                <w:color w:val="000000"/>
+                <w:sz w:val="32"/>
+                <w:szCs w:val="32"/>
+                <w:highlight w:val="green"/>
+              </w:rPr>
+              <w:t>öq</w:t>
+            </w:r>
+            <w:r>
+              <w:rPr>
+                <w:rFonts w:ascii="BRH Malayalam Extra" w:hAnsi="BRH Malayalam Extra" w:cs="BRH Malayalam Extra"/>
+                <w:color w:val="000000"/>
+                <w:sz w:val="32"/>
+                <w:szCs w:val="32"/>
+              </w:rPr>
+              <w:t>px</w:t>
+            </w:r>
+            <w:r>
+              <w:rPr>
+                <w:rFonts w:ascii="BRH Malayalam Extra" w:hAnsi="BRH Malayalam Extra" w:cs="BRH Malayalam Extra"/>
+                <w:color w:val="000000"/>
+                <w:sz w:val="26"/>
+                <w:szCs w:val="32"/>
+              </w:rPr>
+              <w:t>–</w:t>
+            </w:r>
+            <w:r>
+              <w:rPr>
+                <w:rFonts w:ascii="BRH Devanagari Extra" w:hAnsi="BRH Devanagari Extra" w:cs="BRH Malayalam Extra"/>
+                <w:color w:val="000000"/>
+                <w:sz w:val="26"/>
+                <w:szCs w:val="32"/>
+              </w:rPr>
+              <w:t>óè</w:t>
+            </w:r>
+            <w:r>
+              <w:rPr>
+                <w:rFonts w:ascii="BRH Malayalam Extra" w:hAnsi="BRH Malayalam Extra" w:cs="BRH Malayalam Extra"/>
+                <w:color w:val="000000"/>
+                <w:sz w:val="26"/>
+                <w:szCs w:val="32"/>
+              </w:rPr>
+              <w:t>–</w:t>
+            </w:r>
+            <w:r>
+              <w:rPr>
+                <w:rFonts w:ascii="BRH Malayalam Extra" w:hAnsi="BRH Malayalam Extra" w:cs="BRH Malayalam Extra"/>
+                <w:color w:val="000000"/>
+                <w:sz w:val="32"/>
+                <w:szCs w:val="32"/>
+              </w:rPr>
+              <w:t>szZy</w:t>
+            </w:r>
+            <w:r>
+              <w:rPr>
+                <w:rFonts w:ascii="BRH Malayalam Extra" w:hAnsi="BRH Malayalam Extra" w:cs="BRH Malayalam Extra"/>
+                <w:color w:val="000000"/>
+                <w:sz w:val="26"/>
+                <w:szCs w:val="32"/>
+              </w:rPr>
+              <w:t>–</w:t>
+            </w:r>
+            <w:r>
+              <w:rPr>
+                <w:rFonts w:ascii="BRH Malayalam Extra" w:hAnsi="BRH Malayalam Extra" w:cs="BRH Malayalam Extra"/>
+                <w:color w:val="000000"/>
+                <w:sz w:val="32"/>
+                <w:szCs w:val="32"/>
+              </w:rPr>
+              <w:t xml:space="preserve"> öqpx</w:t>
+            </w:r>
+            <w:r>
+              <w:rPr>
+                <w:rFonts w:ascii="BRH Devanagari Extra" w:hAnsi="BRH Devanagari Extra" w:cs="BRH Malayalam Extra"/>
+                <w:color w:val="000000"/>
+                <w:sz w:val="26"/>
+                <w:szCs w:val="32"/>
+              </w:rPr>
+              <w:t>óè</w:t>
+            </w:r>
+            <w:r>
+              <w:rPr>
+                <w:rFonts w:ascii="BRH Malayalam Extra" w:hAnsi="BRH Malayalam Extra" w:cs="BRH Malayalam Extra"/>
+                <w:color w:val="000000"/>
+                <w:sz w:val="32"/>
+                <w:szCs w:val="32"/>
+              </w:rPr>
+              <w:t xml:space="preserve">—sy | </w:t>
             </w:r>
           </w:p>
         </w:tc>
@@ -2391,7 +2934,6 @@
                 <w:sz w:val="32"/>
                 <w:szCs w:val="32"/>
               </w:rPr>
-              <w:lastRenderedPageBreak/>
               <w:t>As Printed</w:t>
             </w:r>
           </w:p>
@@ -4961,6 +5503,7 @@
                 <w:szCs w:val="32"/>
                 <w:lang w:val="it-IT"/>
               </w:rPr>
+              <w:lastRenderedPageBreak/>
               <w:t>45</w:t>
             </w:r>
             <w:r>
@@ -5269,18 +5812,7 @@
                 <w:szCs w:val="32"/>
                 <w:lang w:val="it-IT"/>
               </w:rPr>
-              <w:t xml:space="preserve"> </w:t>
-            </w:r>
-            <w:r>
-              <w:rPr>
-                <w:rFonts w:ascii="BRH Malayalam Extra" w:hAnsi="BRH Malayalam Extra" w:cs="BRH Malayalam Extra"/>
-                <w:color w:val="000000"/>
-                <w:sz w:val="32"/>
-                <w:szCs w:val="32"/>
-                <w:lang w:val="it-IT"/>
-              </w:rPr>
-              <w:lastRenderedPageBreak/>
-              <w:t>dxm—gî</w:t>
+              <w:t xml:space="preserve"> dxm—gî</w:t>
             </w:r>
             <w:r>
               <w:rPr>
@@ -6702,6 +7234,7 @@
                 <w:szCs w:val="32"/>
                 <w:lang w:val="it-IT"/>
               </w:rPr>
+              <w:lastRenderedPageBreak/>
               <w:t>45</w:t>
             </w:r>
             <w:r>
@@ -6988,7 +7521,6 @@
                 <w:szCs w:val="32"/>
                 <w:lang w:val="it-IT"/>
               </w:rPr>
-              <w:lastRenderedPageBreak/>
               <w:t>sõx m</w:t>
             </w:r>
             <w:r>
@@ -9762,6 +10294,7 @@
                 <w:color w:val="000000"/>
                 <w:szCs w:val="32"/>
               </w:rPr>
+              <w:lastRenderedPageBreak/>
               <w:t>43</w:t>
             </w:r>
             <w:r>
@@ -10501,7 +11034,6 @@
                 <w:color w:val="000000"/>
                 <w:szCs w:val="32"/>
               </w:rPr>
-              <w:lastRenderedPageBreak/>
               <w:t>28</w:t>
             </w:r>
             <w:r>
@@ -13078,6 +13610,7 @@
                 <w:color w:val="000000"/>
                 <w:szCs w:val="32"/>
               </w:rPr>
+              <w:lastRenderedPageBreak/>
               <w:t>35</w:t>
             </w:r>
             <w:r>
@@ -14027,7 +14560,6 @@
                 <w:szCs w:val="32"/>
                 <w:highlight w:val="yellow"/>
               </w:rPr>
-              <w:lastRenderedPageBreak/>
               <w:t>s—</w:t>
             </w:r>
             <w:r>
@@ -15103,6 +15635,7 @@
                 <w:color w:val="000000"/>
                 <w:szCs w:val="32"/>
               </w:rPr>
+              <w:lastRenderedPageBreak/>
               <w:t>38</w:t>
             </w:r>
             <w:r>
@@ -16352,7 +16885,6 @@
                 <w:szCs w:val="32"/>
                 <w:highlight w:val="green"/>
               </w:rPr>
-              <w:lastRenderedPageBreak/>
               <w:t>sI</w:t>
             </w:r>
             <w:r>
@@ -17359,6 +17891,7 @@
                 <w:sz w:val="32"/>
                 <w:szCs w:val="32"/>
               </w:rPr>
+              <w:lastRenderedPageBreak/>
               <w:t>Ap—k¡</w:t>
             </w:r>
             <w:r>
@@ -18678,6 +19211,7 @@
                 <w:sz w:val="32"/>
                 <w:szCs w:val="32"/>
               </w:rPr>
+              <w:lastRenderedPageBreak/>
               <w:t>s¢kõ—k</w:t>
             </w:r>
             <w:r>
@@ -19270,6 +19804,7 @@
                 <w:color w:val="000000"/>
                 <w:szCs w:val="32"/>
               </w:rPr>
+              <w:lastRenderedPageBreak/>
               <w:t>34</w:t>
             </w:r>
             <w:r>
@@ -20569,6 +21104,7 @@
                 <w:sz w:val="32"/>
                 <w:szCs w:val="32"/>
               </w:rPr>
+              <w:lastRenderedPageBreak/>
               <w:t>s¢kõ—k</w:t>
             </w:r>
             <w:r>
@@ -21193,6 +21729,7 @@
                 <w:color w:val="000000"/>
                 <w:szCs w:val="32"/>
               </w:rPr>
+              <w:lastRenderedPageBreak/>
               <w:t>37</w:t>
             </w:r>
             <w:r>
@@ -23164,8 +23701,19 @@
                 <w:sz w:val="32"/>
                 <w:szCs w:val="32"/>
               </w:rPr>
-              <w:t>„hy</w:t>
-            </w:r>
+              <w:t>„</w:t>
+            </w:r>
+            <w:proofErr w:type="gramStart"/>
+            <w:r>
+              <w:rPr>
+                <w:rFonts w:ascii="BRH Malayalam Extra" w:hAnsi="BRH Malayalam Extra" w:cs="BRH Malayalam Extra"/>
+                <w:color w:val="000000"/>
+                <w:sz w:val="32"/>
+                <w:szCs w:val="32"/>
+              </w:rPr>
+              <w:t>hy</w:t>
+            </w:r>
+            <w:proofErr w:type="gramEnd"/>
             <w:r>
               <w:rPr>
                 <w:rFonts w:ascii="BRH Malayalam Extra" w:hAnsi="BRH Malayalam Extra" w:cs="BRH Malayalam Extra"/>
@@ -24934,8 +25482,19 @@
                 <w:sz w:val="32"/>
                 <w:szCs w:val="32"/>
               </w:rPr>
-              <w:t>„hy</w:t>
-            </w:r>
+              <w:t>„</w:t>
+            </w:r>
+            <w:proofErr w:type="gramStart"/>
+            <w:r>
+              <w:rPr>
+                <w:rFonts w:ascii="BRH Malayalam Extra" w:hAnsi="BRH Malayalam Extra" w:cs="BRH Malayalam Extra"/>
+                <w:color w:val="000000"/>
+                <w:sz w:val="32"/>
+                <w:szCs w:val="32"/>
+              </w:rPr>
+              <w:t>hy</w:t>
+            </w:r>
+            <w:proofErr w:type="gramEnd"/>
             <w:r>
               <w:rPr>
                 <w:rFonts w:ascii="BRH Malayalam Extra" w:hAnsi="BRH Malayalam Extra" w:cs="BRH Malayalam Extra"/>
@@ -30483,7 +31042,27 @@
                 <w:sz w:val="32"/>
                 <w:szCs w:val="32"/>
               </w:rPr>
-              <w:t xml:space="preserve">I | A(³§)t—J | </w:t>
+              <w:t>I | A(³</w:t>
+            </w:r>
+            <w:proofErr w:type="gramStart"/>
+            <w:r>
+              <w:rPr>
+                <w:rFonts w:ascii="BRH Malayalam Extra" w:hAnsi="BRH Malayalam Extra" w:cs="BRH Malayalam Extra"/>
+                <w:color w:val="000000"/>
+                <w:sz w:val="32"/>
+                <w:szCs w:val="32"/>
+              </w:rPr>
+              <w:t>§)t</w:t>
+            </w:r>
+            <w:proofErr w:type="gramEnd"/>
+            <w:r>
+              <w:rPr>
+                <w:rFonts w:ascii="BRH Malayalam Extra" w:hAnsi="BRH Malayalam Extra" w:cs="BRH Malayalam Extra"/>
+                <w:color w:val="000000"/>
+                <w:sz w:val="32"/>
+                <w:szCs w:val="32"/>
+              </w:rPr>
+              <w:t xml:space="preserve">—J | </w:t>
             </w:r>
           </w:p>
           <w:p>
@@ -30543,7 +31122,17 @@
                 <w:sz w:val="32"/>
                 <w:szCs w:val="32"/>
               </w:rPr>
-              <w:t xml:space="preserve"> i(³§)</w:t>
+              <w:t xml:space="preserve"> i(³</w:t>
+            </w:r>
+            <w:proofErr w:type="gramStart"/>
+            <w:r>
+              <w:rPr>
+                <w:rFonts w:ascii="BRH Malayalam Extra" w:hAnsi="BRH Malayalam Extra" w:cs="BRH Malayalam Extra"/>
+                <w:color w:val="000000"/>
+                <w:sz w:val="32"/>
+                <w:szCs w:val="32"/>
+              </w:rPr>
+              <w:t>§)</w:t>
             </w:r>
             <w:r>
               <w:rPr>
@@ -30553,16 +31142,47 @@
                 <w:szCs w:val="32"/>
                 <w:highlight w:val="yellow"/>
               </w:rPr>
-              <w:t>¥tx—</w:t>
-            </w:r>
-            <w:r>
-              <w:rPr>
-                <w:rFonts w:ascii="BRH Malayalam Extra" w:hAnsi="BRH Malayalam Extra" w:cs="BRH Malayalam Extra"/>
-                <w:color w:val="000000"/>
-                <w:sz w:val="32"/>
-                <w:szCs w:val="32"/>
-              </w:rPr>
-              <w:t xml:space="preserve"> „(³§)t— Gd</w:t>
+              <w:t>¥</w:t>
+            </w:r>
+            <w:proofErr w:type="gramEnd"/>
+            <w:r>
+              <w:rPr>
+                <w:rFonts w:ascii="BRH Malayalam Extra" w:hAnsi="BRH Malayalam Extra" w:cs="BRH Malayalam Extra"/>
+                <w:color w:val="000000"/>
+                <w:sz w:val="32"/>
+                <w:szCs w:val="32"/>
+                <w:highlight w:val="yellow"/>
+              </w:rPr>
+              <w:t>tx—</w:t>
+            </w:r>
+            <w:r>
+              <w:rPr>
+                <w:rFonts w:ascii="BRH Malayalam Extra" w:hAnsi="BRH Malayalam Extra" w:cs="BRH Malayalam Extra"/>
+                <w:color w:val="000000"/>
+                <w:sz w:val="32"/>
+                <w:szCs w:val="32"/>
+              </w:rPr>
+              <w:t xml:space="preserve"> „(³</w:t>
+            </w:r>
+            <w:proofErr w:type="gramStart"/>
+            <w:r>
+              <w:rPr>
+                <w:rFonts w:ascii="BRH Malayalam Extra" w:hAnsi="BRH Malayalam Extra" w:cs="BRH Malayalam Extra"/>
+                <w:color w:val="000000"/>
+                <w:sz w:val="32"/>
+                <w:szCs w:val="32"/>
+              </w:rPr>
+              <w:t>§)t</w:t>
+            </w:r>
+            <w:proofErr w:type="gramEnd"/>
+            <w:r>
+              <w:rPr>
+                <w:rFonts w:ascii="BRH Malayalam Extra" w:hAnsi="BRH Malayalam Extra" w:cs="BRH Malayalam Extra"/>
+                <w:color w:val="000000"/>
+                <w:sz w:val="32"/>
+                <w:szCs w:val="32"/>
+              </w:rPr>
+              <w:t>— Gd</w:t>
             </w:r>
             <w:r>
               <w:rPr>
@@ -30598,7 +31218,27 @@
                 <w:sz w:val="32"/>
                 <w:szCs w:val="32"/>
               </w:rPr>
-              <w:t xml:space="preserve"> i(³§)t—J | </w:t>
+              <w:t xml:space="preserve"> i(³</w:t>
+            </w:r>
+            <w:proofErr w:type="gramStart"/>
+            <w:r>
+              <w:rPr>
+                <w:rFonts w:ascii="BRH Malayalam Extra" w:hAnsi="BRH Malayalam Extra" w:cs="BRH Malayalam Extra"/>
+                <w:color w:val="000000"/>
+                <w:sz w:val="32"/>
+                <w:szCs w:val="32"/>
+              </w:rPr>
+              <w:t>§)t</w:t>
+            </w:r>
+            <w:proofErr w:type="gramEnd"/>
+            <w:r>
+              <w:rPr>
+                <w:rFonts w:ascii="BRH Malayalam Extra" w:hAnsi="BRH Malayalam Extra" w:cs="BRH Malayalam Extra"/>
+                <w:color w:val="000000"/>
+                <w:sz w:val="32"/>
+                <w:szCs w:val="32"/>
+              </w:rPr>
+              <w:t xml:space="preserve">—J | </w:t>
             </w:r>
           </w:p>
           <w:p>
@@ -30760,7 +31400,27 @@
                 <w:sz w:val="32"/>
                 <w:szCs w:val="32"/>
               </w:rPr>
-              <w:t>I | A(³§)t—J | A</w:t>
+              <w:t>I | A(³</w:t>
+            </w:r>
+            <w:proofErr w:type="gramStart"/>
+            <w:r>
+              <w:rPr>
+                <w:rFonts w:ascii="BRH Malayalam Extra" w:hAnsi="BRH Malayalam Extra" w:cs="BRH Malayalam Extra"/>
+                <w:color w:val="000000"/>
+                <w:sz w:val="32"/>
+                <w:szCs w:val="32"/>
+              </w:rPr>
+              <w:t>§)t</w:t>
+            </w:r>
+            <w:proofErr w:type="gramEnd"/>
+            <w:r>
+              <w:rPr>
+                <w:rFonts w:ascii="BRH Malayalam Extra" w:hAnsi="BRH Malayalam Extra" w:cs="BRH Malayalam Extra"/>
+                <w:color w:val="000000"/>
+                <w:sz w:val="32"/>
+                <w:szCs w:val="32"/>
+              </w:rPr>
+              <w:t>—J | A</w:t>
             </w:r>
             <w:r>
               <w:rPr>
@@ -30874,8 +31534,19 @@
                 <w:sz w:val="32"/>
                 <w:szCs w:val="32"/>
               </w:rPr>
-              <w:t xml:space="preserve"> i(³§)¥</w:t>
-            </w:r>
+              <w:t xml:space="preserve"> i(³</w:t>
+            </w:r>
+            <w:proofErr w:type="gramStart"/>
+            <w:r>
+              <w:rPr>
+                <w:rFonts w:ascii="BRH Malayalam Extra" w:hAnsi="BRH Malayalam Extra" w:cs="BRH Malayalam Extra"/>
+                <w:color w:val="000000"/>
+                <w:sz w:val="32"/>
+                <w:szCs w:val="32"/>
+              </w:rPr>
+              <w:t>§)¥</w:t>
+            </w:r>
+            <w:proofErr w:type="gramEnd"/>
             <w:r>
               <w:rPr>
                 <w:rFonts w:ascii="BRH Malayalam Extra" w:hAnsi="BRH Malayalam Extra" w:cs="BRH Malayalam Extra"/>
@@ -30893,61 +31564,141 @@
                 <w:sz w:val="32"/>
                 <w:szCs w:val="32"/>
               </w:rPr>
-              <w:t>x— „(³§)t— Gd ¥id</w:t>
-            </w:r>
-            <w:r>
-              <w:rPr>
-                <w:rFonts w:ascii="BRH Malayalam Extra" w:hAnsi="BRH Malayalam Extra" w:cs="BRH Malayalam Extra"/>
-                <w:color w:val="000000"/>
-                <w:sz w:val="26"/>
-                <w:szCs w:val="32"/>
-              </w:rPr>
-              <w:t>–</w:t>
-            </w:r>
-            <w:r>
-              <w:rPr>
-                <w:rFonts w:ascii="BRH Malayalam Extra" w:hAnsi="BRH Malayalam Extra" w:cs="BRH Malayalam Extra"/>
-                <w:color w:val="000000"/>
-                <w:sz w:val="32"/>
-                <w:szCs w:val="32"/>
-              </w:rPr>
-              <w:t xml:space="preserve"> i(³§)¥tx— Aq§¥Tx Zõq§¥Tx</w:t>
-            </w:r>
-            <w:r>
-              <w:rPr>
-                <w:rFonts w:ascii="BRH Malayalam Extra" w:hAnsi="BRH Malayalam Extra" w:cs="BRH Malayalam Extra"/>
-                <w:color w:val="000000"/>
-                <w:sz w:val="26"/>
-                <w:szCs w:val="32"/>
-              </w:rPr>
-              <w:t>–</w:t>
-            </w:r>
-            <w:r>
-              <w:rPr>
-                <w:rFonts w:ascii="BRH Malayalam Extra" w:hAnsi="BRH Malayalam Extra" w:cs="BRH Malayalam Extra"/>
-                <w:color w:val="000000"/>
-                <w:sz w:val="32"/>
-                <w:szCs w:val="32"/>
-              </w:rPr>
-              <w:t xml:space="preserve"> Zõ(³§)t— Gd ¥id</w:t>
-            </w:r>
-            <w:r>
-              <w:rPr>
-                <w:rFonts w:ascii="BRH Malayalam Extra" w:hAnsi="BRH Malayalam Extra" w:cs="BRH Malayalam Extra"/>
-                <w:color w:val="000000"/>
-                <w:sz w:val="26"/>
-                <w:szCs w:val="32"/>
-              </w:rPr>
-              <w:t>–</w:t>
-            </w:r>
-            <w:r>
-              <w:rPr>
-                <w:rFonts w:ascii="BRH Malayalam Extra" w:hAnsi="BRH Malayalam Extra" w:cs="BRH Malayalam Extra"/>
-                <w:color w:val="000000"/>
-                <w:sz w:val="32"/>
-                <w:szCs w:val="32"/>
-              </w:rPr>
-              <w:t xml:space="preserve"> i(³§)¥tx— Aq§¥TxZy | </w:t>
+              <w:t>x— „(³</w:t>
+            </w:r>
+            <w:proofErr w:type="gramStart"/>
+            <w:r>
+              <w:rPr>
+                <w:rFonts w:ascii="BRH Malayalam Extra" w:hAnsi="BRH Malayalam Extra" w:cs="BRH Malayalam Extra"/>
+                <w:color w:val="000000"/>
+                <w:sz w:val="32"/>
+                <w:szCs w:val="32"/>
+              </w:rPr>
+              <w:t>§)t</w:t>
+            </w:r>
+            <w:proofErr w:type="gramEnd"/>
+            <w:r>
+              <w:rPr>
+                <w:rFonts w:ascii="BRH Malayalam Extra" w:hAnsi="BRH Malayalam Extra" w:cs="BRH Malayalam Extra"/>
+                <w:color w:val="000000"/>
+                <w:sz w:val="32"/>
+                <w:szCs w:val="32"/>
+              </w:rPr>
+              <w:t>— Gd ¥id</w:t>
+            </w:r>
+            <w:r>
+              <w:rPr>
+                <w:rFonts w:ascii="BRH Malayalam Extra" w:hAnsi="BRH Malayalam Extra" w:cs="BRH Malayalam Extra"/>
+                <w:color w:val="000000"/>
+                <w:sz w:val="26"/>
+                <w:szCs w:val="32"/>
+              </w:rPr>
+              <w:t>–</w:t>
+            </w:r>
+            <w:r>
+              <w:rPr>
+                <w:rFonts w:ascii="BRH Malayalam Extra" w:hAnsi="BRH Malayalam Extra" w:cs="BRH Malayalam Extra"/>
+                <w:color w:val="000000"/>
+                <w:sz w:val="32"/>
+                <w:szCs w:val="32"/>
+              </w:rPr>
+              <w:t xml:space="preserve"> i(³</w:t>
+            </w:r>
+            <w:proofErr w:type="gramStart"/>
+            <w:r>
+              <w:rPr>
+                <w:rFonts w:ascii="BRH Malayalam Extra" w:hAnsi="BRH Malayalam Extra" w:cs="BRH Malayalam Extra"/>
+                <w:color w:val="000000"/>
+                <w:sz w:val="32"/>
+                <w:szCs w:val="32"/>
+              </w:rPr>
+              <w:t>§)¥</w:t>
+            </w:r>
+            <w:proofErr w:type="gramEnd"/>
+            <w:r>
+              <w:rPr>
+                <w:rFonts w:ascii="BRH Malayalam Extra" w:hAnsi="BRH Malayalam Extra" w:cs="BRH Malayalam Extra"/>
+                <w:color w:val="000000"/>
+                <w:sz w:val="32"/>
+                <w:szCs w:val="32"/>
+              </w:rPr>
+              <w:t>tx— Aq§¥Tx Zõq§¥Tx</w:t>
+            </w:r>
+            <w:r>
+              <w:rPr>
+                <w:rFonts w:ascii="BRH Malayalam Extra" w:hAnsi="BRH Malayalam Extra" w:cs="BRH Malayalam Extra"/>
+                <w:color w:val="000000"/>
+                <w:sz w:val="26"/>
+                <w:szCs w:val="32"/>
+              </w:rPr>
+              <w:t>–</w:t>
+            </w:r>
+            <w:r>
+              <w:rPr>
+                <w:rFonts w:ascii="BRH Malayalam Extra" w:hAnsi="BRH Malayalam Extra" w:cs="BRH Malayalam Extra"/>
+                <w:color w:val="000000"/>
+                <w:sz w:val="32"/>
+                <w:szCs w:val="32"/>
+              </w:rPr>
+              <w:t xml:space="preserve"> Zõ(³</w:t>
+            </w:r>
+            <w:proofErr w:type="gramStart"/>
+            <w:r>
+              <w:rPr>
+                <w:rFonts w:ascii="BRH Malayalam Extra" w:hAnsi="BRH Malayalam Extra" w:cs="BRH Malayalam Extra"/>
+                <w:color w:val="000000"/>
+                <w:sz w:val="32"/>
+                <w:szCs w:val="32"/>
+              </w:rPr>
+              <w:t>§)t</w:t>
+            </w:r>
+            <w:proofErr w:type="gramEnd"/>
+            <w:r>
+              <w:rPr>
+                <w:rFonts w:ascii="BRH Malayalam Extra" w:hAnsi="BRH Malayalam Extra" w:cs="BRH Malayalam Extra"/>
+                <w:color w:val="000000"/>
+                <w:sz w:val="32"/>
+                <w:szCs w:val="32"/>
+              </w:rPr>
+              <w:t>— Gd ¥id</w:t>
+            </w:r>
+            <w:r>
+              <w:rPr>
+                <w:rFonts w:ascii="BRH Malayalam Extra" w:hAnsi="BRH Malayalam Extra" w:cs="BRH Malayalam Extra"/>
+                <w:color w:val="000000"/>
+                <w:sz w:val="26"/>
+                <w:szCs w:val="32"/>
+              </w:rPr>
+              <w:t>–</w:t>
+            </w:r>
+            <w:r>
+              <w:rPr>
+                <w:rFonts w:ascii="BRH Malayalam Extra" w:hAnsi="BRH Malayalam Extra" w:cs="BRH Malayalam Extra"/>
+                <w:color w:val="000000"/>
+                <w:sz w:val="32"/>
+                <w:szCs w:val="32"/>
+              </w:rPr>
+              <w:t xml:space="preserve"> i(³</w:t>
+            </w:r>
+            <w:proofErr w:type="gramStart"/>
+            <w:r>
+              <w:rPr>
+                <w:rFonts w:ascii="BRH Malayalam Extra" w:hAnsi="BRH Malayalam Extra" w:cs="BRH Malayalam Extra"/>
+                <w:color w:val="000000"/>
+                <w:sz w:val="32"/>
+                <w:szCs w:val="32"/>
+              </w:rPr>
+              <w:t>§)¥</w:t>
+            </w:r>
+            <w:proofErr w:type="gramEnd"/>
+            <w:r>
+              <w:rPr>
+                <w:rFonts w:ascii="BRH Malayalam Extra" w:hAnsi="BRH Malayalam Extra" w:cs="BRH Malayalam Extra"/>
+                <w:color w:val="000000"/>
+                <w:sz w:val="32"/>
+                <w:szCs w:val="32"/>
+              </w:rPr>
+              <w:t xml:space="preserve">tx— Aq§¥TxZy | </w:t>
             </w:r>
           </w:p>
           <w:p>
@@ -31073,7 +31824,27 @@
                 <w:sz w:val="32"/>
                 <w:szCs w:val="32"/>
               </w:rPr>
-              <w:t>)- A(³§)t—J | A</w:t>
+              <w:t>)- A(³</w:t>
+            </w:r>
+            <w:proofErr w:type="gramStart"/>
+            <w:r>
+              <w:rPr>
+                <w:rFonts w:ascii="BRH Malayalam Extra" w:hAnsi="BRH Malayalam Extra" w:cs="BRH Malayalam Extra"/>
+                <w:color w:val="000000"/>
+                <w:sz w:val="32"/>
+                <w:szCs w:val="32"/>
+              </w:rPr>
+              <w:t>§)t</w:t>
+            </w:r>
+            <w:proofErr w:type="gramEnd"/>
+            <w:r>
+              <w:rPr>
+                <w:rFonts w:ascii="BRH Malayalam Extra" w:hAnsi="BRH Malayalam Extra" w:cs="BRH Malayalam Extra"/>
+                <w:color w:val="000000"/>
+                <w:sz w:val="32"/>
+                <w:szCs w:val="32"/>
+              </w:rPr>
+              <w:t>—J | A</w:t>
             </w:r>
             <w:r>
               <w:rPr>
@@ -31175,25 +31946,56 @@
                 <w:sz w:val="32"/>
                 <w:szCs w:val="32"/>
               </w:rPr>
-              <w:t>A(³§)¥tx— Aq§¥Tx Zõq§¥Tx</w:t>
-            </w:r>
-            <w:r>
-              <w:rPr>
-                <w:rFonts w:ascii="BRH Malayalam Extra" w:hAnsi="BRH Malayalam Extra" w:cs="BRH Malayalam Extra"/>
-                <w:color w:val="000000"/>
-                <w:sz w:val="26"/>
-                <w:szCs w:val="32"/>
-              </w:rPr>
-              <w:t>–</w:t>
-            </w:r>
-            <w:r>
-              <w:rPr>
-                <w:rFonts w:ascii="BRH Malayalam Extra" w:hAnsi="BRH Malayalam Extra" w:cs="BRH Malayalam Extra"/>
-                <w:color w:val="000000"/>
-                <w:sz w:val="32"/>
-                <w:szCs w:val="32"/>
-              </w:rPr>
-              <w:t xml:space="preserve"> Zõ(³§)</w:t>
+              <w:lastRenderedPageBreak/>
+              <w:t>A(³</w:t>
+            </w:r>
+            <w:proofErr w:type="gramStart"/>
+            <w:r>
+              <w:rPr>
+                <w:rFonts w:ascii="BRH Malayalam Extra" w:hAnsi="BRH Malayalam Extra" w:cs="BRH Malayalam Extra"/>
+                <w:color w:val="000000"/>
+                <w:sz w:val="32"/>
+                <w:szCs w:val="32"/>
+              </w:rPr>
+              <w:t>§)¥</w:t>
+            </w:r>
+            <w:proofErr w:type="gramEnd"/>
+            <w:r>
+              <w:rPr>
+                <w:rFonts w:ascii="BRH Malayalam Extra" w:hAnsi="BRH Malayalam Extra" w:cs="BRH Malayalam Extra"/>
+                <w:color w:val="000000"/>
+                <w:sz w:val="32"/>
+                <w:szCs w:val="32"/>
+              </w:rPr>
+              <w:t>tx— Aq§¥Tx Zõq§¥Tx</w:t>
+            </w:r>
+            <w:r>
+              <w:rPr>
+                <w:rFonts w:ascii="BRH Malayalam Extra" w:hAnsi="BRH Malayalam Extra" w:cs="BRH Malayalam Extra"/>
+                <w:color w:val="000000"/>
+                <w:sz w:val="26"/>
+                <w:szCs w:val="32"/>
+              </w:rPr>
+              <w:t>–</w:t>
+            </w:r>
+            <w:r>
+              <w:rPr>
+                <w:rFonts w:ascii="BRH Malayalam Extra" w:hAnsi="BRH Malayalam Extra" w:cs="BRH Malayalam Extra"/>
+                <w:color w:val="000000"/>
+                <w:sz w:val="32"/>
+                <w:szCs w:val="32"/>
+              </w:rPr>
+              <w:t xml:space="preserve"> Zõ(³</w:t>
+            </w:r>
+            <w:proofErr w:type="gramStart"/>
+            <w:r>
+              <w:rPr>
+                <w:rFonts w:ascii="BRH Malayalam Extra" w:hAnsi="BRH Malayalam Extra" w:cs="BRH Malayalam Extra"/>
+                <w:color w:val="000000"/>
+                <w:sz w:val="32"/>
+                <w:szCs w:val="32"/>
+              </w:rPr>
+              <w:t>§)</w:t>
             </w:r>
             <w:r>
               <w:rPr>
@@ -31203,26 +32005,47 @@
                 <w:szCs w:val="32"/>
                 <w:highlight w:val="yellow"/>
               </w:rPr>
-              <w:t>¥tx—</w:t>
-            </w:r>
-            <w:r>
-              <w:rPr>
-                <w:rFonts w:ascii="BRH Malayalam Extra" w:hAnsi="BRH Malayalam Extra" w:cs="BRH Malayalam Extra"/>
-                <w:color w:val="000000"/>
-                <w:sz w:val="32"/>
-                <w:szCs w:val="32"/>
-              </w:rPr>
-              <w:t xml:space="preserve"> </w:t>
-            </w:r>
-            <w:r>
-              <w:rPr>
-                <w:rFonts w:ascii="BRH Malayalam Extra" w:hAnsi="BRH Malayalam Extra" w:cs="BRH Malayalam Extra"/>
-                <w:color w:val="000000"/>
-                <w:sz w:val="32"/>
-                <w:szCs w:val="32"/>
-              </w:rPr>
-              <w:lastRenderedPageBreak/>
-              <w:t>„(³§)¥tx— Aq§¥Tx</w:t>
+              <w:t>¥</w:t>
+            </w:r>
+            <w:proofErr w:type="gramEnd"/>
+            <w:r>
+              <w:rPr>
+                <w:rFonts w:ascii="BRH Malayalam Extra" w:hAnsi="BRH Malayalam Extra" w:cs="BRH Malayalam Extra"/>
+                <w:color w:val="000000"/>
+                <w:sz w:val="32"/>
+                <w:szCs w:val="32"/>
+                <w:highlight w:val="yellow"/>
+              </w:rPr>
+              <w:t>tx—</w:t>
+            </w:r>
+            <w:r>
+              <w:rPr>
+                <w:rFonts w:ascii="BRH Malayalam Extra" w:hAnsi="BRH Malayalam Extra" w:cs="BRH Malayalam Extra"/>
+                <w:color w:val="000000"/>
+                <w:sz w:val="32"/>
+                <w:szCs w:val="32"/>
+              </w:rPr>
+              <w:t xml:space="preserve"> „(³</w:t>
+            </w:r>
+            <w:proofErr w:type="gramStart"/>
+            <w:r>
+              <w:rPr>
+                <w:rFonts w:ascii="BRH Malayalam Extra" w:hAnsi="BRH Malayalam Extra" w:cs="BRH Malayalam Extra"/>
+                <w:color w:val="000000"/>
+                <w:sz w:val="32"/>
+                <w:szCs w:val="32"/>
+              </w:rPr>
+              <w:t>§)¥</w:t>
+            </w:r>
+            <w:proofErr w:type="gramEnd"/>
+            <w:r>
+              <w:rPr>
+                <w:rFonts w:ascii="BRH Malayalam Extra" w:hAnsi="BRH Malayalam Extra" w:cs="BRH Malayalam Extra"/>
+                <w:color w:val="000000"/>
+                <w:sz w:val="32"/>
+                <w:szCs w:val="32"/>
+              </w:rPr>
+              <w:t>tx— Aq§¥Tx</w:t>
             </w:r>
             <w:r>
               <w:rPr>
@@ -31276,7 +32099,17 @@
                 <w:sz w:val="32"/>
                 <w:szCs w:val="32"/>
               </w:rPr>
-              <w:t xml:space="preserve"> Zõ(³§)</w:t>
+              <w:t xml:space="preserve"> Zõ(³</w:t>
+            </w:r>
+            <w:proofErr w:type="gramStart"/>
+            <w:r>
+              <w:rPr>
+                <w:rFonts w:ascii="BRH Malayalam Extra" w:hAnsi="BRH Malayalam Extra" w:cs="BRH Malayalam Extra"/>
+                <w:color w:val="000000"/>
+                <w:sz w:val="32"/>
+                <w:szCs w:val="32"/>
+              </w:rPr>
+              <w:t>§)</w:t>
             </w:r>
             <w:r>
               <w:rPr>
@@ -31286,16 +32119,47 @@
                 <w:szCs w:val="32"/>
                 <w:highlight w:val="yellow"/>
               </w:rPr>
-              <w:t>¥tx</w:t>
-            </w:r>
-            <w:r>
-              <w:rPr>
-                <w:rFonts w:ascii="BRH Malayalam Extra" w:hAnsi="BRH Malayalam Extra" w:cs="BRH Malayalam Extra"/>
-                <w:color w:val="000000"/>
-                <w:sz w:val="32"/>
-                <w:szCs w:val="32"/>
-              </w:rPr>
-              <w:t>— „(³§)¥tx— Aq§¥Tx</w:t>
+              <w:t>¥</w:t>
+            </w:r>
+            <w:proofErr w:type="gramEnd"/>
+            <w:r>
+              <w:rPr>
+                <w:rFonts w:ascii="BRH Malayalam Extra" w:hAnsi="BRH Malayalam Extra" w:cs="BRH Malayalam Extra"/>
+                <w:color w:val="000000"/>
+                <w:sz w:val="32"/>
+                <w:szCs w:val="32"/>
+                <w:highlight w:val="yellow"/>
+              </w:rPr>
+              <w:t>tx</w:t>
+            </w:r>
+            <w:r>
+              <w:rPr>
+                <w:rFonts w:ascii="BRH Malayalam Extra" w:hAnsi="BRH Malayalam Extra" w:cs="BRH Malayalam Extra"/>
+                <w:color w:val="000000"/>
+                <w:sz w:val="32"/>
+                <w:szCs w:val="32"/>
+              </w:rPr>
+              <w:t>— „(³</w:t>
+            </w:r>
+            <w:proofErr w:type="gramStart"/>
+            <w:r>
+              <w:rPr>
+                <w:rFonts w:ascii="BRH Malayalam Extra" w:hAnsi="BRH Malayalam Extra" w:cs="BRH Malayalam Extra"/>
+                <w:color w:val="000000"/>
+                <w:sz w:val="32"/>
+                <w:szCs w:val="32"/>
+              </w:rPr>
+              <w:t>§)¥</w:t>
+            </w:r>
+            <w:proofErr w:type="gramEnd"/>
+            <w:r>
+              <w:rPr>
+                <w:rFonts w:ascii="BRH Malayalam Extra" w:hAnsi="BRH Malayalam Extra" w:cs="BRH Malayalam Extra"/>
+                <w:color w:val="000000"/>
+                <w:sz w:val="32"/>
+                <w:szCs w:val="32"/>
+              </w:rPr>
+              <w:t>tx— Aq§¥Tx</w:t>
             </w:r>
             <w:r>
               <w:rPr>
@@ -31525,7 +32389,27 @@
                 <w:sz w:val="32"/>
                 <w:szCs w:val="32"/>
               </w:rPr>
-              <w:t xml:space="preserve">I | A(³§)t—J | </w:t>
+              <w:t>I | A(³</w:t>
+            </w:r>
+            <w:proofErr w:type="gramStart"/>
+            <w:r>
+              <w:rPr>
+                <w:rFonts w:ascii="BRH Malayalam Extra" w:hAnsi="BRH Malayalam Extra" w:cs="BRH Malayalam Extra"/>
+                <w:color w:val="000000"/>
+                <w:sz w:val="32"/>
+                <w:szCs w:val="32"/>
+              </w:rPr>
+              <w:t>§)t</w:t>
+            </w:r>
+            <w:proofErr w:type="gramEnd"/>
+            <w:r>
+              <w:rPr>
+                <w:rFonts w:ascii="BRH Malayalam Extra" w:hAnsi="BRH Malayalam Extra" w:cs="BRH Malayalam Extra"/>
+                <w:color w:val="000000"/>
+                <w:sz w:val="32"/>
+                <w:szCs w:val="32"/>
+              </w:rPr>
+              <w:t xml:space="preserve">—J | </w:t>
             </w:r>
           </w:p>
           <w:p>
@@ -31585,7 +32469,17 @@
                 <w:sz w:val="32"/>
                 <w:szCs w:val="32"/>
               </w:rPr>
-              <w:t xml:space="preserve"> i(³§)</w:t>
+              <w:t xml:space="preserve"> i(³</w:t>
+            </w:r>
+            <w:proofErr w:type="gramStart"/>
+            <w:r>
+              <w:rPr>
+                <w:rFonts w:ascii="BRH Malayalam Extra" w:hAnsi="BRH Malayalam Extra" w:cs="BRH Malayalam Extra"/>
+                <w:color w:val="000000"/>
+                <w:sz w:val="32"/>
+                <w:szCs w:val="32"/>
+              </w:rPr>
+              <w:t>§)</w:t>
             </w:r>
             <w:r>
               <w:rPr>
@@ -31595,16 +32489,47 @@
                 <w:szCs w:val="32"/>
                 <w:highlight w:val="green"/>
               </w:rPr>
-              <w:t>¥tx</w:t>
-            </w:r>
-            <w:r>
-              <w:rPr>
-                <w:rFonts w:ascii="BRH Malayalam Extra" w:hAnsi="BRH Malayalam Extra" w:cs="BRH Malayalam Extra"/>
-                <w:color w:val="000000"/>
-                <w:sz w:val="32"/>
-                <w:szCs w:val="32"/>
-              </w:rPr>
-              <w:t xml:space="preserve"> „(³§)t— Gd</w:t>
+              <w:t>¥</w:t>
+            </w:r>
+            <w:proofErr w:type="gramEnd"/>
+            <w:r>
+              <w:rPr>
+                <w:rFonts w:ascii="BRH Malayalam Extra" w:hAnsi="BRH Malayalam Extra" w:cs="BRH Malayalam Extra"/>
+                <w:color w:val="000000"/>
+                <w:sz w:val="32"/>
+                <w:szCs w:val="32"/>
+                <w:highlight w:val="green"/>
+              </w:rPr>
+              <w:t>tx</w:t>
+            </w:r>
+            <w:r>
+              <w:rPr>
+                <w:rFonts w:ascii="BRH Malayalam Extra" w:hAnsi="BRH Malayalam Extra" w:cs="BRH Malayalam Extra"/>
+                <w:color w:val="000000"/>
+                <w:sz w:val="32"/>
+                <w:szCs w:val="32"/>
+              </w:rPr>
+              <w:t xml:space="preserve"> „(³</w:t>
+            </w:r>
+            <w:proofErr w:type="gramStart"/>
+            <w:r>
+              <w:rPr>
+                <w:rFonts w:ascii="BRH Malayalam Extra" w:hAnsi="BRH Malayalam Extra" w:cs="BRH Malayalam Extra"/>
+                <w:color w:val="000000"/>
+                <w:sz w:val="32"/>
+                <w:szCs w:val="32"/>
+              </w:rPr>
+              <w:t>§)t</w:t>
+            </w:r>
+            <w:proofErr w:type="gramEnd"/>
+            <w:r>
+              <w:rPr>
+                <w:rFonts w:ascii="BRH Malayalam Extra" w:hAnsi="BRH Malayalam Extra" w:cs="BRH Malayalam Extra"/>
+                <w:color w:val="000000"/>
+                <w:sz w:val="32"/>
+                <w:szCs w:val="32"/>
+              </w:rPr>
+              <w:t>— Gd</w:t>
             </w:r>
             <w:r>
               <w:rPr>
@@ -31640,7 +32565,27 @@
                 <w:sz w:val="32"/>
                 <w:szCs w:val="32"/>
               </w:rPr>
-              <w:t xml:space="preserve"> i(³§)t—J | </w:t>
+              <w:t xml:space="preserve"> i(³</w:t>
+            </w:r>
+            <w:proofErr w:type="gramStart"/>
+            <w:r>
+              <w:rPr>
+                <w:rFonts w:ascii="BRH Malayalam Extra" w:hAnsi="BRH Malayalam Extra" w:cs="BRH Malayalam Extra"/>
+                <w:color w:val="000000"/>
+                <w:sz w:val="32"/>
+                <w:szCs w:val="32"/>
+              </w:rPr>
+              <w:t>§)t</w:t>
+            </w:r>
+            <w:proofErr w:type="gramEnd"/>
+            <w:r>
+              <w:rPr>
+                <w:rFonts w:ascii="BRH Malayalam Extra" w:hAnsi="BRH Malayalam Extra" w:cs="BRH Malayalam Extra"/>
+                <w:color w:val="000000"/>
+                <w:sz w:val="32"/>
+                <w:szCs w:val="32"/>
+              </w:rPr>
+              <w:t xml:space="preserve">—J | </w:t>
             </w:r>
           </w:p>
           <w:p>
@@ -31802,7 +32747,27 @@
                 <w:sz w:val="32"/>
                 <w:szCs w:val="32"/>
               </w:rPr>
-              <w:t>I | A(³§)t—J | A</w:t>
+              <w:t>I | A(³</w:t>
+            </w:r>
+            <w:proofErr w:type="gramStart"/>
+            <w:r>
+              <w:rPr>
+                <w:rFonts w:ascii="BRH Malayalam Extra" w:hAnsi="BRH Malayalam Extra" w:cs="BRH Malayalam Extra"/>
+                <w:color w:val="000000"/>
+                <w:sz w:val="32"/>
+                <w:szCs w:val="32"/>
+              </w:rPr>
+              <w:t>§)t</w:t>
+            </w:r>
+            <w:proofErr w:type="gramEnd"/>
+            <w:r>
+              <w:rPr>
+                <w:rFonts w:ascii="BRH Malayalam Extra" w:hAnsi="BRH Malayalam Extra" w:cs="BRH Malayalam Extra"/>
+                <w:color w:val="000000"/>
+                <w:sz w:val="32"/>
+                <w:szCs w:val="32"/>
+              </w:rPr>
+              <w:t>—J | A</w:t>
             </w:r>
             <w:r>
               <w:rPr>
@@ -31916,8 +32881,19 @@
                 <w:sz w:val="32"/>
                 <w:szCs w:val="32"/>
               </w:rPr>
-              <w:t xml:space="preserve"> i(³§)¥</w:t>
-            </w:r>
+              <w:t xml:space="preserve"> i(³</w:t>
+            </w:r>
+            <w:proofErr w:type="gramStart"/>
+            <w:r>
+              <w:rPr>
+                <w:rFonts w:ascii="BRH Malayalam Extra" w:hAnsi="BRH Malayalam Extra" w:cs="BRH Malayalam Extra"/>
+                <w:color w:val="000000"/>
+                <w:sz w:val="32"/>
+                <w:szCs w:val="32"/>
+              </w:rPr>
+              <w:t>§)¥</w:t>
+            </w:r>
+            <w:proofErr w:type="gramEnd"/>
             <w:r>
               <w:rPr>
                 <w:rFonts w:ascii="BRH Malayalam Extra" w:hAnsi="BRH Malayalam Extra" w:cs="BRH Malayalam Extra"/>
@@ -31935,61 +32911,141 @@
                 <w:sz w:val="32"/>
                 <w:szCs w:val="32"/>
               </w:rPr>
-              <w:t xml:space="preserve"> „(³§)t— Gd ¥id</w:t>
-            </w:r>
-            <w:r>
-              <w:rPr>
-                <w:rFonts w:ascii="BRH Malayalam Extra" w:hAnsi="BRH Malayalam Extra" w:cs="BRH Malayalam Extra"/>
-                <w:color w:val="000000"/>
-                <w:sz w:val="26"/>
-                <w:szCs w:val="32"/>
-              </w:rPr>
-              <w:t>–</w:t>
-            </w:r>
-            <w:r>
-              <w:rPr>
-                <w:rFonts w:ascii="BRH Malayalam Extra" w:hAnsi="BRH Malayalam Extra" w:cs="BRH Malayalam Extra"/>
-                <w:color w:val="000000"/>
-                <w:sz w:val="32"/>
-                <w:szCs w:val="32"/>
-              </w:rPr>
-              <w:t xml:space="preserve"> i(³§)¥tx— Aq§¥Tx Zõq§¥Tx</w:t>
-            </w:r>
-            <w:r>
-              <w:rPr>
-                <w:rFonts w:ascii="BRH Malayalam Extra" w:hAnsi="BRH Malayalam Extra" w:cs="BRH Malayalam Extra"/>
-                <w:color w:val="000000"/>
-                <w:sz w:val="26"/>
-                <w:szCs w:val="32"/>
-              </w:rPr>
-              <w:t>–</w:t>
-            </w:r>
-            <w:r>
-              <w:rPr>
-                <w:rFonts w:ascii="BRH Malayalam Extra" w:hAnsi="BRH Malayalam Extra" w:cs="BRH Malayalam Extra"/>
-                <w:color w:val="000000"/>
-                <w:sz w:val="32"/>
-                <w:szCs w:val="32"/>
-              </w:rPr>
-              <w:t xml:space="preserve"> Zõ(³§)t— Gd ¥id</w:t>
-            </w:r>
-            <w:r>
-              <w:rPr>
-                <w:rFonts w:ascii="BRH Malayalam Extra" w:hAnsi="BRH Malayalam Extra" w:cs="BRH Malayalam Extra"/>
-                <w:color w:val="000000"/>
-                <w:sz w:val="26"/>
-                <w:szCs w:val="32"/>
-              </w:rPr>
-              <w:t>–</w:t>
-            </w:r>
-            <w:r>
-              <w:rPr>
-                <w:rFonts w:ascii="BRH Malayalam Extra" w:hAnsi="BRH Malayalam Extra" w:cs="BRH Malayalam Extra"/>
-                <w:color w:val="000000"/>
-                <w:sz w:val="32"/>
-                <w:szCs w:val="32"/>
-              </w:rPr>
-              <w:t xml:space="preserve"> i(³§)¥tx— Aq§¥TxZy | </w:t>
+              <w:t xml:space="preserve"> „(³</w:t>
+            </w:r>
+            <w:proofErr w:type="gramStart"/>
+            <w:r>
+              <w:rPr>
+                <w:rFonts w:ascii="BRH Malayalam Extra" w:hAnsi="BRH Malayalam Extra" w:cs="BRH Malayalam Extra"/>
+                <w:color w:val="000000"/>
+                <w:sz w:val="32"/>
+                <w:szCs w:val="32"/>
+              </w:rPr>
+              <w:t>§)t</w:t>
+            </w:r>
+            <w:proofErr w:type="gramEnd"/>
+            <w:r>
+              <w:rPr>
+                <w:rFonts w:ascii="BRH Malayalam Extra" w:hAnsi="BRH Malayalam Extra" w:cs="BRH Malayalam Extra"/>
+                <w:color w:val="000000"/>
+                <w:sz w:val="32"/>
+                <w:szCs w:val="32"/>
+              </w:rPr>
+              <w:t>— Gd ¥id</w:t>
+            </w:r>
+            <w:r>
+              <w:rPr>
+                <w:rFonts w:ascii="BRH Malayalam Extra" w:hAnsi="BRH Malayalam Extra" w:cs="BRH Malayalam Extra"/>
+                <w:color w:val="000000"/>
+                <w:sz w:val="26"/>
+                <w:szCs w:val="32"/>
+              </w:rPr>
+              <w:t>–</w:t>
+            </w:r>
+            <w:r>
+              <w:rPr>
+                <w:rFonts w:ascii="BRH Malayalam Extra" w:hAnsi="BRH Malayalam Extra" w:cs="BRH Malayalam Extra"/>
+                <w:color w:val="000000"/>
+                <w:sz w:val="32"/>
+                <w:szCs w:val="32"/>
+              </w:rPr>
+              <w:t xml:space="preserve"> i(³</w:t>
+            </w:r>
+            <w:proofErr w:type="gramStart"/>
+            <w:r>
+              <w:rPr>
+                <w:rFonts w:ascii="BRH Malayalam Extra" w:hAnsi="BRH Malayalam Extra" w:cs="BRH Malayalam Extra"/>
+                <w:color w:val="000000"/>
+                <w:sz w:val="32"/>
+                <w:szCs w:val="32"/>
+              </w:rPr>
+              <w:t>§)¥</w:t>
+            </w:r>
+            <w:proofErr w:type="gramEnd"/>
+            <w:r>
+              <w:rPr>
+                <w:rFonts w:ascii="BRH Malayalam Extra" w:hAnsi="BRH Malayalam Extra" w:cs="BRH Malayalam Extra"/>
+                <w:color w:val="000000"/>
+                <w:sz w:val="32"/>
+                <w:szCs w:val="32"/>
+              </w:rPr>
+              <w:t>tx— Aq§¥Tx Zõq§¥Tx</w:t>
+            </w:r>
+            <w:r>
+              <w:rPr>
+                <w:rFonts w:ascii="BRH Malayalam Extra" w:hAnsi="BRH Malayalam Extra" w:cs="BRH Malayalam Extra"/>
+                <w:color w:val="000000"/>
+                <w:sz w:val="26"/>
+                <w:szCs w:val="32"/>
+              </w:rPr>
+              <w:t>–</w:t>
+            </w:r>
+            <w:r>
+              <w:rPr>
+                <w:rFonts w:ascii="BRH Malayalam Extra" w:hAnsi="BRH Malayalam Extra" w:cs="BRH Malayalam Extra"/>
+                <w:color w:val="000000"/>
+                <w:sz w:val="32"/>
+                <w:szCs w:val="32"/>
+              </w:rPr>
+              <w:t xml:space="preserve"> Zõ(³</w:t>
+            </w:r>
+            <w:proofErr w:type="gramStart"/>
+            <w:r>
+              <w:rPr>
+                <w:rFonts w:ascii="BRH Malayalam Extra" w:hAnsi="BRH Malayalam Extra" w:cs="BRH Malayalam Extra"/>
+                <w:color w:val="000000"/>
+                <w:sz w:val="32"/>
+                <w:szCs w:val="32"/>
+              </w:rPr>
+              <w:t>§)t</w:t>
+            </w:r>
+            <w:proofErr w:type="gramEnd"/>
+            <w:r>
+              <w:rPr>
+                <w:rFonts w:ascii="BRH Malayalam Extra" w:hAnsi="BRH Malayalam Extra" w:cs="BRH Malayalam Extra"/>
+                <w:color w:val="000000"/>
+                <w:sz w:val="32"/>
+                <w:szCs w:val="32"/>
+              </w:rPr>
+              <w:t>— Gd ¥id</w:t>
+            </w:r>
+            <w:r>
+              <w:rPr>
+                <w:rFonts w:ascii="BRH Malayalam Extra" w:hAnsi="BRH Malayalam Extra" w:cs="BRH Malayalam Extra"/>
+                <w:color w:val="000000"/>
+                <w:sz w:val="26"/>
+                <w:szCs w:val="32"/>
+              </w:rPr>
+              <w:t>–</w:t>
+            </w:r>
+            <w:r>
+              <w:rPr>
+                <w:rFonts w:ascii="BRH Malayalam Extra" w:hAnsi="BRH Malayalam Extra" w:cs="BRH Malayalam Extra"/>
+                <w:color w:val="000000"/>
+                <w:sz w:val="32"/>
+                <w:szCs w:val="32"/>
+              </w:rPr>
+              <w:t xml:space="preserve"> i(³</w:t>
+            </w:r>
+            <w:proofErr w:type="gramStart"/>
+            <w:r>
+              <w:rPr>
+                <w:rFonts w:ascii="BRH Malayalam Extra" w:hAnsi="BRH Malayalam Extra" w:cs="BRH Malayalam Extra"/>
+                <w:color w:val="000000"/>
+                <w:sz w:val="32"/>
+                <w:szCs w:val="32"/>
+              </w:rPr>
+              <w:t>§)¥</w:t>
+            </w:r>
+            <w:proofErr w:type="gramEnd"/>
+            <w:r>
+              <w:rPr>
+                <w:rFonts w:ascii="BRH Malayalam Extra" w:hAnsi="BRH Malayalam Extra" w:cs="BRH Malayalam Extra"/>
+                <w:color w:val="000000"/>
+                <w:sz w:val="32"/>
+                <w:szCs w:val="32"/>
+              </w:rPr>
+              <w:t xml:space="preserve">tx— Aq§¥TxZy | </w:t>
             </w:r>
           </w:p>
           <w:p>
@@ -32115,7 +33171,27 @@
                 <w:sz w:val="32"/>
                 <w:szCs w:val="32"/>
               </w:rPr>
-              <w:t>)- A(³§)t—J | A</w:t>
+              <w:t>)- A(³</w:t>
+            </w:r>
+            <w:proofErr w:type="gramStart"/>
+            <w:r>
+              <w:rPr>
+                <w:rFonts w:ascii="BRH Malayalam Extra" w:hAnsi="BRH Malayalam Extra" w:cs="BRH Malayalam Extra"/>
+                <w:color w:val="000000"/>
+                <w:sz w:val="32"/>
+                <w:szCs w:val="32"/>
+              </w:rPr>
+              <w:t>§)t</w:t>
+            </w:r>
+            <w:proofErr w:type="gramEnd"/>
+            <w:r>
+              <w:rPr>
+                <w:rFonts w:ascii="BRH Malayalam Extra" w:hAnsi="BRH Malayalam Extra" w:cs="BRH Malayalam Extra"/>
+                <w:color w:val="000000"/>
+                <w:sz w:val="32"/>
+                <w:szCs w:val="32"/>
+              </w:rPr>
+              <w:t>—J | A</w:t>
             </w:r>
             <w:r>
               <w:rPr>
@@ -32217,25 +33293,56 @@
                 <w:sz w:val="32"/>
                 <w:szCs w:val="32"/>
               </w:rPr>
-              <w:t>A(³§)¥tx— Aq§¥Tx Zõq§¥Tx</w:t>
-            </w:r>
-            <w:r>
-              <w:rPr>
-                <w:rFonts w:ascii="BRH Malayalam Extra" w:hAnsi="BRH Malayalam Extra" w:cs="BRH Malayalam Extra"/>
-                <w:color w:val="000000"/>
-                <w:sz w:val="26"/>
-                <w:szCs w:val="32"/>
-              </w:rPr>
-              <w:t>–</w:t>
-            </w:r>
-            <w:r>
-              <w:rPr>
-                <w:rFonts w:ascii="BRH Malayalam Extra" w:hAnsi="BRH Malayalam Extra" w:cs="BRH Malayalam Extra"/>
-                <w:color w:val="000000"/>
-                <w:sz w:val="32"/>
-                <w:szCs w:val="32"/>
-              </w:rPr>
-              <w:t xml:space="preserve"> Zõ(³§)</w:t>
+              <w:lastRenderedPageBreak/>
+              <w:t>A(³</w:t>
+            </w:r>
+            <w:proofErr w:type="gramStart"/>
+            <w:r>
+              <w:rPr>
+                <w:rFonts w:ascii="BRH Malayalam Extra" w:hAnsi="BRH Malayalam Extra" w:cs="BRH Malayalam Extra"/>
+                <w:color w:val="000000"/>
+                <w:sz w:val="32"/>
+                <w:szCs w:val="32"/>
+              </w:rPr>
+              <w:t>§)¥</w:t>
+            </w:r>
+            <w:proofErr w:type="gramEnd"/>
+            <w:r>
+              <w:rPr>
+                <w:rFonts w:ascii="BRH Malayalam Extra" w:hAnsi="BRH Malayalam Extra" w:cs="BRH Malayalam Extra"/>
+                <w:color w:val="000000"/>
+                <w:sz w:val="32"/>
+                <w:szCs w:val="32"/>
+              </w:rPr>
+              <w:t>tx— Aq§¥Tx Zõq§¥Tx</w:t>
+            </w:r>
+            <w:r>
+              <w:rPr>
+                <w:rFonts w:ascii="BRH Malayalam Extra" w:hAnsi="BRH Malayalam Extra" w:cs="BRH Malayalam Extra"/>
+                <w:color w:val="000000"/>
+                <w:sz w:val="26"/>
+                <w:szCs w:val="32"/>
+              </w:rPr>
+              <w:t>–</w:t>
+            </w:r>
+            <w:r>
+              <w:rPr>
+                <w:rFonts w:ascii="BRH Malayalam Extra" w:hAnsi="BRH Malayalam Extra" w:cs="BRH Malayalam Extra"/>
+                <w:color w:val="000000"/>
+                <w:sz w:val="32"/>
+                <w:szCs w:val="32"/>
+              </w:rPr>
+              <w:t xml:space="preserve"> Zõ(³</w:t>
+            </w:r>
+            <w:proofErr w:type="gramStart"/>
+            <w:r>
+              <w:rPr>
+                <w:rFonts w:ascii="BRH Malayalam Extra" w:hAnsi="BRH Malayalam Extra" w:cs="BRH Malayalam Extra"/>
+                <w:color w:val="000000"/>
+                <w:sz w:val="32"/>
+                <w:szCs w:val="32"/>
+              </w:rPr>
+              <w:t>§)</w:t>
             </w:r>
             <w:r>
               <w:rPr>
@@ -32245,26 +33352,47 @@
                 <w:szCs w:val="32"/>
                 <w:highlight w:val="green"/>
               </w:rPr>
-              <w:t>¥tx</w:t>
-            </w:r>
-            <w:r>
-              <w:rPr>
-                <w:rFonts w:ascii="BRH Malayalam Extra" w:hAnsi="BRH Malayalam Extra" w:cs="BRH Malayalam Extra"/>
-                <w:color w:val="000000"/>
-                <w:sz w:val="32"/>
-                <w:szCs w:val="32"/>
-              </w:rPr>
-              <w:t xml:space="preserve"> </w:t>
-            </w:r>
-            <w:r>
-              <w:rPr>
-                <w:rFonts w:ascii="BRH Malayalam Extra" w:hAnsi="BRH Malayalam Extra" w:cs="BRH Malayalam Extra"/>
-                <w:color w:val="000000"/>
-                <w:sz w:val="32"/>
-                <w:szCs w:val="32"/>
-              </w:rPr>
-              <w:lastRenderedPageBreak/>
-              <w:t>„(³§)¥tx— Aq§¥Tx</w:t>
+              <w:t>¥</w:t>
+            </w:r>
+            <w:proofErr w:type="gramEnd"/>
+            <w:r>
+              <w:rPr>
+                <w:rFonts w:ascii="BRH Malayalam Extra" w:hAnsi="BRH Malayalam Extra" w:cs="BRH Malayalam Extra"/>
+                <w:color w:val="000000"/>
+                <w:sz w:val="32"/>
+                <w:szCs w:val="32"/>
+                <w:highlight w:val="green"/>
+              </w:rPr>
+              <w:t>tx</w:t>
+            </w:r>
+            <w:r>
+              <w:rPr>
+                <w:rFonts w:ascii="BRH Malayalam Extra" w:hAnsi="BRH Malayalam Extra" w:cs="BRH Malayalam Extra"/>
+                <w:color w:val="000000"/>
+                <w:sz w:val="32"/>
+                <w:szCs w:val="32"/>
+              </w:rPr>
+              <w:t xml:space="preserve"> „(³</w:t>
+            </w:r>
+            <w:proofErr w:type="gramStart"/>
+            <w:r>
+              <w:rPr>
+                <w:rFonts w:ascii="BRH Malayalam Extra" w:hAnsi="BRH Malayalam Extra" w:cs="BRH Malayalam Extra"/>
+                <w:color w:val="000000"/>
+                <w:sz w:val="32"/>
+                <w:szCs w:val="32"/>
+              </w:rPr>
+              <w:t>§)¥</w:t>
+            </w:r>
+            <w:proofErr w:type="gramEnd"/>
+            <w:r>
+              <w:rPr>
+                <w:rFonts w:ascii="BRH Malayalam Extra" w:hAnsi="BRH Malayalam Extra" w:cs="BRH Malayalam Extra"/>
+                <w:color w:val="000000"/>
+                <w:sz w:val="32"/>
+                <w:szCs w:val="32"/>
+              </w:rPr>
+              <w:t>tx— Aq§¥Tx</w:t>
             </w:r>
             <w:r>
               <w:rPr>
@@ -32342,7 +33470,17 @@
                 <w:sz w:val="32"/>
                 <w:szCs w:val="32"/>
               </w:rPr>
-              <w:t xml:space="preserve"> Zõ(³§)</w:t>
+              <w:t xml:space="preserve"> Zõ(³</w:t>
+            </w:r>
+            <w:proofErr w:type="gramStart"/>
+            <w:r>
+              <w:rPr>
+                <w:rFonts w:ascii="BRH Malayalam Extra" w:hAnsi="BRH Malayalam Extra" w:cs="BRH Malayalam Extra"/>
+                <w:color w:val="000000"/>
+                <w:sz w:val="32"/>
+                <w:szCs w:val="32"/>
+              </w:rPr>
+              <w:t>§)</w:t>
             </w:r>
             <w:r>
               <w:rPr>
@@ -32352,16 +33490,47 @@
                 <w:szCs w:val="32"/>
                 <w:highlight w:val="green"/>
               </w:rPr>
-              <w:t>¥tx</w:t>
-            </w:r>
-            <w:r>
-              <w:rPr>
-                <w:rFonts w:ascii="BRH Malayalam Extra" w:hAnsi="BRH Malayalam Extra" w:cs="BRH Malayalam Extra"/>
-                <w:color w:val="000000"/>
-                <w:sz w:val="32"/>
-                <w:szCs w:val="32"/>
-              </w:rPr>
-              <w:t xml:space="preserve"> „(³§)¥tx— Aq§¥Tx</w:t>
+              <w:t>¥</w:t>
+            </w:r>
+            <w:proofErr w:type="gramEnd"/>
+            <w:r>
+              <w:rPr>
+                <w:rFonts w:ascii="BRH Malayalam Extra" w:hAnsi="BRH Malayalam Extra" w:cs="BRH Malayalam Extra"/>
+                <w:color w:val="000000"/>
+                <w:sz w:val="32"/>
+                <w:szCs w:val="32"/>
+                <w:highlight w:val="green"/>
+              </w:rPr>
+              <w:t>tx</w:t>
+            </w:r>
+            <w:r>
+              <w:rPr>
+                <w:rFonts w:ascii="BRH Malayalam Extra" w:hAnsi="BRH Malayalam Extra" w:cs="BRH Malayalam Extra"/>
+                <w:color w:val="000000"/>
+                <w:sz w:val="32"/>
+                <w:szCs w:val="32"/>
+              </w:rPr>
+              <w:t xml:space="preserve"> „(³</w:t>
+            </w:r>
+            <w:proofErr w:type="gramStart"/>
+            <w:r>
+              <w:rPr>
+                <w:rFonts w:ascii="BRH Malayalam Extra" w:hAnsi="BRH Malayalam Extra" w:cs="BRH Malayalam Extra"/>
+                <w:color w:val="000000"/>
+                <w:sz w:val="32"/>
+                <w:szCs w:val="32"/>
+              </w:rPr>
+              <w:t>§)¥</w:t>
+            </w:r>
+            <w:proofErr w:type="gramEnd"/>
+            <w:r>
+              <w:rPr>
+                <w:rFonts w:ascii="BRH Malayalam Extra" w:hAnsi="BRH Malayalam Extra" w:cs="BRH Malayalam Extra"/>
+                <w:color w:val="000000"/>
+                <w:sz w:val="32"/>
+                <w:szCs w:val="32"/>
+              </w:rPr>
+              <w:t>tx— Aq§¥Tx</w:t>
             </w:r>
             <w:r>
               <w:rPr>

</xml_diff>

<commit_message>
nmv 09 09 2026
</commit_message>
<xml_diff>
--- a/TS Jatai Ghanam Project/TS 3.4/TS 3.4 Ghanam Malayalam Corrections.docx
+++ b/TS Jatai Ghanam Project/TS 3.4/TS 3.4 Ghanam Malayalam Corrections.docx
@@ -1,6 +1,6 @@
 
 <file path=word/document.xml><?xml version="1.0" encoding="utf-8"?>
-<w:document xmlns:wpc="http://schemas.microsoft.com/office/word/2010/wordprocessingCanvas" xmlns:cx="http://schemas.microsoft.com/office/drawing/2014/chartex" xmlns:cx1="http://schemas.microsoft.com/office/drawing/2015/9/8/chartex" xmlns:cx2="http://schemas.microsoft.com/office/drawing/2015/10/21/chartex" xmlns:cx3="http://schemas.microsoft.com/office/drawing/2016/5/9/chartex" xmlns:cx4="http://schemas.microsoft.com/office/drawing/2016/5/10/chartex" xmlns:cx5="http://schemas.microsoft.com/office/drawing/2016/5/11/chartex" xmlns:cx6="http://schemas.microsoft.com/office/drawing/2016/5/12/chartex" xmlns:cx7="http://schemas.microsoft.com/office/drawing/2016/5/13/chartex" xmlns:cx8="http://schemas.microsoft.com/office/drawing/2016/5/14/chartex" xmlns:mc="http://schemas.openxmlformats.org/markup-compatibility/2006" xmlns:aink="http://schemas.microsoft.com/office/drawing/2016/ink" xmlns:am3d="http://schemas.microsoft.com/office/drawing/2017/model3d" xmlns:o="urn:schemas-microsoft-com:office:office" xmlns:oel="http://schemas.microsoft.com/office/2019/extlst" xmlns:r="http://schemas.openxmlformats.org/officeDocument/2006/relationships" xmlns:m="http://schemas.openxmlformats.org/officeDocument/2006/math" xmlns:v="urn:schemas-microsoft-com:vml" xmlns:wp14="http://schemas.microsoft.com/office/word/2010/wordprocessingDrawing" xmlns:wp="http://schemas.openxmlformats.org/drawingml/2006/wordprocessingDrawing" xmlns:w10="urn:schemas-microsoft-com:office:word" xmlns:w="http://schemas.openxmlformats.org/wordprocessingml/2006/main" xmlns:w14="http://schemas.microsoft.com/office/word/2010/wordml" xmlns:w15="http://schemas.microsoft.com/office/word/2012/wordml" xmlns:w16cei="http://schemas.microsoft.com/office/word/2026/wordml/cei" xmlns:w16cex="http://schemas.microsoft.com/office/word/2018/wordml/cex" xmlns:w16cid="http://schemas.microsoft.com/office/word/2016/wordml/cid" xmlns:w16="http://schemas.microsoft.com/office/word/2018/wordml" xmlns:w16du="http://schemas.microsoft.com/office/word/2023/wordml/word16du" xmlns:w16sdtdh="http://schemas.microsoft.com/office/word/2020/wordml/sdtdatahash" xmlns:w16sdtfl="http://schemas.microsoft.com/office/word/2024/wordml/sdtformatlock" xmlns:w16se="http://schemas.microsoft.com/office/word/2015/wordml/symex" xmlns:wpg="http://schemas.microsoft.com/office/word/2010/wordprocessingGroup" xmlns:wpi="http://schemas.microsoft.com/office/word/2010/wordprocessingInk" xmlns:wne="http://schemas.microsoft.com/office/word/2006/wordml" xmlns:wps="http://schemas.microsoft.com/office/word/2010/wordprocessingShape" mc:Ignorable="w14 w15 w16se w16cid w16 w16cex w16sdtdh w16sdtfl w16du wp14">
+<w:document xmlns:wpc="http://schemas.microsoft.com/office/word/2010/wordprocessingCanvas" xmlns:cx="http://schemas.microsoft.com/office/drawing/2014/chartex" xmlns:cx1="http://schemas.microsoft.com/office/drawing/2015/9/8/chartex" xmlns:cx2="http://schemas.microsoft.com/office/drawing/2015/10/21/chartex" xmlns:cx3="http://schemas.microsoft.com/office/drawing/2016/5/9/chartex" xmlns:cx4="http://schemas.microsoft.com/office/drawing/2016/5/10/chartex" xmlns:cx5="http://schemas.microsoft.com/office/drawing/2016/5/11/chartex" xmlns:cx6="http://schemas.microsoft.com/office/drawing/2016/5/12/chartex" xmlns:cx7="http://schemas.microsoft.com/office/drawing/2016/5/13/chartex" xmlns:cx8="http://schemas.microsoft.com/office/drawing/2016/5/14/chartex" xmlns:mc="http://schemas.openxmlformats.org/markup-compatibility/2006" xmlns:aink="http://schemas.microsoft.com/office/drawing/2016/ink" xmlns:am3d="http://schemas.microsoft.com/office/drawing/2017/model3d" xmlns:o="urn:schemas-microsoft-com:office:office" xmlns:oel="http://schemas.microsoft.com/office/2019/extlst" xmlns:r="http://schemas.openxmlformats.org/officeDocument/2006/relationships" xmlns:m="http://schemas.openxmlformats.org/officeDocument/2006/math" xmlns:v="urn:schemas-microsoft-com:vml" xmlns:wp14="http://schemas.microsoft.com/office/word/2010/wordprocessingDrawing" xmlns:wp="http://schemas.openxmlformats.org/drawingml/2006/wordprocessingDrawing" xmlns:w10="urn:schemas-microsoft-com:office:word" xmlns:w="http://schemas.openxmlformats.org/wordprocessingml/2006/main" xmlns:w14="http://schemas.microsoft.com/office/word/2010/wordml" xmlns:w15="http://schemas.microsoft.com/office/word/2012/wordml" xmlns:w16cex="http://schemas.microsoft.com/office/word/2018/wordml/cex" xmlns:w16cid="http://schemas.microsoft.com/office/word/2016/wordml/cid" xmlns:w16="http://schemas.microsoft.com/office/word/2018/wordml" xmlns:w16du="http://schemas.microsoft.com/office/word/2023/wordml/word16du" xmlns:w16sdtdh="http://schemas.microsoft.com/office/word/2020/wordml/sdtdatahash" xmlns:w16sdtfl="http://schemas.microsoft.com/office/word/2024/wordml/sdtformatlock" xmlns:w16se="http://schemas.microsoft.com/office/word/2015/wordml/symex" xmlns:wpg="http://schemas.microsoft.com/office/word/2010/wordprocessingGroup" xmlns:wpi="http://schemas.microsoft.com/office/word/2010/wordprocessingInk" xmlns:wne="http://schemas.microsoft.com/office/word/2006/wordml" xmlns:wps="http://schemas.microsoft.com/office/word/2010/wordprocessingShape" mc:Ignorable="w14 w15 w16se w16cid w16 w16cex w16sdtdh w16sdtfl w16du wp14">
   <w:body>
     <w:p>
       <w:pPr>
@@ -112,9 +112,8 @@
           <w:szCs w:val="32"/>
           <w:u w:val="single"/>
         </w:rPr>
-        <w:t xml:space="preserve">Observed </w:t>
+        <w:t xml:space="preserve">Observed till </w:t>
       </w:r>
-      <w:proofErr w:type="gramStart"/>
       <w:r>
         <w:rPr>
           <w:b/>
@@ -123,20 +122,8 @@
           <w:szCs w:val="32"/>
           <w:u w:val="single"/>
         </w:rPr>
-        <w:t xml:space="preserve">till </w:t>
+        <w:t>31st Aug 2026</w:t>
       </w:r>
-      <w:r>
-        <w:rPr>
-          <w:b/>
-          <w:bCs/>
-          <w:sz w:val="32"/>
-          <w:szCs w:val="32"/>
-          <w:highlight w:val="red"/>
-          <w:u w:val="single"/>
-        </w:rPr>
-        <w:t>?????</w:t>
-      </w:r>
-      <w:proofErr w:type="gramEnd"/>
     </w:p>
     <w:p>
       <w:pPr>
@@ -2599,50 +2586,43 @@
           </w:p>
         </w:tc>
       </w:tr>
-      <w:tr>
-        <w:trPr>
-          <w:trHeight w:val="1183"/>
-        </w:trPr>
-        <w:tc>
-          <w:tcPr>
-            <w:tcW w:w="7166" w:type="dxa"/>
-          </w:tcPr>
-          <w:p>
-            <w:pPr>
-              <w:widowControl w:val="0"/>
-              <w:autoSpaceDE w:val="0"/>
-              <w:autoSpaceDN w:val="0"/>
-              <w:adjustRightInd w:val="0"/>
-              <w:spacing w:before="0" w:line="240" w:lineRule="auto"/>
-              <w:rPr>
-                <w:rFonts w:cs="ar"/>
-                <w:color w:val="000000"/>
-                <w:szCs w:val="36"/>
-              </w:rPr>
-            </w:pPr>
-          </w:p>
-        </w:tc>
-        <w:tc>
-          <w:tcPr>
-            <w:tcW w:w="7371" w:type="dxa"/>
-          </w:tcPr>
-          <w:p>
-            <w:pPr>
-              <w:widowControl w:val="0"/>
-              <w:autoSpaceDE w:val="0"/>
-              <w:autoSpaceDN w:val="0"/>
-              <w:adjustRightInd w:val="0"/>
-              <w:spacing w:before="0" w:line="240" w:lineRule="auto"/>
-              <w:rPr>
-                <w:rFonts w:cs="ar"/>
-                <w:color w:val="000000"/>
-                <w:szCs w:val="36"/>
-              </w:rPr>
-            </w:pPr>
-          </w:p>
-        </w:tc>
-      </w:tr>
     </w:tbl>
+    <w:p>
+      <w:pPr>
+        <w:spacing w:before="0" w:line="240" w:lineRule="auto"/>
+        <w:jc w:val="center"/>
+        <w:rPr>
+          <w:b/>
+          <w:bCs/>
+          <w:sz w:val="32"/>
+          <w:szCs w:val="32"/>
+          <w:u w:val="single"/>
+        </w:rPr>
+      </w:pPr>
+      <w:r>
+        <w:rPr>
+          <w:b/>
+          <w:bCs/>
+          <w:sz w:val="32"/>
+          <w:szCs w:val="32"/>
+          <w:u w:val="single"/>
+        </w:rPr>
+        <w:t>============</w:t>
+      </w:r>
+    </w:p>
+    <w:p>
+      <w:pPr>
+        <w:spacing w:before="0" w:line="240" w:lineRule="auto"/>
+        <w:jc w:val="center"/>
+        <w:rPr>
+          <w:b/>
+          <w:bCs/>
+          <w:sz w:val="32"/>
+          <w:szCs w:val="32"/>
+          <w:u w:val="single"/>
+        </w:rPr>
+      </w:pPr>
+    </w:p>
     <w:p>
       <w:pPr>
         <w:spacing w:before="0" w:line="240" w:lineRule="auto"/>
@@ -2702,6 +2682,7 @@
           <w:szCs w:val="32"/>
           <w:u w:val="single"/>
         </w:rPr>
+        <w:lastRenderedPageBreak/>
         <w:t xml:space="preserve">TS </w:t>
       </w:r>
       <w:r>
@@ -3530,6 +3511,124 @@
               <w:adjustRightInd w:val="0"/>
               <w:spacing w:before="0" w:line="240" w:lineRule="auto"/>
               <w:rPr>
+                <w:rFonts w:ascii="BRH Malayalam Extra" w:hAnsi="BRH Malayalam Extra" w:cs="BRH Malayalam Extra"/>
+                <w:color w:val="000000"/>
+                <w:sz w:val="32"/>
+                <w:szCs w:val="32"/>
+              </w:rPr>
+            </w:pPr>
+            <w:r>
+              <w:rPr>
+                <w:rFonts w:ascii="BRH Malayalam Extra" w:hAnsi="BRH Malayalam Extra" w:cs="BRH Malayalam Extra"/>
+                <w:color w:val="000000"/>
+                <w:sz w:val="32"/>
+                <w:szCs w:val="32"/>
+              </w:rPr>
+              <w:t>BªPâ— Zõ£</w:t>
+            </w:r>
+            <w:r>
+              <w:rPr>
+                <w:rFonts w:ascii="BRH Malayalam Extra" w:hAnsi="BRH Malayalam Extra" w:cs="BRH Malayalam Extra"/>
+                <w:color w:val="000000"/>
+                <w:sz w:val="32"/>
+                <w:szCs w:val="32"/>
+                <w:highlight w:val="green"/>
+              </w:rPr>
+              <w:t>Pâ</w:t>
+            </w:r>
+            <w:r>
+              <w:rPr>
+                <w:rFonts w:ascii="BRH Malayalam Extra" w:hAnsi="BRH Malayalam Extra" w:cs="BRH Malayalam Extra"/>
+                <w:color w:val="000000"/>
+                <w:sz w:val="26"/>
+                <w:szCs w:val="32"/>
+                <w:highlight w:val="green"/>
+              </w:rPr>
+              <w:t>–</w:t>
+            </w:r>
+            <w:r>
+              <w:rPr>
+                <w:rFonts w:ascii="BRH Malayalam Extra" w:hAnsi="BRH Malayalam Extra" w:cs="BRH Malayalam Extra"/>
+                <w:color w:val="000000"/>
+                <w:sz w:val="32"/>
+                <w:szCs w:val="32"/>
+              </w:rPr>
+              <w:t xml:space="preserve"> Zõxª</w:t>
+            </w:r>
+            <w:r>
+              <w:rPr>
+                <w:rFonts w:ascii="BRH Malayalam Extra" w:hAnsi="BRH Malayalam Extra" w:cs="BRH Malayalam Extra"/>
+                <w:color w:val="000000"/>
+                <w:sz w:val="32"/>
+                <w:szCs w:val="32"/>
+                <w:highlight w:val="green"/>
+              </w:rPr>
+              <w:t>P</w:t>
+            </w:r>
+            <w:r>
+              <w:rPr>
+                <w:rFonts w:ascii="BRH Malayalam Extra" w:hAnsi="BRH Malayalam Extra" w:cs="BRH Malayalam Extra"/>
+                <w:color w:val="000000"/>
+                <w:sz w:val="32"/>
+                <w:szCs w:val="32"/>
+                <w:highlight w:val="yellow"/>
+              </w:rPr>
+              <w:t>â</w:t>
+            </w:r>
+            <w:r>
+              <w:rPr>
+                <w:rFonts w:ascii="BRH Malayalam Extra" w:hAnsi="BRH Malayalam Extra" w:cs="BRH Malayalam Extra"/>
+                <w:color w:val="000000"/>
+                <w:sz w:val="32"/>
+                <w:szCs w:val="32"/>
+              </w:rPr>
+              <w:t>—Zy</w:t>
+            </w:r>
+            <w:r>
+              <w:rPr>
+                <w:rFonts w:ascii="BRH Malayalam Extra" w:hAnsi="BRH Malayalam Extra" w:cs="BRH Malayalam Extra"/>
+                <w:color w:val="000000"/>
+                <w:sz w:val="26"/>
+                <w:szCs w:val="32"/>
+              </w:rPr>
+              <w:t>–</w:t>
+            </w:r>
+            <w:r>
+              <w:rPr>
+                <w:rFonts w:ascii="BRH Malayalam Extra" w:hAnsi="BRH Malayalam Extra" w:cs="BRH Malayalam Extra"/>
+                <w:color w:val="000000"/>
+                <w:sz w:val="32"/>
+                <w:szCs w:val="32"/>
+              </w:rPr>
+              <w:t xml:space="preserve"> jR—ix¥dx</w:t>
+            </w:r>
+            <w:r>
+              <w:rPr>
+                <w:rFonts w:ascii="BRH Malayalam Extra" w:hAnsi="BRH Malayalam Extra" w:cs="BRH Malayalam Extra"/>
+                <w:color w:val="000000"/>
+                <w:sz w:val="26"/>
+                <w:szCs w:val="32"/>
+              </w:rPr>
+              <w:t>–</w:t>
+            </w:r>
+            <w:r>
+              <w:rPr>
+                <w:rFonts w:ascii="BRH Malayalam Extra" w:hAnsi="BRH Malayalam Extra" w:cs="BRH Malayalam Extra"/>
+                <w:color w:val="000000"/>
+                <w:sz w:val="32"/>
+                <w:szCs w:val="32"/>
+              </w:rPr>
+              <w:t xml:space="preserve"> jR—ixd </w:t>
+            </w:r>
+          </w:p>
+          <w:p>
+            <w:pPr>
+              <w:widowControl w:val="0"/>
+              <w:autoSpaceDE w:val="0"/>
+              <w:autoSpaceDN w:val="0"/>
+              <w:adjustRightInd w:val="0"/>
+              <w:spacing w:before="0" w:line="240" w:lineRule="auto"/>
+              <w:rPr>
                 <w:rFonts w:cs="BRH Malayalam Extra"/>
                 <w:color w:val="FF0000"/>
                 <w:szCs w:val="40"/>
@@ -3542,101 +3641,7 @@
                 <w:sz w:val="32"/>
                 <w:szCs w:val="32"/>
               </w:rPr>
-              <w:t>BªPâ— Zõ£</w:t>
-            </w:r>
-            <w:r>
-              <w:rPr>
-                <w:rFonts w:ascii="BRH Malayalam Extra" w:hAnsi="BRH Malayalam Extra" w:cs="BRH Malayalam Extra"/>
-                <w:color w:val="000000"/>
-                <w:sz w:val="32"/>
-                <w:szCs w:val="32"/>
-                <w:highlight w:val="green"/>
-              </w:rPr>
-              <w:t>Pâ</w:t>
-            </w:r>
-            <w:r>
-              <w:rPr>
-                <w:rFonts w:ascii="BRH Malayalam Extra" w:hAnsi="BRH Malayalam Extra" w:cs="BRH Malayalam Extra"/>
-                <w:color w:val="000000"/>
-                <w:sz w:val="26"/>
-                <w:szCs w:val="32"/>
-                <w:highlight w:val="green"/>
-              </w:rPr>
-              <w:t>–</w:t>
-            </w:r>
-            <w:r>
-              <w:rPr>
-                <w:rFonts w:ascii="BRH Malayalam Extra" w:hAnsi="BRH Malayalam Extra" w:cs="BRH Malayalam Extra"/>
-                <w:color w:val="000000"/>
-                <w:sz w:val="32"/>
-                <w:szCs w:val="32"/>
-              </w:rPr>
-              <w:t xml:space="preserve"> Zõxª</w:t>
-            </w:r>
-            <w:r>
-              <w:rPr>
-                <w:rFonts w:ascii="BRH Malayalam Extra" w:hAnsi="BRH Malayalam Extra" w:cs="BRH Malayalam Extra"/>
-                <w:color w:val="000000"/>
-                <w:sz w:val="32"/>
-                <w:szCs w:val="32"/>
-                <w:highlight w:val="green"/>
-              </w:rPr>
-              <w:t>P</w:t>
-            </w:r>
-            <w:r>
-              <w:rPr>
-                <w:rFonts w:ascii="BRH Malayalam Extra" w:hAnsi="BRH Malayalam Extra" w:cs="BRH Malayalam Extra"/>
-                <w:color w:val="000000"/>
-                <w:sz w:val="32"/>
-                <w:szCs w:val="32"/>
-                <w:highlight w:val="yellow"/>
-              </w:rPr>
-              <w:t>â</w:t>
-            </w:r>
-            <w:r>
-              <w:rPr>
-                <w:rFonts w:ascii="BRH Malayalam Extra" w:hAnsi="BRH Malayalam Extra" w:cs="BRH Malayalam Extra"/>
-                <w:color w:val="000000"/>
-                <w:sz w:val="32"/>
-                <w:szCs w:val="32"/>
-              </w:rPr>
-              <w:t>—Zy</w:t>
-            </w:r>
-            <w:r>
-              <w:rPr>
-                <w:rFonts w:ascii="BRH Malayalam Extra" w:hAnsi="BRH Malayalam Extra" w:cs="BRH Malayalam Extra"/>
-                <w:color w:val="000000"/>
-                <w:sz w:val="26"/>
-                <w:szCs w:val="32"/>
-              </w:rPr>
-              <w:t>–</w:t>
-            </w:r>
-            <w:r>
-              <w:rPr>
-                <w:rFonts w:ascii="BRH Malayalam Extra" w:hAnsi="BRH Malayalam Extra" w:cs="BRH Malayalam Extra"/>
-                <w:color w:val="000000"/>
-                <w:sz w:val="32"/>
-                <w:szCs w:val="32"/>
-              </w:rPr>
-              <w:t xml:space="preserve"> jR—ix¥dx</w:t>
-            </w:r>
-            <w:r>
-              <w:rPr>
-                <w:rFonts w:ascii="BRH Malayalam Extra" w:hAnsi="BRH Malayalam Extra" w:cs="BRH Malayalam Extra"/>
-                <w:color w:val="000000"/>
-                <w:sz w:val="26"/>
-                <w:szCs w:val="32"/>
-              </w:rPr>
-              <w:t>–</w:t>
-            </w:r>
-            <w:r>
-              <w:rPr>
-                <w:rFonts w:ascii="BRH Malayalam Extra" w:hAnsi="BRH Malayalam Extra" w:cs="BRH Malayalam Extra"/>
-                <w:color w:val="000000"/>
-                <w:sz w:val="32"/>
-                <w:szCs w:val="32"/>
-              </w:rPr>
-              <w:t xml:space="preserve"> jR—ixd E</w:t>
+              <w:t>E</w:t>
             </w:r>
             <w:r>
               <w:rPr>
@@ -5496,6 +5501,22 @@
                 <w:lang w:val="it-IT"/>
               </w:rPr>
             </w:pPr>
+          </w:p>
+          <w:p>
+            <w:pPr>
+              <w:widowControl w:val="0"/>
+              <w:autoSpaceDE w:val="0"/>
+              <w:autoSpaceDN w:val="0"/>
+              <w:adjustRightInd w:val="0"/>
+              <w:spacing w:before="0" w:line="240" w:lineRule="auto"/>
+              <w:rPr>
+                <w:rFonts w:ascii="BRH Malayalam Extra" w:hAnsi="BRH Malayalam Extra" w:cs="BRH Malayalam Extra"/>
+                <w:color w:val="000000"/>
+                <w:sz w:val="32"/>
+                <w:szCs w:val="32"/>
+                <w:lang w:val="it-IT"/>
+              </w:rPr>
+            </w:pPr>
             <w:r>
               <w:rPr>
                 <w:rFonts w:cs="BRH Malayalam Extra"/>
@@ -7227,152 +7248,6 @@
                 <w:lang w:val="it-IT"/>
               </w:rPr>
             </w:pPr>
-            <w:r>
-              <w:rPr>
-                <w:rFonts w:cs="BRH Malayalam Extra"/>
-                <w:color w:val="000000"/>
-                <w:szCs w:val="32"/>
-                <w:lang w:val="it-IT"/>
-              </w:rPr>
-              <w:lastRenderedPageBreak/>
-              <w:t>45</w:t>
-            </w:r>
-            <w:r>
-              <w:rPr>
-                <w:rFonts w:ascii="BRH Malayalam Extra" w:hAnsi="BRH Malayalam Extra" w:cs="BRH Malayalam Extra"/>
-                <w:color w:val="000000"/>
-                <w:sz w:val="32"/>
-                <w:szCs w:val="32"/>
-                <w:lang w:val="it-IT"/>
-              </w:rPr>
-              <w:t>)</w:t>
-            </w:r>
-            <w:r>
-              <w:rPr>
-                <w:rFonts w:ascii="BRH Malayalam Extra" w:hAnsi="BRH Malayalam Extra" w:cs="BRH Malayalam Extra"/>
-                <w:color w:val="000000"/>
-                <w:sz w:val="32"/>
-                <w:szCs w:val="32"/>
-                <w:lang w:val="it-IT"/>
-              </w:rPr>
-              <w:tab/>
-            </w:r>
-            <w:r>
-              <w:rPr>
-                <w:rFonts w:cs="BRH Malayalam Extra"/>
-                <w:color w:val="000000"/>
-                <w:szCs w:val="32"/>
-                <w:lang w:val="it-IT"/>
-              </w:rPr>
-              <w:t>3</w:t>
-            </w:r>
-            <w:r>
-              <w:rPr>
-                <w:rFonts w:ascii="BRH Malayalam Extra" w:hAnsi="BRH Malayalam Extra" w:cs="BRH Malayalam Extra"/>
-                <w:color w:val="000000"/>
-                <w:sz w:val="32"/>
-                <w:szCs w:val="32"/>
-                <w:lang w:val="it-IT"/>
-              </w:rPr>
-              <w:t>.</w:t>
-            </w:r>
-            <w:r>
-              <w:rPr>
-                <w:rFonts w:cs="BRH Malayalam Extra"/>
-                <w:color w:val="000000"/>
-                <w:szCs w:val="32"/>
-                <w:lang w:val="it-IT"/>
-              </w:rPr>
-              <w:t>4</w:t>
-            </w:r>
-            <w:r>
-              <w:rPr>
-                <w:rFonts w:ascii="BRH Malayalam Extra" w:hAnsi="BRH Malayalam Extra" w:cs="BRH Malayalam Extra"/>
-                <w:color w:val="000000"/>
-                <w:sz w:val="32"/>
-                <w:szCs w:val="32"/>
-                <w:lang w:val="it-IT"/>
-              </w:rPr>
-              <w:t>.</w:t>
-            </w:r>
-            <w:r>
-              <w:rPr>
-                <w:rFonts w:cs="BRH Malayalam Extra"/>
-                <w:color w:val="000000"/>
-                <w:szCs w:val="32"/>
-                <w:lang w:val="it-IT"/>
-              </w:rPr>
-              <w:t>1</w:t>
-            </w:r>
-            <w:r>
-              <w:rPr>
-                <w:rFonts w:ascii="BRH Malayalam Extra" w:hAnsi="BRH Malayalam Extra" w:cs="BRH Malayalam Extra"/>
-                <w:color w:val="000000"/>
-                <w:sz w:val="32"/>
-                <w:szCs w:val="32"/>
-                <w:lang w:val="it-IT"/>
-              </w:rPr>
-              <w:t>.</w:t>
-            </w:r>
-            <w:r>
-              <w:rPr>
-                <w:rFonts w:cs="BRH Malayalam Extra"/>
-                <w:color w:val="000000"/>
-                <w:szCs w:val="32"/>
-                <w:lang w:val="it-IT"/>
-              </w:rPr>
-              <w:t>3</w:t>
-            </w:r>
-            <w:r>
-              <w:rPr>
-                <w:rFonts w:ascii="BRH Malayalam Extra" w:hAnsi="BRH Malayalam Extra" w:cs="BRH Malayalam Extra"/>
-                <w:color w:val="000000"/>
-                <w:sz w:val="32"/>
-                <w:szCs w:val="32"/>
-                <w:lang w:val="it-IT"/>
-              </w:rPr>
-              <w:t>(</w:t>
-            </w:r>
-            <w:r>
-              <w:rPr>
-                <w:rFonts w:cs="BRH Malayalam Extra"/>
-                <w:color w:val="000000"/>
-                <w:szCs w:val="32"/>
-                <w:lang w:val="it-IT"/>
-              </w:rPr>
-              <w:t>38</w:t>
-            </w:r>
-            <w:r>
-              <w:rPr>
-                <w:rFonts w:ascii="BRH Malayalam Extra" w:hAnsi="BRH Malayalam Extra" w:cs="BRH Malayalam Extra"/>
-                <w:color w:val="000000"/>
-                <w:sz w:val="32"/>
-                <w:szCs w:val="32"/>
-                <w:lang w:val="it-IT"/>
-              </w:rPr>
-              <w:t>)- Bm—</w:t>
-            </w:r>
-            <w:r>
-              <w:rPr>
-                <w:rFonts w:ascii="BRH Malayalam Extra" w:hAnsi="BRH Malayalam Extra" w:cs="BRH Malayalam Extra"/>
-                <w:color w:val="000000"/>
-                <w:sz w:val="32"/>
-                <w:szCs w:val="32"/>
-                <w:highlight w:val="green"/>
-                <w:lang w:val="it-IT"/>
-              </w:rPr>
-              <w:t>g</w:t>
-            </w:r>
-            <w:r>
-              <w:rPr>
-                <w:rFonts w:ascii="BRH Malayalam Extra" w:hAnsi="BRH Malayalam Extra" w:cs="BRH Malayalam Extra"/>
-                <w:color w:val="000000"/>
-                <w:sz w:val="32"/>
-                <w:szCs w:val="32"/>
-                <w:lang w:val="it-IT"/>
-              </w:rPr>
-              <w:t>îsõ | d | Ap— |</w:t>
-            </w:r>
           </w:p>
           <w:p>
             <w:pPr>
@@ -7391,13 +7266,128 @@
             </w:pPr>
             <w:r>
               <w:rPr>
-                <w:rFonts w:ascii="BRH Malayalam Extra" w:hAnsi="BRH Malayalam Extra" w:cs="BRH Malayalam Extra"/>
-                <w:color w:val="000000"/>
-                <w:sz w:val="32"/>
+                <w:rFonts w:cs="BRH Malayalam Extra"/>
+                <w:color w:val="000000"/>
                 <w:szCs w:val="32"/>
                 <w:lang w:val="it-IT"/>
               </w:rPr>
-              <w:t>Bm—</w:t>
+              <w:lastRenderedPageBreak/>
+              <w:t>45</w:t>
+            </w:r>
+            <w:r>
+              <w:rPr>
+                <w:rFonts w:ascii="BRH Malayalam Extra" w:hAnsi="BRH Malayalam Extra" w:cs="BRH Malayalam Extra"/>
+                <w:color w:val="000000"/>
+                <w:sz w:val="32"/>
+                <w:szCs w:val="32"/>
+                <w:lang w:val="it-IT"/>
+              </w:rPr>
+              <w:t>)</w:t>
+            </w:r>
+            <w:r>
+              <w:rPr>
+                <w:rFonts w:ascii="BRH Malayalam Extra" w:hAnsi="BRH Malayalam Extra" w:cs="BRH Malayalam Extra"/>
+                <w:color w:val="000000"/>
+                <w:sz w:val="32"/>
+                <w:szCs w:val="32"/>
+                <w:lang w:val="it-IT"/>
+              </w:rPr>
+              <w:tab/>
+            </w:r>
+            <w:r>
+              <w:rPr>
+                <w:rFonts w:cs="BRH Malayalam Extra"/>
+                <w:color w:val="000000"/>
+                <w:szCs w:val="32"/>
+                <w:lang w:val="it-IT"/>
+              </w:rPr>
+              <w:t>3</w:t>
+            </w:r>
+            <w:r>
+              <w:rPr>
+                <w:rFonts w:ascii="BRH Malayalam Extra" w:hAnsi="BRH Malayalam Extra" w:cs="BRH Malayalam Extra"/>
+                <w:color w:val="000000"/>
+                <w:sz w:val="32"/>
+                <w:szCs w:val="32"/>
+                <w:lang w:val="it-IT"/>
+              </w:rPr>
+              <w:t>.</w:t>
+            </w:r>
+            <w:r>
+              <w:rPr>
+                <w:rFonts w:cs="BRH Malayalam Extra"/>
+                <w:color w:val="000000"/>
+                <w:szCs w:val="32"/>
+                <w:lang w:val="it-IT"/>
+              </w:rPr>
+              <w:t>4</w:t>
+            </w:r>
+            <w:r>
+              <w:rPr>
+                <w:rFonts w:ascii="BRH Malayalam Extra" w:hAnsi="BRH Malayalam Extra" w:cs="BRH Malayalam Extra"/>
+                <w:color w:val="000000"/>
+                <w:sz w:val="32"/>
+                <w:szCs w:val="32"/>
+                <w:lang w:val="it-IT"/>
+              </w:rPr>
+              <w:t>.</w:t>
+            </w:r>
+            <w:r>
+              <w:rPr>
+                <w:rFonts w:cs="BRH Malayalam Extra"/>
+                <w:color w:val="000000"/>
+                <w:szCs w:val="32"/>
+                <w:lang w:val="it-IT"/>
+              </w:rPr>
+              <w:t>1</w:t>
+            </w:r>
+            <w:r>
+              <w:rPr>
+                <w:rFonts w:ascii="BRH Malayalam Extra" w:hAnsi="BRH Malayalam Extra" w:cs="BRH Malayalam Extra"/>
+                <w:color w:val="000000"/>
+                <w:sz w:val="32"/>
+                <w:szCs w:val="32"/>
+                <w:lang w:val="it-IT"/>
+              </w:rPr>
+              <w:t>.</w:t>
+            </w:r>
+            <w:r>
+              <w:rPr>
+                <w:rFonts w:cs="BRH Malayalam Extra"/>
+                <w:color w:val="000000"/>
+                <w:szCs w:val="32"/>
+                <w:lang w:val="it-IT"/>
+              </w:rPr>
+              <w:t>3</w:t>
+            </w:r>
+            <w:r>
+              <w:rPr>
+                <w:rFonts w:ascii="BRH Malayalam Extra" w:hAnsi="BRH Malayalam Extra" w:cs="BRH Malayalam Extra"/>
+                <w:color w:val="000000"/>
+                <w:sz w:val="32"/>
+                <w:szCs w:val="32"/>
+                <w:lang w:val="it-IT"/>
+              </w:rPr>
+              <w:t>(</w:t>
+            </w:r>
+            <w:r>
+              <w:rPr>
+                <w:rFonts w:cs="BRH Malayalam Extra"/>
+                <w:color w:val="000000"/>
+                <w:szCs w:val="32"/>
+                <w:lang w:val="it-IT"/>
+              </w:rPr>
+              <w:t>38</w:t>
+            </w:r>
+            <w:r>
+              <w:rPr>
+                <w:rFonts w:ascii="BRH Malayalam Extra" w:hAnsi="BRH Malayalam Extra" w:cs="BRH Malayalam Extra"/>
+                <w:color w:val="000000"/>
+                <w:sz w:val="32"/>
+                <w:szCs w:val="32"/>
+                <w:lang w:val="it-IT"/>
+              </w:rPr>
+              <w:t>)- Bm—</w:t>
             </w:r>
             <w:r>
               <w:rPr>
@@ -7408,6 +7398,53 @@
                 <w:highlight w:val="green"/>
                 <w:lang w:val="it-IT"/>
               </w:rPr>
+              <w:t>g</w:t>
+            </w:r>
+            <w:r>
+              <w:rPr>
+                <w:rFonts w:ascii="BRH Malayalam Extra" w:hAnsi="BRH Malayalam Extra" w:cs="BRH Malayalam Extra"/>
+                <w:color w:val="000000"/>
+                <w:sz w:val="32"/>
+                <w:szCs w:val="32"/>
+                <w:lang w:val="it-IT"/>
+              </w:rPr>
+              <w:t>îsõ | d | Ap— |</w:t>
+            </w:r>
+          </w:p>
+          <w:p>
+            <w:pPr>
+              <w:widowControl w:val="0"/>
+              <w:autoSpaceDE w:val="0"/>
+              <w:autoSpaceDN w:val="0"/>
+              <w:adjustRightInd w:val="0"/>
+              <w:spacing w:before="0" w:line="240" w:lineRule="auto"/>
+              <w:rPr>
+                <w:rFonts w:ascii="BRH Malayalam Extra" w:hAnsi="BRH Malayalam Extra" w:cs="BRH Malayalam Extra"/>
+                <w:color w:val="000000"/>
+                <w:sz w:val="32"/>
+                <w:szCs w:val="32"/>
+                <w:lang w:val="it-IT"/>
+              </w:rPr>
+            </w:pPr>
+            <w:r>
+              <w:rPr>
+                <w:rFonts w:ascii="BRH Malayalam Extra" w:hAnsi="BRH Malayalam Extra" w:cs="BRH Malayalam Extra"/>
+                <w:color w:val="000000"/>
+                <w:sz w:val="32"/>
+                <w:szCs w:val="32"/>
+                <w:lang w:val="it-IT"/>
+              </w:rPr>
+              <w:t>Bm—</w:t>
+            </w:r>
+            <w:r>
+              <w:rPr>
+                <w:rFonts w:ascii="BRH Malayalam Extra" w:hAnsi="BRH Malayalam Extra" w:cs="BRH Malayalam Extra"/>
+                <w:color w:val="000000"/>
+                <w:sz w:val="32"/>
+                <w:szCs w:val="32"/>
+                <w:highlight w:val="green"/>
+                <w:lang w:val="it-IT"/>
+              </w:rPr>
               <w:t>gîsõ</w:t>
             </w:r>
             <w:r>
@@ -7501,7 +7538,33 @@
                 <w:szCs w:val="32"/>
                 <w:lang w:val="it-IT"/>
               </w:rPr>
-              <w:t xml:space="preserve"> dxm—gî</w:t>
+              <w:t xml:space="preserve"> </w:t>
+            </w:r>
+          </w:p>
+          <w:p>
+            <w:pPr>
+              <w:widowControl w:val="0"/>
+              <w:autoSpaceDE w:val="0"/>
+              <w:autoSpaceDN w:val="0"/>
+              <w:adjustRightInd w:val="0"/>
+              <w:spacing w:before="0" w:line="240" w:lineRule="auto"/>
+              <w:rPr>
+                <w:rFonts w:ascii="BRH Malayalam Extra" w:hAnsi="BRH Malayalam Extra" w:cs="BRH Malayalam Extra"/>
+                <w:color w:val="000000"/>
+                <w:sz w:val="32"/>
+                <w:szCs w:val="32"/>
+                <w:lang w:val="it-IT"/>
+              </w:rPr>
+            </w:pPr>
+            <w:r>
+              <w:rPr>
+                <w:rFonts w:ascii="BRH Malayalam Extra" w:hAnsi="BRH Malayalam Extra" w:cs="BRH Malayalam Extra"/>
+                <w:color w:val="000000"/>
+                <w:sz w:val="32"/>
+                <w:szCs w:val="32"/>
+                <w:lang w:val="it-IT"/>
+              </w:rPr>
+              <w:t>dxm—gî</w:t>
             </w:r>
             <w:r>
               <w:rPr>
@@ -10262,7 +10325,7 @@
       </w:tr>
       <w:tr>
         <w:trPr>
-          <w:trHeight w:val="1163"/>
+          <w:trHeight w:val="801"/>
         </w:trPr>
         <w:tc>
           <w:tcPr>
@@ -10294,7 +10357,6 @@
                 <w:color w:val="000000"/>
                 <w:szCs w:val="32"/>
               </w:rPr>
-              <w:lastRenderedPageBreak/>
               <w:t>43</w:t>
             </w:r>
             <w:r>
@@ -10460,6 +10522,7 @@
                 <w:szCs w:val="32"/>
                 <w:highlight w:val="yellow"/>
               </w:rPr>
+              <w:lastRenderedPageBreak/>
               <w:t>B</w:t>
             </w:r>
             <w:r>
@@ -10662,6 +10725,7 @@
                 <w:color w:val="000000"/>
                 <w:szCs w:val="32"/>
               </w:rPr>
+              <w:lastRenderedPageBreak/>
               <w:t>43</w:t>
             </w:r>
             <w:r>
@@ -10827,6 +10891,7 @@
                 <w:szCs w:val="32"/>
                 <w:highlight w:val="green"/>
               </w:rPr>
+              <w:lastRenderedPageBreak/>
               <w:t>A</w:t>
             </w:r>
             <w:r>
@@ -11034,6 +11099,7 @@
                 <w:color w:val="000000"/>
                 <w:szCs w:val="32"/>
               </w:rPr>
+              <w:lastRenderedPageBreak/>
               <w:t>28</w:t>
             </w:r>
             <w:r>
@@ -14289,7 +14355,31 @@
                 <w:sz w:val="32"/>
                 <w:szCs w:val="32"/>
               </w:rPr>
-              <w:t>Æx | s</w:t>
+              <w:t xml:space="preserve">Æx | </w:t>
+            </w:r>
+          </w:p>
+          <w:p>
+            <w:pPr>
+              <w:widowControl w:val="0"/>
+              <w:autoSpaceDE w:val="0"/>
+              <w:autoSpaceDN w:val="0"/>
+              <w:adjustRightInd w:val="0"/>
+              <w:spacing w:before="0" w:line="240" w:lineRule="auto"/>
+              <w:rPr>
+                <w:rFonts w:ascii="BRH Malayalam Extra" w:hAnsi="BRH Malayalam Extra" w:cs="BRH Malayalam Extra"/>
+                <w:color w:val="000000"/>
+                <w:sz w:val="32"/>
+                <w:szCs w:val="32"/>
+              </w:rPr>
+            </w:pPr>
+            <w:r>
+              <w:rPr>
+                <w:rFonts w:ascii="BRH Malayalam Extra" w:hAnsi="BRH Malayalam Extra" w:cs="BRH Malayalam Extra"/>
+                <w:color w:val="000000"/>
+                <w:sz w:val="32"/>
+                <w:szCs w:val="32"/>
+              </w:rPr>
+              <w:t>s</w:t>
             </w:r>
             <w:r>
               <w:rPr>
@@ -16519,97 +16609,7 @@
                 <w:sz w:val="32"/>
                 <w:szCs w:val="32"/>
               </w:rPr>
-              <w:t>Æx | s</w:t>
-            </w:r>
-            <w:r>
-              <w:rPr>
-                <w:rFonts w:ascii="BRH Malayalam Extra" w:hAnsi="BRH Malayalam Extra" w:cs="BRH Malayalam Extra"/>
-                <w:color w:val="000000"/>
-                <w:sz w:val="26"/>
-                <w:szCs w:val="32"/>
-              </w:rPr>
-              <w:t>–</w:t>
-            </w:r>
-            <w:r>
-              <w:rPr>
-                <w:rFonts w:ascii="BRH Malayalam Extra" w:hAnsi="BRH Malayalam Extra" w:cs="BRH Malayalam Extra"/>
-                <w:color w:val="000000"/>
-                <w:sz w:val="32"/>
-                <w:szCs w:val="32"/>
-              </w:rPr>
-              <w:t>I</w:t>
-            </w:r>
-            <w:r>
-              <w:rPr>
-                <w:rFonts w:ascii="BRH Devanagari Extra" w:hAnsi="BRH Devanagari Extra" w:cs="BRH Malayalam Extra"/>
-                <w:color w:val="000000"/>
-                <w:sz w:val="28"/>
-                <w:szCs w:val="32"/>
-              </w:rPr>
-              <w:t>Æ</w:t>
-            </w:r>
-            <w:r>
-              <w:rPr>
-                <w:rFonts w:ascii="BRH Malayalam Extra" w:hAnsi="BRH Malayalam Extra" w:cs="BRH Malayalam Extra"/>
-                <w:color w:val="000000"/>
-                <w:sz w:val="32"/>
-                <w:szCs w:val="32"/>
-              </w:rPr>
-              <w:t>p</w:t>
-            </w:r>
-            <w:r>
-              <w:rPr>
-                <w:rFonts w:ascii="BRH Malayalam Extra" w:hAnsi="BRH Malayalam Extra" w:cs="BRH Malayalam Extra"/>
-                <w:color w:val="000000"/>
-                <w:sz w:val="26"/>
-                <w:szCs w:val="32"/>
-              </w:rPr>
-              <w:t>–</w:t>
-            </w:r>
-            <w:r>
-              <w:rPr>
-                <w:rFonts w:ascii="BRH Malayalam Extra" w:hAnsi="BRH Malayalam Extra" w:cs="BRH Malayalam Extra"/>
-                <w:color w:val="000000"/>
-                <w:sz w:val="32"/>
-                <w:szCs w:val="32"/>
-              </w:rPr>
-              <w:t>a§s</w:t>
-            </w:r>
-            <w:r>
-              <w:rPr>
-                <w:rFonts w:ascii="BRH Malayalam Extra" w:hAnsi="BRH Malayalam Extra" w:cs="BRH Malayalam Extra"/>
-                <w:color w:val="000000"/>
-                <w:sz w:val="26"/>
-                <w:szCs w:val="32"/>
-              </w:rPr>
-              <w:t>–</w:t>
-            </w:r>
-            <w:r>
-              <w:rPr>
-                <w:rFonts w:ascii="BRH Malayalam Extra" w:hAnsi="BRH Malayalam Extra" w:cs="BRH Malayalam Extra"/>
-                <w:color w:val="000000"/>
-                <w:sz w:val="32"/>
-                <w:szCs w:val="32"/>
-              </w:rPr>
-              <w:t>k</w:t>
-            </w:r>
-            <w:r>
-              <w:rPr>
-                <w:rFonts w:ascii="BRH Malayalam Extra" w:hAnsi="BRH Malayalam Extra" w:cs="BRH Malayalam Extra"/>
-                <w:color w:val="000000"/>
-                <w:sz w:val="26"/>
-                <w:szCs w:val="32"/>
-              </w:rPr>
-              <w:t>–</w:t>
-            </w:r>
-            <w:r>
-              <w:rPr>
-                <w:rFonts w:ascii="BRH Malayalam Extra" w:hAnsi="BRH Malayalam Extra" w:cs="BRH Malayalam Extra"/>
-                <w:color w:val="000000"/>
-                <w:sz w:val="32"/>
-                <w:szCs w:val="32"/>
-              </w:rPr>
-              <w:t>sb—J |</w:t>
+              <w:t xml:space="preserve">Æx | </w:t>
             </w:r>
           </w:p>
           <w:p>
@@ -16633,129 +16633,25 @@
                 <w:sz w:val="32"/>
                 <w:szCs w:val="32"/>
               </w:rPr>
-              <w:t>G</w:t>
-            </w:r>
-            <w:r>
-              <w:rPr>
-                <w:rFonts w:ascii="BRH Malayalam Extra" w:hAnsi="BRH Malayalam Extra" w:cs="BRH Malayalam Extra"/>
-                <w:color w:val="000000"/>
-                <w:sz w:val="26"/>
-                <w:szCs w:val="32"/>
-              </w:rPr>
-              <w:t>–</w:t>
-            </w:r>
-            <w:r>
-              <w:rPr>
-                <w:rFonts w:ascii="BRH Malayalam Extra" w:hAnsi="BRH Malayalam Extra" w:cs="BRH Malayalam Extra"/>
-                <w:color w:val="000000"/>
-                <w:sz w:val="32"/>
-                <w:szCs w:val="32"/>
-              </w:rPr>
-              <w:t>px p—k¡</w:t>
-            </w:r>
-            <w:r>
-              <w:rPr>
-                <w:rFonts w:ascii="BRH Malayalam Extra" w:hAnsi="BRH Malayalam Extra" w:cs="BRH Malayalam Extra"/>
-                <w:color w:val="000000"/>
-                <w:sz w:val="26"/>
-                <w:szCs w:val="32"/>
-              </w:rPr>
-              <w:t>–</w:t>
-            </w:r>
-            <w:r>
-              <w:rPr>
-                <w:rFonts w:ascii="BRH Malayalam Extra" w:hAnsi="BRH Malayalam Extra" w:cs="BRH Malayalam Extra"/>
-                <w:color w:val="000000"/>
-                <w:sz w:val="32"/>
-                <w:szCs w:val="32"/>
-              </w:rPr>
-              <w:t>Æx „p—</w:t>
-            </w:r>
-            <w:r>
-              <w:rPr>
-                <w:rFonts w:ascii="BRH Malayalam Extra" w:hAnsi="BRH Malayalam Extra" w:cs="BRH Malayalam Extra"/>
-                <w:color w:val="000000"/>
-                <w:sz w:val="32"/>
-                <w:szCs w:val="32"/>
-                <w:highlight w:val="green"/>
-              </w:rPr>
-              <w:t>k¡¤¤Æ</w:t>
-            </w:r>
-            <w:r>
-              <w:rPr>
-                <w:rFonts w:ascii="BRH Malayalam Extra" w:hAnsi="BRH Malayalam Extra" w:cs="BRH Malayalam Extra"/>
-                <w:color w:val="000000"/>
-                <w:sz w:val="26"/>
-                <w:szCs w:val="32"/>
-                <w:highlight w:val="yellow"/>
-              </w:rPr>
-              <w:t>–</w:t>
-            </w:r>
-            <w:r>
-              <w:rPr>
-                <w:rFonts w:ascii="BRH Malayalam Extra" w:hAnsi="BRH Malayalam Extra" w:cs="BRH Malayalam Extra"/>
-                <w:color w:val="000000"/>
-                <w:sz w:val="32"/>
-                <w:szCs w:val="32"/>
-              </w:rPr>
-              <w:t xml:space="preserve"> </w:t>
-            </w:r>
-            <w:r>
-              <w:rPr>
-                <w:rFonts w:ascii="BRH Malayalam Extra" w:hAnsi="BRH Malayalam Extra" w:cs="BRH Malayalam Extra"/>
-                <w:color w:val="000000"/>
-                <w:sz w:val="32"/>
-                <w:szCs w:val="32"/>
-              </w:rPr>
-              <w:t>¤¤p</w:t>
-            </w:r>
-            <w:r>
-              <w:rPr>
-                <w:rFonts w:ascii="BRH Malayalam Extra" w:hAnsi="BRH Malayalam Extra" w:cs="BRH Malayalam Extra"/>
-                <w:color w:val="000000"/>
-                <w:sz w:val="32"/>
-                <w:szCs w:val="32"/>
-              </w:rPr>
-              <w:t>px p</w:t>
-            </w:r>
-            <w:r>
-              <w:rPr>
-                <w:rFonts w:ascii="BRH Malayalam Extra" w:hAnsi="BRH Malayalam Extra" w:cs="BRH Malayalam Extra"/>
-                <w:color w:val="000000"/>
-                <w:sz w:val="32"/>
-                <w:szCs w:val="32"/>
-                <w:highlight w:val="yellow"/>
-              </w:rPr>
-              <w:t>—</w:t>
-            </w:r>
-            <w:r>
-              <w:rPr>
-                <w:rFonts w:ascii="BRH Malayalam Extra" w:hAnsi="BRH Malayalam Extra" w:cs="BRH Malayalam Extra"/>
-                <w:color w:val="000000"/>
-                <w:sz w:val="32"/>
-                <w:szCs w:val="32"/>
-                <w:highlight w:val="green"/>
-              </w:rPr>
-              <w:t>k¡</w:t>
-            </w:r>
-            <w:r>
-              <w:rPr>
-                <w:rFonts w:ascii="BRH Malayalam Extra" w:hAnsi="BRH Malayalam Extra" w:cs="BRH Malayalam Extra"/>
-                <w:color w:val="000000"/>
-                <w:sz w:val="32"/>
-                <w:szCs w:val="32"/>
-              </w:rPr>
-              <w:t xml:space="preserve">Æx </w:t>
-            </w:r>
-            <w:r>
-              <w:rPr>
-                <w:rFonts w:ascii="BRH Malayalam Extra" w:hAnsi="BRH Malayalam Extra" w:cs="BRH Malayalam Extra"/>
-                <w:color w:val="000000"/>
-                <w:sz w:val="32"/>
-                <w:szCs w:val="32"/>
-                <w:highlight w:val="green"/>
-              </w:rPr>
-              <w:t>sI</w:t>
+              <w:t>s</w:t>
+            </w:r>
+            <w:r>
+              <w:rPr>
+                <w:rFonts w:ascii="BRH Malayalam Extra" w:hAnsi="BRH Malayalam Extra" w:cs="BRH Malayalam Extra"/>
+                <w:color w:val="000000"/>
+                <w:sz w:val="26"/>
+                <w:szCs w:val="32"/>
+              </w:rPr>
+              <w:t>–</w:t>
+            </w:r>
+            <w:r>
+              <w:rPr>
+                <w:rFonts w:ascii="BRH Malayalam Extra" w:hAnsi="BRH Malayalam Extra" w:cs="BRH Malayalam Extra"/>
+                <w:color w:val="000000"/>
+                <w:sz w:val="32"/>
+                <w:szCs w:val="32"/>
+              </w:rPr>
+              <w:t>I</w:t>
             </w:r>
             <w:r>
               <w:rPr>
@@ -16773,155 +16669,61 @@
                 <w:sz w:val="32"/>
                 <w:szCs w:val="32"/>
               </w:rPr>
-              <w:t>pa§sk</w:t>
-            </w:r>
-            <w:r>
-              <w:rPr>
-                <w:rFonts w:ascii="BRH Malayalam Extra" w:hAnsi="BRH Malayalam Extra" w:cs="BRH Malayalam Extra"/>
-                <w:color w:val="000000"/>
-                <w:sz w:val="26"/>
-                <w:szCs w:val="32"/>
-              </w:rPr>
-              <w:t>–</w:t>
-            </w:r>
-            <w:r>
-              <w:rPr>
-                <w:rFonts w:ascii="BRH Malayalam Extra" w:hAnsi="BRH Malayalam Extra" w:cs="BRH Malayalam Extra"/>
-                <w:color w:val="000000"/>
-                <w:sz w:val="32"/>
-                <w:szCs w:val="32"/>
-              </w:rPr>
-              <w:t>sb—J sI</w:t>
-            </w:r>
-            <w:r>
-              <w:rPr>
-                <w:rFonts w:ascii="BRH Devanagari Extra" w:hAnsi="BRH Devanagari Extra" w:cs="BRH Malayalam Extra"/>
-                <w:color w:val="000000"/>
-                <w:sz w:val="28"/>
-                <w:szCs w:val="32"/>
-              </w:rPr>
-              <w:t>Æ</w:t>
-            </w:r>
-            <w:r>
-              <w:rPr>
-                <w:rFonts w:ascii="BRH Malayalam Extra" w:hAnsi="BRH Malayalam Extra" w:cs="BRH Malayalam Extra"/>
-                <w:color w:val="000000"/>
-                <w:sz w:val="32"/>
-                <w:szCs w:val="32"/>
-              </w:rPr>
-              <w:t>pa§sk</w:t>
-            </w:r>
-            <w:r>
-              <w:rPr>
-                <w:rFonts w:ascii="BRH Malayalam Extra" w:hAnsi="BRH Malayalam Extra" w:cs="BRH Malayalam Extra"/>
-                <w:color w:val="000000"/>
-                <w:sz w:val="26"/>
-                <w:szCs w:val="32"/>
-              </w:rPr>
-              <w:t>–</w:t>
-            </w:r>
-            <w:r>
-              <w:rPr>
-                <w:rFonts w:ascii="BRH Malayalam Extra" w:hAnsi="BRH Malayalam Extra" w:cs="BRH Malayalam Extra"/>
-                <w:color w:val="000000"/>
-                <w:sz w:val="32"/>
-                <w:szCs w:val="32"/>
-              </w:rPr>
-              <w:t>s¥bx „p—</w:t>
-            </w:r>
-            <w:r>
-              <w:rPr>
-                <w:rFonts w:ascii="BRH Malayalam Extra" w:hAnsi="BRH Malayalam Extra" w:cs="BRH Malayalam Extra"/>
-                <w:color w:val="000000"/>
-                <w:sz w:val="32"/>
-                <w:szCs w:val="32"/>
-                <w:highlight w:val="green"/>
-              </w:rPr>
-              <w:t>k¡¤¤Æ</w:t>
-            </w:r>
-            <w:r>
-              <w:rPr>
-                <w:rFonts w:ascii="BRH Malayalam Extra" w:hAnsi="BRH Malayalam Extra" w:cs="BRH Malayalam Extra"/>
-                <w:color w:val="000000"/>
-                <w:sz w:val="26"/>
-                <w:szCs w:val="32"/>
-                <w:highlight w:val="green"/>
-              </w:rPr>
-              <w:t>–</w:t>
-            </w:r>
-            <w:r>
-              <w:rPr>
-                <w:rFonts w:ascii="BRH Malayalam Extra" w:hAnsi="BRH Malayalam Extra" w:cs="BRH Malayalam Extra"/>
-                <w:color w:val="000000"/>
-                <w:sz w:val="32"/>
-                <w:szCs w:val="32"/>
-              </w:rPr>
-              <w:t xml:space="preserve"> ¤¤ppx p—</w:t>
-            </w:r>
-            <w:r>
-              <w:rPr>
-                <w:rFonts w:ascii="BRH Malayalam Extra" w:hAnsi="BRH Malayalam Extra" w:cs="BRH Malayalam Extra"/>
-                <w:color w:val="000000"/>
-                <w:sz w:val="32"/>
-                <w:szCs w:val="32"/>
-                <w:highlight w:val="green"/>
-              </w:rPr>
-              <w:t>k¡</w:t>
-            </w:r>
-            <w:r>
-              <w:rPr>
-                <w:rFonts w:ascii="BRH Malayalam Extra" w:hAnsi="BRH Malayalam Extra" w:cs="BRH Malayalam Extra"/>
-                <w:color w:val="000000"/>
-                <w:sz w:val="32"/>
-                <w:szCs w:val="32"/>
-              </w:rPr>
-              <w:t xml:space="preserve">Æx </w:t>
-            </w:r>
-            <w:r>
-              <w:rPr>
-                <w:rFonts w:ascii="BRH Malayalam Extra" w:hAnsi="BRH Malayalam Extra" w:cs="BRH Malayalam Extra"/>
-                <w:color w:val="000000"/>
-                <w:sz w:val="32"/>
-                <w:szCs w:val="32"/>
-                <w:highlight w:val="green"/>
-              </w:rPr>
-              <w:t>sI</w:t>
-            </w:r>
-            <w:r>
-              <w:rPr>
-                <w:rFonts w:ascii="BRH Devanagari Extra" w:hAnsi="BRH Devanagari Extra" w:cs="BRH Malayalam Extra"/>
-                <w:color w:val="000000"/>
-                <w:sz w:val="28"/>
-                <w:szCs w:val="32"/>
-              </w:rPr>
-              <w:t>Æ</w:t>
-            </w:r>
-            <w:r>
-              <w:rPr>
-                <w:rFonts w:ascii="BRH Malayalam Extra" w:hAnsi="BRH Malayalam Extra" w:cs="BRH Malayalam Extra"/>
-                <w:color w:val="000000"/>
-                <w:sz w:val="32"/>
-                <w:szCs w:val="32"/>
-              </w:rPr>
-              <w:t>pa§sk</w:t>
-            </w:r>
-            <w:r>
-              <w:rPr>
-                <w:rFonts w:ascii="BRH Malayalam Extra" w:hAnsi="BRH Malayalam Extra" w:cs="BRH Malayalam Extra"/>
-                <w:color w:val="000000"/>
-                <w:sz w:val="26"/>
-                <w:szCs w:val="32"/>
-              </w:rPr>
-              <w:t>–</w:t>
-            </w:r>
-            <w:r>
-              <w:rPr>
-                <w:rFonts w:ascii="BRH Malayalam Extra" w:hAnsi="BRH Malayalam Extra" w:cs="BRH Malayalam Extra"/>
-                <w:color w:val="000000"/>
-                <w:sz w:val="32"/>
-                <w:szCs w:val="32"/>
-              </w:rPr>
-              <w:t xml:space="preserve">sb—J | </w:t>
+              <w:t>p</w:t>
+            </w:r>
+            <w:r>
+              <w:rPr>
+                <w:rFonts w:ascii="BRH Malayalam Extra" w:hAnsi="BRH Malayalam Extra" w:cs="BRH Malayalam Extra"/>
+                <w:color w:val="000000"/>
+                <w:sz w:val="26"/>
+                <w:szCs w:val="32"/>
+              </w:rPr>
+              <w:t>–</w:t>
+            </w:r>
+            <w:r>
+              <w:rPr>
+                <w:rFonts w:ascii="BRH Malayalam Extra" w:hAnsi="BRH Malayalam Extra" w:cs="BRH Malayalam Extra"/>
+                <w:color w:val="000000"/>
+                <w:sz w:val="32"/>
+                <w:szCs w:val="32"/>
+              </w:rPr>
+              <w:t>a§s</w:t>
+            </w:r>
+            <w:r>
+              <w:rPr>
+                <w:rFonts w:ascii="BRH Malayalam Extra" w:hAnsi="BRH Malayalam Extra" w:cs="BRH Malayalam Extra"/>
+                <w:color w:val="000000"/>
+                <w:sz w:val="26"/>
+                <w:szCs w:val="32"/>
+              </w:rPr>
+              <w:t>–</w:t>
+            </w:r>
+            <w:r>
+              <w:rPr>
+                <w:rFonts w:ascii="BRH Malayalam Extra" w:hAnsi="BRH Malayalam Extra" w:cs="BRH Malayalam Extra"/>
+                <w:color w:val="000000"/>
+                <w:sz w:val="32"/>
+                <w:szCs w:val="32"/>
+              </w:rPr>
+              <w:t>k</w:t>
+            </w:r>
+            <w:r>
+              <w:rPr>
+                <w:rFonts w:ascii="BRH Malayalam Extra" w:hAnsi="BRH Malayalam Extra" w:cs="BRH Malayalam Extra"/>
+                <w:color w:val="000000"/>
+                <w:sz w:val="26"/>
+                <w:szCs w:val="32"/>
+              </w:rPr>
+              <w:t>–</w:t>
+            </w:r>
+            <w:r>
+              <w:rPr>
+                <w:rFonts w:ascii="BRH Malayalam Extra" w:hAnsi="BRH Malayalam Extra" w:cs="BRH Malayalam Extra"/>
+                <w:color w:val="000000"/>
+                <w:sz w:val="32"/>
+                <w:szCs w:val="32"/>
+              </w:rPr>
+              <w:t>sb—J |</w:t>
             </w:r>
           </w:p>
           <w:p>
@@ -16940,114 +16742,48 @@
             </w:pPr>
             <w:r>
               <w:rPr>
-                <w:rFonts w:cs="BRH Malayalam Extra"/>
-                <w:color w:val="000000"/>
-                <w:szCs w:val="32"/>
-              </w:rPr>
-              <w:t>37</w:t>
-            </w:r>
-            <w:r>
-              <w:rPr>
-                <w:rFonts w:ascii="BRH Malayalam Extra" w:hAnsi="BRH Malayalam Extra" w:cs="BRH Malayalam Extra"/>
-                <w:color w:val="000000"/>
-                <w:sz w:val="32"/>
-                <w:szCs w:val="32"/>
-              </w:rPr>
-              <w:t>)</w:t>
-            </w:r>
-            <w:r>
-              <w:rPr>
-                <w:rFonts w:ascii="BRH Malayalam Extra" w:hAnsi="BRH Malayalam Extra" w:cs="BRH Malayalam Extra"/>
-                <w:color w:val="000000"/>
-                <w:sz w:val="32"/>
-                <w:szCs w:val="32"/>
-              </w:rPr>
-              <w:tab/>
-            </w:r>
-            <w:r>
-              <w:rPr>
-                <w:rFonts w:cs="BRH Malayalam Extra"/>
-                <w:color w:val="000000"/>
-                <w:szCs w:val="32"/>
-              </w:rPr>
-              <w:t>3</w:t>
-            </w:r>
-            <w:r>
-              <w:rPr>
-                <w:rFonts w:ascii="BRH Malayalam Extra" w:hAnsi="BRH Malayalam Extra" w:cs="BRH Malayalam Extra"/>
-                <w:color w:val="000000"/>
-                <w:sz w:val="32"/>
-                <w:szCs w:val="32"/>
-              </w:rPr>
-              <w:t>.</w:t>
-            </w:r>
-            <w:r>
-              <w:rPr>
-                <w:rFonts w:cs="BRH Malayalam Extra"/>
-                <w:color w:val="000000"/>
-                <w:szCs w:val="32"/>
-              </w:rPr>
-              <w:t>4</w:t>
-            </w:r>
-            <w:r>
-              <w:rPr>
-                <w:rFonts w:ascii="BRH Malayalam Extra" w:hAnsi="BRH Malayalam Extra" w:cs="BRH Malayalam Extra"/>
-                <w:color w:val="000000"/>
-                <w:sz w:val="32"/>
-                <w:szCs w:val="32"/>
-              </w:rPr>
-              <w:t>.</w:t>
-            </w:r>
-            <w:r>
-              <w:rPr>
-                <w:rFonts w:cs="BRH Malayalam Extra"/>
-                <w:color w:val="000000"/>
-                <w:szCs w:val="32"/>
-              </w:rPr>
-              <w:t>3</w:t>
-            </w:r>
-            <w:r>
-              <w:rPr>
-                <w:rFonts w:ascii="BRH Malayalam Extra" w:hAnsi="BRH Malayalam Extra" w:cs="BRH Malayalam Extra"/>
-                <w:color w:val="000000"/>
-                <w:sz w:val="32"/>
-                <w:szCs w:val="32"/>
-              </w:rPr>
-              <w:t>.</w:t>
-            </w:r>
-            <w:r>
-              <w:rPr>
-                <w:rFonts w:cs="BRH Malayalam Extra"/>
-                <w:color w:val="000000"/>
-                <w:szCs w:val="32"/>
-              </w:rPr>
-              <w:t>8</w:t>
-            </w:r>
-            <w:r>
-              <w:rPr>
-                <w:rFonts w:ascii="BRH Malayalam Extra" w:hAnsi="BRH Malayalam Extra" w:cs="BRH Malayalam Extra"/>
-                <w:color w:val="000000"/>
-                <w:sz w:val="32"/>
-                <w:szCs w:val="32"/>
-              </w:rPr>
-              <w:t>(</w:t>
-            </w:r>
-            <w:r>
-              <w:rPr>
-                <w:rFonts w:cs="BRH Malayalam Extra"/>
-                <w:color w:val="000000"/>
-                <w:szCs w:val="32"/>
-              </w:rPr>
-              <w:t>31</w:t>
-            </w:r>
-            <w:r>
-              <w:rPr>
-                <w:rFonts w:ascii="BRH Malayalam Extra" w:hAnsi="BRH Malayalam Extra" w:cs="BRH Malayalam Extra"/>
-                <w:color w:val="000000"/>
-                <w:sz w:val="32"/>
-                <w:szCs w:val="32"/>
-              </w:rPr>
-              <w:t>)- Ap—</w:t>
+                <w:rFonts w:ascii="BRH Malayalam Extra" w:hAnsi="BRH Malayalam Extra" w:cs="BRH Malayalam Extra"/>
+                <w:color w:val="000000"/>
+                <w:sz w:val="32"/>
+                <w:szCs w:val="32"/>
+              </w:rPr>
+              <w:t>G</w:t>
+            </w:r>
+            <w:r>
+              <w:rPr>
+                <w:rFonts w:ascii="BRH Malayalam Extra" w:hAnsi="BRH Malayalam Extra" w:cs="BRH Malayalam Extra"/>
+                <w:color w:val="000000"/>
+                <w:sz w:val="26"/>
+                <w:szCs w:val="32"/>
+              </w:rPr>
+              <w:t>–</w:t>
+            </w:r>
+            <w:r>
+              <w:rPr>
+                <w:rFonts w:ascii="BRH Malayalam Extra" w:hAnsi="BRH Malayalam Extra" w:cs="BRH Malayalam Extra"/>
+                <w:color w:val="000000"/>
+                <w:sz w:val="32"/>
+                <w:szCs w:val="32"/>
+              </w:rPr>
+              <w:t>px p—k¡</w:t>
+            </w:r>
+            <w:r>
+              <w:rPr>
+                <w:rFonts w:ascii="BRH Malayalam Extra" w:hAnsi="BRH Malayalam Extra" w:cs="BRH Malayalam Extra"/>
+                <w:color w:val="000000"/>
+                <w:sz w:val="26"/>
+                <w:szCs w:val="32"/>
+              </w:rPr>
+              <w:t>–</w:t>
+            </w:r>
+            <w:r>
+              <w:rPr>
+                <w:rFonts w:ascii="BRH Malayalam Extra" w:hAnsi="BRH Malayalam Extra" w:cs="BRH Malayalam Extra"/>
+                <w:color w:val="000000"/>
+                <w:sz w:val="32"/>
+                <w:szCs w:val="32"/>
+              </w:rPr>
+              <w:t>Æx „p—</w:t>
             </w:r>
             <w:r>
               <w:rPr>
@@ -17057,6 +16793,63 @@
                 <w:szCs w:val="32"/>
                 <w:highlight w:val="green"/>
               </w:rPr>
+              <w:t>k¡¤¤Æ</w:t>
+            </w:r>
+            <w:r>
+              <w:rPr>
+                <w:rFonts w:ascii="BRH Malayalam Extra" w:hAnsi="BRH Malayalam Extra" w:cs="BRH Malayalam Extra"/>
+                <w:color w:val="000000"/>
+                <w:sz w:val="26"/>
+                <w:szCs w:val="32"/>
+                <w:highlight w:val="yellow"/>
+              </w:rPr>
+              <w:t>–</w:t>
+            </w:r>
+            <w:r>
+              <w:rPr>
+                <w:rFonts w:ascii="BRH Malayalam Extra" w:hAnsi="BRH Malayalam Extra" w:cs="BRH Malayalam Extra"/>
+                <w:color w:val="000000"/>
+                <w:sz w:val="32"/>
+                <w:szCs w:val="32"/>
+              </w:rPr>
+              <w:t xml:space="preserve"> </w:t>
+            </w:r>
+            <w:r>
+              <w:rPr>
+                <w:rFonts w:ascii="BRH Malayalam Extra" w:hAnsi="BRH Malayalam Extra" w:cs="BRH Malayalam Extra"/>
+                <w:color w:val="000000"/>
+                <w:sz w:val="32"/>
+                <w:szCs w:val="32"/>
+              </w:rPr>
+              <w:t>¤¤p</w:t>
+            </w:r>
+            <w:r>
+              <w:rPr>
+                <w:rFonts w:ascii="BRH Malayalam Extra" w:hAnsi="BRH Malayalam Extra" w:cs="BRH Malayalam Extra"/>
+                <w:color w:val="000000"/>
+                <w:sz w:val="32"/>
+                <w:szCs w:val="32"/>
+              </w:rPr>
+              <w:t>px p</w:t>
+            </w:r>
+            <w:r>
+              <w:rPr>
+                <w:rFonts w:ascii="BRH Malayalam Extra" w:hAnsi="BRH Malayalam Extra" w:cs="BRH Malayalam Extra"/>
+                <w:color w:val="000000"/>
+                <w:sz w:val="32"/>
+                <w:szCs w:val="32"/>
+                <w:highlight w:val="yellow"/>
+              </w:rPr>
+              <w:t>—</w:t>
+            </w:r>
+            <w:r>
+              <w:rPr>
+                <w:rFonts w:ascii="BRH Malayalam Extra" w:hAnsi="BRH Malayalam Extra" w:cs="BRH Malayalam Extra"/>
+                <w:color w:val="000000"/>
+                <w:sz w:val="32"/>
+                <w:szCs w:val="32"/>
+                <w:highlight w:val="green"/>
+              </w:rPr>
               <w:t>k¡</w:t>
             </w:r>
             <w:r>
@@ -17066,97 +16859,7 @@
                 <w:sz w:val="32"/>
                 <w:szCs w:val="32"/>
               </w:rPr>
-              <w:t>Æx | s</w:t>
-            </w:r>
-            <w:r>
-              <w:rPr>
-                <w:rFonts w:ascii="BRH Malayalam Extra" w:hAnsi="BRH Malayalam Extra" w:cs="BRH Malayalam Extra"/>
-                <w:color w:val="000000"/>
-                <w:sz w:val="26"/>
-                <w:szCs w:val="32"/>
-              </w:rPr>
-              <w:t>–</w:t>
-            </w:r>
-            <w:r>
-              <w:rPr>
-                <w:rFonts w:ascii="BRH Malayalam Extra" w:hAnsi="BRH Malayalam Extra" w:cs="BRH Malayalam Extra"/>
-                <w:color w:val="000000"/>
-                <w:sz w:val="32"/>
-                <w:szCs w:val="32"/>
-              </w:rPr>
-              <w:t>I</w:t>
-            </w:r>
-            <w:r>
-              <w:rPr>
-                <w:rFonts w:ascii="BRH Devanagari Extra" w:hAnsi="BRH Devanagari Extra" w:cs="BRH Malayalam Extra"/>
-                <w:color w:val="000000"/>
-                <w:sz w:val="28"/>
-                <w:szCs w:val="32"/>
-              </w:rPr>
-              <w:t>Æ</w:t>
-            </w:r>
-            <w:r>
-              <w:rPr>
-                <w:rFonts w:ascii="BRH Malayalam Extra" w:hAnsi="BRH Malayalam Extra" w:cs="BRH Malayalam Extra"/>
-                <w:color w:val="000000"/>
-                <w:sz w:val="32"/>
-                <w:szCs w:val="32"/>
-              </w:rPr>
-              <w:t>p</w:t>
-            </w:r>
-            <w:r>
-              <w:rPr>
-                <w:rFonts w:ascii="BRH Malayalam Extra" w:hAnsi="BRH Malayalam Extra" w:cs="BRH Malayalam Extra"/>
-                <w:color w:val="000000"/>
-                <w:sz w:val="26"/>
-                <w:szCs w:val="32"/>
-              </w:rPr>
-              <w:t>–</w:t>
-            </w:r>
-            <w:r>
-              <w:rPr>
-                <w:rFonts w:ascii="BRH Malayalam Extra" w:hAnsi="BRH Malayalam Extra" w:cs="BRH Malayalam Extra"/>
-                <w:color w:val="000000"/>
-                <w:sz w:val="32"/>
-                <w:szCs w:val="32"/>
-              </w:rPr>
-              <w:t>a§s</w:t>
-            </w:r>
-            <w:r>
-              <w:rPr>
-                <w:rFonts w:ascii="BRH Malayalam Extra" w:hAnsi="BRH Malayalam Extra" w:cs="BRH Malayalam Extra"/>
-                <w:color w:val="000000"/>
-                <w:sz w:val="26"/>
-                <w:szCs w:val="32"/>
-              </w:rPr>
-              <w:t>–</w:t>
-            </w:r>
-            <w:r>
-              <w:rPr>
-                <w:rFonts w:ascii="BRH Malayalam Extra" w:hAnsi="BRH Malayalam Extra" w:cs="BRH Malayalam Extra"/>
-                <w:color w:val="000000"/>
-                <w:sz w:val="32"/>
-                <w:szCs w:val="32"/>
-              </w:rPr>
-              <w:t>k</w:t>
-            </w:r>
-            <w:r>
-              <w:rPr>
-                <w:rFonts w:ascii="BRH Malayalam Extra" w:hAnsi="BRH Malayalam Extra" w:cs="BRH Malayalam Extra"/>
-                <w:color w:val="000000"/>
-                <w:sz w:val="26"/>
-                <w:szCs w:val="32"/>
-              </w:rPr>
-              <w:t>–</w:t>
-            </w:r>
-            <w:r>
-              <w:rPr>
-                <w:rFonts w:ascii="BRH Malayalam Extra" w:hAnsi="BRH Malayalam Extra" w:cs="BRH Malayalam Extra"/>
-                <w:color w:val="000000"/>
-                <w:sz w:val="32"/>
-                <w:szCs w:val="32"/>
-              </w:rPr>
-              <w:t xml:space="preserve">sb—J | </w:t>
+              <w:t xml:space="preserve">Æx </w:t>
             </w:r>
           </w:p>
           <w:p>
@@ -17179,80 +16882,175 @@
                 <w:color w:val="000000"/>
                 <w:sz w:val="32"/>
                 <w:szCs w:val="32"/>
-              </w:rPr>
-              <w:t>s</w:t>
-            </w:r>
-            <w:r>
-              <w:rPr>
-                <w:rFonts w:ascii="BRH Malayalam Extra" w:hAnsi="BRH Malayalam Extra" w:cs="BRH Malayalam Extra"/>
-                <w:color w:val="000000"/>
-                <w:sz w:val="26"/>
-                <w:szCs w:val="32"/>
-              </w:rPr>
-              <w:t>–</w:t>
-            </w:r>
-            <w:r>
-              <w:rPr>
-                <w:rFonts w:ascii="BRH Malayalam Extra" w:hAnsi="BRH Malayalam Extra" w:cs="BRH Malayalam Extra"/>
-                <w:color w:val="000000"/>
-                <w:sz w:val="32"/>
-                <w:szCs w:val="32"/>
-              </w:rPr>
-              <w:t>t</w:t>
-            </w:r>
-            <w:r>
-              <w:rPr>
-                <w:rFonts w:ascii="BRH Malayalam Extra" w:hAnsi="BRH Malayalam Extra" w:cs="BRH Malayalam Extra"/>
-                <w:color w:val="000000"/>
-                <w:sz w:val="26"/>
-                <w:szCs w:val="32"/>
-              </w:rPr>
-              <w:t>–</w:t>
-            </w:r>
-            <w:r>
-              <w:rPr>
-                <w:rFonts w:ascii="BRH Malayalam Extra" w:hAnsi="BRH Malayalam Extra" w:cs="BRH Malayalam Extra"/>
-                <w:color w:val="000000"/>
-                <w:sz w:val="32"/>
-                <w:szCs w:val="32"/>
-              </w:rPr>
-              <w:t>ös</w:t>
-            </w:r>
-            <w:r>
-              <w:rPr>
-                <w:rFonts w:ascii="BRH Malayalam Extra" w:hAnsi="BRH Malayalam Extra" w:cs="BRH Malayalam Extra"/>
-                <w:color w:val="000000"/>
-                <w:sz w:val="26"/>
-                <w:szCs w:val="32"/>
-              </w:rPr>
-              <w:t>–</w:t>
-            </w:r>
-            <w:r>
-              <w:rPr>
-                <w:rFonts w:ascii="BRH Malayalam Extra" w:hAnsi="BRH Malayalam Extra" w:cs="BRH Malayalam Extra"/>
-                <w:color w:val="000000"/>
-                <w:sz w:val="32"/>
-                <w:szCs w:val="32"/>
-              </w:rPr>
-              <w:t>jx</w:t>
-            </w:r>
-            <w:r>
-              <w:rPr>
-                <w:rFonts w:ascii="BRH Malayalam Extra" w:hAnsi="BRH Malayalam Extra" w:cs="BRH Malayalam Extra"/>
-                <w:color w:val="000000"/>
-                <w:sz w:val="26"/>
-                <w:szCs w:val="32"/>
-              </w:rPr>
-              <w:t>–</w:t>
-            </w:r>
-            <w:r>
-              <w:rPr>
-                <w:rFonts w:ascii="BRH Malayalam Extra" w:hAnsi="BRH Malayalam Extra" w:cs="BRH Malayalam Extra"/>
-                <w:color w:val="000000"/>
-                <w:sz w:val="32"/>
-                <w:szCs w:val="32"/>
-              </w:rPr>
-              <w:t>Ryd—J |</w:t>
+                <w:highlight w:val="green"/>
+              </w:rPr>
+              <w:t>sI</w:t>
+            </w:r>
+            <w:r>
+              <w:rPr>
+                <w:rFonts w:ascii="BRH Devanagari Extra" w:hAnsi="BRH Devanagari Extra" w:cs="BRH Malayalam Extra"/>
+                <w:color w:val="000000"/>
+                <w:sz w:val="28"/>
+                <w:szCs w:val="32"/>
+              </w:rPr>
+              <w:t>Æ</w:t>
+            </w:r>
+            <w:r>
+              <w:rPr>
+                <w:rFonts w:ascii="BRH Malayalam Extra" w:hAnsi="BRH Malayalam Extra" w:cs="BRH Malayalam Extra"/>
+                <w:color w:val="000000"/>
+                <w:sz w:val="32"/>
+                <w:szCs w:val="32"/>
+              </w:rPr>
+              <w:t>pa§sk</w:t>
+            </w:r>
+            <w:r>
+              <w:rPr>
+                <w:rFonts w:ascii="BRH Malayalam Extra" w:hAnsi="BRH Malayalam Extra" w:cs="BRH Malayalam Extra"/>
+                <w:color w:val="000000"/>
+                <w:sz w:val="26"/>
+                <w:szCs w:val="32"/>
+              </w:rPr>
+              <w:t>–</w:t>
+            </w:r>
+            <w:r>
+              <w:rPr>
+                <w:rFonts w:ascii="BRH Malayalam Extra" w:hAnsi="BRH Malayalam Extra" w:cs="BRH Malayalam Extra"/>
+                <w:color w:val="000000"/>
+                <w:sz w:val="32"/>
+                <w:szCs w:val="32"/>
+              </w:rPr>
+              <w:t>sb—J sI</w:t>
+            </w:r>
+            <w:r>
+              <w:rPr>
+                <w:rFonts w:ascii="BRH Devanagari Extra" w:hAnsi="BRH Devanagari Extra" w:cs="BRH Malayalam Extra"/>
+                <w:color w:val="000000"/>
+                <w:sz w:val="28"/>
+                <w:szCs w:val="32"/>
+              </w:rPr>
+              <w:t>Æ</w:t>
+            </w:r>
+            <w:r>
+              <w:rPr>
+                <w:rFonts w:ascii="BRH Malayalam Extra" w:hAnsi="BRH Malayalam Extra" w:cs="BRH Malayalam Extra"/>
+                <w:color w:val="000000"/>
+                <w:sz w:val="32"/>
+                <w:szCs w:val="32"/>
+              </w:rPr>
+              <w:t>pa§sk</w:t>
+            </w:r>
+            <w:r>
+              <w:rPr>
+                <w:rFonts w:ascii="BRH Malayalam Extra" w:hAnsi="BRH Malayalam Extra" w:cs="BRH Malayalam Extra"/>
+                <w:color w:val="000000"/>
+                <w:sz w:val="26"/>
+                <w:szCs w:val="32"/>
+              </w:rPr>
+              <w:t>–</w:t>
+            </w:r>
+            <w:r>
+              <w:rPr>
+                <w:rFonts w:ascii="BRH Malayalam Extra" w:hAnsi="BRH Malayalam Extra" w:cs="BRH Malayalam Extra"/>
+                <w:color w:val="000000"/>
+                <w:sz w:val="32"/>
+                <w:szCs w:val="32"/>
+              </w:rPr>
+              <w:t>s¥bx „p—</w:t>
+            </w:r>
+            <w:r>
+              <w:rPr>
+                <w:rFonts w:ascii="BRH Malayalam Extra" w:hAnsi="BRH Malayalam Extra" w:cs="BRH Malayalam Extra"/>
+                <w:color w:val="000000"/>
+                <w:sz w:val="32"/>
+                <w:szCs w:val="32"/>
+                <w:highlight w:val="green"/>
+              </w:rPr>
+              <w:t>k¡¤¤Æ</w:t>
+            </w:r>
+            <w:r>
+              <w:rPr>
+                <w:rFonts w:ascii="BRH Malayalam Extra" w:hAnsi="BRH Malayalam Extra" w:cs="BRH Malayalam Extra"/>
+                <w:color w:val="000000"/>
+                <w:sz w:val="26"/>
+                <w:szCs w:val="32"/>
+                <w:highlight w:val="green"/>
+              </w:rPr>
+              <w:t>–</w:t>
+            </w:r>
+            <w:r>
+              <w:rPr>
+                <w:rFonts w:ascii="BRH Malayalam Extra" w:hAnsi="BRH Malayalam Extra" w:cs="BRH Malayalam Extra"/>
+                <w:color w:val="000000"/>
+                <w:sz w:val="32"/>
+                <w:szCs w:val="32"/>
+              </w:rPr>
+              <w:t xml:space="preserve"> ¤¤ppx p—</w:t>
+            </w:r>
+            <w:r>
+              <w:rPr>
+                <w:rFonts w:ascii="BRH Malayalam Extra" w:hAnsi="BRH Malayalam Extra" w:cs="BRH Malayalam Extra"/>
+                <w:color w:val="000000"/>
+                <w:sz w:val="32"/>
+                <w:szCs w:val="32"/>
+                <w:highlight w:val="green"/>
+              </w:rPr>
+              <w:t>k¡</w:t>
+            </w:r>
+            <w:r>
+              <w:rPr>
+                <w:rFonts w:ascii="BRH Malayalam Extra" w:hAnsi="BRH Malayalam Extra" w:cs="BRH Malayalam Extra"/>
+                <w:color w:val="000000"/>
+                <w:sz w:val="32"/>
+                <w:szCs w:val="32"/>
+              </w:rPr>
+              <w:t xml:space="preserve">Æx </w:t>
+            </w:r>
+            <w:r>
+              <w:rPr>
+                <w:rFonts w:ascii="BRH Malayalam Extra" w:hAnsi="BRH Malayalam Extra" w:cs="BRH Malayalam Extra"/>
+                <w:color w:val="000000"/>
+                <w:sz w:val="32"/>
+                <w:szCs w:val="32"/>
+                <w:highlight w:val="green"/>
+              </w:rPr>
+              <w:t>sI</w:t>
+            </w:r>
+            <w:r>
+              <w:rPr>
+                <w:rFonts w:ascii="BRH Devanagari Extra" w:hAnsi="BRH Devanagari Extra" w:cs="BRH Malayalam Extra"/>
+                <w:color w:val="000000"/>
+                <w:sz w:val="28"/>
+                <w:szCs w:val="32"/>
+              </w:rPr>
+              <w:t>Æ</w:t>
+            </w:r>
+            <w:r>
+              <w:rPr>
+                <w:rFonts w:ascii="BRH Malayalam Extra" w:hAnsi="BRH Malayalam Extra" w:cs="BRH Malayalam Extra"/>
+                <w:color w:val="000000"/>
+                <w:sz w:val="32"/>
+                <w:szCs w:val="32"/>
+              </w:rPr>
+              <w:t>pa§sk</w:t>
+            </w:r>
+            <w:r>
+              <w:rPr>
+                <w:rFonts w:ascii="BRH Malayalam Extra" w:hAnsi="BRH Malayalam Extra" w:cs="BRH Malayalam Extra"/>
+                <w:color w:val="000000"/>
+                <w:sz w:val="26"/>
+                <w:szCs w:val="32"/>
+              </w:rPr>
+              <w:t>–</w:t>
+            </w:r>
+            <w:r>
+              <w:rPr>
+                <w:rFonts w:ascii="BRH Malayalam Extra" w:hAnsi="BRH Malayalam Extra" w:cs="BRH Malayalam Extra"/>
+                <w:color w:val="000000"/>
+                <w:sz w:val="32"/>
+                <w:szCs w:val="32"/>
+              </w:rPr>
+              <w:t xml:space="preserve">sb—J | </w:t>
             </w:r>
           </w:p>
           <w:p>
@@ -17271,12 +17069,114 @@
             </w:pPr>
             <w:r>
               <w:rPr>
-                <w:rFonts w:ascii="BRH Malayalam Extra" w:hAnsi="BRH Malayalam Extra" w:cs="BRH Malayalam Extra"/>
-                <w:color w:val="000000"/>
-                <w:sz w:val="32"/>
-                <w:szCs w:val="32"/>
-              </w:rPr>
-              <w:t>Ap—</w:t>
+                <w:rFonts w:cs="BRH Malayalam Extra"/>
+                <w:color w:val="000000"/>
+                <w:szCs w:val="32"/>
+              </w:rPr>
+              <w:t>37</w:t>
+            </w:r>
+            <w:r>
+              <w:rPr>
+                <w:rFonts w:ascii="BRH Malayalam Extra" w:hAnsi="BRH Malayalam Extra" w:cs="BRH Malayalam Extra"/>
+                <w:color w:val="000000"/>
+                <w:sz w:val="32"/>
+                <w:szCs w:val="32"/>
+              </w:rPr>
+              <w:t>)</w:t>
+            </w:r>
+            <w:r>
+              <w:rPr>
+                <w:rFonts w:ascii="BRH Malayalam Extra" w:hAnsi="BRH Malayalam Extra" w:cs="BRH Malayalam Extra"/>
+                <w:color w:val="000000"/>
+                <w:sz w:val="32"/>
+                <w:szCs w:val="32"/>
+              </w:rPr>
+              <w:tab/>
+            </w:r>
+            <w:r>
+              <w:rPr>
+                <w:rFonts w:cs="BRH Malayalam Extra"/>
+                <w:color w:val="000000"/>
+                <w:szCs w:val="32"/>
+              </w:rPr>
+              <w:t>3</w:t>
+            </w:r>
+            <w:r>
+              <w:rPr>
+                <w:rFonts w:ascii="BRH Malayalam Extra" w:hAnsi="BRH Malayalam Extra" w:cs="BRH Malayalam Extra"/>
+                <w:color w:val="000000"/>
+                <w:sz w:val="32"/>
+                <w:szCs w:val="32"/>
+              </w:rPr>
+              <w:t>.</w:t>
+            </w:r>
+            <w:r>
+              <w:rPr>
+                <w:rFonts w:cs="BRH Malayalam Extra"/>
+                <w:color w:val="000000"/>
+                <w:szCs w:val="32"/>
+              </w:rPr>
+              <w:t>4</w:t>
+            </w:r>
+            <w:r>
+              <w:rPr>
+                <w:rFonts w:ascii="BRH Malayalam Extra" w:hAnsi="BRH Malayalam Extra" w:cs="BRH Malayalam Extra"/>
+                <w:color w:val="000000"/>
+                <w:sz w:val="32"/>
+                <w:szCs w:val="32"/>
+              </w:rPr>
+              <w:t>.</w:t>
+            </w:r>
+            <w:r>
+              <w:rPr>
+                <w:rFonts w:cs="BRH Malayalam Extra"/>
+                <w:color w:val="000000"/>
+                <w:szCs w:val="32"/>
+              </w:rPr>
+              <w:t>3</w:t>
+            </w:r>
+            <w:r>
+              <w:rPr>
+                <w:rFonts w:ascii="BRH Malayalam Extra" w:hAnsi="BRH Malayalam Extra" w:cs="BRH Malayalam Extra"/>
+                <w:color w:val="000000"/>
+                <w:sz w:val="32"/>
+                <w:szCs w:val="32"/>
+              </w:rPr>
+              <w:t>.</w:t>
+            </w:r>
+            <w:r>
+              <w:rPr>
+                <w:rFonts w:cs="BRH Malayalam Extra"/>
+                <w:color w:val="000000"/>
+                <w:szCs w:val="32"/>
+              </w:rPr>
+              <w:t>8</w:t>
+            </w:r>
+            <w:r>
+              <w:rPr>
+                <w:rFonts w:ascii="BRH Malayalam Extra" w:hAnsi="BRH Malayalam Extra" w:cs="BRH Malayalam Extra"/>
+                <w:color w:val="000000"/>
+                <w:sz w:val="32"/>
+                <w:szCs w:val="32"/>
+              </w:rPr>
+              <w:t>(</w:t>
+            </w:r>
+            <w:r>
+              <w:rPr>
+                <w:rFonts w:cs="BRH Malayalam Extra"/>
+                <w:color w:val="000000"/>
+                <w:szCs w:val="32"/>
+              </w:rPr>
+              <w:t>31</w:t>
+            </w:r>
+            <w:r>
+              <w:rPr>
+                <w:rFonts w:ascii="BRH Malayalam Extra" w:hAnsi="BRH Malayalam Extra" w:cs="BRH Malayalam Extra"/>
+                <w:color w:val="000000"/>
+                <w:sz w:val="32"/>
+                <w:szCs w:val="32"/>
+              </w:rPr>
+              <w:t>)- Ap—</w:t>
             </w:r>
             <w:r>
               <w:rPr>
@@ -17295,17 +17195,25 @@
                 <w:sz w:val="32"/>
                 <w:szCs w:val="32"/>
               </w:rPr>
-              <w:t xml:space="preserve">Æx </w:t>
-            </w:r>
-            <w:r>
-              <w:rPr>
-                <w:rFonts w:ascii="BRH Malayalam Extra" w:hAnsi="BRH Malayalam Extra" w:cs="BRH Malayalam Extra"/>
-                <w:color w:val="000000"/>
-                <w:sz w:val="32"/>
-                <w:szCs w:val="32"/>
-                <w:highlight w:val="green"/>
-              </w:rPr>
-              <w:t>sI</w:t>
+              <w:t>Æx | s</w:t>
+            </w:r>
+            <w:r>
+              <w:rPr>
+                <w:rFonts w:ascii="BRH Malayalam Extra" w:hAnsi="BRH Malayalam Extra" w:cs="BRH Malayalam Extra"/>
+                <w:color w:val="000000"/>
+                <w:sz w:val="26"/>
+                <w:szCs w:val="32"/>
+              </w:rPr>
+              <w:t>–</w:t>
+            </w:r>
+            <w:r>
+              <w:rPr>
+                <w:rFonts w:ascii="BRH Malayalam Extra" w:hAnsi="BRH Malayalam Extra" w:cs="BRH Malayalam Extra"/>
+                <w:color w:val="000000"/>
+                <w:sz w:val="32"/>
+                <w:szCs w:val="32"/>
+              </w:rPr>
+              <w:t>I</w:t>
             </w:r>
             <w:r>
               <w:rPr>
@@ -17323,61 +17231,61 @@
                 <w:sz w:val="32"/>
                 <w:szCs w:val="32"/>
               </w:rPr>
-              <w:t>pa§sk</w:t>
-            </w:r>
-            <w:r>
-              <w:rPr>
-                <w:rFonts w:ascii="BRH Malayalam Extra" w:hAnsi="BRH Malayalam Extra" w:cs="BRH Malayalam Extra"/>
-                <w:color w:val="000000"/>
-                <w:sz w:val="26"/>
-                <w:szCs w:val="32"/>
-              </w:rPr>
-              <w:t>–</w:t>
-            </w:r>
-            <w:r>
-              <w:rPr>
-                <w:rFonts w:ascii="BRH Malayalam Extra" w:hAnsi="BRH Malayalam Extra" w:cs="BRH Malayalam Extra"/>
-                <w:color w:val="000000"/>
-                <w:sz w:val="32"/>
-                <w:szCs w:val="32"/>
-              </w:rPr>
-              <w:t>sb—J sI</w:t>
-            </w:r>
-            <w:r>
-              <w:rPr>
-                <w:rFonts w:ascii="BRH Devanagari Extra" w:hAnsi="BRH Devanagari Extra" w:cs="BRH Malayalam Extra"/>
-                <w:color w:val="000000"/>
-                <w:sz w:val="28"/>
-                <w:szCs w:val="32"/>
-              </w:rPr>
-              <w:t>Æ</w:t>
-            </w:r>
-            <w:r>
-              <w:rPr>
-                <w:rFonts w:ascii="BRH Malayalam Extra" w:hAnsi="BRH Malayalam Extra" w:cs="BRH Malayalam Extra"/>
-                <w:color w:val="000000"/>
-                <w:sz w:val="32"/>
-                <w:szCs w:val="32"/>
-              </w:rPr>
-              <w:t>pa§sk</w:t>
-            </w:r>
-            <w:r>
-              <w:rPr>
-                <w:rFonts w:ascii="BRH Malayalam Extra" w:hAnsi="BRH Malayalam Extra" w:cs="BRH Malayalam Extra"/>
-                <w:color w:val="000000"/>
-                <w:sz w:val="26"/>
-                <w:szCs w:val="32"/>
-              </w:rPr>
-              <w:t>–</w:t>
-            </w:r>
-            <w:r>
-              <w:rPr>
-                <w:rFonts w:ascii="BRH Malayalam Extra" w:hAnsi="BRH Malayalam Extra" w:cs="BRH Malayalam Extra"/>
-                <w:color w:val="000000"/>
-                <w:sz w:val="32"/>
-                <w:szCs w:val="32"/>
-              </w:rPr>
-              <w:t xml:space="preserve">s¥bx </w:t>
+              <w:t>p</w:t>
+            </w:r>
+            <w:r>
+              <w:rPr>
+                <w:rFonts w:ascii="BRH Malayalam Extra" w:hAnsi="BRH Malayalam Extra" w:cs="BRH Malayalam Extra"/>
+                <w:color w:val="000000"/>
+                <w:sz w:val="26"/>
+                <w:szCs w:val="32"/>
+              </w:rPr>
+              <w:t>–</w:t>
+            </w:r>
+            <w:r>
+              <w:rPr>
+                <w:rFonts w:ascii="BRH Malayalam Extra" w:hAnsi="BRH Malayalam Extra" w:cs="BRH Malayalam Extra"/>
+                <w:color w:val="000000"/>
+                <w:sz w:val="32"/>
+                <w:szCs w:val="32"/>
+              </w:rPr>
+              <w:t>a§s</w:t>
+            </w:r>
+            <w:r>
+              <w:rPr>
+                <w:rFonts w:ascii="BRH Malayalam Extra" w:hAnsi="BRH Malayalam Extra" w:cs="BRH Malayalam Extra"/>
+                <w:color w:val="000000"/>
+                <w:sz w:val="26"/>
+                <w:szCs w:val="32"/>
+              </w:rPr>
+              <w:t>–</w:t>
+            </w:r>
+            <w:r>
+              <w:rPr>
+                <w:rFonts w:ascii="BRH Malayalam Extra" w:hAnsi="BRH Malayalam Extra" w:cs="BRH Malayalam Extra"/>
+                <w:color w:val="000000"/>
+                <w:sz w:val="32"/>
+                <w:szCs w:val="32"/>
+              </w:rPr>
+              <w:t>k</w:t>
+            </w:r>
+            <w:r>
+              <w:rPr>
+                <w:rFonts w:ascii="BRH Malayalam Extra" w:hAnsi="BRH Malayalam Extra" w:cs="BRH Malayalam Extra"/>
+                <w:color w:val="000000"/>
+                <w:sz w:val="26"/>
+                <w:szCs w:val="32"/>
+              </w:rPr>
+              <w:t>–</w:t>
+            </w:r>
+            <w:r>
+              <w:rPr>
+                <w:rFonts w:ascii="BRH Malayalam Extra" w:hAnsi="BRH Malayalam Extra" w:cs="BRH Malayalam Extra"/>
+                <w:color w:val="000000"/>
+                <w:sz w:val="32"/>
+                <w:szCs w:val="32"/>
+              </w:rPr>
+              <w:t xml:space="preserve">sb—J | </w:t>
             </w:r>
           </w:p>
           <w:p>
@@ -17401,171 +17309,79 @@
                 <w:sz w:val="32"/>
                 <w:szCs w:val="32"/>
               </w:rPr>
-              <w:t>„p—k¡</w:t>
-            </w:r>
-            <w:r>
-              <w:rPr>
-                <w:rFonts w:ascii="BRH Malayalam Extra" w:hAnsi="BRH Malayalam Extra" w:cs="BRH Malayalam Extra"/>
-                <w:color w:val="000000"/>
-                <w:sz w:val="26"/>
-                <w:szCs w:val="32"/>
-              </w:rPr>
-              <w:t>–</w:t>
-            </w:r>
-            <w:r>
-              <w:rPr>
-                <w:rFonts w:ascii="BRH Malayalam Extra" w:hAnsi="BRH Malayalam Extra" w:cs="BRH Malayalam Extra"/>
-                <w:color w:val="000000"/>
-                <w:sz w:val="32"/>
-                <w:szCs w:val="32"/>
-              </w:rPr>
-              <w:t>Æx „p—</w:t>
-            </w:r>
-            <w:r>
-              <w:rPr>
-                <w:rFonts w:ascii="BRH Malayalam Extra" w:hAnsi="BRH Malayalam Extra" w:cs="BRH Malayalam Extra"/>
-                <w:color w:val="000000"/>
-                <w:sz w:val="32"/>
-                <w:szCs w:val="32"/>
-                <w:highlight w:val="green"/>
-              </w:rPr>
-              <w:t>k¡</w:t>
-            </w:r>
-            <w:r>
-              <w:rPr>
-                <w:rFonts w:ascii="BRH Malayalam Extra" w:hAnsi="BRH Malayalam Extra" w:cs="BRH Malayalam Extra"/>
-                <w:color w:val="000000"/>
-                <w:sz w:val="32"/>
-                <w:szCs w:val="32"/>
-              </w:rPr>
-              <w:t xml:space="preserve">Æx </w:t>
-            </w:r>
-            <w:r>
-              <w:rPr>
-                <w:rFonts w:ascii="BRH Malayalam Extra" w:hAnsi="BRH Malayalam Extra" w:cs="BRH Malayalam Extra"/>
-                <w:color w:val="000000"/>
-                <w:sz w:val="32"/>
-                <w:szCs w:val="32"/>
-                <w:highlight w:val="green"/>
-              </w:rPr>
               <w:t>s</w:t>
             </w:r>
             <w:r>
               <w:rPr>
                 <w:rFonts w:ascii="BRH Malayalam Extra" w:hAnsi="BRH Malayalam Extra" w:cs="BRH Malayalam Extra"/>
                 <w:color w:val="000000"/>
-                <w:sz w:val="32"/>
-                <w:szCs w:val="32"/>
-              </w:rPr>
-              <w:t>I</w:t>
-            </w:r>
-            <w:r>
-              <w:rPr>
-                <w:rFonts w:ascii="BRH Devanagari Extra" w:hAnsi="BRH Devanagari Extra" w:cs="BRH Malayalam Extra"/>
-                <w:color w:val="000000"/>
-                <w:sz w:val="28"/>
-                <w:szCs w:val="32"/>
-              </w:rPr>
-              <w:t>Æ</w:t>
-            </w:r>
-            <w:r>
-              <w:rPr>
-                <w:rFonts w:ascii="BRH Malayalam Extra" w:hAnsi="BRH Malayalam Extra" w:cs="BRH Malayalam Extra"/>
-                <w:color w:val="000000"/>
-                <w:sz w:val="32"/>
-                <w:szCs w:val="32"/>
-              </w:rPr>
-              <w:t>pa§sk</w:t>
-            </w:r>
-            <w:r>
-              <w:rPr>
-                <w:rFonts w:ascii="BRH Malayalam Extra" w:hAnsi="BRH Malayalam Extra" w:cs="BRH Malayalam Extra"/>
-                <w:color w:val="000000"/>
-                <w:sz w:val="26"/>
-                <w:szCs w:val="32"/>
-              </w:rPr>
-              <w:t>–</w:t>
-            </w:r>
-            <w:r>
-              <w:rPr>
-                <w:rFonts w:ascii="BRH Malayalam Extra" w:hAnsi="BRH Malayalam Extra" w:cs="BRH Malayalam Extra"/>
-                <w:color w:val="000000"/>
-                <w:sz w:val="32"/>
-                <w:szCs w:val="32"/>
-              </w:rPr>
-              <w:t>sb—J stösjx</w:t>
-            </w:r>
-            <w:r>
-              <w:rPr>
-                <w:rFonts w:ascii="BRH Malayalam Extra" w:hAnsi="BRH Malayalam Extra" w:cs="BRH Malayalam Extra"/>
-                <w:color w:val="000000"/>
-                <w:sz w:val="26"/>
-                <w:szCs w:val="32"/>
-              </w:rPr>
-              <w:t>–</w:t>
-            </w:r>
-            <w:r>
-              <w:rPr>
-                <w:rFonts w:ascii="BRH Malayalam Extra" w:hAnsi="BRH Malayalam Extra" w:cs="BRH Malayalam Extra"/>
-                <w:color w:val="000000"/>
-                <w:sz w:val="32"/>
-                <w:szCs w:val="32"/>
-              </w:rPr>
-              <w:t>Ryd—J stösjx</w:t>
-            </w:r>
-            <w:r>
-              <w:rPr>
-                <w:rFonts w:ascii="BRH Malayalam Extra" w:hAnsi="BRH Malayalam Extra" w:cs="BRH Malayalam Extra"/>
-                <w:color w:val="000000"/>
-                <w:sz w:val="26"/>
-                <w:szCs w:val="32"/>
-              </w:rPr>
-              <w:t>–</w:t>
-            </w:r>
-            <w:r>
-              <w:rPr>
-                <w:rFonts w:ascii="BRH Malayalam Extra" w:hAnsi="BRH Malayalam Extra" w:cs="BRH Malayalam Extra"/>
-                <w:color w:val="000000"/>
-                <w:sz w:val="32"/>
-                <w:szCs w:val="32"/>
-              </w:rPr>
-              <w:t>Ryd—J sI</w:t>
-            </w:r>
-            <w:r>
-              <w:rPr>
-                <w:rFonts w:ascii="BRH Devanagari Extra" w:hAnsi="BRH Devanagari Extra" w:cs="BRH Malayalam Extra"/>
-                <w:color w:val="000000"/>
-                <w:sz w:val="28"/>
-                <w:szCs w:val="32"/>
-              </w:rPr>
-              <w:t>Æ</w:t>
-            </w:r>
-            <w:r>
-              <w:rPr>
-                <w:rFonts w:ascii="BRH Malayalam Extra" w:hAnsi="BRH Malayalam Extra" w:cs="BRH Malayalam Extra"/>
-                <w:color w:val="000000"/>
-                <w:sz w:val="32"/>
-                <w:szCs w:val="32"/>
-              </w:rPr>
-              <w:t>pa§sk</w:t>
-            </w:r>
-            <w:r>
-              <w:rPr>
-                <w:rFonts w:ascii="BRH Malayalam Extra" w:hAnsi="BRH Malayalam Extra" w:cs="BRH Malayalam Extra"/>
-                <w:color w:val="000000"/>
-                <w:sz w:val="26"/>
-                <w:szCs w:val="32"/>
-              </w:rPr>
-              <w:t>–</w:t>
-            </w:r>
-            <w:r>
-              <w:rPr>
-                <w:rFonts w:ascii="BRH Malayalam Extra" w:hAnsi="BRH Malayalam Extra" w:cs="BRH Malayalam Extra"/>
-                <w:color w:val="000000"/>
-                <w:sz w:val="32"/>
-                <w:szCs w:val="32"/>
-              </w:rPr>
-              <w:t xml:space="preserve">s¥bx </w:t>
+                <w:sz w:val="26"/>
+                <w:szCs w:val="32"/>
+              </w:rPr>
+              <w:t>–</w:t>
+            </w:r>
+            <w:r>
+              <w:rPr>
+                <w:rFonts w:ascii="BRH Malayalam Extra" w:hAnsi="BRH Malayalam Extra" w:cs="BRH Malayalam Extra"/>
+                <w:color w:val="000000"/>
+                <w:sz w:val="32"/>
+                <w:szCs w:val="32"/>
+              </w:rPr>
+              <w:t>t</w:t>
+            </w:r>
+            <w:r>
+              <w:rPr>
+                <w:rFonts w:ascii="BRH Malayalam Extra" w:hAnsi="BRH Malayalam Extra" w:cs="BRH Malayalam Extra"/>
+                <w:color w:val="000000"/>
+                <w:sz w:val="26"/>
+                <w:szCs w:val="32"/>
+              </w:rPr>
+              <w:t>–</w:t>
+            </w:r>
+            <w:r>
+              <w:rPr>
+                <w:rFonts w:ascii="BRH Malayalam Extra" w:hAnsi="BRH Malayalam Extra" w:cs="BRH Malayalam Extra"/>
+                <w:color w:val="000000"/>
+                <w:sz w:val="32"/>
+                <w:szCs w:val="32"/>
+              </w:rPr>
+              <w:t>ös</w:t>
+            </w:r>
+            <w:r>
+              <w:rPr>
+                <w:rFonts w:ascii="BRH Malayalam Extra" w:hAnsi="BRH Malayalam Extra" w:cs="BRH Malayalam Extra"/>
+                <w:color w:val="000000"/>
+                <w:sz w:val="26"/>
+                <w:szCs w:val="32"/>
+              </w:rPr>
+              <w:t>–</w:t>
+            </w:r>
+            <w:r>
+              <w:rPr>
+                <w:rFonts w:ascii="BRH Malayalam Extra" w:hAnsi="BRH Malayalam Extra" w:cs="BRH Malayalam Extra"/>
+                <w:color w:val="000000"/>
+                <w:sz w:val="32"/>
+                <w:szCs w:val="32"/>
+              </w:rPr>
+              <w:t>jx</w:t>
+            </w:r>
+            <w:r>
+              <w:rPr>
+                <w:rFonts w:ascii="BRH Malayalam Extra" w:hAnsi="BRH Malayalam Extra" w:cs="BRH Malayalam Extra"/>
+                <w:color w:val="000000"/>
+                <w:sz w:val="26"/>
+                <w:szCs w:val="32"/>
+              </w:rPr>
+              <w:t>–</w:t>
+            </w:r>
+            <w:r>
+              <w:rPr>
+                <w:rFonts w:ascii="BRH Malayalam Extra" w:hAnsi="BRH Malayalam Extra" w:cs="BRH Malayalam Extra"/>
+                <w:color w:val="000000"/>
+                <w:sz w:val="32"/>
+                <w:szCs w:val="32"/>
+              </w:rPr>
+              <w:t>Ryd—J |</w:t>
             </w:r>
           </w:p>
           <w:p>
@@ -17589,25 +17405,7 @@
                 <w:sz w:val="32"/>
                 <w:szCs w:val="32"/>
               </w:rPr>
-              <w:t>„p—k¡</w:t>
-            </w:r>
-            <w:r>
-              <w:rPr>
-                <w:rFonts w:ascii="BRH Malayalam Extra" w:hAnsi="BRH Malayalam Extra" w:cs="BRH Malayalam Extra"/>
-                <w:color w:val="000000"/>
-                <w:sz w:val="26"/>
-                <w:szCs w:val="32"/>
-              </w:rPr>
-              <w:t>–</w:t>
-            </w:r>
-            <w:r>
-              <w:rPr>
-                <w:rFonts w:ascii="BRH Malayalam Extra" w:hAnsi="BRH Malayalam Extra" w:cs="BRH Malayalam Extra"/>
-                <w:color w:val="000000"/>
-                <w:sz w:val="32"/>
-                <w:szCs w:val="32"/>
-              </w:rPr>
-              <w:t>Æx „p—</w:t>
+              <w:t>Ap—</w:t>
             </w:r>
             <w:r>
               <w:rPr>
@@ -17636,16 +17434,7 @@
                 <w:szCs w:val="32"/>
                 <w:highlight w:val="green"/>
               </w:rPr>
-              <w:t>s</w:t>
-            </w:r>
-            <w:r>
-              <w:rPr>
-                <w:rFonts w:ascii="BRH Malayalam Extra" w:hAnsi="BRH Malayalam Extra" w:cs="BRH Malayalam Extra"/>
-                <w:color w:val="000000"/>
-                <w:sz w:val="32"/>
-                <w:szCs w:val="32"/>
-              </w:rPr>
-              <w:t>I</w:t>
+              <w:t>sI</w:t>
             </w:r>
             <w:r>
               <w:rPr>
@@ -17681,7 +17470,43 @@
                 <w:sz w:val="32"/>
                 <w:szCs w:val="32"/>
               </w:rPr>
-              <w:t xml:space="preserve">sb—J </w:t>
+              <w:t>sb—J sI</w:t>
+            </w:r>
+            <w:r>
+              <w:rPr>
+                <w:rFonts w:ascii="BRH Devanagari Extra" w:hAnsi="BRH Devanagari Extra" w:cs="BRH Malayalam Extra"/>
+                <w:color w:val="000000"/>
+                <w:sz w:val="28"/>
+                <w:szCs w:val="32"/>
+              </w:rPr>
+              <w:t>Æ</w:t>
+            </w:r>
+            <w:r>
+              <w:rPr>
+                <w:rFonts w:ascii="BRH Malayalam Extra" w:hAnsi="BRH Malayalam Extra" w:cs="BRH Malayalam Extra"/>
+                <w:color w:val="000000"/>
+                <w:sz w:val="32"/>
+                <w:szCs w:val="32"/>
+              </w:rPr>
+              <w:t>pa§sk</w:t>
+            </w:r>
+            <w:r>
+              <w:rPr>
+                <w:rFonts w:ascii="BRH Malayalam Extra" w:hAnsi="BRH Malayalam Extra" w:cs="BRH Malayalam Extra"/>
+                <w:color w:val="000000"/>
+                <w:sz w:val="26"/>
+                <w:szCs w:val="32"/>
+              </w:rPr>
+              <w:t>–</w:t>
+            </w:r>
+            <w:r>
+              <w:rPr>
+                <w:rFonts w:ascii="BRH Malayalam Extra" w:hAnsi="BRH Malayalam Extra" w:cs="BRH Malayalam Extra"/>
+                <w:color w:val="000000"/>
+                <w:sz w:val="32"/>
+                <w:szCs w:val="32"/>
+              </w:rPr>
+              <w:t xml:space="preserve">s¥bx </w:t>
             </w:r>
           </w:p>
           <w:p>
@@ -17705,25 +17530,171 @@
                 <w:sz w:val="32"/>
                 <w:szCs w:val="32"/>
               </w:rPr>
-              <w:t>stösjx</w:t>
-            </w:r>
-            <w:r>
-              <w:rPr>
-                <w:rFonts w:ascii="BRH Malayalam Extra" w:hAnsi="BRH Malayalam Extra" w:cs="BRH Malayalam Extra"/>
-                <w:color w:val="000000"/>
-                <w:sz w:val="26"/>
-                <w:szCs w:val="32"/>
-              </w:rPr>
-              <w:t>–</w:t>
-            </w:r>
-            <w:r>
-              <w:rPr>
-                <w:rFonts w:ascii="BRH Malayalam Extra" w:hAnsi="BRH Malayalam Extra" w:cs="BRH Malayalam Extra"/>
-                <w:color w:val="000000"/>
-                <w:sz w:val="32"/>
-                <w:szCs w:val="32"/>
-              </w:rPr>
-              <w:t xml:space="preserve">Ryd—J | </w:t>
+              <w:t>„p—k¡</w:t>
+            </w:r>
+            <w:r>
+              <w:rPr>
+                <w:rFonts w:ascii="BRH Malayalam Extra" w:hAnsi="BRH Malayalam Extra" w:cs="BRH Malayalam Extra"/>
+                <w:color w:val="000000"/>
+                <w:sz w:val="26"/>
+                <w:szCs w:val="32"/>
+              </w:rPr>
+              <w:t>–</w:t>
+            </w:r>
+            <w:r>
+              <w:rPr>
+                <w:rFonts w:ascii="BRH Malayalam Extra" w:hAnsi="BRH Malayalam Extra" w:cs="BRH Malayalam Extra"/>
+                <w:color w:val="000000"/>
+                <w:sz w:val="32"/>
+                <w:szCs w:val="32"/>
+              </w:rPr>
+              <w:t>Æx „p—</w:t>
+            </w:r>
+            <w:r>
+              <w:rPr>
+                <w:rFonts w:ascii="BRH Malayalam Extra" w:hAnsi="BRH Malayalam Extra" w:cs="BRH Malayalam Extra"/>
+                <w:color w:val="000000"/>
+                <w:sz w:val="32"/>
+                <w:szCs w:val="32"/>
+                <w:highlight w:val="green"/>
+              </w:rPr>
+              <w:t>k¡</w:t>
+            </w:r>
+            <w:r>
+              <w:rPr>
+                <w:rFonts w:ascii="BRH Malayalam Extra" w:hAnsi="BRH Malayalam Extra" w:cs="BRH Malayalam Extra"/>
+                <w:color w:val="000000"/>
+                <w:sz w:val="32"/>
+                <w:szCs w:val="32"/>
+              </w:rPr>
+              <w:t xml:space="preserve">Æx </w:t>
+            </w:r>
+            <w:r>
+              <w:rPr>
+                <w:rFonts w:ascii="BRH Malayalam Extra" w:hAnsi="BRH Malayalam Extra" w:cs="BRH Malayalam Extra"/>
+                <w:color w:val="000000"/>
+                <w:sz w:val="32"/>
+                <w:szCs w:val="32"/>
+                <w:highlight w:val="green"/>
+              </w:rPr>
+              <w:t>s</w:t>
+            </w:r>
+            <w:r>
+              <w:rPr>
+                <w:rFonts w:ascii="BRH Malayalam Extra" w:hAnsi="BRH Malayalam Extra" w:cs="BRH Malayalam Extra"/>
+                <w:color w:val="000000"/>
+                <w:sz w:val="32"/>
+                <w:szCs w:val="32"/>
+              </w:rPr>
+              <w:t>I</w:t>
+            </w:r>
+            <w:r>
+              <w:rPr>
+                <w:rFonts w:ascii="BRH Devanagari Extra" w:hAnsi="BRH Devanagari Extra" w:cs="BRH Malayalam Extra"/>
+                <w:color w:val="000000"/>
+                <w:sz w:val="28"/>
+                <w:szCs w:val="32"/>
+              </w:rPr>
+              <w:t>Æ</w:t>
+            </w:r>
+            <w:r>
+              <w:rPr>
+                <w:rFonts w:ascii="BRH Malayalam Extra" w:hAnsi="BRH Malayalam Extra" w:cs="BRH Malayalam Extra"/>
+                <w:color w:val="000000"/>
+                <w:sz w:val="32"/>
+                <w:szCs w:val="32"/>
+              </w:rPr>
+              <w:t>pa§sk</w:t>
+            </w:r>
+            <w:r>
+              <w:rPr>
+                <w:rFonts w:ascii="BRH Malayalam Extra" w:hAnsi="BRH Malayalam Extra" w:cs="BRH Malayalam Extra"/>
+                <w:color w:val="000000"/>
+                <w:sz w:val="26"/>
+                <w:szCs w:val="32"/>
+              </w:rPr>
+              <w:t>–</w:t>
+            </w:r>
+            <w:r>
+              <w:rPr>
+                <w:rFonts w:ascii="BRH Malayalam Extra" w:hAnsi="BRH Malayalam Extra" w:cs="BRH Malayalam Extra"/>
+                <w:color w:val="000000"/>
+                <w:sz w:val="32"/>
+                <w:szCs w:val="32"/>
+              </w:rPr>
+              <w:t>sb—J stösjx</w:t>
+            </w:r>
+            <w:r>
+              <w:rPr>
+                <w:rFonts w:ascii="BRH Malayalam Extra" w:hAnsi="BRH Malayalam Extra" w:cs="BRH Malayalam Extra"/>
+                <w:color w:val="000000"/>
+                <w:sz w:val="26"/>
+                <w:szCs w:val="32"/>
+              </w:rPr>
+              <w:t>–</w:t>
+            </w:r>
+            <w:r>
+              <w:rPr>
+                <w:rFonts w:ascii="BRH Malayalam Extra" w:hAnsi="BRH Malayalam Extra" w:cs="BRH Malayalam Extra"/>
+                <w:color w:val="000000"/>
+                <w:sz w:val="32"/>
+                <w:szCs w:val="32"/>
+              </w:rPr>
+              <w:t>Ryd—J stösjx</w:t>
+            </w:r>
+            <w:r>
+              <w:rPr>
+                <w:rFonts w:ascii="BRH Malayalam Extra" w:hAnsi="BRH Malayalam Extra" w:cs="BRH Malayalam Extra"/>
+                <w:color w:val="000000"/>
+                <w:sz w:val="26"/>
+                <w:szCs w:val="32"/>
+              </w:rPr>
+              <w:t>–</w:t>
+            </w:r>
+            <w:r>
+              <w:rPr>
+                <w:rFonts w:ascii="BRH Malayalam Extra" w:hAnsi="BRH Malayalam Extra" w:cs="BRH Malayalam Extra"/>
+                <w:color w:val="000000"/>
+                <w:sz w:val="32"/>
+                <w:szCs w:val="32"/>
+              </w:rPr>
+              <w:t>Ryd—J sI</w:t>
+            </w:r>
+            <w:r>
+              <w:rPr>
+                <w:rFonts w:ascii="BRH Devanagari Extra" w:hAnsi="BRH Devanagari Extra" w:cs="BRH Malayalam Extra"/>
+                <w:color w:val="000000"/>
+                <w:sz w:val="28"/>
+                <w:szCs w:val="32"/>
+              </w:rPr>
+              <w:t>Æ</w:t>
+            </w:r>
+            <w:r>
+              <w:rPr>
+                <w:rFonts w:ascii="BRH Malayalam Extra" w:hAnsi="BRH Malayalam Extra" w:cs="BRH Malayalam Extra"/>
+                <w:color w:val="000000"/>
+                <w:sz w:val="32"/>
+                <w:szCs w:val="32"/>
+              </w:rPr>
+              <w:t>pa§sk</w:t>
+            </w:r>
+            <w:r>
+              <w:rPr>
+                <w:rFonts w:ascii="BRH Malayalam Extra" w:hAnsi="BRH Malayalam Extra" w:cs="BRH Malayalam Extra"/>
+                <w:color w:val="000000"/>
+                <w:sz w:val="26"/>
+                <w:szCs w:val="32"/>
+              </w:rPr>
+              <w:t>–</w:t>
+            </w:r>
+            <w:r>
+              <w:rPr>
+                <w:rFonts w:ascii="BRH Malayalam Extra" w:hAnsi="BRH Malayalam Extra" w:cs="BRH Malayalam Extra"/>
+                <w:color w:val="000000"/>
+                <w:sz w:val="32"/>
+                <w:szCs w:val="32"/>
+              </w:rPr>
+              <w:t xml:space="preserve">s¥bx </w:t>
             </w:r>
           </w:p>
           <w:p>
@@ -17742,114 +17713,30 @@
             </w:pPr>
             <w:r>
               <w:rPr>
-                <w:rFonts w:cs="BRH Malayalam Extra"/>
-                <w:color w:val="000000"/>
-                <w:szCs w:val="32"/>
-              </w:rPr>
-              <w:t>38</w:t>
-            </w:r>
-            <w:r>
-              <w:rPr>
-                <w:rFonts w:ascii="BRH Malayalam Extra" w:hAnsi="BRH Malayalam Extra" w:cs="BRH Malayalam Extra"/>
-                <w:color w:val="000000"/>
-                <w:sz w:val="32"/>
-                <w:szCs w:val="32"/>
-              </w:rPr>
-              <w:t>)</w:t>
-            </w:r>
-            <w:r>
-              <w:rPr>
-                <w:rFonts w:ascii="BRH Malayalam Extra" w:hAnsi="BRH Malayalam Extra" w:cs="BRH Malayalam Extra"/>
-                <w:color w:val="000000"/>
-                <w:sz w:val="32"/>
-                <w:szCs w:val="32"/>
-              </w:rPr>
-              <w:tab/>
-            </w:r>
-            <w:r>
-              <w:rPr>
-                <w:rFonts w:cs="BRH Malayalam Extra"/>
-                <w:color w:val="000000"/>
-                <w:szCs w:val="32"/>
-              </w:rPr>
-              <w:t>3</w:t>
-            </w:r>
-            <w:r>
-              <w:rPr>
-                <w:rFonts w:ascii="BRH Malayalam Extra" w:hAnsi="BRH Malayalam Extra" w:cs="BRH Malayalam Extra"/>
-                <w:color w:val="000000"/>
-                <w:sz w:val="32"/>
-                <w:szCs w:val="32"/>
-              </w:rPr>
-              <w:t>.</w:t>
-            </w:r>
-            <w:r>
-              <w:rPr>
-                <w:rFonts w:cs="BRH Malayalam Extra"/>
-                <w:color w:val="000000"/>
-                <w:szCs w:val="32"/>
-              </w:rPr>
-              <w:t>4</w:t>
-            </w:r>
-            <w:r>
-              <w:rPr>
-                <w:rFonts w:ascii="BRH Malayalam Extra" w:hAnsi="BRH Malayalam Extra" w:cs="BRH Malayalam Extra"/>
-                <w:color w:val="000000"/>
-                <w:sz w:val="32"/>
-                <w:szCs w:val="32"/>
-              </w:rPr>
-              <w:t>.</w:t>
-            </w:r>
-            <w:r>
-              <w:rPr>
-                <w:rFonts w:cs="BRH Malayalam Extra"/>
-                <w:color w:val="000000"/>
-                <w:szCs w:val="32"/>
-              </w:rPr>
-              <w:t>3</w:t>
-            </w:r>
-            <w:r>
-              <w:rPr>
-                <w:rFonts w:ascii="BRH Malayalam Extra" w:hAnsi="BRH Malayalam Extra" w:cs="BRH Malayalam Extra"/>
-                <w:color w:val="000000"/>
-                <w:sz w:val="32"/>
-                <w:szCs w:val="32"/>
-              </w:rPr>
-              <w:t>.</w:t>
-            </w:r>
-            <w:r>
-              <w:rPr>
-                <w:rFonts w:cs="BRH Malayalam Extra"/>
-                <w:color w:val="000000"/>
-                <w:szCs w:val="32"/>
-              </w:rPr>
-              <w:t>8</w:t>
-            </w:r>
-            <w:r>
-              <w:rPr>
-                <w:rFonts w:ascii="BRH Malayalam Extra" w:hAnsi="BRH Malayalam Extra" w:cs="BRH Malayalam Extra"/>
-                <w:color w:val="000000"/>
-                <w:sz w:val="32"/>
-                <w:szCs w:val="32"/>
-              </w:rPr>
-              <w:t>(</w:t>
-            </w:r>
-            <w:r>
-              <w:rPr>
-                <w:rFonts w:cs="BRH Malayalam Extra"/>
-                <w:color w:val="000000"/>
-                <w:szCs w:val="32"/>
-              </w:rPr>
-              <w:t>31</w:t>
-            </w:r>
-            <w:r>
-              <w:rPr>
-                <w:rFonts w:ascii="BRH Malayalam Extra" w:hAnsi="BRH Malayalam Extra" w:cs="BRH Malayalam Extra"/>
-                <w:color w:val="000000"/>
-                <w:sz w:val="32"/>
-                <w:szCs w:val="32"/>
-              </w:rPr>
-              <w:t>)- Ap—</w:t>
+                <w:rFonts w:ascii="BRH Malayalam Extra" w:hAnsi="BRH Malayalam Extra" w:cs="BRH Malayalam Extra"/>
+                <w:color w:val="000000"/>
+                <w:sz w:val="32"/>
+                <w:szCs w:val="32"/>
+              </w:rPr>
+              <w:t>„p—k¡</w:t>
+            </w:r>
+            <w:r>
+              <w:rPr>
+                <w:rFonts w:ascii="BRH Malayalam Extra" w:hAnsi="BRH Malayalam Extra" w:cs="BRH Malayalam Extra"/>
+                <w:color w:val="000000"/>
+                <w:sz w:val="26"/>
+                <w:szCs w:val="32"/>
+              </w:rPr>
+              <w:t>–</w:t>
+            </w:r>
+            <w:r>
+              <w:rPr>
+                <w:rFonts w:ascii="BRH Malayalam Extra" w:hAnsi="BRH Malayalam Extra" w:cs="BRH Malayalam Extra"/>
+                <w:color w:val="000000"/>
+                <w:sz w:val="32"/>
+                <w:szCs w:val="32"/>
+              </w:rPr>
+              <w:t>Æx „p—</w:t>
             </w:r>
             <w:r>
               <w:rPr>
@@ -17868,7 +17755,62 @@
                 <w:sz w:val="32"/>
                 <w:szCs w:val="32"/>
               </w:rPr>
-              <w:t>Æx |</w:t>
+              <w:t xml:space="preserve">Æx </w:t>
+            </w:r>
+            <w:r>
+              <w:rPr>
+                <w:rFonts w:ascii="BRH Malayalam Extra" w:hAnsi="BRH Malayalam Extra" w:cs="BRH Malayalam Extra"/>
+                <w:color w:val="000000"/>
+                <w:sz w:val="32"/>
+                <w:szCs w:val="32"/>
+                <w:highlight w:val="green"/>
+              </w:rPr>
+              <w:t>s</w:t>
+            </w:r>
+            <w:r>
+              <w:rPr>
+                <w:rFonts w:ascii="BRH Malayalam Extra" w:hAnsi="BRH Malayalam Extra" w:cs="BRH Malayalam Extra"/>
+                <w:color w:val="000000"/>
+                <w:sz w:val="32"/>
+                <w:szCs w:val="32"/>
+              </w:rPr>
+              <w:t>I</w:t>
+            </w:r>
+            <w:r>
+              <w:rPr>
+                <w:rFonts w:ascii="BRH Devanagari Extra" w:hAnsi="BRH Devanagari Extra" w:cs="BRH Malayalam Extra"/>
+                <w:color w:val="000000"/>
+                <w:sz w:val="28"/>
+                <w:szCs w:val="32"/>
+              </w:rPr>
+              <w:t>Æ</w:t>
+            </w:r>
+            <w:r>
+              <w:rPr>
+                <w:rFonts w:ascii="BRH Malayalam Extra" w:hAnsi="BRH Malayalam Extra" w:cs="BRH Malayalam Extra"/>
+                <w:color w:val="000000"/>
+                <w:sz w:val="32"/>
+                <w:szCs w:val="32"/>
+              </w:rPr>
+              <w:t>pa§sk</w:t>
+            </w:r>
+            <w:r>
+              <w:rPr>
+                <w:rFonts w:ascii="BRH Malayalam Extra" w:hAnsi="BRH Malayalam Extra" w:cs="BRH Malayalam Extra"/>
+                <w:color w:val="000000"/>
+                <w:sz w:val="26"/>
+                <w:szCs w:val="32"/>
+              </w:rPr>
+              <w:t>–</w:t>
+            </w:r>
+            <w:r>
+              <w:rPr>
+                <w:rFonts w:ascii="BRH Malayalam Extra" w:hAnsi="BRH Malayalam Extra" w:cs="BRH Malayalam Extra"/>
+                <w:color w:val="000000"/>
+                <w:sz w:val="32"/>
+                <w:szCs w:val="32"/>
+              </w:rPr>
+              <w:t xml:space="preserve">sb—J </w:t>
             </w:r>
           </w:p>
           <w:p>
@@ -17879,6 +17821,194 @@
               <w:adjustRightInd w:val="0"/>
               <w:spacing w:before="0" w:line="240" w:lineRule="auto"/>
               <w:rPr>
+                <w:rFonts w:ascii="BRH Malayalam Extra" w:hAnsi="BRH Malayalam Extra" w:cs="BRH Malayalam Extra"/>
+                <w:color w:val="000000"/>
+                <w:sz w:val="32"/>
+                <w:szCs w:val="32"/>
+              </w:rPr>
+            </w:pPr>
+            <w:r>
+              <w:rPr>
+                <w:rFonts w:ascii="BRH Malayalam Extra" w:hAnsi="BRH Malayalam Extra" w:cs="BRH Malayalam Extra"/>
+                <w:color w:val="000000"/>
+                <w:sz w:val="32"/>
+                <w:szCs w:val="32"/>
+              </w:rPr>
+              <w:t>stösjx</w:t>
+            </w:r>
+            <w:r>
+              <w:rPr>
+                <w:rFonts w:ascii="BRH Malayalam Extra" w:hAnsi="BRH Malayalam Extra" w:cs="BRH Malayalam Extra"/>
+                <w:color w:val="000000"/>
+                <w:sz w:val="26"/>
+                <w:szCs w:val="32"/>
+              </w:rPr>
+              <w:t>–</w:t>
+            </w:r>
+            <w:r>
+              <w:rPr>
+                <w:rFonts w:ascii="BRH Malayalam Extra" w:hAnsi="BRH Malayalam Extra" w:cs="BRH Malayalam Extra"/>
+                <w:color w:val="000000"/>
+                <w:sz w:val="32"/>
+                <w:szCs w:val="32"/>
+              </w:rPr>
+              <w:t xml:space="preserve">Ryd—J | </w:t>
+            </w:r>
+          </w:p>
+          <w:p>
+            <w:pPr>
+              <w:widowControl w:val="0"/>
+              <w:autoSpaceDE w:val="0"/>
+              <w:autoSpaceDN w:val="0"/>
+              <w:adjustRightInd w:val="0"/>
+              <w:spacing w:before="0" w:line="240" w:lineRule="auto"/>
+              <w:rPr>
+                <w:rFonts w:ascii="BRH Malayalam Extra" w:hAnsi="BRH Malayalam Extra" w:cs="BRH Malayalam Extra"/>
+                <w:color w:val="000000"/>
+                <w:sz w:val="32"/>
+                <w:szCs w:val="32"/>
+              </w:rPr>
+            </w:pPr>
+            <w:r>
+              <w:rPr>
+                <w:rFonts w:cs="BRH Malayalam Extra"/>
+                <w:color w:val="000000"/>
+                <w:szCs w:val="32"/>
+              </w:rPr>
+              <w:lastRenderedPageBreak/>
+              <w:t>38</w:t>
+            </w:r>
+            <w:r>
+              <w:rPr>
+                <w:rFonts w:ascii="BRH Malayalam Extra" w:hAnsi="BRH Malayalam Extra" w:cs="BRH Malayalam Extra"/>
+                <w:color w:val="000000"/>
+                <w:sz w:val="32"/>
+                <w:szCs w:val="32"/>
+              </w:rPr>
+              <w:t>)</w:t>
+            </w:r>
+            <w:r>
+              <w:rPr>
+                <w:rFonts w:ascii="BRH Malayalam Extra" w:hAnsi="BRH Malayalam Extra" w:cs="BRH Malayalam Extra"/>
+                <w:color w:val="000000"/>
+                <w:sz w:val="32"/>
+                <w:szCs w:val="32"/>
+              </w:rPr>
+              <w:tab/>
+            </w:r>
+            <w:r>
+              <w:rPr>
+                <w:rFonts w:cs="BRH Malayalam Extra"/>
+                <w:color w:val="000000"/>
+                <w:szCs w:val="32"/>
+              </w:rPr>
+              <w:t>3</w:t>
+            </w:r>
+            <w:r>
+              <w:rPr>
+                <w:rFonts w:ascii="BRH Malayalam Extra" w:hAnsi="BRH Malayalam Extra" w:cs="BRH Malayalam Extra"/>
+                <w:color w:val="000000"/>
+                <w:sz w:val="32"/>
+                <w:szCs w:val="32"/>
+              </w:rPr>
+              <w:t>.</w:t>
+            </w:r>
+            <w:r>
+              <w:rPr>
+                <w:rFonts w:cs="BRH Malayalam Extra"/>
+                <w:color w:val="000000"/>
+                <w:szCs w:val="32"/>
+              </w:rPr>
+              <w:t>4</w:t>
+            </w:r>
+            <w:r>
+              <w:rPr>
+                <w:rFonts w:ascii="BRH Malayalam Extra" w:hAnsi="BRH Malayalam Extra" w:cs="BRH Malayalam Extra"/>
+                <w:color w:val="000000"/>
+                <w:sz w:val="32"/>
+                <w:szCs w:val="32"/>
+              </w:rPr>
+              <w:t>.</w:t>
+            </w:r>
+            <w:r>
+              <w:rPr>
+                <w:rFonts w:cs="BRH Malayalam Extra"/>
+                <w:color w:val="000000"/>
+                <w:szCs w:val="32"/>
+              </w:rPr>
+              <w:t>3</w:t>
+            </w:r>
+            <w:r>
+              <w:rPr>
+                <w:rFonts w:ascii="BRH Malayalam Extra" w:hAnsi="BRH Malayalam Extra" w:cs="BRH Malayalam Extra"/>
+                <w:color w:val="000000"/>
+                <w:sz w:val="32"/>
+                <w:szCs w:val="32"/>
+              </w:rPr>
+              <w:t>.</w:t>
+            </w:r>
+            <w:r>
+              <w:rPr>
+                <w:rFonts w:cs="BRH Malayalam Extra"/>
+                <w:color w:val="000000"/>
+                <w:szCs w:val="32"/>
+              </w:rPr>
+              <w:t>8</w:t>
+            </w:r>
+            <w:r>
+              <w:rPr>
+                <w:rFonts w:ascii="BRH Malayalam Extra" w:hAnsi="BRH Malayalam Extra" w:cs="BRH Malayalam Extra"/>
+                <w:color w:val="000000"/>
+                <w:sz w:val="32"/>
+                <w:szCs w:val="32"/>
+              </w:rPr>
+              <w:t>(</w:t>
+            </w:r>
+            <w:r>
+              <w:rPr>
+                <w:rFonts w:cs="BRH Malayalam Extra"/>
+                <w:color w:val="000000"/>
+                <w:szCs w:val="32"/>
+              </w:rPr>
+              <w:t>31</w:t>
+            </w:r>
+            <w:r>
+              <w:rPr>
+                <w:rFonts w:ascii="BRH Malayalam Extra" w:hAnsi="BRH Malayalam Extra" w:cs="BRH Malayalam Extra"/>
+                <w:color w:val="000000"/>
+                <w:sz w:val="32"/>
+                <w:szCs w:val="32"/>
+              </w:rPr>
+              <w:t>)- Ap—</w:t>
+            </w:r>
+            <w:r>
+              <w:rPr>
+                <w:rFonts w:ascii="BRH Malayalam Extra" w:hAnsi="BRH Malayalam Extra" w:cs="BRH Malayalam Extra"/>
+                <w:color w:val="000000"/>
+                <w:sz w:val="32"/>
+                <w:szCs w:val="32"/>
+                <w:highlight w:val="green"/>
+              </w:rPr>
+              <w:t>k¡</w:t>
+            </w:r>
+            <w:r>
+              <w:rPr>
+                <w:rFonts w:ascii="BRH Malayalam Extra" w:hAnsi="BRH Malayalam Extra" w:cs="BRH Malayalam Extra"/>
+                <w:color w:val="000000"/>
+                <w:sz w:val="32"/>
+                <w:szCs w:val="32"/>
+              </w:rPr>
+              <w:t>Æx |</w:t>
+            </w:r>
+          </w:p>
+          <w:p>
+            <w:pPr>
+              <w:widowControl w:val="0"/>
+              <w:autoSpaceDE w:val="0"/>
+              <w:autoSpaceDN w:val="0"/>
+              <w:adjustRightInd w:val="0"/>
+              <w:spacing w:before="0" w:line="240" w:lineRule="auto"/>
+              <w:rPr>
                 <w:rFonts w:cs="BRH Malayalam Extra"/>
                 <w:color w:val="FF0000"/>
                 <w:szCs w:val="40"/>
@@ -17891,7 +18021,6 @@
                 <w:sz w:val="32"/>
                 <w:szCs w:val="32"/>
               </w:rPr>
-              <w:lastRenderedPageBreak/>
               <w:t>Ap—k¡</w:t>
             </w:r>
             <w:r>
@@ -17953,7 +18082,7 @@
       </w:tr>
       <w:tr>
         <w:trPr>
-          <w:trHeight w:val="4952"/>
+          <w:trHeight w:val="2967"/>
         </w:trPr>
         <w:tc>
           <w:tcPr>
@@ -17985,7 +18114,6 @@
                 <w:color w:val="000000"/>
                 <w:szCs w:val="32"/>
               </w:rPr>
-              <w:lastRenderedPageBreak/>
               <w:t>34</w:t>
             </w:r>
             <w:r>
@@ -19005,190 +19133,6 @@
                 <w:szCs w:val="32"/>
               </w:rPr>
             </w:pPr>
-            <w:r>
-              <w:rPr>
-                <w:rFonts w:cs="BRH Malayalam Extra"/>
-                <w:color w:val="000000"/>
-                <w:szCs w:val="32"/>
-              </w:rPr>
-              <w:t>38</w:t>
-            </w:r>
-            <w:r>
-              <w:rPr>
-                <w:rFonts w:ascii="BRH Malayalam Extra" w:hAnsi="BRH Malayalam Extra" w:cs="BRH Malayalam Extra"/>
-                <w:color w:val="000000"/>
-                <w:sz w:val="32"/>
-                <w:szCs w:val="32"/>
-              </w:rPr>
-              <w:t>)</w:t>
-            </w:r>
-            <w:r>
-              <w:rPr>
-                <w:rFonts w:ascii="BRH Malayalam Extra" w:hAnsi="BRH Malayalam Extra" w:cs="BRH Malayalam Extra"/>
-                <w:color w:val="000000"/>
-                <w:sz w:val="32"/>
-                <w:szCs w:val="32"/>
-              </w:rPr>
-              <w:tab/>
-            </w:r>
-            <w:r>
-              <w:rPr>
-                <w:rFonts w:cs="BRH Malayalam Extra"/>
-                <w:color w:val="000000"/>
-                <w:szCs w:val="32"/>
-              </w:rPr>
-              <w:t>3</w:t>
-            </w:r>
-            <w:r>
-              <w:rPr>
-                <w:rFonts w:ascii="BRH Malayalam Extra" w:hAnsi="BRH Malayalam Extra" w:cs="BRH Malayalam Extra"/>
-                <w:color w:val="000000"/>
-                <w:sz w:val="32"/>
-                <w:szCs w:val="32"/>
-              </w:rPr>
-              <w:t>.</w:t>
-            </w:r>
-            <w:r>
-              <w:rPr>
-                <w:rFonts w:cs="BRH Malayalam Extra"/>
-                <w:color w:val="000000"/>
-                <w:szCs w:val="32"/>
-              </w:rPr>
-              <w:t>4</w:t>
-            </w:r>
-            <w:r>
-              <w:rPr>
-                <w:rFonts w:ascii="BRH Malayalam Extra" w:hAnsi="BRH Malayalam Extra" w:cs="BRH Malayalam Extra"/>
-                <w:color w:val="000000"/>
-                <w:sz w:val="32"/>
-                <w:szCs w:val="32"/>
-              </w:rPr>
-              <w:t>.</w:t>
-            </w:r>
-            <w:r>
-              <w:rPr>
-                <w:rFonts w:cs="BRH Malayalam Extra"/>
-                <w:color w:val="000000"/>
-                <w:szCs w:val="32"/>
-              </w:rPr>
-              <w:t>7</w:t>
-            </w:r>
-            <w:r>
-              <w:rPr>
-                <w:rFonts w:ascii="BRH Malayalam Extra" w:hAnsi="BRH Malayalam Extra" w:cs="BRH Malayalam Extra"/>
-                <w:color w:val="000000"/>
-                <w:sz w:val="32"/>
-                <w:szCs w:val="32"/>
-              </w:rPr>
-              <w:t>.</w:t>
-            </w:r>
-            <w:r>
-              <w:rPr>
-                <w:rFonts w:cs="BRH Malayalam Extra"/>
-                <w:color w:val="000000"/>
-                <w:szCs w:val="32"/>
-              </w:rPr>
-              <w:t>1</w:t>
-            </w:r>
-            <w:r>
-              <w:rPr>
-                <w:rFonts w:ascii="BRH Malayalam Extra" w:hAnsi="BRH Malayalam Extra" w:cs="BRH Malayalam Extra"/>
-                <w:color w:val="000000"/>
-                <w:sz w:val="32"/>
-                <w:szCs w:val="32"/>
-              </w:rPr>
-              <w:t>(</w:t>
-            </w:r>
-            <w:r>
-              <w:rPr>
-                <w:rFonts w:cs="BRH Malayalam Extra"/>
-                <w:color w:val="000000"/>
-                <w:szCs w:val="32"/>
-              </w:rPr>
-              <w:t>33</w:t>
-            </w:r>
-            <w:r>
-              <w:rPr>
-                <w:rFonts w:ascii="BRH Malayalam Extra" w:hAnsi="BRH Malayalam Extra" w:cs="BRH Malayalam Extra"/>
-                <w:color w:val="000000"/>
-                <w:sz w:val="32"/>
-                <w:szCs w:val="32"/>
-              </w:rPr>
-              <w:t>)- s¢kõ—k</w:t>
-            </w:r>
-            <w:r>
-              <w:rPr>
-                <w:rFonts w:ascii="BRH Malayalam Extra" w:hAnsi="BRH Malayalam Extra" w:cs="BRH Malayalam Extra"/>
-                <w:color w:val="000000"/>
-                <w:sz w:val="32"/>
-                <w:szCs w:val="32"/>
-                <w:highlight w:val="yellow"/>
-              </w:rPr>
-              <w:t>qôy</w:t>
-            </w:r>
-            <w:r>
-              <w:rPr>
-                <w:rFonts w:ascii="BRH Malayalam Extra" w:hAnsi="BRH Malayalam Extra" w:cs="BRH Malayalam Extra"/>
-                <w:color w:val="000000"/>
-                <w:sz w:val="32"/>
-                <w:szCs w:val="32"/>
-              </w:rPr>
-              <w:t xml:space="preserve"> | P</w:t>
-            </w:r>
-            <w:r>
-              <w:rPr>
-                <w:rFonts w:ascii="BRH Malayalam Extra" w:hAnsi="BRH Malayalam Extra" w:cs="BRH Malayalam Extra"/>
-                <w:color w:val="000000"/>
-                <w:sz w:val="26"/>
-                <w:szCs w:val="32"/>
-              </w:rPr>
-              <w:t>–</w:t>
-            </w:r>
-            <w:r>
-              <w:rPr>
-                <w:rFonts w:ascii="BRH Malayalam Extra" w:hAnsi="BRH Malayalam Extra" w:cs="BRH Malayalam Extra"/>
-                <w:color w:val="000000"/>
-                <w:sz w:val="32"/>
-                <w:szCs w:val="32"/>
-              </w:rPr>
-              <w:t>öÉix˜J | M</w:t>
-            </w:r>
-            <w:r>
-              <w:rPr>
-                <w:rFonts w:ascii="BRH Malayalam Extra" w:hAnsi="BRH Malayalam Extra" w:cs="BRH Malayalam Extra"/>
-                <w:color w:val="000000"/>
-                <w:sz w:val="26"/>
-                <w:szCs w:val="32"/>
-              </w:rPr>
-              <w:t>–</w:t>
-            </w:r>
-            <w:r>
-              <w:rPr>
-                <w:rFonts w:ascii="BRH Malayalam Extra" w:hAnsi="BRH Malayalam Extra" w:cs="BRH Malayalam Extra"/>
-                <w:color w:val="000000"/>
-                <w:sz w:val="32"/>
-                <w:szCs w:val="32"/>
-              </w:rPr>
-              <w:t>Ê</w:t>
-            </w:r>
-            <w:r>
-              <w:rPr>
-                <w:rFonts w:ascii="BRH Malayalam Extra" w:hAnsi="BRH Malayalam Extra" w:cs="BRH Malayalam Extra"/>
-                <w:color w:val="000000"/>
-                <w:sz w:val="26"/>
-                <w:szCs w:val="32"/>
-              </w:rPr>
-              <w:t>–</w:t>
-            </w:r>
-            <w:r>
-              <w:rPr>
-                <w:rFonts w:ascii="BRH Malayalam Extra" w:hAnsi="BRH Malayalam Extra" w:cs="BRH Malayalam Extra"/>
-                <w:color w:val="000000"/>
-                <w:sz w:val="32"/>
-                <w:szCs w:val="32"/>
-              </w:rPr>
-              <w:t>ªpJ |</w:t>
-            </w:r>
           </w:p>
           <w:p>
             <w:pPr>
@@ -19206,12 +19150,211 @@
             </w:pPr>
             <w:r>
               <w:rPr>
-                <w:rFonts w:ascii="BRH Malayalam Extra" w:hAnsi="BRH Malayalam Extra" w:cs="BRH Malayalam Extra"/>
-                <w:color w:val="000000"/>
-                <w:sz w:val="32"/>
+                <w:rFonts w:cs="BRH Malayalam Extra"/>
+                <w:color w:val="000000"/>
                 <w:szCs w:val="32"/>
               </w:rPr>
               <w:lastRenderedPageBreak/>
+              <w:t>38</w:t>
+            </w:r>
+            <w:r>
+              <w:rPr>
+                <w:rFonts w:ascii="BRH Malayalam Extra" w:hAnsi="BRH Malayalam Extra" w:cs="BRH Malayalam Extra"/>
+                <w:color w:val="000000"/>
+                <w:sz w:val="32"/>
+                <w:szCs w:val="32"/>
+              </w:rPr>
+              <w:t>)</w:t>
+            </w:r>
+            <w:r>
+              <w:rPr>
+                <w:rFonts w:ascii="BRH Malayalam Extra" w:hAnsi="BRH Malayalam Extra" w:cs="BRH Malayalam Extra"/>
+                <w:color w:val="000000"/>
+                <w:sz w:val="32"/>
+                <w:szCs w:val="32"/>
+              </w:rPr>
+              <w:tab/>
+            </w:r>
+            <w:r>
+              <w:rPr>
+                <w:rFonts w:cs="BRH Malayalam Extra"/>
+                <w:color w:val="000000"/>
+                <w:szCs w:val="32"/>
+              </w:rPr>
+              <w:t>3</w:t>
+            </w:r>
+            <w:r>
+              <w:rPr>
+                <w:rFonts w:ascii="BRH Malayalam Extra" w:hAnsi="BRH Malayalam Extra" w:cs="BRH Malayalam Extra"/>
+                <w:color w:val="000000"/>
+                <w:sz w:val="32"/>
+                <w:szCs w:val="32"/>
+              </w:rPr>
+              <w:t>.</w:t>
+            </w:r>
+            <w:r>
+              <w:rPr>
+                <w:rFonts w:cs="BRH Malayalam Extra"/>
+                <w:color w:val="000000"/>
+                <w:szCs w:val="32"/>
+              </w:rPr>
+              <w:t>4</w:t>
+            </w:r>
+            <w:r>
+              <w:rPr>
+                <w:rFonts w:ascii="BRH Malayalam Extra" w:hAnsi="BRH Malayalam Extra" w:cs="BRH Malayalam Extra"/>
+                <w:color w:val="000000"/>
+                <w:sz w:val="32"/>
+                <w:szCs w:val="32"/>
+              </w:rPr>
+              <w:t>.</w:t>
+            </w:r>
+            <w:r>
+              <w:rPr>
+                <w:rFonts w:cs="BRH Malayalam Extra"/>
+                <w:color w:val="000000"/>
+                <w:szCs w:val="32"/>
+              </w:rPr>
+              <w:t>7</w:t>
+            </w:r>
+            <w:r>
+              <w:rPr>
+                <w:rFonts w:ascii="BRH Malayalam Extra" w:hAnsi="BRH Malayalam Extra" w:cs="BRH Malayalam Extra"/>
+                <w:color w:val="000000"/>
+                <w:sz w:val="32"/>
+                <w:szCs w:val="32"/>
+              </w:rPr>
+              <w:t>.</w:t>
+            </w:r>
+            <w:r>
+              <w:rPr>
+                <w:rFonts w:cs="BRH Malayalam Extra"/>
+                <w:color w:val="000000"/>
+                <w:szCs w:val="32"/>
+              </w:rPr>
+              <w:t>1</w:t>
+            </w:r>
+            <w:r>
+              <w:rPr>
+                <w:rFonts w:ascii="BRH Malayalam Extra" w:hAnsi="BRH Malayalam Extra" w:cs="BRH Malayalam Extra"/>
+                <w:color w:val="000000"/>
+                <w:sz w:val="32"/>
+                <w:szCs w:val="32"/>
+              </w:rPr>
+              <w:t>(</w:t>
+            </w:r>
+            <w:r>
+              <w:rPr>
+                <w:rFonts w:cs="BRH Malayalam Extra"/>
+                <w:color w:val="000000"/>
+                <w:szCs w:val="32"/>
+              </w:rPr>
+              <w:t>33</w:t>
+            </w:r>
+            <w:r>
+              <w:rPr>
+                <w:rFonts w:ascii="BRH Malayalam Extra" w:hAnsi="BRH Malayalam Extra" w:cs="BRH Malayalam Extra"/>
+                <w:color w:val="000000"/>
+                <w:sz w:val="32"/>
+                <w:szCs w:val="32"/>
+              </w:rPr>
+              <w:t>)- s¢kõ—k</w:t>
+            </w:r>
+            <w:r>
+              <w:rPr>
+                <w:rFonts w:ascii="BRH Malayalam Extra" w:hAnsi="BRH Malayalam Extra" w:cs="BRH Malayalam Extra"/>
+                <w:color w:val="000000"/>
+                <w:sz w:val="32"/>
+                <w:szCs w:val="32"/>
+                <w:highlight w:val="yellow"/>
+              </w:rPr>
+              <w:t>qôy</w:t>
+            </w:r>
+            <w:r>
+              <w:rPr>
+                <w:rFonts w:ascii="BRH Malayalam Extra" w:hAnsi="BRH Malayalam Extra" w:cs="BRH Malayalam Extra"/>
+                <w:color w:val="000000"/>
+                <w:sz w:val="32"/>
+                <w:szCs w:val="32"/>
+              </w:rPr>
+              <w:t xml:space="preserve"> | P</w:t>
+            </w:r>
+            <w:r>
+              <w:rPr>
+                <w:rFonts w:ascii="BRH Malayalam Extra" w:hAnsi="BRH Malayalam Extra" w:cs="BRH Malayalam Extra"/>
+                <w:color w:val="000000"/>
+                <w:sz w:val="26"/>
+                <w:szCs w:val="32"/>
+              </w:rPr>
+              <w:t>–</w:t>
+            </w:r>
+            <w:r>
+              <w:rPr>
+                <w:rFonts w:ascii="BRH Malayalam Extra" w:hAnsi="BRH Malayalam Extra" w:cs="BRH Malayalam Extra"/>
+                <w:color w:val="000000"/>
+                <w:sz w:val="32"/>
+                <w:szCs w:val="32"/>
+              </w:rPr>
+              <w:t>öÉix˜J | M</w:t>
+            </w:r>
+            <w:r>
+              <w:rPr>
+                <w:rFonts w:ascii="BRH Malayalam Extra" w:hAnsi="BRH Malayalam Extra" w:cs="BRH Malayalam Extra"/>
+                <w:color w:val="000000"/>
+                <w:sz w:val="26"/>
+                <w:szCs w:val="32"/>
+              </w:rPr>
+              <w:t>–</w:t>
+            </w:r>
+            <w:r>
+              <w:rPr>
+                <w:rFonts w:ascii="BRH Malayalam Extra" w:hAnsi="BRH Malayalam Extra" w:cs="BRH Malayalam Extra"/>
+                <w:color w:val="000000"/>
+                <w:sz w:val="32"/>
+                <w:szCs w:val="32"/>
+              </w:rPr>
+              <w:t>Ê</w:t>
+            </w:r>
+            <w:r>
+              <w:rPr>
+                <w:rFonts w:ascii="BRH Malayalam Extra" w:hAnsi="BRH Malayalam Extra" w:cs="BRH Malayalam Extra"/>
+                <w:color w:val="000000"/>
+                <w:sz w:val="26"/>
+                <w:szCs w:val="32"/>
+              </w:rPr>
+              <w:t>–</w:t>
+            </w:r>
+            <w:r>
+              <w:rPr>
+                <w:rFonts w:ascii="BRH Malayalam Extra" w:hAnsi="BRH Malayalam Extra" w:cs="BRH Malayalam Extra"/>
+                <w:color w:val="000000"/>
+                <w:sz w:val="32"/>
+                <w:szCs w:val="32"/>
+              </w:rPr>
+              <w:t>ªpJ |</w:t>
+            </w:r>
+          </w:p>
+          <w:p>
+            <w:pPr>
+              <w:widowControl w:val="0"/>
+              <w:autoSpaceDE w:val="0"/>
+              <w:autoSpaceDN w:val="0"/>
+              <w:adjustRightInd w:val="0"/>
+              <w:spacing w:before="0" w:line="240" w:lineRule="auto"/>
+              <w:rPr>
+                <w:rFonts w:ascii="BRH Malayalam Extra" w:hAnsi="BRH Malayalam Extra" w:cs="BRH Malayalam Extra"/>
+                <w:color w:val="000000"/>
+                <w:sz w:val="32"/>
+                <w:szCs w:val="32"/>
+              </w:rPr>
+            </w:pPr>
+            <w:r>
+              <w:rPr>
+                <w:rFonts w:ascii="BRH Malayalam Extra" w:hAnsi="BRH Malayalam Extra" w:cs="BRH Malayalam Extra"/>
+                <w:color w:val="000000"/>
+                <w:sz w:val="32"/>
+                <w:szCs w:val="32"/>
+              </w:rPr>
               <w:t>s¢kõ—k</w:t>
             </w:r>
             <w:r>
@@ -20809,71 +20952,7 @@
                 <w:sz w:val="32"/>
                 <w:szCs w:val="32"/>
               </w:rPr>
-              <w:t>iïJ s¡—r¡</w:t>
-            </w:r>
-            <w:r>
-              <w:rPr>
-                <w:rFonts w:ascii="BRH Malayalam Extra" w:hAnsi="BRH Malayalam Extra" w:cs="BRH Malayalam Extra"/>
-                <w:color w:val="000000"/>
-                <w:sz w:val="26"/>
-                <w:szCs w:val="32"/>
-              </w:rPr>
-              <w:t>–</w:t>
-            </w:r>
-            <w:r>
-              <w:rPr>
-                <w:rFonts w:ascii="BRH Malayalam Extra" w:hAnsi="BRH Malayalam Extra" w:cs="BRH Malayalam Extra"/>
-                <w:color w:val="000000"/>
-                <w:sz w:val="32"/>
-                <w:szCs w:val="32"/>
-              </w:rPr>
-              <w:t>iïJ s¢kõ—k</w:t>
-            </w:r>
-            <w:r>
-              <w:rPr>
-                <w:rFonts w:ascii="BRH Malayalam Extra" w:hAnsi="BRH Malayalam Extra" w:cs="BRH Malayalam Extra"/>
-                <w:color w:val="000000"/>
-                <w:sz w:val="32"/>
-                <w:szCs w:val="32"/>
-                <w:highlight w:val="green"/>
-              </w:rPr>
-              <w:t>qôy</w:t>
-            </w:r>
-            <w:r>
-              <w:rPr>
-                <w:rFonts w:ascii="BRH Malayalam Extra" w:hAnsi="BRH Malayalam Extra" w:cs="BRH Malayalam Extra"/>
-                <w:color w:val="000000"/>
-                <w:sz w:val="32"/>
-                <w:szCs w:val="32"/>
-              </w:rPr>
-              <w:t xml:space="preserve"> </w:t>
-            </w:r>
-            <w:r>
-              <w:rPr>
-                <w:rFonts w:ascii="BRH Malayalam Extra" w:hAnsi="BRH Malayalam Extra" w:cs="BRH Malayalam Extra"/>
-                <w:sz w:val="32"/>
-                <w:szCs w:val="32"/>
-                <w:highlight w:val="green"/>
-              </w:rPr>
-              <w:t>Ò</w:t>
-            </w:r>
-            <w:r>
-              <w:rPr>
-                <w:rFonts w:ascii="BRH Malayalam Extra" w:hAnsi="BRH Malayalam Extra" w:cs="BRH Malayalam Extra"/>
-                <w:color w:val="000000"/>
-                <w:sz w:val="26"/>
-                <w:szCs w:val="32"/>
-              </w:rPr>
-              <w:t>––</w:t>
-            </w:r>
-            <w:r>
-              <w:rPr>
-                <w:rFonts w:ascii="BRH Malayalam Extra" w:hAnsi="BRH Malayalam Extra" w:cs="BRH Malayalam Extra"/>
-                <w:color w:val="000000"/>
-                <w:sz w:val="32"/>
-                <w:szCs w:val="32"/>
-              </w:rPr>
-              <w:t xml:space="preserve">öÉix˜J | </w:t>
+              <w:t xml:space="preserve">iïJ </w:t>
             </w:r>
           </w:p>
           <w:p>
@@ -20892,195 +20971,76 @@
             </w:pPr>
             <w:r>
               <w:rPr>
-                <w:rFonts w:cs="BRH Malayalam Extra"/>
-                <w:color w:val="000000"/>
-                <w:szCs w:val="32"/>
-              </w:rPr>
-              <w:t>38</w:t>
-            </w:r>
-            <w:r>
-              <w:rPr>
-                <w:rFonts w:ascii="BRH Malayalam Extra" w:hAnsi="BRH Malayalam Extra" w:cs="BRH Malayalam Extra"/>
-                <w:color w:val="000000"/>
-                <w:sz w:val="32"/>
-                <w:szCs w:val="32"/>
-              </w:rPr>
-              <w:t>)</w:t>
-            </w:r>
-            <w:r>
-              <w:rPr>
-                <w:rFonts w:ascii="BRH Malayalam Extra" w:hAnsi="BRH Malayalam Extra" w:cs="BRH Malayalam Extra"/>
-                <w:color w:val="000000"/>
-                <w:sz w:val="32"/>
-                <w:szCs w:val="32"/>
-              </w:rPr>
-              <w:tab/>
-            </w:r>
-            <w:r>
-              <w:rPr>
-                <w:rFonts w:cs="BRH Malayalam Extra"/>
-                <w:color w:val="000000"/>
-                <w:szCs w:val="32"/>
-              </w:rPr>
-              <w:t>3</w:t>
-            </w:r>
-            <w:r>
-              <w:rPr>
-                <w:rFonts w:ascii="BRH Malayalam Extra" w:hAnsi="BRH Malayalam Extra" w:cs="BRH Malayalam Extra"/>
-                <w:color w:val="000000"/>
-                <w:sz w:val="32"/>
-                <w:szCs w:val="32"/>
-              </w:rPr>
-              <w:t>.</w:t>
-            </w:r>
-            <w:r>
-              <w:rPr>
-                <w:rFonts w:cs="BRH Malayalam Extra"/>
-                <w:color w:val="000000"/>
-                <w:szCs w:val="32"/>
-              </w:rPr>
-              <w:t>4</w:t>
-            </w:r>
-            <w:r>
-              <w:rPr>
-                <w:rFonts w:ascii="BRH Malayalam Extra" w:hAnsi="BRH Malayalam Extra" w:cs="BRH Malayalam Extra"/>
-                <w:color w:val="000000"/>
-                <w:sz w:val="32"/>
-                <w:szCs w:val="32"/>
-              </w:rPr>
-              <w:t>.</w:t>
-            </w:r>
-            <w:r>
-              <w:rPr>
-                <w:rFonts w:cs="BRH Malayalam Extra"/>
-                <w:color w:val="000000"/>
-                <w:szCs w:val="32"/>
-              </w:rPr>
-              <w:t>7</w:t>
-            </w:r>
-            <w:r>
-              <w:rPr>
-                <w:rFonts w:ascii="BRH Malayalam Extra" w:hAnsi="BRH Malayalam Extra" w:cs="BRH Malayalam Extra"/>
-                <w:color w:val="000000"/>
-                <w:sz w:val="32"/>
-                <w:szCs w:val="32"/>
-              </w:rPr>
-              <w:t>.</w:t>
-            </w:r>
-            <w:r>
-              <w:rPr>
-                <w:rFonts w:cs="BRH Malayalam Extra"/>
-                <w:color w:val="000000"/>
-                <w:szCs w:val="32"/>
-              </w:rPr>
-              <w:t>1</w:t>
-            </w:r>
-            <w:r>
-              <w:rPr>
-                <w:rFonts w:ascii="BRH Malayalam Extra" w:hAnsi="BRH Malayalam Extra" w:cs="BRH Malayalam Extra"/>
-                <w:color w:val="000000"/>
-                <w:sz w:val="32"/>
-                <w:szCs w:val="32"/>
-              </w:rPr>
-              <w:t>(</w:t>
-            </w:r>
-            <w:r>
-              <w:rPr>
-                <w:rFonts w:cs="BRH Malayalam Extra"/>
-                <w:color w:val="000000"/>
-                <w:szCs w:val="32"/>
-              </w:rPr>
-              <w:t>33</w:t>
-            </w:r>
-            <w:r>
-              <w:rPr>
-                <w:rFonts w:ascii="BRH Malayalam Extra" w:hAnsi="BRH Malayalam Extra" w:cs="BRH Malayalam Extra"/>
-                <w:color w:val="000000"/>
-                <w:sz w:val="32"/>
-                <w:szCs w:val="32"/>
-              </w:rPr>
-              <w:t>)- s¢kõ—k</w:t>
-            </w:r>
-            <w:r>
-              <w:rPr>
-                <w:rFonts w:ascii="BRH Malayalam Extra" w:hAnsi="BRH Malayalam Extra" w:cs="BRH Malayalam Extra"/>
-                <w:color w:val="000000"/>
-                <w:sz w:val="32"/>
-                <w:szCs w:val="32"/>
+                <w:rFonts w:ascii="BRH Malayalam Extra" w:hAnsi="BRH Malayalam Extra" w:cs="BRH Malayalam Extra"/>
+                <w:color w:val="000000"/>
+                <w:sz w:val="32"/>
+                <w:szCs w:val="32"/>
+              </w:rPr>
+              <w:t>s¡—r¡</w:t>
+            </w:r>
+            <w:r>
+              <w:rPr>
+                <w:rFonts w:ascii="BRH Malayalam Extra" w:hAnsi="BRH Malayalam Extra" w:cs="BRH Malayalam Extra"/>
+                <w:color w:val="000000"/>
+                <w:sz w:val="26"/>
+                <w:szCs w:val="32"/>
+              </w:rPr>
+              <w:t>–</w:t>
+            </w:r>
+            <w:r>
+              <w:rPr>
+                <w:rFonts w:ascii="BRH Malayalam Extra" w:hAnsi="BRH Malayalam Extra" w:cs="BRH Malayalam Extra"/>
+                <w:color w:val="000000"/>
+                <w:sz w:val="32"/>
+                <w:szCs w:val="32"/>
+              </w:rPr>
+              <w:t>iïJ s¢kõ—k</w:t>
+            </w:r>
+            <w:r>
+              <w:rPr>
+                <w:rFonts w:ascii="BRH Malayalam Extra" w:hAnsi="BRH Malayalam Extra" w:cs="BRH Malayalam Extra"/>
+                <w:color w:val="000000"/>
+                <w:sz w:val="32"/>
+                <w:szCs w:val="32"/>
+                <w:highlight w:val="green"/>
               </w:rPr>
               <w:t>qôy</w:t>
             </w:r>
             <w:r>
               <w:rPr>
                 <w:rFonts w:ascii="BRH Malayalam Extra" w:hAnsi="BRH Malayalam Extra" w:cs="BRH Malayalam Extra"/>
+                <w:color w:val="000000"/>
+                <w:sz w:val="32"/>
+                <w:szCs w:val="32"/>
+              </w:rPr>
+              <w:t xml:space="preserve"> </w:t>
+            </w:r>
+            <w:r>
+              <w:rPr>
+                <w:rFonts w:ascii="BRH Malayalam Extra" w:hAnsi="BRH Malayalam Extra" w:cs="BRH Malayalam Extra"/>
                 <w:sz w:val="32"/>
                 <w:szCs w:val="32"/>
                 <w:highlight w:val="green"/>
               </w:rPr>
-              <w:t>J</w:t>
-            </w:r>
-            <w:r>
-              <w:rPr>
-                <w:rFonts w:ascii="BRH Malayalam Extra" w:hAnsi="BRH Malayalam Extra" w:cs="BRH Malayalam Extra"/>
-                <w:color w:val="000000"/>
-                <w:sz w:val="32"/>
-                <w:szCs w:val="32"/>
-              </w:rPr>
-              <w:t xml:space="preserve"> | P</w:t>
-            </w:r>
-            <w:r>
-              <w:rPr>
-                <w:rFonts w:ascii="BRH Malayalam Extra" w:hAnsi="BRH Malayalam Extra" w:cs="BRH Malayalam Extra"/>
-                <w:color w:val="000000"/>
-                <w:sz w:val="26"/>
-                <w:szCs w:val="32"/>
-              </w:rPr>
-              <w:t>–</w:t>
-            </w:r>
-            <w:r>
-              <w:rPr>
-                <w:rFonts w:ascii="BRH Malayalam Extra" w:hAnsi="BRH Malayalam Extra" w:cs="BRH Malayalam Extra"/>
-                <w:color w:val="000000"/>
-                <w:sz w:val="32"/>
-                <w:szCs w:val="32"/>
-              </w:rPr>
-              <w:t>öÉix˜J | M</w:t>
-            </w:r>
-            <w:r>
-              <w:rPr>
-                <w:rFonts w:ascii="BRH Malayalam Extra" w:hAnsi="BRH Malayalam Extra" w:cs="BRH Malayalam Extra"/>
-                <w:color w:val="000000"/>
-                <w:sz w:val="26"/>
-                <w:szCs w:val="32"/>
-              </w:rPr>
-              <w:t>–</w:t>
-            </w:r>
-            <w:r>
-              <w:rPr>
-                <w:rFonts w:ascii="BRH Malayalam Extra" w:hAnsi="BRH Malayalam Extra" w:cs="BRH Malayalam Extra"/>
-                <w:color w:val="000000"/>
-                <w:sz w:val="32"/>
-                <w:szCs w:val="32"/>
-              </w:rPr>
-              <w:t>Ê</w:t>
-            </w:r>
-            <w:r>
-              <w:rPr>
-                <w:rFonts w:ascii="BRH Malayalam Extra" w:hAnsi="BRH Malayalam Extra" w:cs="BRH Malayalam Extra"/>
-                <w:color w:val="000000"/>
-                <w:sz w:val="26"/>
-                <w:szCs w:val="32"/>
-              </w:rPr>
-              <w:t>–</w:t>
-            </w:r>
-            <w:r>
-              <w:rPr>
-                <w:rFonts w:ascii="BRH Malayalam Extra" w:hAnsi="BRH Malayalam Extra" w:cs="BRH Malayalam Extra"/>
-                <w:color w:val="000000"/>
-                <w:sz w:val="32"/>
-                <w:szCs w:val="32"/>
-              </w:rPr>
-              <w:t>ªpJ |</w:t>
+              <w:t>Ò</w:t>
+            </w:r>
+            <w:r>
+              <w:rPr>
+                <w:rFonts w:ascii="BRH Malayalam Extra" w:hAnsi="BRH Malayalam Extra" w:cs="BRH Malayalam Extra"/>
+                <w:color w:val="000000"/>
+                <w:sz w:val="26"/>
+                <w:szCs w:val="32"/>
+              </w:rPr>
+              <w:t>––</w:t>
+            </w:r>
+            <w:r>
+              <w:rPr>
+                <w:rFonts w:ascii="BRH Malayalam Extra" w:hAnsi="BRH Malayalam Extra" w:cs="BRH Malayalam Extra"/>
+                <w:color w:val="000000"/>
+                <w:sz w:val="32"/>
+                <w:szCs w:val="32"/>
+              </w:rPr>
+              <w:t xml:space="preserve">öÉix˜J | </w:t>
             </w:r>
           </w:p>
           <w:p>
@@ -21097,14 +21057,236 @@
                 <w:szCs w:val="32"/>
               </w:rPr>
             </w:pPr>
-            <w:r>
-              <w:rPr>
-                <w:rFonts w:ascii="BRH Malayalam Extra" w:hAnsi="BRH Malayalam Extra" w:cs="BRH Malayalam Extra"/>
-                <w:color w:val="000000"/>
-                <w:sz w:val="32"/>
+          </w:p>
+          <w:p>
+            <w:pPr>
+              <w:widowControl w:val="0"/>
+              <w:autoSpaceDE w:val="0"/>
+              <w:autoSpaceDN w:val="0"/>
+              <w:adjustRightInd w:val="0"/>
+              <w:spacing w:before="0" w:line="240" w:lineRule="auto"/>
+              <w:rPr>
+                <w:rFonts w:ascii="BRH Malayalam Extra" w:hAnsi="BRH Malayalam Extra" w:cs="BRH Malayalam Extra"/>
+                <w:color w:val="000000"/>
+                <w:sz w:val="32"/>
+                <w:szCs w:val="32"/>
+              </w:rPr>
+            </w:pPr>
+            <w:r>
+              <w:rPr>
+                <w:rFonts w:cs="BRH Malayalam Extra"/>
+                <w:color w:val="000000"/>
                 <w:szCs w:val="32"/>
               </w:rPr>
               <w:lastRenderedPageBreak/>
+              <w:t>38</w:t>
+            </w:r>
+            <w:r>
+              <w:rPr>
+                <w:rFonts w:ascii="BRH Malayalam Extra" w:hAnsi="BRH Malayalam Extra" w:cs="BRH Malayalam Extra"/>
+                <w:color w:val="000000"/>
+                <w:sz w:val="32"/>
+                <w:szCs w:val="32"/>
+              </w:rPr>
+              <w:t>)</w:t>
+            </w:r>
+            <w:r>
+              <w:rPr>
+                <w:rFonts w:ascii="BRH Malayalam Extra" w:hAnsi="BRH Malayalam Extra" w:cs="BRH Malayalam Extra"/>
+                <w:color w:val="000000"/>
+                <w:sz w:val="32"/>
+                <w:szCs w:val="32"/>
+              </w:rPr>
+              <w:tab/>
+            </w:r>
+            <w:r>
+              <w:rPr>
+                <w:rFonts w:cs="BRH Malayalam Extra"/>
+                <w:color w:val="000000"/>
+                <w:szCs w:val="32"/>
+              </w:rPr>
+              <w:t>3</w:t>
+            </w:r>
+            <w:r>
+              <w:rPr>
+                <w:rFonts w:ascii="BRH Malayalam Extra" w:hAnsi="BRH Malayalam Extra" w:cs="BRH Malayalam Extra"/>
+                <w:color w:val="000000"/>
+                <w:sz w:val="32"/>
+                <w:szCs w:val="32"/>
+              </w:rPr>
+              <w:t>.</w:t>
+            </w:r>
+            <w:r>
+              <w:rPr>
+                <w:rFonts w:cs="BRH Malayalam Extra"/>
+                <w:color w:val="000000"/>
+                <w:szCs w:val="32"/>
+              </w:rPr>
+              <w:t>4</w:t>
+            </w:r>
+            <w:r>
+              <w:rPr>
+                <w:rFonts w:ascii="BRH Malayalam Extra" w:hAnsi="BRH Malayalam Extra" w:cs="BRH Malayalam Extra"/>
+                <w:color w:val="000000"/>
+                <w:sz w:val="32"/>
+                <w:szCs w:val="32"/>
+              </w:rPr>
+              <w:t>.</w:t>
+            </w:r>
+            <w:r>
+              <w:rPr>
+                <w:rFonts w:cs="BRH Malayalam Extra"/>
+                <w:color w:val="000000"/>
+                <w:szCs w:val="32"/>
+              </w:rPr>
+              <w:t>7</w:t>
+            </w:r>
+            <w:r>
+              <w:rPr>
+                <w:rFonts w:ascii="BRH Malayalam Extra" w:hAnsi="BRH Malayalam Extra" w:cs="BRH Malayalam Extra"/>
+                <w:color w:val="000000"/>
+                <w:sz w:val="32"/>
+                <w:szCs w:val="32"/>
+              </w:rPr>
+              <w:t>.</w:t>
+            </w:r>
+            <w:r>
+              <w:rPr>
+                <w:rFonts w:cs="BRH Malayalam Extra"/>
+                <w:color w:val="000000"/>
+                <w:szCs w:val="32"/>
+              </w:rPr>
+              <w:t>1</w:t>
+            </w:r>
+            <w:r>
+              <w:rPr>
+                <w:rFonts w:ascii="BRH Malayalam Extra" w:hAnsi="BRH Malayalam Extra" w:cs="BRH Malayalam Extra"/>
+                <w:color w:val="000000"/>
+                <w:sz w:val="32"/>
+                <w:szCs w:val="32"/>
+              </w:rPr>
+              <w:t>(</w:t>
+            </w:r>
+            <w:r>
+              <w:rPr>
+                <w:rFonts w:cs="BRH Malayalam Extra"/>
+                <w:color w:val="000000"/>
+                <w:szCs w:val="32"/>
+              </w:rPr>
+              <w:t>33</w:t>
+            </w:r>
+            <w:r>
+              <w:rPr>
+                <w:rFonts w:ascii="BRH Malayalam Extra" w:hAnsi="BRH Malayalam Extra" w:cs="BRH Malayalam Extra"/>
+                <w:color w:val="000000"/>
+                <w:sz w:val="32"/>
+                <w:szCs w:val="32"/>
+              </w:rPr>
+              <w:t>)- s¢kõ—k</w:t>
+            </w:r>
+            <w:r>
+              <w:rPr>
+                <w:rFonts w:ascii="BRH Malayalam Extra" w:hAnsi="BRH Malayalam Extra" w:cs="BRH Malayalam Extra"/>
+                <w:color w:val="000000"/>
+                <w:sz w:val="32"/>
+                <w:szCs w:val="32"/>
+              </w:rPr>
+              <w:t>qôy</w:t>
+            </w:r>
+            <w:r>
+              <w:rPr>
+                <w:rFonts w:ascii="BRH Malayalam Extra" w:hAnsi="BRH Malayalam Extra" w:cs="BRH Malayalam Extra"/>
+                <w:sz w:val="32"/>
+                <w:szCs w:val="32"/>
+                <w:highlight w:val="green"/>
+              </w:rPr>
+              <w:t>J</w:t>
+            </w:r>
+            <w:r>
+              <w:rPr>
+                <w:rFonts w:ascii="BRH Malayalam Extra" w:hAnsi="BRH Malayalam Extra" w:cs="BRH Malayalam Extra"/>
+                <w:color w:val="000000"/>
+                <w:sz w:val="32"/>
+                <w:szCs w:val="32"/>
+              </w:rPr>
+              <w:t xml:space="preserve"> | P</w:t>
+            </w:r>
+            <w:r>
+              <w:rPr>
+                <w:rFonts w:ascii="BRH Malayalam Extra" w:hAnsi="BRH Malayalam Extra" w:cs="BRH Malayalam Extra"/>
+                <w:color w:val="000000"/>
+                <w:sz w:val="26"/>
+                <w:szCs w:val="32"/>
+              </w:rPr>
+              <w:t>–</w:t>
+            </w:r>
+            <w:r>
+              <w:rPr>
+                <w:rFonts w:ascii="BRH Malayalam Extra" w:hAnsi="BRH Malayalam Extra" w:cs="BRH Malayalam Extra"/>
+                <w:color w:val="000000"/>
+                <w:sz w:val="32"/>
+                <w:szCs w:val="32"/>
+              </w:rPr>
+              <w:t>öÉix˜J | M</w:t>
+            </w:r>
+            <w:r>
+              <w:rPr>
+                <w:rFonts w:ascii="BRH Malayalam Extra" w:hAnsi="BRH Malayalam Extra" w:cs="BRH Malayalam Extra"/>
+                <w:color w:val="000000"/>
+                <w:sz w:val="26"/>
+                <w:szCs w:val="32"/>
+              </w:rPr>
+              <w:t>–</w:t>
+            </w:r>
+            <w:r>
+              <w:rPr>
+                <w:rFonts w:ascii="BRH Malayalam Extra" w:hAnsi="BRH Malayalam Extra" w:cs="BRH Malayalam Extra"/>
+                <w:color w:val="000000"/>
+                <w:sz w:val="32"/>
+                <w:szCs w:val="32"/>
+              </w:rPr>
+              <w:t>Ê</w:t>
+            </w:r>
+            <w:r>
+              <w:rPr>
+                <w:rFonts w:ascii="BRH Malayalam Extra" w:hAnsi="BRH Malayalam Extra" w:cs="BRH Malayalam Extra"/>
+                <w:color w:val="000000"/>
+                <w:sz w:val="26"/>
+                <w:szCs w:val="32"/>
+              </w:rPr>
+              <w:t>–</w:t>
+            </w:r>
+            <w:r>
+              <w:rPr>
+                <w:rFonts w:ascii="BRH Malayalam Extra" w:hAnsi="BRH Malayalam Extra" w:cs="BRH Malayalam Extra"/>
+                <w:color w:val="000000"/>
+                <w:sz w:val="32"/>
+                <w:szCs w:val="32"/>
+              </w:rPr>
+              <w:t>ªpJ |</w:t>
+            </w:r>
+          </w:p>
+          <w:p>
+            <w:pPr>
+              <w:widowControl w:val="0"/>
+              <w:autoSpaceDE w:val="0"/>
+              <w:autoSpaceDN w:val="0"/>
+              <w:adjustRightInd w:val="0"/>
+              <w:spacing w:before="0" w:line="240" w:lineRule="auto"/>
+              <w:rPr>
+                <w:rFonts w:ascii="BRH Malayalam Extra" w:hAnsi="BRH Malayalam Extra" w:cs="BRH Malayalam Extra"/>
+                <w:color w:val="000000"/>
+                <w:sz w:val="32"/>
+                <w:szCs w:val="32"/>
+              </w:rPr>
+            </w:pPr>
+            <w:r>
+              <w:rPr>
+                <w:rFonts w:ascii="BRH Malayalam Extra" w:hAnsi="BRH Malayalam Extra" w:cs="BRH Malayalam Extra"/>
+                <w:color w:val="000000"/>
+                <w:sz w:val="32"/>
+                <w:szCs w:val="32"/>
+              </w:rPr>
               <w:t>s¢kõ—k</w:t>
             </w:r>
             <w:r>
@@ -21729,7 +21911,6 @@
                 <w:color w:val="000000"/>
                 <w:szCs w:val="32"/>
               </w:rPr>
-              <w:lastRenderedPageBreak/>
               <w:t>37</w:t>
             </w:r>
             <w:r>
@@ -32188,9 +32369,8 @@
               <w:adjustRightInd w:val="0"/>
               <w:spacing w:before="0" w:line="240" w:lineRule="auto"/>
               <w:rPr>
-                <w:rFonts w:ascii="BRH Malayalam Extra" w:hAnsi="BRH Malayalam Extra" w:cs="BRH Malayalam Extra"/>
-                <w:color w:val="000000"/>
-                <w:sz w:val="32"/>
+                <w:rFonts w:cs="BRH Malayalam Extra"/>
+                <w:color w:val="000000"/>
                 <w:szCs w:val="32"/>
               </w:rPr>
             </w:pPr>
@@ -32203,20 +32383,6 @@
               </w:rPr>
               <w:t xml:space="preserve">ZõÇy—ZJ | </w:t>
             </w:r>
-          </w:p>
-          <w:p>
-            <w:pPr>
-              <w:widowControl w:val="0"/>
-              <w:autoSpaceDE w:val="0"/>
-              <w:autoSpaceDN w:val="0"/>
-              <w:adjustRightInd w:val="0"/>
-              <w:spacing w:before="0" w:line="240" w:lineRule="auto"/>
-              <w:rPr>
-                <w:rFonts w:cs="BRH Malayalam Extra"/>
-                <w:color w:val="000000"/>
-                <w:szCs w:val="32"/>
-              </w:rPr>
-            </w:pPr>
           </w:p>
         </w:tc>
         <w:tc>
@@ -34109,7 +34275,7 @@
 </file>
 
 <file path=word/endnotes.xml><?xml version="1.0" encoding="utf-8"?>
-<w:endnotes xmlns:wpc="http://schemas.microsoft.com/office/word/2010/wordprocessingCanvas" xmlns:cx="http://schemas.microsoft.com/office/drawing/2014/chartex" xmlns:cx1="http://schemas.microsoft.com/office/drawing/2015/9/8/chartex" xmlns:cx2="http://schemas.microsoft.com/office/drawing/2015/10/21/chartex" xmlns:cx3="http://schemas.microsoft.com/office/drawing/2016/5/9/chartex" xmlns:cx4="http://schemas.microsoft.com/office/drawing/2016/5/10/chartex" xmlns:cx5="http://schemas.microsoft.com/office/drawing/2016/5/11/chartex" xmlns:cx6="http://schemas.microsoft.com/office/drawing/2016/5/12/chartex" xmlns:cx7="http://schemas.microsoft.com/office/drawing/2016/5/13/chartex" xmlns:cx8="http://schemas.microsoft.com/office/drawing/2016/5/14/chartex" xmlns:mc="http://schemas.openxmlformats.org/markup-compatibility/2006" xmlns:aink="http://schemas.microsoft.com/office/drawing/2016/ink" xmlns:am3d="http://schemas.microsoft.com/office/drawing/2017/model3d" xmlns:o="urn:schemas-microsoft-com:office:office" xmlns:oel="http://schemas.microsoft.com/office/2019/extlst" xmlns:r="http://schemas.openxmlformats.org/officeDocument/2006/relationships" xmlns:m="http://schemas.openxmlformats.org/officeDocument/2006/math" xmlns:v="urn:schemas-microsoft-com:vml" xmlns:wp14="http://schemas.microsoft.com/office/word/2010/wordprocessingDrawing" xmlns:wp="http://schemas.openxmlformats.org/drawingml/2006/wordprocessingDrawing" xmlns:w10="urn:schemas-microsoft-com:office:word" xmlns:w="http://schemas.openxmlformats.org/wordprocessingml/2006/main" xmlns:w14="http://schemas.microsoft.com/office/word/2010/wordml" xmlns:w15="http://schemas.microsoft.com/office/word/2012/wordml" xmlns:w16cei="http://schemas.microsoft.com/office/word/2026/wordml/cei" xmlns:w16cex="http://schemas.microsoft.com/office/word/2018/wordml/cex" xmlns:w16cid="http://schemas.microsoft.com/office/word/2016/wordml/cid" xmlns:w16="http://schemas.microsoft.com/office/word/2018/wordml" xmlns:w16du="http://schemas.microsoft.com/office/word/2023/wordml/word16du" xmlns:w16sdtdh="http://schemas.microsoft.com/office/word/2020/wordml/sdtdatahash" xmlns:w16sdtfl="http://schemas.microsoft.com/office/word/2024/wordml/sdtformatlock" xmlns:w16se="http://schemas.microsoft.com/office/word/2015/wordml/symex" xmlns:wpg="http://schemas.microsoft.com/office/word/2010/wordprocessingGroup" xmlns:wpi="http://schemas.microsoft.com/office/word/2010/wordprocessingInk" xmlns:wne="http://schemas.microsoft.com/office/word/2006/wordml" xmlns:wps="http://schemas.microsoft.com/office/word/2010/wordprocessingShape" mc:Ignorable="w14 w15 w16se w16cid w16 w16cex w16sdtdh w16sdtfl w16du wp14">
+<w:endnotes xmlns:wpc="http://schemas.microsoft.com/office/word/2010/wordprocessingCanvas" xmlns:cx="http://schemas.microsoft.com/office/drawing/2014/chartex" xmlns:cx1="http://schemas.microsoft.com/office/drawing/2015/9/8/chartex" xmlns:cx2="http://schemas.microsoft.com/office/drawing/2015/10/21/chartex" xmlns:cx3="http://schemas.microsoft.com/office/drawing/2016/5/9/chartex" xmlns:cx4="http://schemas.microsoft.com/office/drawing/2016/5/10/chartex" xmlns:cx5="http://schemas.microsoft.com/office/drawing/2016/5/11/chartex" xmlns:cx6="http://schemas.microsoft.com/office/drawing/2016/5/12/chartex" xmlns:cx7="http://schemas.microsoft.com/office/drawing/2016/5/13/chartex" xmlns:cx8="http://schemas.microsoft.com/office/drawing/2016/5/14/chartex" xmlns:mc="http://schemas.openxmlformats.org/markup-compatibility/2006" xmlns:aink="http://schemas.microsoft.com/office/drawing/2016/ink" xmlns:am3d="http://schemas.microsoft.com/office/drawing/2017/model3d" xmlns:o="urn:schemas-microsoft-com:office:office" xmlns:oel="http://schemas.microsoft.com/office/2019/extlst" xmlns:r="http://schemas.openxmlformats.org/officeDocument/2006/relationships" xmlns:m="http://schemas.openxmlformats.org/officeDocument/2006/math" xmlns:v="urn:schemas-microsoft-com:vml" xmlns:wp14="http://schemas.microsoft.com/office/word/2010/wordprocessingDrawing" xmlns:wp="http://schemas.openxmlformats.org/drawingml/2006/wordprocessingDrawing" xmlns:w10="urn:schemas-microsoft-com:office:word" xmlns:w="http://schemas.openxmlformats.org/wordprocessingml/2006/main" xmlns:w14="http://schemas.microsoft.com/office/word/2010/wordml" xmlns:w15="http://schemas.microsoft.com/office/word/2012/wordml" xmlns:w16cex="http://schemas.microsoft.com/office/word/2018/wordml/cex" xmlns:w16cid="http://schemas.microsoft.com/office/word/2016/wordml/cid" xmlns:w16="http://schemas.microsoft.com/office/word/2018/wordml" xmlns:w16du="http://schemas.microsoft.com/office/word/2023/wordml/word16du" xmlns:w16sdtdh="http://schemas.microsoft.com/office/word/2020/wordml/sdtdatahash" xmlns:w16sdtfl="http://schemas.microsoft.com/office/word/2024/wordml/sdtformatlock" xmlns:w16se="http://schemas.microsoft.com/office/word/2015/wordml/symex" xmlns:wpg="http://schemas.microsoft.com/office/word/2010/wordprocessingGroup" xmlns:wpi="http://schemas.microsoft.com/office/word/2010/wordprocessingInk" xmlns:wne="http://schemas.microsoft.com/office/word/2006/wordml" xmlns:wps="http://schemas.microsoft.com/office/word/2010/wordprocessingShape" mc:Ignorable="w14 w15 w16se w16cid w16 w16cex w16sdtdh w16sdtfl w16du wp14">
   <w:endnote w:type="separator" w:id="-1">
     <w:p>
       <w:pPr>
@@ -34134,7 +34300,7 @@
 </file>
 
 <file path=word/footer1.xml><?xml version="1.0" encoding="utf-8"?>
-<w:ftr xmlns:wpc="http://schemas.microsoft.com/office/word/2010/wordprocessingCanvas" xmlns:cx="http://schemas.microsoft.com/office/drawing/2014/chartex" xmlns:cx1="http://schemas.microsoft.com/office/drawing/2015/9/8/chartex" xmlns:cx2="http://schemas.microsoft.com/office/drawing/2015/10/21/chartex" xmlns:cx3="http://schemas.microsoft.com/office/drawing/2016/5/9/chartex" xmlns:cx4="http://schemas.microsoft.com/office/drawing/2016/5/10/chartex" xmlns:cx5="http://schemas.microsoft.com/office/drawing/2016/5/11/chartex" xmlns:cx6="http://schemas.microsoft.com/office/drawing/2016/5/12/chartex" xmlns:cx7="http://schemas.microsoft.com/office/drawing/2016/5/13/chartex" xmlns:cx8="http://schemas.microsoft.com/office/drawing/2016/5/14/chartex" xmlns:mc="http://schemas.openxmlformats.org/markup-compatibility/2006" xmlns:aink="http://schemas.microsoft.com/office/drawing/2016/ink" xmlns:am3d="http://schemas.microsoft.com/office/drawing/2017/model3d" xmlns:o="urn:schemas-microsoft-com:office:office" xmlns:oel="http://schemas.microsoft.com/office/2019/extlst" xmlns:r="http://schemas.openxmlformats.org/officeDocument/2006/relationships" xmlns:m="http://schemas.openxmlformats.org/officeDocument/2006/math" xmlns:v="urn:schemas-microsoft-com:vml" xmlns:wp14="http://schemas.microsoft.com/office/word/2010/wordprocessingDrawing" xmlns:wp="http://schemas.openxmlformats.org/drawingml/2006/wordprocessingDrawing" xmlns:w10="urn:schemas-microsoft-com:office:word" xmlns:w="http://schemas.openxmlformats.org/wordprocessingml/2006/main" xmlns:w14="http://schemas.microsoft.com/office/word/2010/wordml" xmlns:w15="http://schemas.microsoft.com/office/word/2012/wordml" xmlns:w16cei="http://schemas.microsoft.com/office/word/2026/wordml/cei" xmlns:w16cex="http://schemas.microsoft.com/office/word/2018/wordml/cex" xmlns:w16cid="http://schemas.microsoft.com/office/word/2016/wordml/cid" xmlns:w16="http://schemas.microsoft.com/office/word/2018/wordml" xmlns:w16du="http://schemas.microsoft.com/office/word/2023/wordml/word16du" xmlns:w16sdtdh="http://schemas.microsoft.com/office/word/2020/wordml/sdtdatahash" xmlns:w16sdtfl="http://schemas.microsoft.com/office/word/2024/wordml/sdtformatlock" xmlns:w16se="http://schemas.microsoft.com/office/word/2015/wordml/symex" xmlns:wpg="http://schemas.microsoft.com/office/word/2010/wordprocessingGroup" xmlns:wpi="http://schemas.microsoft.com/office/word/2010/wordprocessingInk" xmlns:wne="http://schemas.microsoft.com/office/word/2006/wordml" xmlns:wps="http://schemas.microsoft.com/office/word/2010/wordprocessingShape" mc:Ignorable="w14 w15 w16se w16cid w16 w16cex w16sdtdh w16sdtfl w16du wp14">
+<w:ftr xmlns:wpc="http://schemas.microsoft.com/office/word/2010/wordprocessingCanvas" xmlns:cx="http://schemas.microsoft.com/office/drawing/2014/chartex" xmlns:cx1="http://schemas.microsoft.com/office/drawing/2015/9/8/chartex" xmlns:cx2="http://schemas.microsoft.com/office/drawing/2015/10/21/chartex" xmlns:cx3="http://schemas.microsoft.com/office/drawing/2016/5/9/chartex" xmlns:cx4="http://schemas.microsoft.com/office/drawing/2016/5/10/chartex" xmlns:cx5="http://schemas.microsoft.com/office/drawing/2016/5/11/chartex" xmlns:cx6="http://schemas.microsoft.com/office/drawing/2016/5/12/chartex" xmlns:cx7="http://schemas.microsoft.com/office/drawing/2016/5/13/chartex" xmlns:cx8="http://schemas.microsoft.com/office/drawing/2016/5/14/chartex" xmlns:mc="http://schemas.openxmlformats.org/markup-compatibility/2006" xmlns:aink="http://schemas.microsoft.com/office/drawing/2016/ink" xmlns:am3d="http://schemas.microsoft.com/office/drawing/2017/model3d" xmlns:o="urn:schemas-microsoft-com:office:office" xmlns:oel="http://schemas.microsoft.com/office/2019/extlst" xmlns:r="http://schemas.openxmlformats.org/officeDocument/2006/relationships" xmlns:m="http://schemas.openxmlformats.org/officeDocument/2006/math" xmlns:v="urn:schemas-microsoft-com:vml" xmlns:wp14="http://schemas.microsoft.com/office/word/2010/wordprocessingDrawing" xmlns:wp="http://schemas.openxmlformats.org/drawingml/2006/wordprocessingDrawing" xmlns:w10="urn:schemas-microsoft-com:office:word" xmlns:w="http://schemas.openxmlformats.org/wordprocessingml/2006/main" xmlns:w14="http://schemas.microsoft.com/office/word/2010/wordml" xmlns:w15="http://schemas.microsoft.com/office/word/2012/wordml" xmlns:w16cex="http://schemas.microsoft.com/office/word/2018/wordml/cex" xmlns:w16cid="http://schemas.microsoft.com/office/word/2016/wordml/cid" xmlns:w16="http://schemas.microsoft.com/office/word/2018/wordml" xmlns:w16du="http://schemas.microsoft.com/office/word/2023/wordml/word16du" xmlns:w16sdtdh="http://schemas.microsoft.com/office/word/2020/wordml/sdtdatahash" xmlns:w16sdtfl="http://schemas.microsoft.com/office/word/2024/wordml/sdtformatlock" xmlns:w16se="http://schemas.microsoft.com/office/word/2015/wordml/symex" xmlns:wpg="http://schemas.microsoft.com/office/word/2010/wordprocessingGroup" xmlns:wpi="http://schemas.microsoft.com/office/word/2010/wordprocessingInk" xmlns:wne="http://schemas.microsoft.com/office/word/2006/wordml" xmlns:wps="http://schemas.microsoft.com/office/word/2010/wordprocessingShape" mc:Ignorable="w14 w15 w16se w16cid w16 w16cex w16sdtdh w16sdtfl w16du wp14">
   <w:p>
     <w:pPr>
       <w:pBdr>
@@ -34316,7 +34482,7 @@
 </file>
 
 <file path=word/footer2.xml><?xml version="1.0" encoding="utf-8"?>
-<w:ftr xmlns:wpc="http://schemas.microsoft.com/office/word/2010/wordprocessingCanvas" xmlns:cx="http://schemas.microsoft.com/office/drawing/2014/chartex" xmlns:cx1="http://schemas.microsoft.com/office/drawing/2015/9/8/chartex" xmlns:cx2="http://schemas.microsoft.com/office/drawing/2015/10/21/chartex" xmlns:cx3="http://schemas.microsoft.com/office/drawing/2016/5/9/chartex" xmlns:cx4="http://schemas.microsoft.com/office/drawing/2016/5/10/chartex" xmlns:cx5="http://schemas.microsoft.com/office/drawing/2016/5/11/chartex" xmlns:cx6="http://schemas.microsoft.com/office/drawing/2016/5/12/chartex" xmlns:cx7="http://schemas.microsoft.com/office/drawing/2016/5/13/chartex" xmlns:cx8="http://schemas.microsoft.com/office/drawing/2016/5/14/chartex" xmlns:mc="http://schemas.openxmlformats.org/markup-compatibility/2006" xmlns:aink="http://schemas.microsoft.com/office/drawing/2016/ink" xmlns:am3d="http://schemas.microsoft.com/office/drawing/2017/model3d" xmlns:o="urn:schemas-microsoft-com:office:office" xmlns:oel="http://schemas.microsoft.com/office/2019/extlst" xmlns:r="http://schemas.openxmlformats.org/officeDocument/2006/relationships" xmlns:m="http://schemas.openxmlformats.org/officeDocument/2006/math" xmlns:v="urn:schemas-microsoft-com:vml" xmlns:wp14="http://schemas.microsoft.com/office/word/2010/wordprocessingDrawing" xmlns:wp="http://schemas.openxmlformats.org/drawingml/2006/wordprocessingDrawing" xmlns:w10="urn:schemas-microsoft-com:office:word" xmlns:w="http://schemas.openxmlformats.org/wordprocessingml/2006/main" xmlns:w14="http://schemas.microsoft.com/office/word/2010/wordml" xmlns:w15="http://schemas.microsoft.com/office/word/2012/wordml" xmlns:w16cei="http://schemas.microsoft.com/office/word/2026/wordml/cei" xmlns:w16cex="http://schemas.microsoft.com/office/word/2018/wordml/cex" xmlns:w16cid="http://schemas.microsoft.com/office/word/2016/wordml/cid" xmlns:w16="http://schemas.microsoft.com/office/word/2018/wordml" xmlns:w16du="http://schemas.microsoft.com/office/word/2023/wordml/word16du" xmlns:w16sdtdh="http://schemas.microsoft.com/office/word/2020/wordml/sdtdatahash" xmlns:w16sdtfl="http://schemas.microsoft.com/office/word/2024/wordml/sdtformatlock" xmlns:w16se="http://schemas.microsoft.com/office/word/2015/wordml/symex" xmlns:wpg="http://schemas.microsoft.com/office/word/2010/wordprocessingGroup" xmlns:wpi="http://schemas.microsoft.com/office/word/2010/wordprocessingInk" xmlns:wne="http://schemas.microsoft.com/office/word/2006/wordml" xmlns:wps="http://schemas.microsoft.com/office/word/2010/wordprocessingShape" mc:Ignorable="w14 w15 w16se w16cid w16 w16cex w16sdtdh w16sdtfl w16du wp14">
+<w:ftr xmlns:wpc="http://schemas.microsoft.com/office/word/2010/wordprocessingCanvas" xmlns:cx="http://schemas.microsoft.com/office/drawing/2014/chartex" xmlns:cx1="http://schemas.microsoft.com/office/drawing/2015/9/8/chartex" xmlns:cx2="http://schemas.microsoft.com/office/drawing/2015/10/21/chartex" xmlns:cx3="http://schemas.microsoft.com/office/drawing/2016/5/9/chartex" xmlns:cx4="http://schemas.microsoft.com/office/drawing/2016/5/10/chartex" xmlns:cx5="http://schemas.microsoft.com/office/drawing/2016/5/11/chartex" xmlns:cx6="http://schemas.microsoft.com/office/drawing/2016/5/12/chartex" xmlns:cx7="http://schemas.microsoft.com/office/drawing/2016/5/13/chartex" xmlns:cx8="http://schemas.microsoft.com/office/drawing/2016/5/14/chartex" xmlns:mc="http://schemas.openxmlformats.org/markup-compatibility/2006" xmlns:aink="http://schemas.microsoft.com/office/drawing/2016/ink" xmlns:am3d="http://schemas.microsoft.com/office/drawing/2017/model3d" xmlns:o="urn:schemas-microsoft-com:office:office" xmlns:oel="http://schemas.microsoft.com/office/2019/extlst" xmlns:r="http://schemas.openxmlformats.org/officeDocument/2006/relationships" xmlns:m="http://schemas.openxmlformats.org/officeDocument/2006/math" xmlns:v="urn:schemas-microsoft-com:vml" xmlns:wp14="http://schemas.microsoft.com/office/word/2010/wordprocessingDrawing" xmlns:wp="http://schemas.openxmlformats.org/drawingml/2006/wordprocessingDrawing" xmlns:w10="urn:schemas-microsoft-com:office:word" xmlns:w="http://schemas.openxmlformats.org/wordprocessingml/2006/main" xmlns:w14="http://schemas.microsoft.com/office/word/2010/wordml" xmlns:w15="http://schemas.microsoft.com/office/word/2012/wordml" xmlns:w16cex="http://schemas.microsoft.com/office/word/2018/wordml/cex" xmlns:w16cid="http://schemas.microsoft.com/office/word/2016/wordml/cid" xmlns:w16="http://schemas.microsoft.com/office/word/2018/wordml" xmlns:w16du="http://schemas.microsoft.com/office/word/2023/wordml/word16du" xmlns:w16sdtdh="http://schemas.microsoft.com/office/word/2020/wordml/sdtdatahash" xmlns:w16sdtfl="http://schemas.microsoft.com/office/word/2024/wordml/sdtformatlock" xmlns:w16se="http://schemas.microsoft.com/office/word/2015/wordml/symex" xmlns:wpg="http://schemas.microsoft.com/office/word/2010/wordprocessingGroup" xmlns:wpi="http://schemas.microsoft.com/office/word/2010/wordprocessingInk" xmlns:wne="http://schemas.microsoft.com/office/word/2006/wordml" xmlns:wps="http://schemas.microsoft.com/office/word/2010/wordprocessingShape" mc:Ignorable="w14 w15 w16se w16cid w16 w16cex w16sdtdh w16sdtfl w16du wp14">
   <w:p>
     <w:pPr>
       <w:pBdr>
@@ -34522,7 +34688,7 @@
 </file>
 
 <file path=word/footnotes.xml><?xml version="1.0" encoding="utf-8"?>
-<w:footnotes xmlns:wpc="http://schemas.microsoft.com/office/word/2010/wordprocessingCanvas" xmlns:cx="http://schemas.microsoft.com/office/drawing/2014/chartex" xmlns:cx1="http://schemas.microsoft.com/office/drawing/2015/9/8/chartex" xmlns:cx2="http://schemas.microsoft.com/office/drawing/2015/10/21/chartex" xmlns:cx3="http://schemas.microsoft.com/office/drawing/2016/5/9/chartex" xmlns:cx4="http://schemas.microsoft.com/office/drawing/2016/5/10/chartex" xmlns:cx5="http://schemas.microsoft.com/office/drawing/2016/5/11/chartex" xmlns:cx6="http://schemas.microsoft.com/office/drawing/2016/5/12/chartex" xmlns:cx7="http://schemas.microsoft.com/office/drawing/2016/5/13/chartex" xmlns:cx8="http://schemas.microsoft.com/office/drawing/2016/5/14/chartex" xmlns:mc="http://schemas.openxmlformats.org/markup-compatibility/2006" xmlns:aink="http://schemas.microsoft.com/office/drawing/2016/ink" xmlns:am3d="http://schemas.microsoft.com/office/drawing/2017/model3d" xmlns:o="urn:schemas-microsoft-com:office:office" xmlns:oel="http://schemas.microsoft.com/office/2019/extlst" xmlns:r="http://schemas.openxmlformats.org/officeDocument/2006/relationships" xmlns:m="http://schemas.openxmlformats.org/officeDocument/2006/math" xmlns:v="urn:schemas-microsoft-com:vml" xmlns:wp14="http://schemas.microsoft.com/office/word/2010/wordprocessingDrawing" xmlns:wp="http://schemas.openxmlformats.org/drawingml/2006/wordprocessingDrawing" xmlns:w10="urn:schemas-microsoft-com:office:word" xmlns:w="http://schemas.openxmlformats.org/wordprocessingml/2006/main" xmlns:w14="http://schemas.microsoft.com/office/word/2010/wordml" xmlns:w15="http://schemas.microsoft.com/office/word/2012/wordml" xmlns:w16cei="http://schemas.microsoft.com/office/word/2026/wordml/cei" xmlns:w16cex="http://schemas.microsoft.com/office/word/2018/wordml/cex" xmlns:w16cid="http://schemas.microsoft.com/office/word/2016/wordml/cid" xmlns:w16="http://schemas.microsoft.com/office/word/2018/wordml" xmlns:w16du="http://schemas.microsoft.com/office/word/2023/wordml/word16du" xmlns:w16sdtdh="http://schemas.microsoft.com/office/word/2020/wordml/sdtdatahash" xmlns:w16sdtfl="http://schemas.microsoft.com/office/word/2024/wordml/sdtformatlock" xmlns:w16se="http://schemas.microsoft.com/office/word/2015/wordml/symex" xmlns:wpg="http://schemas.microsoft.com/office/word/2010/wordprocessingGroup" xmlns:wpi="http://schemas.microsoft.com/office/word/2010/wordprocessingInk" xmlns:wne="http://schemas.microsoft.com/office/word/2006/wordml" xmlns:wps="http://schemas.microsoft.com/office/word/2010/wordprocessingShape" mc:Ignorable="w14 w15 w16se w16cid w16 w16cex w16sdtdh w16sdtfl w16du wp14">
+<w:footnotes xmlns:wpc="http://schemas.microsoft.com/office/word/2010/wordprocessingCanvas" xmlns:cx="http://schemas.microsoft.com/office/drawing/2014/chartex" xmlns:cx1="http://schemas.microsoft.com/office/drawing/2015/9/8/chartex" xmlns:cx2="http://schemas.microsoft.com/office/drawing/2015/10/21/chartex" xmlns:cx3="http://schemas.microsoft.com/office/drawing/2016/5/9/chartex" xmlns:cx4="http://schemas.microsoft.com/office/drawing/2016/5/10/chartex" xmlns:cx5="http://schemas.microsoft.com/office/drawing/2016/5/11/chartex" xmlns:cx6="http://schemas.microsoft.com/office/drawing/2016/5/12/chartex" xmlns:cx7="http://schemas.microsoft.com/office/drawing/2016/5/13/chartex" xmlns:cx8="http://schemas.microsoft.com/office/drawing/2016/5/14/chartex" xmlns:mc="http://schemas.openxmlformats.org/markup-compatibility/2006" xmlns:aink="http://schemas.microsoft.com/office/drawing/2016/ink" xmlns:am3d="http://schemas.microsoft.com/office/drawing/2017/model3d" xmlns:o="urn:schemas-microsoft-com:office:office" xmlns:oel="http://schemas.microsoft.com/office/2019/extlst" xmlns:r="http://schemas.openxmlformats.org/officeDocument/2006/relationships" xmlns:m="http://schemas.openxmlformats.org/officeDocument/2006/math" xmlns:v="urn:schemas-microsoft-com:vml" xmlns:wp14="http://schemas.microsoft.com/office/word/2010/wordprocessingDrawing" xmlns:wp="http://schemas.openxmlformats.org/drawingml/2006/wordprocessingDrawing" xmlns:w10="urn:schemas-microsoft-com:office:word" xmlns:w="http://schemas.openxmlformats.org/wordprocessingml/2006/main" xmlns:w14="http://schemas.microsoft.com/office/word/2010/wordml" xmlns:w15="http://schemas.microsoft.com/office/word/2012/wordml" xmlns:w16cex="http://schemas.microsoft.com/office/word/2018/wordml/cex" xmlns:w16cid="http://schemas.microsoft.com/office/word/2016/wordml/cid" xmlns:w16="http://schemas.microsoft.com/office/word/2018/wordml" xmlns:w16du="http://schemas.microsoft.com/office/word/2023/wordml/word16du" xmlns:w16sdtdh="http://schemas.microsoft.com/office/word/2020/wordml/sdtdatahash" xmlns:w16sdtfl="http://schemas.microsoft.com/office/word/2024/wordml/sdtformatlock" xmlns:w16se="http://schemas.microsoft.com/office/word/2015/wordml/symex" xmlns:wpg="http://schemas.microsoft.com/office/word/2010/wordprocessingGroup" xmlns:wpi="http://schemas.microsoft.com/office/word/2010/wordprocessingInk" xmlns:wne="http://schemas.microsoft.com/office/word/2006/wordml" xmlns:wps="http://schemas.microsoft.com/office/word/2010/wordprocessingShape" mc:Ignorable="w14 w15 w16se w16cid w16 w16cex w16sdtdh w16sdtfl w16du wp14">
   <w:footnote w:type="separator" w:id="-1">
     <w:p>
       <w:pPr>
@@ -34547,7 +34713,7 @@
 </file>
 
 <file path=word/header1.xml><?xml version="1.0" encoding="utf-8"?>
-<w:hdr xmlns:wpc="http://schemas.microsoft.com/office/word/2010/wordprocessingCanvas" xmlns:cx="http://schemas.microsoft.com/office/drawing/2014/chartex" xmlns:cx1="http://schemas.microsoft.com/office/drawing/2015/9/8/chartex" xmlns:cx2="http://schemas.microsoft.com/office/drawing/2015/10/21/chartex" xmlns:cx3="http://schemas.microsoft.com/office/drawing/2016/5/9/chartex" xmlns:cx4="http://schemas.microsoft.com/office/drawing/2016/5/10/chartex" xmlns:cx5="http://schemas.microsoft.com/office/drawing/2016/5/11/chartex" xmlns:cx6="http://schemas.microsoft.com/office/drawing/2016/5/12/chartex" xmlns:cx7="http://schemas.microsoft.com/office/drawing/2016/5/13/chartex" xmlns:cx8="http://schemas.microsoft.com/office/drawing/2016/5/14/chartex" xmlns:mc="http://schemas.openxmlformats.org/markup-compatibility/2006" xmlns:aink="http://schemas.microsoft.com/office/drawing/2016/ink" xmlns:am3d="http://schemas.microsoft.com/office/drawing/2017/model3d" xmlns:o="urn:schemas-microsoft-com:office:office" xmlns:oel="http://schemas.microsoft.com/office/2019/extlst" xmlns:r="http://schemas.openxmlformats.org/officeDocument/2006/relationships" xmlns:m="http://schemas.openxmlformats.org/officeDocument/2006/math" xmlns:v="urn:schemas-microsoft-com:vml" xmlns:wp14="http://schemas.microsoft.com/office/word/2010/wordprocessingDrawing" xmlns:wp="http://schemas.openxmlformats.org/drawingml/2006/wordprocessingDrawing" xmlns:w10="urn:schemas-microsoft-com:office:word" xmlns:w="http://schemas.openxmlformats.org/wordprocessingml/2006/main" xmlns:w14="http://schemas.microsoft.com/office/word/2010/wordml" xmlns:w15="http://schemas.microsoft.com/office/word/2012/wordml" xmlns:w16cei="http://schemas.microsoft.com/office/word/2026/wordml/cei" xmlns:w16cex="http://schemas.microsoft.com/office/word/2018/wordml/cex" xmlns:w16cid="http://schemas.microsoft.com/office/word/2016/wordml/cid" xmlns:w16="http://schemas.microsoft.com/office/word/2018/wordml" xmlns:w16du="http://schemas.microsoft.com/office/word/2023/wordml/word16du" xmlns:w16sdtdh="http://schemas.microsoft.com/office/word/2020/wordml/sdtdatahash" xmlns:w16sdtfl="http://schemas.microsoft.com/office/word/2024/wordml/sdtformatlock" xmlns:w16se="http://schemas.microsoft.com/office/word/2015/wordml/symex" xmlns:wpg="http://schemas.microsoft.com/office/word/2010/wordprocessingGroup" xmlns:wpi="http://schemas.microsoft.com/office/word/2010/wordprocessingInk" xmlns:wne="http://schemas.microsoft.com/office/word/2006/wordml" xmlns:wps="http://schemas.microsoft.com/office/word/2010/wordprocessingShape" mc:Ignorable="w14 w15 w16se w16cid w16 w16cex w16sdtdh w16sdtfl w16du wp14">
+<w:hdr xmlns:wpc="http://schemas.microsoft.com/office/word/2010/wordprocessingCanvas" xmlns:cx="http://schemas.microsoft.com/office/drawing/2014/chartex" xmlns:cx1="http://schemas.microsoft.com/office/drawing/2015/9/8/chartex" xmlns:cx2="http://schemas.microsoft.com/office/drawing/2015/10/21/chartex" xmlns:cx3="http://schemas.microsoft.com/office/drawing/2016/5/9/chartex" xmlns:cx4="http://schemas.microsoft.com/office/drawing/2016/5/10/chartex" xmlns:cx5="http://schemas.microsoft.com/office/drawing/2016/5/11/chartex" xmlns:cx6="http://schemas.microsoft.com/office/drawing/2016/5/12/chartex" xmlns:cx7="http://schemas.microsoft.com/office/drawing/2016/5/13/chartex" xmlns:cx8="http://schemas.microsoft.com/office/drawing/2016/5/14/chartex" xmlns:mc="http://schemas.openxmlformats.org/markup-compatibility/2006" xmlns:aink="http://schemas.microsoft.com/office/drawing/2016/ink" xmlns:am3d="http://schemas.microsoft.com/office/drawing/2017/model3d" xmlns:o="urn:schemas-microsoft-com:office:office" xmlns:oel="http://schemas.microsoft.com/office/2019/extlst" xmlns:r="http://schemas.openxmlformats.org/officeDocument/2006/relationships" xmlns:m="http://schemas.openxmlformats.org/officeDocument/2006/math" xmlns:v="urn:schemas-microsoft-com:vml" xmlns:wp14="http://schemas.microsoft.com/office/word/2010/wordprocessingDrawing" xmlns:wp="http://schemas.openxmlformats.org/drawingml/2006/wordprocessingDrawing" xmlns:w10="urn:schemas-microsoft-com:office:word" xmlns:w="http://schemas.openxmlformats.org/wordprocessingml/2006/main" xmlns:w14="http://schemas.microsoft.com/office/word/2010/wordml" xmlns:w15="http://schemas.microsoft.com/office/word/2012/wordml" xmlns:w16cex="http://schemas.microsoft.com/office/word/2018/wordml/cex" xmlns:w16cid="http://schemas.microsoft.com/office/word/2016/wordml/cid" xmlns:w16="http://schemas.microsoft.com/office/word/2018/wordml" xmlns:w16du="http://schemas.microsoft.com/office/word/2023/wordml/word16du" xmlns:w16sdtdh="http://schemas.microsoft.com/office/word/2020/wordml/sdtdatahash" xmlns:w16sdtfl="http://schemas.microsoft.com/office/word/2024/wordml/sdtformatlock" xmlns:w16se="http://schemas.microsoft.com/office/word/2015/wordml/symex" xmlns:wpg="http://schemas.microsoft.com/office/word/2010/wordprocessingGroup" xmlns:wpi="http://schemas.microsoft.com/office/word/2010/wordprocessingInk" xmlns:wne="http://schemas.microsoft.com/office/word/2006/wordml" xmlns:wps="http://schemas.microsoft.com/office/word/2010/wordprocessingShape" mc:Ignorable="w14 w15 w16se w16cid w16 w16cex w16sdtdh w16sdtfl w16du wp14">
   <w:p>
     <w:pPr>
       <w:pStyle w:val="Header"/>
@@ -34568,7 +34734,7 @@
 </file>
 
 <file path=word/header2.xml><?xml version="1.0" encoding="utf-8"?>
-<w:hdr xmlns:wpc="http://schemas.microsoft.com/office/word/2010/wordprocessingCanvas" xmlns:cx="http://schemas.microsoft.com/office/drawing/2014/chartex" xmlns:cx1="http://schemas.microsoft.com/office/drawing/2015/9/8/chartex" xmlns:cx2="http://schemas.microsoft.com/office/drawing/2015/10/21/chartex" xmlns:cx3="http://schemas.microsoft.com/office/drawing/2016/5/9/chartex" xmlns:cx4="http://schemas.microsoft.com/office/drawing/2016/5/10/chartex" xmlns:cx5="http://schemas.microsoft.com/office/drawing/2016/5/11/chartex" xmlns:cx6="http://schemas.microsoft.com/office/drawing/2016/5/12/chartex" xmlns:cx7="http://schemas.microsoft.com/office/drawing/2016/5/13/chartex" xmlns:cx8="http://schemas.microsoft.com/office/drawing/2016/5/14/chartex" xmlns:mc="http://schemas.openxmlformats.org/markup-compatibility/2006" xmlns:aink="http://schemas.microsoft.com/office/drawing/2016/ink" xmlns:am3d="http://schemas.microsoft.com/office/drawing/2017/model3d" xmlns:o="urn:schemas-microsoft-com:office:office" xmlns:oel="http://schemas.microsoft.com/office/2019/extlst" xmlns:r="http://schemas.openxmlformats.org/officeDocument/2006/relationships" xmlns:m="http://schemas.openxmlformats.org/officeDocument/2006/math" xmlns:v="urn:schemas-microsoft-com:vml" xmlns:wp14="http://schemas.microsoft.com/office/word/2010/wordprocessingDrawing" xmlns:wp="http://schemas.openxmlformats.org/drawingml/2006/wordprocessingDrawing" xmlns:w10="urn:schemas-microsoft-com:office:word" xmlns:w="http://schemas.openxmlformats.org/wordprocessingml/2006/main" xmlns:w14="http://schemas.microsoft.com/office/word/2010/wordml" xmlns:w15="http://schemas.microsoft.com/office/word/2012/wordml" xmlns:w16cei="http://schemas.microsoft.com/office/word/2026/wordml/cei" xmlns:w16cex="http://schemas.microsoft.com/office/word/2018/wordml/cex" xmlns:w16cid="http://schemas.microsoft.com/office/word/2016/wordml/cid" xmlns:w16="http://schemas.microsoft.com/office/word/2018/wordml" xmlns:w16du="http://schemas.microsoft.com/office/word/2023/wordml/word16du" xmlns:w16sdtdh="http://schemas.microsoft.com/office/word/2020/wordml/sdtdatahash" xmlns:w16sdtfl="http://schemas.microsoft.com/office/word/2024/wordml/sdtformatlock" xmlns:w16se="http://schemas.microsoft.com/office/word/2015/wordml/symex" xmlns:wpg="http://schemas.microsoft.com/office/word/2010/wordprocessingGroup" xmlns:wpi="http://schemas.microsoft.com/office/word/2010/wordprocessingInk" xmlns:wne="http://schemas.microsoft.com/office/word/2006/wordml" xmlns:wps="http://schemas.microsoft.com/office/word/2010/wordprocessingShape" mc:Ignorable="w14 w15 w16se w16cid w16 w16cex w16sdtdh w16sdtfl w16du wp14">
+<w:hdr xmlns:wpc="http://schemas.microsoft.com/office/word/2010/wordprocessingCanvas" xmlns:cx="http://schemas.microsoft.com/office/drawing/2014/chartex" xmlns:cx1="http://schemas.microsoft.com/office/drawing/2015/9/8/chartex" xmlns:cx2="http://schemas.microsoft.com/office/drawing/2015/10/21/chartex" xmlns:cx3="http://schemas.microsoft.com/office/drawing/2016/5/9/chartex" xmlns:cx4="http://schemas.microsoft.com/office/drawing/2016/5/10/chartex" xmlns:cx5="http://schemas.microsoft.com/office/drawing/2016/5/11/chartex" xmlns:cx6="http://schemas.microsoft.com/office/drawing/2016/5/12/chartex" xmlns:cx7="http://schemas.microsoft.com/office/drawing/2016/5/13/chartex" xmlns:cx8="http://schemas.microsoft.com/office/drawing/2016/5/14/chartex" xmlns:mc="http://schemas.openxmlformats.org/markup-compatibility/2006" xmlns:aink="http://schemas.microsoft.com/office/drawing/2016/ink" xmlns:am3d="http://schemas.microsoft.com/office/drawing/2017/model3d" xmlns:o="urn:schemas-microsoft-com:office:office" xmlns:oel="http://schemas.microsoft.com/office/2019/extlst" xmlns:r="http://schemas.openxmlformats.org/officeDocument/2006/relationships" xmlns:m="http://schemas.openxmlformats.org/officeDocument/2006/math" xmlns:v="urn:schemas-microsoft-com:vml" xmlns:wp14="http://schemas.microsoft.com/office/word/2010/wordprocessingDrawing" xmlns:wp="http://schemas.openxmlformats.org/drawingml/2006/wordprocessingDrawing" xmlns:w10="urn:schemas-microsoft-com:office:word" xmlns:w="http://schemas.openxmlformats.org/wordprocessingml/2006/main" xmlns:w14="http://schemas.microsoft.com/office/word/2010/wordml" xmlns:w15="http://schemas.microsoft.com/office/word/2012/wordml" xmlns:w16cex="http://schemas.microsoft.com/office/word/2018/wordml/cex" xmlns:w16cid="http://schemas.microsoft.com/office/word/2016/wordml/cid" xmlns:w16="http://schemas.microsoft.com/office/word/2018/wordml" xmlns:w16du="http://schemas.microsoft.com/office/word/2023/wordml/word16du" xmlns:w16sdtdh="http://schemas.microsoft.com/office/word/2020/wordml/sdtdatahash" xmlns:w16sdtfl="http://schemas.microsoft.com/office/word/2024/wordml/sdtformatlock" xmlns:w16se="http://schemas.microsoft.com/office/word/2015/wordml/symex" xmlns:wpg="http://schemas.microsoft.com/office/word/2010/wordprocessingGroup" xmlns:wpi="http://schemas.microsoft.com/office/word/2010/wordprocessingInk" xmlns:wne="http://schemas.microsoft.com/office/word/2006/wordml" xmlns:wps="http://schemas.microsoft.com/office/word/2010/wordprocessingShape" mc:Ignorable="w14 w15 w16se w16cid w16 w16cex w16sdtdh w16sdtfl w16du wp14">
   <w:p>
     <w:pPr>
       <w:pStyle w:val="Header"/>

</xml_diff>